<commit_message>
added troubleshooting log, added rough tuning values of circuit components for sine wave test
</commit_message>
<xml_diff>
--- a/PID-Controller-using-OP-AMPS- Hari Mohan 2026A8PS1148H.docx
+++ b/PID-Controller-using-OP-AMPS- Hari Mohan 2026A8PS1148H.docx
@@ -2,6 +2,1442 @@
 <file path=word/document.xml><?xml version="1.0" encoding="utf-8"?>
 <w:document xmlns:wpc="http://schemas.microsoft.com/office/word/2010/wordprocessingCanvas" xmlns:cx="http://schemas.microsoft.com/office/drawing/2014/chartex" xmlns:cx1="http://schemas.microsoft.com/office/drawing/2015/9/8/chartex" xmlns:cx2="http://schemas.microsoft.com/office/drawing/2015/10/21/chartex" xmlns:cx3="http://schemas.microsoft.com/office/drawing/2016/5/9/chartex" xmlns:cx4="http://schemas.microsoft.com/office/drawing/2016/5/10/chartex" xmlns:cx5="http://schemas.microsoft.com/office/drawing/2016/5/11/chartex" xmlns:cx6="http://schemas.microsoft.com/office/drawing/2016/5/12/chartex" xmlns:cx7="http://schemas.microsoft.com/office/drawing/2016/5/13/chartex" xmlns:cx8="http://schemas.microsoft.com/office/drawing/2016/5/14/chartex" xmlns:mc="http://schemas.openxmlformats.org/markup-compatibility/2006" xmlns:aink="http://schemas.microsoft.com/office/drawing/2016/ink" xmlns:am3d="http://schemas.microsoft.com/office/drawing/2017/model3d" xmlns:o="urn:schemas-microsoft-com:office:office" xmlns:oel="http://schemas.microsoft.com/office/2019/extlst" xmlns:r="http://schemas.openxmlformats.org/officeDocument/2006/relationships" xmlns:m="http://schemas.openxmlformats.org/officeDocument/2006/math" xmlns:v="urn:schemas-microsoft-com:vml" xmlns:wp14="http://schemas.microsoft.com/office/word/2010/wordprocessingDrawing" xmlns:wp="http://schemas.openxmlformats.org/drawingml/2006/wordprocessingDrawing" xmlns:w10="urn:schemas-microsoft-com:office:word" xmlns:w="http://schemas.openxmlformats.org/wordprocessingml/2006/main" xmlns:w14="http://schemas.microsoft.com/office/word/2010/wordml" xmlns:w15="http://schemas.microsoft.com/office/word/2012/wordml" xmlns:w16cei="http://schemas.microsoft.com/office/word/2026/wordml/cei" xmlns:w16cex="http://schemas.microsoft.com/office/word/2018/wordml/cex" xmlns:w16cid="http://schemas.microsoft.com/office/word/2016/wordml/cid" xmlns:w16="http://schemas.microsoft.com/office/word/2018/wordml" xmlns:w16du="http://schemas.microsoft.com/office/word/2023/wordml/word16du" xmlns:w16sdtdh="http://schemas.microsoft.com/office/word/2020/wordml/sdtdatahash" xmlns:w16sdtfl="http://schemas.microsoft.com/office/word/2024/wordml/sdtformatlock" xmlns:w16se="http://schemas.microsoft.com/office/word/2015/wordml/symex" xmlns:wpg="http://schemas.microsoft.com/office/word/2010/wordprocessingGroup" xmlns:wpi="http://schemas.microsoft.com/office/word/2010/wordprocessingInk" xmlns:wne="http://schemas.microsoft.com/office/word/2006/wordml" xmlns:wps="http://schemas.microsoft.com/office/word/2010/wordprocessingShape" mc:Ignorable="w14 w15 w16se w16cid w16 w16cex w16sdtdh w16sdtfl w16du wp14">
   <w:body>
+    <w:p>
+      <w:pPr>
+        <w:pStyle w:val="Title"/>
+        <w:jc w:val="center"/>
+        <w:rPr>
+          <w:rFonts w:ascii="Arial" w:hAnsi="Arial" w:cs="Arial"/>
+          <w:b/>
+          <w:bCs/>
+          <w:u w:val="single"/>
+        </w:rPr>
+      </w:pPr>
+      <w:r>
+        <w:rPr>
+          <w:rFonts w:ascii="Arial" w:hAnsi="Arial" w:cs="Arial"/>
+          <w:b/>
+          <w:bCs/>
+          <w:u w:val="single"/>
+        </w:rPr>
+        <w:t xml:space="preserve">Building PID Controller using OP AMPS and </w:t>
+      </w:r>
+      <w:r>
+        <w:rPr>
+          <w:rFonts w:ascii="Arial" w:hAnsi="Arial" w:cs="Arial"/>
+          <w:b/>
+          <w:bCs/>
+          <w:u w:val="single"/>
+        </w:rPr>
+        <w:t>P</w:t>
+      </w:r>
+      <w:r>
+        <w:rPr>
+          <w:rFonts w:ascii="Arial" w:hAnsi="Arial" w:cs="Arial"/>
+          <w:b/>
+          <w:bCs/>
+          <w:u w:val="single"/>
+        </w:rPr>
+        <w:t>assin</w:t>
+      </w:r>
+      <w:r>
+        <w:rPr>
+          <w:rFonts w:ascii="Arial" w:hAnsi="Arial" w:cs="Arial"/>
+          <w:b/>
+          <w:bCs/>
+          <w:u w:val="single"/>
+        </w:rPr>
+        <w:t>g</w:t>
+      </w:r>
+      <w:r>
+        <w:rPr>
+          <w:rFonts w:ascii="Arial" w:hAnsi="Arial" w:cs="Arial"/>
+          <w:b/>
+          <w:bCs/>
+          <w:u w:val="single"/>
+        </w:rPr>
+        <w:t xml:space="preserve"> </w:t>
+      </w:r>
+      <w:r>
+        <w:rPr>
+          <w:rFonts w:ascii="Arial" w:hAnsi="Arial" w:cs="Arial"/>
+          <w:b/>
+          <w:bCs/>
+          <w:u w:val="single"/>
+        </w:rPr>
+        <w:t>T</w:t>
+      </w:r>
+      <w:r>
+        <w:rPr>
+          <w:rFonts w:ascii="Arial" w:hAnsi="Arial" w:cs="Arial"/>
+          <w:b/>
+          <w:bCs/>
+          <w:u w:val="single"/>
+        </w:rPr>
+        <w:t xml:space="preserve">ime </w:t>
+      </w:r>
+      <w:r>
+        <w:rPr>
+          <w:rFonts w:ascii="Arial" w:hAnsi="Arial" w:cs="Arial"/>
+          <w:b/>
+          <w:bCs/>
+          <w:u w:val="single"/>
+        </w:rPr>
+        <w:t>V</w:t>
+      </w:r>
+      <w:r>
+        <w:rPr>
+          <w:rFonts w:ascii="Arial" w:hAnsi="Arial" w:cs="Arial"/>
+          <w:b/>
+          <w:bCs/>
+          <w:u w:val="single"/>
+        </w:rPr>
+        <w:t xml:space="preserve">arying </w:t>
+      </w:r>
+      <w:r>
+        <w:rPr>
+          <w:rFonts w:ascii="Arial" w:hAnsi="Arial" w:cs="Arial"/>
+          <w:b/>
+          <w:bCs/>
+          <w:u w:val="single"/>
+        </w:rPr>
+        <w:t>V</w:t>
+      </w:r>
+      <w:r>
+        <w:rPr>
+          <w:rFonts w:ascii="Arial" w:hAnsi="Arial" w:cs="Arial"/>
+          <w:b/>
+          <w:bCs/>
+          <w:u w:val="single"/>
+        </w:rPr>
+        <w:t xml:space="preserve">oltage </w:t>
+      </w:r>
+      <w:r>
+        <w:rPr>
+          <w:rFonts w:ascii="Arial" w:hAnsi="Arial" w:cs="Arial"/>
+          <w:b/>
+          <w:bCs/>
+          <w:u w:val="single"/>
+        </w:rPr>
+        <w:t>S</w:t>
+      </w:r>
+      <w:r>
+        <w:rPr>
+          <w:rFonts w:ascii="Arial" w:hAnsi="Arial" w:cs="Arial"/>
+          <w:b/>
+          <w:bCs/>
+          <w:u w:val="single"/>
+        </w:rPr>
+        <w:t xml:space="preserve">ignals </w:t>
+      </w:r>
+      <w:r>
+        <w:rPr>
+          <w:rFonts w:ascii="Arial" w:hAnsi="Arial" w:cs="Arial"/>
+          <w:b/>
+          <w:bCs/>
+          <w:u w:val="single"/>
+        </w:rPr>
+        <w:t>T</w:t>
+      </w:r>
+      <w:r>
+        <w:rPr>
+          <w:rFonts w:ascii="Arial" w:hAnsi="Arial" w:cs="Arial"/>
+          <w:b/>
+          <w:bCs/>
+          <w:u w:val="single"/>
+        </w:rPr>
+        <w:t xml:space="preserve">hrough </w:t>
+      </w:r>
+      <w:r>
+        <w:rPr>
+          <w:rFonts w:ascii="Arial" w:hAnsi="Arial" w:cs="Arial"/>
+          <w:b/>
+          <w:bCs/>
+          <w:u w:val="single"/>
+        </w:rPr>
+        <w:t>I</w:t>
+      </w:r>
+      <w:r>
+        <w:rPr>
+          <w:rFonts w:ascii="Arial" w:hAnsi="Arial" w:cs="Arial"/>
+          <w:b/>
+          <w:bCs/>
+          <w:u w:val="single"/>
+        </w:rPr>
+        <w:t>t</w:t>
+      </w:r>
+    </w:p>
+    <w:p>
+      <w:r>
+        <w:t xml:space="preserve">what to write </w:t>
+      </w:r>
+    </w:p>
+    <w:p>
+      <w:r>
+        <w:t>sabki equations</w:t>
+      </w:r>
+    </w:p>
+    <w:p>
+      <w:r>
+        <w:t xml:space="preserve">summing wale ki equations </w:t>
+      </w:r>
+    </w:p>
+    <w:p>
+      <w:r>
+        <w:t>saare parts ki values</w:t>
+      </w:r>
+    </w:p>
+    <w:p/>
+    <w:p>
+      <w:r>
+        <w:t>uske baad sine wave + pics</w:t>
+      </w:r>
+    </w:p>
+    <w:p>
+      <w:r>
+        <w:t>4square wave + pics</w:t>
+      </w:r>
+    </w:p>
+    <w:p>
+      <w:r>
+        <w:t>saw + pics</w:t>
+      </w:r>
+    </w:p>
+    <w:p>
+      <w:r>
+        <w:t>uske baad trouble shooting</w:t>
+      </w:r>
+    </w:p>
+    <w:p/>
+    <w:p/>
+    <w:p>
+      <w:r>
+        <w:t xml:space="preserve">with 12 v supply clipping starts at output boltage = </w:t>
+      </w:r>
+      <w:r>
+        <w:t>24 volts trial and error</w:t>
+      </w:r>
+    </w:p>
+    <w:p>
+      <w:r>
+        <w:t>CIRCUIT SPECIFICS</w:t>
+      </w:r>
+    </w:p>
+    <w:p>
+      <w:r>
+        <w:t xml:space="preserve">INPUT VOLTAGE +12, -12, 0 GROUND </w:t>
+      </w:r>
+    </w:p>
+    <w:p/>
+    <w:p>
+      <w:r>
+        <w:t>PROPORTIONAL CONTROL</w:t>
+      </w:r>
+    </w:p>
+    <w:p>
+      <w:r>
+        <w:t xml:space="preserve">Rin = </w:t>
+      </w:r>
+      <w:r>
+        <w:t>5</w:t>
+      </w:r>
+      <w:r>
+        <w:t>k</w:t>
+      </w:r>
+    </w:p>
+    <w:p>
+      <w:r>
+        <w:t xml:space="preserve">Rf = </w:t>
+      </w:r>
+      <w:r>
+        <w:t>20</w:t>
+      </w:r>
+      <w:r>
+        <w:t>k</w:t>
+      </w:r>
+    </w:p>
+    <w:p>
+      <w:r>
+        <w:t>Rout = 10</w:t>
+      </w:r>
+      <w:r>
+        <w:t>k</w:t>
+      </w:r>
+    </w:p>
+    <w:p>
+      <w:r>
+        <w:t xml:space="preserve">gain = -Rf/Rin = </w:t>
+      </w:r>
+      <w:r>
+        <w:t xml:space="preserve">4 </w:t>
+      </w:r>
+      <w:r>
+        <w:t>times</w:t>
+      </w:r>
+    </w:p>
+    <w:p>
+      <w:r>
+        <w:t>180 degree phase difference/flipped/amplified output</w:t>
+      </w:r>
+    </w:p>
+    <w:p>
+      <w:r>
+        <w:t xml:space="preserve">Sin amplified to </w:t>
+      </w:r>
+      <w:r>
+        <w:t>8</w:t>
+      </w:r>
+      <w:r>
+        <w:t>v</w:t>
+      </w:r>
+    </w:p>
+    <w:p>
+      <w:r>
+        <w:t xml:space="preserve">square amplified to </w:t>
+      </w:r>
+    </w:p>
+    <w:p>
+      <w:r>
+        <w:t xml:space="preserve">saw amplified to </w:t>
+      </w:r>
+    </w:p>
+    <w:p/>
+    <w:p>
+      <w:r>
+        <w:t>INTEGRAL CONTROL</w:t>
+      </w:r>
+    </w:p>
+    <w:p>
+      <w:r>
+        <w:t xml:space="preserve">Rin = </w:t>
+      </w:r>
+      <w:r>
+        <w:t>3K</w:t>
+      </w:r>
+    </w:p>
+    <w:p>
+      <w:r>
+        <w:t xml:space="preserve">Cf = </w:t>
+      </w:r>
+      <w:r>
+        <w:t>10k</w:t>
+      </w:r>
+    </w:p>
+    <w:p>
+      <w:r>
+        <w:t xml:space="preserve">Rf = </w:t>
+      </w:r>
+      <w:r>
+        <w:t>100nF</w:t>
+      </w:r>
+    </w:p>
+    <w:p>
+      <w:r>
+        <w:t xml:space="preserve">Rout = </w:t>
+      </w:r>
+      <w:r>
+        <w:t>10k</w:t>
+      </w:r>
+    </w:p>
+    <w:p/>
+    <w:p>
+      <w:r>
+        <w:t>See maths in notebook</w:t>
+      </w:r>
+    </w:p>
+    <w:p>
+      <w:r>
+        <w:t xml:space="preserve">gain = </w:t>
+      </w:r>
+    </w:p>
+    <w:p>
+      <w:r>
+        <w:t>R Vout = 31830.98</w:t>
+      </w:r>
+    </w:p>
+    <w:p>
+      <w:r>
+        <w:t xml:space="preserve">R = </w:t>
+      </w:r>
+      <w:r>
+        <w:t>31,83.098 , input value of Vo to get in that range  for Vo = 10 (divided by Vo)</w:t>
+      </w:r>
+    </w:p>
+    <w:p>
+      <w:r>
+        <w:t>-----------------------------------------------</w:t>
+      </w:r>
+    </w:p>
+    <w:p>
+      <w:r>
+        <w:t>differential control</w:t>
+      </w:r>
+    </w:p>
+    <w:p>
+      <w:r>
+        <w:t>rf = 10/smthe</w:t>
+      </w:r>
+    </w:p>
+    <w:p>
+      <w:r>
+        <w:t>rf = 79577.47</w:t>
+      </w:r>
+    </w:p>
+    <w:p>
+      <w:r>
+        <w:t>rf = 80 k</w:t>
+      </w:r>
+    </w:p>
+    <w:p/>
+    <w:p>
+      <w:r>
+        <w:t>vo = 10</w:t>
+      </w:r>
+    </w:p>
+    <w:p/>
+    <w:p>
+      <w:pPr>
+        <w:numPr>
+          <w:ilvl w:val="0"/>
+          <w:numId w:val="13"/>
+        </w:numPr>
+        <w:rPr>
+          <w:sz w:val="32"/>
+          <w:szCs w:val="32"/>
+        </w:rPr>
+      </w:pPr>
+      <w:r>
+        <w:rPr>
+          <w:b/>
+          <w:bCs/>
+          <w:sz w:val="32"/>
+          <w:szCs w:val="32"/>
+        </w:rPr>
+        <w:t>Sine Wave Test:</w:t>
+      </w:r>
+    </w:p>
+    <w:p>
+      <w:pPr>
+        <w:numPr>
+          <w:ilvl w:val="1"/>
+          <w:numId w:val="13"/>
+        </w:numPr>
+      </w:pPr>
+      <w:r>
+        <w:t>Frequency: 100 Hz</w:t>
+      </w:r>
+    </w:p>
+    <w:p>
+      <w:pPr>
+        <w:numPr>
+          <w:ilvl w:val="1"/>
+          <w:numId w:val="13"/>
+        </w:numPr>
+      </w:pPr>
+      <w:r>
+        <w:t>Amplitude: 2.0 V</w:t>
+      </w:r>
+    </w:p>
+    <w:p>
+      <w:pPr>
+        <w:numPr>
+          <w:ilvl w:val="1"/>
+          <w:numId w:val="13"/>
+        </w:numPr>
+      </w:pPr>
+      <w:r>
+        <w:t>DC Offset: 0.0 V</w:t>
+      </w:r>
+    </w:p>
+    <w:p>
+      <w:pPr>
+        <w:numPr>
+          <w:ilvl w:val="1"/>
+          <w:numId w:val="13"/>
+        </w:numPr>
+      </w:pPr>
+      <w:r>
+        <w:t>Function Type: Sine</w:t>
+      </w:r>
+    </w:p>
+    <w:p>
+      <w:pPr>
+        <w:numPr>
+          <w:ilvl w:val="0"/>
+          <w:numId w:val="13"/>
+        </w:numPr>
+      </w:pPr>
+      <w:r>
+        <w:rPr>
+          <w:b/>
+          <w:bCs/>
+        </w:rPr>
+        <w:t>Square Wave Test:</w:t>
+      </w:r>
+    </w:p>
+    <w:p>
+      <w:pPr>
+        <w:numPr>
+          <w:ilvl w:val="1"/>
+          <w:numId w:val="13"/>
+        </w:numPr>
+      </w:pPr>
+      <w:r>
+        <w:t>Frequency: 50 Hz</w:t>
+      </w:r>
+    </w:p>
+    <w:p>
+      <w:pPr>
+        <w:numPr>
+          <w:ilvl w:val="1"/>
+          <w:numId w:val="13"/>
+        </w:numPr>
+      </w:pPr>
+      <w:r>
+        <w:t>Amplitude: 2.5 V</w:t>
+      </w:r>
+    </w:p>
+    <w:p>
+      <w:pPr>
+        <w:numPr>
+          <w:ilvl w:val="1"/>
+          <w:numId w:val="13"/>
+        </w:numPr>
+      </w:pPr>
+      <w:r>
+        <w:t>DC Offset: 0.0 V</w:t>
+      </w:r>
+    </w:p>
+    <w:p>
+      <w:pPr>
+        <w:numPr>
+          <w:ilvl w:val="1"/>
+          <w:numId w:val="13"/>
+        </w:numPr>
+      </w:pPr>
+      <w:r>
+        <w:lastRenderedPageBreak/>
+        <w:t>Function Type: Square</w:t>
+      </w:r>
+    </w:p>
+    <w:p>
+      <w:pPr>
+        <w:numPr>
+          <w:ilvl w:val="0"/>
+          <w:numId w:val="13"/>
+        </w:numPr>
+      </w:pPr>
+      <w:r>
+        <w:rPr>
+          <w:b/>
+          <w:bCs/>
+        </w:rPr>
+        <w:t>Sawtooth/Triangle Wave Test:</w:t>
+      </w:r>
+    </w:p>
+    <w:p>
+      <w:pPr>
+        <w:numPr>
+          <w:ilvl w:val="1"/>
+          <w:numId w:val="13"/>
+        </w:numPr>
+      </w:pPr>
+      <w:r>
+        <w:t>Frequency: 100 Hz</w:t>
+      </w:r>
+    </w:p>
+    <w:p>
+      <w:pPr>
+        <w:numPr>
+          <w:ilvl w:val="1"/>
+          <w:numId w:val="13"/>
+        </w:numPr>
+      </w:pPr>
+      <w:r>
+        <w:t>Amplitude: 2.0 V</w:t>
+      </w:r>
+    </w:p>
+    <w:p>
+      <w:pPr>
+        <w:numPr>
+          <w:ilvl w:val="1"/>
+          <w:numId w:val="13"/>
+        </w:numPr>
+      </w:pPr>
+      <w:r>
+        <w:t>DC Offset: 0.0 V</w:t>
+      </w:r>
+    </w:p>
+    <w:p>
+      <w:pPr>
+        <w:numPr>
+          <w:ilvl w:val="1"/>
+          <w:numId w:val="13"/>
+        </w:numPr>
+      </w:pPr>
+      <w:r>
+        <w:t>Function Type: Triangle</w:t>
+      </w:r>
+    </w:p>
+    <w:p>
+      <w:pPr>
+        <w:pBdr>
+          <w:bottom w:val="single" w:sz="12" w:space="1" w:color="auto"/>
+        </w:pBdr>
+      </w:pPr>
+    </w:p>
+    <w:p>
+      <w:r>
+        <w:t>TROUBLESHOOTING</w:t>
+      </w:r>
+    </w:p>
+    <w:p>
+      <w:pPr>
+        <w:pStyle w:val="ListParagraph"/>
+        <w:numPr>
+          <w:ilvl w:val="0"/>
+          <w:numId w:val="8"/>
+        </w:numPr>
+        <w:rPr>
+          <w:u w:val="single"/>
+        </w:rPr>
+      </w:pPr>
+      <w:r>
+        <w:rPr>
+          <w:u w:val="single"/>
+        </w:rPr>
+        <w:t xml:space="preserve">Why use large </w:t>
+      </w:r>
+      <w:r>
+        <w:rPr>
+          <w:u w:val="single"/>
+        </w:rPr>
+        <w:t>resistance?</w:t>
+      </w:r>
+      <w:r>
+        <w:rPr>
+          <w:u w:val="single"/>
+        </w:rPr>
+        <w:t xml:space="preserve"> </w:t>
+      </w:r>
+    </w:p>
+    <w:p>
+      <w:pPr>
+        <w:pStyle w:val="ListParagraph"/>
+      </w:pPr>
+      <w:r>
+        <w:t xml:space="preserve"> </w:t>
+      </w:r>
+      <w:r>
+        <w:t>to limit current drawn from function generator</w:t>
+      </w:r>
+      <w:r>
+        <w:t>, h</w:t>
+      </w:r>
+      <w:r>
+        <w:t>eat loss and all</w:t>
+      </w:r>
+      <w:r>
+        <w:br/>
+      </w:r>
+    </w:p>
+    <w:p>
+      <w:pPr>
+        <w:pStyle w:val="ListParagraph"/>
+        <w:numPr>
+          <w:ilvl w:val="0"/>
+          <w:numId w:val="7"/>
+        </w:numPr>
+      </w:pPr>
+      <w:r>
+        <w:rPr>
+          <w:u w:val="single"/>
+        </w:rPr>
+        <w:t>Output Voltage from Op Amp gets clipped</w:t>
+      </w:r>
+      <w:r>
+        <w:br/>
+      </w:r>
+      <w:r>
+        <w:t xml:space="preserve">If Gain in inverting amplifier is </w:t>
+      </w:r>
+      <w:r>
+        <w:t>very high such that output voltage is more</w:t>
+      </w:r>
+      <w:r>
+        <w:t xml:space="preserve"> than what power supply of amplifier can support</w:t>
+      </w:r>
+      <w:r>
+        <w:t>,</w:t>
+      </w:r>
+      <w:r>
+        <w:t xml:space="preserve"> output wave form gets clipped</w:t>
+      </w:r>
+      <w:r>
+        <w:t>.</w:t>
+      </w:r>
+      <w:r>
+        <w:br/>
+      </w:r>
+      <w:r>
+        <w:br/>
+      </w:r>
+      <w:r>
+        <w:t>Eg: in</w:t>
+      </w:r>
+      <w:r>
+        <w:t>itially took</w:t>
+      </w:r>
+      <w:r>
+        <w:t xml:space="preserve"> P</w:t>
+      </w:r>
+      <w:r>
+        <w:t>roportional</w:t>
+      </w:r>
+      <w:r>
+        <w:t xml:space="preserve"> control with 9 V supply,</w:t>
+      </w:r>
+      <w:r>
+        <w:t xml:space="preserve"> input signal amplitude = 2V, gain</w:t>
+      </w:r>
+      <w:r>
+        <w:t xml:space="preserve"> </w:t>
+      </w:r>
+      <w:r>
+        <w:t>= 10. Output signal = 20V was clipped at the top.</w:t>
+      </w:r>
+      <w:r>
+        <w:br/>
+      </w:r>
+      <w:r>
+        <w:br/>
+        <w:t>This problem was resolved using a 12 V supply, which can comfortably handle gain in given situation.</w:t>
+      </w:r>
+      <w:r>
+        <w:br/>
+      </w:r>
+    </w:p>
+    <w:p>
+      <w:pPr>
+        <w:pStyle w:val="ListParagraph"/>
+        <w:numPr>
+          <w:ilvl w:val="0"/>
+          <w:numId w:val="7"/>
+        </w:numPr>
+        <w:rPr>
+          <w:u w:val="single"/>
+        </w:rPr>
+      </w:pPr>
+      <w:r>
+        <w:rPr>
+          <w:u w:val="single"/>
+        </w:rPr>
+        <w:t>N</w:t>
+      </w:r>
+      <w:r>
+        <w:rPr>
+          <w:u w:val="single"/>
+        </w:rPr>
+        <w:t>egative DC offset on output waveform of Integral Control</w:t>
+      </w:r>
+    </w:p>
+    <w:p>
+      <w:pPr>
+        <w:pStyle w:val="ListParagraph"/>
+      </w:pPr>
+      <w:r>
+        <w:t>An Ideal integral controller would use only</w:t>
+      </w:r>
+      <w:r>
+        <w:t xml:space="preserve"> a capacitor in the feedback loop. </w:t>
+      </w:r>
+      <w:r>
+        <w:br/>
+      </w:r>
+    </w:p>
+    <w:p>
+      <w:pPr>
+        <w:pStyle w:val="ListParagraph"/>
+      </w:pPr>
+      <w:r>
+        <w:t xml:space="preserve">For </w:t>
+      </w:r>
+      <w:r>
+        <w:t xml:space="preserve">non-ideal </w:t>
+      </w:r>
+      <w:r>
+        <w:t>case,</w:t>
+      </w:r>
+      <w:r>
+        <w:t xml:space="preserve"> small error DC voltage is produced due to minor voltage difference between inverting and non-inverting inputs,</w:t>
+      </w:r>
+      <w:r>
+        <w:t xml:space="preserve"> Capacitor acts as open circuit for DC </w:t>
+      </w:r>
+      <w:r>
+        <w:t>and gets charged. Thus, t</w:t>
+      </w:r>
+      <w:r>
+        <w:t>hese small voltages don’t have a feedback loop and hence form an open loop inverting amplifier</w:t>
+      </w:r>
+      <w:r>
+        <w:t>.</w:t>
+      </w:r>
+      <w:r>
+        <w:t xml:space="preserve"> Gain in open loop inverting amplifier is very large </w:t>
+      </w:r>
+    </w:p>
+    <w:p>
+      <w:pPr>
+        <w:pStyle w:val="ListParagraph"/>
+      </w:pPr>
+      <w:r>
+        <w:t>(around200,000) hence these small voltages are amplified to noticeable amount in output which causes the negative DC offset</w:t>
+      </w:r>
+    </w:p>
+    <w:p>
+      <w:pPr>
+        <w:pStyle w:val="ListParagraph"/>
+      </w:pPr>
+    </w:p>
+    <w:p>
+      <w:pPr>
+        <w:pStyle w:val="ListParagraph"/>
+      </w:pPr>
+      <w:r>
+        <w:t xml:space="preserve">FIX: </w:t>
+      </w:r>
+      <w:r>
+        <w:t>Attach</w:t>
+      </w:r>
+      <w:r>
+        <w:t xml:space="preserve"> a large resistor in parallel to the capacitor</w:t>
+      </w:r>
+    </w:p>
+    <w:p>
+      <w:pPr>
+        <w:pStyle w:val="ListParagraph"/>
+      </w:pPr>
+      <w:r>
+        <w:t>This creates</w:t>
+      </w:r>
+      <w:r>
+        <w:t xml:space="preserve"> a feedback loop for the small DC voltage errors, creating a closed loop inverting amplifier for them, which reduces the current gain (gain is lower in closed loop compared to open loop Gain = -Rf/Rin). Resistor is large so that AC signal doesn’t flow back from it.</w:t>
+      </w:r>
+    </w:p>
+    <w:p>
+      <w:pPr>
+        <w:pStyle w:val="ListParagraph"/>
+      </w:pPr>
+    </w:p>
+    <w:p>
+      <w:pPr>
+        <w:pStyle w:val="ListParagraph"/>
+        <w:numPr>
+          <w:ilvl w:val="0"/>
+          <w:numId w:val="7"/>
+        </w:numPr>
+        <w:rPr>
+          <w:u w:val="single"/>
+        </w:rPr>
+      </w:pPr>
+      <w:r>
+        <w:rPr>
+          <w:u w:val="single"/>
+        </w:rPr>
+        <w:t>Connecting the Derivative control caused the input signal to flatline.</w:t>
+      </w:r>
+    </w:p>
+    <w:p>
+      <w:pPr>
+        <w:pStyle w:val="ListParagraph"/>
+      </w:pPr>
+      <w:r>
+        <w:t xml:space="preserve"> At high frequency AC signals, the capacitive reactance (=1/2pifC) becomes very low, and the input capacitor behaves like a virtual short circuit </w:t>
+      </w:r>
+      <w:r>
+        <w:t xml:space="preserve">essentially </w:t>
+      </w:r>
+      <w:r>
+        <w:t>connecting the positive end of the function generator directly to the inverting input which acts as a virtual ground (stays close to 0). The negative terminal of function generator is connected to ground and the positive terminal got connected to a virtual ground (as explained above), so we essentially shorted our function generator which caused the signal it generated to collapse and caused the other controllers to show haphazard outputs.</w:t>
+      </w:r>
+    </w:p>
+    <w:p>
+      <w:pPr>
+        <w:pStyle w:val="ListParagraph"/>
+      </w:pPr>
+    </w:p>
+    <w:p>
+      <w:pPr>
+        <w:pStyle w:val="ListParagraph"/>
+      </w:pPr>
+      <w:r>
+        <w:t>FIX : attach a small resistance in series with the input capacitor.</w:t>
+      </w:r>
+    </w:p>
+    <w:p>
+      <w:pPr>
+        <w:pStyle w:val="ListParagraph"/>
+      </w:pPr>
+    </w:p>
+    <w:p>
+      <w:pPr>
+        <w:pStyle w:val="ListParagraph"/>
+      </w:pPr>
+    </w:p>
+    <w:p>
+      <w:pPr>
+        <w:pStyle w:val="ListParagraph"/>
+        <w:numPr>
+          <w:ilvl w:val="0"/>
+          <w:numId w:val="7"/>
+        </w:numPr>
+      </w:pPr>
+      <w:r>
+        <w:t xml:space="preserve">Jaggedness of surface – small errors being amplified by the differentiator </w:t>
+      </w:r>
+    </w:p>
+    <w:p>
+      <w:pPr>
+        <w:pStyle w:val="ListParagraph"/>
+        <w:numPr>
+          <w:ilvl w:val="0"/>
+          <w:numId w:val="7"/>
+        </w:numPr>
+      </w:pPr>
+      <w:r>
+        <w:t>fix how ? Increasing the input resistor reduces jaggedness</w:t>
+      </w:r>
+    </w:p>
+    <w:p>
+      <w:pPr>
+        <w:pStyle w:val="ListParagraph"/>
+        <w:numPr>
+          <w:ilvl w:val="0"/>
+          <w:numId w:val="7"/>
+        </w:numPr>
+      </w:pPr>
+      <w:r>
+        <w:t>cutoff voltage both integrator and diffrentiator</w:t>
+      </w:r>
+    </w:p>
+    <w:p/>
+    <w:p>
+      <w:r>
+        <w:br w:type="page"/>
+      </w:r>
+    </w:p>
+    <w:p>
+      <w:r>
+        <w:lastRenderedPageBreak/>
+        <w:t xml:space="preserve">The reason your input oscilloscope flatlined and the other stages went crazy is that </w:t>
+      </w:r>
+      <w:r>
+        <w:rPr>
+          <w:b/>
+          <w:bCs/>
+        </w:rPr>
+        <w:t>your Derivative (D) stage is acting as a short circuit and dragging down the entire function generator.</w:t>
+      </w:r>
+    </w:p>
+    <w:p/>
+    <w:p>
+      <w:r>
+        <w:t>Because all three stages (P, I, and D) share the same main input node, a short circuit in one stage kills the signal for all of them.</w:t>
+      </w:r>
+    </w:p>
+    <w:p>
+      <w:r>
+        <w:br/>
+      </w:r>
+    </w:p>
+    <w:p>
+      <w:pPr>
+        <w:rPr>
+          <w:b/>
+          <w:bCs/>
+        </w:rPr>
+      </w:pPr>
+      <w:r>
+        <w:rPr>
+          <w:b/>
+          <w:bCs/>
+        </w:rPr>
+        <w:t>Why the Derivative Stage Causes a Short Circuit</w:t>
+      </w:r>
+    </w:p>
+    <w:p>
+      <w:r>
+        <w:t>A textbook Derivative controller connects a capacitor directly from the input signal to Pin 2 of the op-amp.</w:t>
+      </w:r>
+    </w:p>
+    <w:p>
+      <w:r>
+        <w:br/>
+      </w:r>
+    </w:p>
+    <w:p>
+      <w:pPr>
+        <w:numPr>
+          <w:ilvl w:val="0"/>
+          <w:numId w:val="3"/>
+        </w:numPr>
+      </w:pPr>
+      <w:r>
+        <w:t xml:space="preserve">Capacitors act as a solid wall to DC, but they act like a </w:t>
+      </w:r>
+      <w:r>
+        <w:rPr>
+          <w:b/>
+          <w:bCs/>
+        </w:rPr>
+        <w:t>piece of wire (a short circuit)</w:t>
+      </w:r>
+      <w:r>
+        <w:t xml:space="preserve"> to high frequencies and sudden voltage changes (like the sharp edges of square and triangle waves).</w:t>
+      </w:r>
+    </w:p>
+    <w:p/>
+    <w:p>
+      <w:pPr>
+        <w:numPr>
+          <w:ilvl w:val="0"/>
+          <w:numId w:val="3"/>
+        </w:numPr>
+      </w:pPr>
+      <w:r>
+        <w:t>Because Pin 2 is a "virtual ground" (</w:t>
+      </w:r>
+      <m:oMath>
+        <m:r>
+          <w:rPr>
+            <w:rFonts w:ascii="Cambria Math" w:hAnsi="Cambria Math"/>
+          </w:rPr>
+          <m:t>0</m:t>
+        </m:r>
+        <m:r>
+          <m:rPr>
+            <m:nor/>
+          </m:rPr>
+          <m:t> V</m:t>
+        </m:r>
+      </m:oMath>
+      <w:r>
+        <w:t>), the high-frequency parts of your input wave pass straight through the capacitor directly into ground. This literally short-circuits your function generator, which is why your input oscilloscope flatlined.</w:t>
+      </w:r>
+    </w:p>
+    <w:p/>
+    <w:p>
+      <w:pPr>
+        <w:numPr>
+          <w:ilvl w:val="0"/>
+          <w:numId w:val="3"/>
+        </w:numPr>
+      </w:pPr>
+      <w:r>
+        <w:t>Tinkercad's simulation engine panics when this happens, resulting in the jagged edges and square pulses you see on the other scopes.</w:t>
+      </w:r>
+    </w:p>
+    <w:p/>
+    <w:p>
+      <w:pPr>
+        <w:rPr>
+          <w:b/>
+          <w:bCs/>
+        </w:rPr>
+      </w:pPr>
+      <w:r>
+        <w:rPr>
+          <w:b/>
+          <w:bCs/>
+        </w:rPr>
+        <w:t>How to Fix the D Stage (The "Practical Differentiator")</w:t>
+      </w:r>
+    </w:p>
+    <w:p>
+      <w:r>
+        <w:t>To fix this, you must add a resistor in series with the input capacitor to limit the current and stop it from shorting out the input node.</w:t>
+      </w:r>
+    </w:p>
+    <w:p/>
+    <w:p>
+      <w:r>
+        <w:rPr>
+          <w:b/>
+          <w:bCs/>
+        </w:rPr>
+        <w:t>1.Disconnect the D Stage Temporarily:</w:t>
+      </w:r>
+      <w:r>
+        <w:t>Isolate the problem.</w:t>
+      </w:r>
+    </w:p>
+    <w:p>
+      <w:r>
+        <w:t>Delete the wire connecting the main input node to your Derivative capacitor. Run the simulation. Your input wave, P stage, and I stage should instantly return to normal.</w:t>
+      </w:r>
+    </w:p>
+    <w:p>
+      <w:r>
+        <w:lastRenderedPageBreak/>
+        <w:br/>
+      </w:r>
+    </w:p>
+    <w:p>
+      <w:r>
+        <w:rPr>
+          <w:b/>
+          <w:bCs/>
+        </w:rPr>
+        <w:t>2.Add a Series Resistor to the Input:</w:t>
+      </w:r>
+      <w:r>
+        <w:t>Limit the high-frequency current.</w:t>
+      </w:r>
+    </w:p>
+    <w:p>
+      <w:r>
+        <w:t xml:space="preserve">Place a </w:t>
+      </w:r>
+      <m:oMath>
+        <m:r>
+          <w:rPr>
+            <w:rFonts w:ascii="Cambria Math" w:hAnsi="Cambria Math"/>
+          </w:rPr>
+          <m:t>1</m:t>
+        </m:r>
+        <m:r>
+          <m:rPr>
+            <m:nor/>
+          </m:rPr>
+          <m:t> k</m:t>
+        </m:r>
+        <m:r>
+          <m:rPr>
+            <m:sty m:val="p"/>
+          </m:rPr>
+          <w:rPr>
+            <w:rFonts w:ascii="Cambria Math" w:hAnsi="Cambria Math"/>
+          </w:rPr>
+          <m:t>Ω</m:t>
+        </m:r>
+      </m:oMath>
+      <w:r>
+        <w:rPr>
+          <w:b/>
+          <w:bCs/>
+        </w:rPr>
+        <w:t xml:space="preserve"> resistor</w:t>
+      </w:r>
+      <w:r>
+        <w:t xml:space="preserve"> directly in series with your D-stage input capacitor.</w:t>
+      </w:r>
+    </w:p>
+    <w:p>
+      <w:r>
+        <w:br/>
+      </w:r>
+    </w:p>
+    <w:p>
+      <w:pPr>
+        <w:numPr>
+          <w:ilvl w:val="0"/>
+          <w:numId w:val="4"/>
+        </w:numPr>
+      </w:pPr>
+      <w:r>
+        <w:t xml:space="preserve">The path should be: </w:t>
+      </w:r>
+      <w:r>
+        <w:rPr>
+          <w:b/>
+          <w:bCs/>
+        </w:rPr>
+        <w:t>Main Input Node</w:t>
+      </w:r>
+      <w:r>
+        <w:t xml:space="preserve"> </w:t>
+      </w:r>
+      <m:oMath>
+        <m:r>
+          <w:rPr>
+            <w:rFonts w:ascii="Cambria Math" w:hAnsi="Cambria Math"/>
+          </w:rPr>
+          <m:t>→</m:t>
+        </m:r>
+      </m:oMath>
+      <w:r>
+        <w:t xml:space="preserve"> </w:t>
+      </w:r>
+      <m:oMath>
+        <m:r>
+          <w:rPr>
+            <w:rFonts w:ascii="Cambria Math" w:hAnsi="Cambria Math"/>
+          </w:rPr>
+          <m:t>100</m:t>
+        </m:r>
+        <m:r>
+          <m:rPr>
+            <m:nor/>
+          </m:rPr>
+          <m:t> nF</m:t>
+        </m:r>
+      </m:oMath>
+      <w:r>
+        <w:rPr>
+          <w:b/>
+          <w:bCs/>
+        </w:rPr>
+        <w:t xml:space="preserve"> Capacitor</w:t>
+      </w:r>
+      <w:r>
+        <w:t xml:space="preserve"> </w:t>
+      </w:r>
+      <m:oMath>
+        <m:r>
+          <w:rPr>
+            <w:rFonts w:ascii="Cambria Math" w:hAnsi="Cambria Math"/>
+          </w:rPr>
+          <m:t>→</m:t>
+        </m:r>
+      </m:oMath>
+      <w:r>
+        <w:t xml:space="preserve"> </w:t>
+      </w:r>
+      <m:oMath>
+        <m:r>
+          <w:rPr>
+            <w:rFonts w:ascii="Cambria Math" w:hAnsi="Cambria Math"/>
+          </w:rPr>
+          <m:t>1</m:t>
+        </m:r>
+        <m:r>
+          <m:rPr>
+            <m:nor/>
+          </m:rPr>
+          <m:t> k</m:t>
+        </m:r>
+        <m:r>
+          <m:rPr>
+            <m:sty m:val="p"/>
+          </m:rPr>
+          <w:rPr>
+            <w:rFonts w:ascii="Cambria Math" w:hAnsi="Cambria Math"/>
+          </w:rPr>
+          <m:t>Ω</m:t>
+        </m:r>
+      </m:oMath>
+      <w:r>
+        <w:rPr>
+          <w:b/>
+          <w:bCs/>
+        </w:rPr>
+        <w:t xml:space="preserve"> Resistor</w:t>
+      </w:r>
+      <w:r>
+        <w:t xml:space="preserve"> </w:t>
+      </w:r>
+      <m:oMath>
+        <m:r>
+          <w:rPr>
+            <w:rFonts w:ascii="Cambria Math" w:hAnsi="Cambria Math"/>
+          </w:rPr>
+          <m:t>→</m:t>
+        </m:r>
+      </m:oMath>
+      <w:r>
+        <w:t xml:space="preserve"> </w:t>
+      </w:r>
+      <w:r>
+        <w:rPr>
+          <w:b/>
+          <w:bCs/>
+        </w:rPr>
+        <w:t>Pin 2 of the D Op-Amp</w:t>
+      </w:r>
+      <w:r>
+        <w:t>.</w:t>
+      </w:r>
+    </w:p>
+    <w:p>
+      <w:r>
+        <w:br/>
+      </w:r>
+    </w:p>
+    <w:p>
+      <w:pPr>
+        <w:numPr>
+          <w:ilvl w:val="0"/>
+          <w:numId w:val="4"/>
+        </w:numPr>
+      </w:pPr>
+      <w:r>
+        <w:t>This stops the capacitor from acting like a 0-ohm wire during fast voltage changes, saving your input signal.</w:t>
+      </w:r>
+    </w:p>
+    <w:p>
+      <w:r>
+        <w:br/>
+      </w:r>
+    </w:p>
+    <w:p>
+      <w:r>
+        <w:rPr>
+          <w:b/>
+          <w:bCs/>
+        </w:rPr>
+        <w:t>3.Verify the Feedback Resistor:</w:t>
+      </w:r>
+      <w:r>
+        <w:t>Check the feedback loop.</w:t>
+      </w:r>
+    </w:p>
+    <w:p>
+      <w:r>
+        <w:t xml:space="preserve">Ensure you have a </w:t>
+      </w:r>
+      <m:oMath>
+        <m:r>
+          <w:rPr>
+            <w:rFonts w:ascii="Cambria Math" w:hAnsi="Cambria Math"/>
+          </w:rPr>
+          <m:t>10</m:t>
+        </m:r>
+        <m:r>
+          <m:rPr>
+            <m:nor/>
+          </m:rPr>
+          <m:t> k</m:t>
+        </m:r>
+        <m:r>
+          <m:rPr>
+            <m:sty m:val="p"/>
+          </m:rPr>
+          <w:rPr>
+            <w:rFonts w:ascii="Cambria Math" w:hAnsi="Cambria Math"/>
+          </w:rPr>
+          <m:t>Ω</m:t>
+        </m:r>
+      </m:oMath>
+      <w:r>
+        <w:rPr>
+          <w:b/>
+          <w:bCs/>
+        </w:rPr>
+        <w:t xml:space="preserve"> resistor</w:t>
+      </w:r>
+      <w:r>
+        <w:t xml:space="preserve"> connected between </w:t>
+      </w:r>
+      <w:r>
+        <w:rPr>
+          <w:b/>
+          <w:bCs/>
+        </w:rPr>
+        <w:t>Pin 2</w:t>
+      </w:r>
+      <w:r>
+        <w:t xml:space="preserve"> and </w:t>
+      </w:r>
+      <w:r>
+        <w:rPr>
+          <w:b/>
+          <w:bCs/>
+        </w:rPr>
+        <w:t>Pin 6</w:t>
+      </w:r>
+      <w:r>
+        <w:t xml:space="preserve"> of the Derivative Op-Amp. Without this, the op-amp will run at infinite gain and saturate immediately into a square wave.</w:t>
+      </w:r>
+    </w:p>
+    <w:p>
+      <w:r>
+        <w:br/>
+      </w:r>
+    </w:p>
+    <w:p>
+      <w:r>
+        <w:rPr>
+          <w:b/>
+          <w:bCs/>
+        </w:rPr>
+        <w:t>4.Check Pin 3:</w:t>
+      </w:r>
+      <w:r>
+        <w:t>Keep it grounded.</w:t>
+      </w:r>
+    </w:p>
+    <w:p>
+      <w:r>
+        <w:t xml:space="preserve">Just like the other stages, make sure </w:t>
+      </w:r>
+      <w:r>
+        <w:rPr>
+          <w:b/>
+          <w:bCs/>
+        </w:rPr>
+        <w:t>Pin 3</w:t>
+      </w:r>
+      <w:r>
+        <w:t xml:space="preserve"> of the D Op-Amp is securely connected to your System Ground.</w:t>
+      </w:r>
+    </w:p>
+    <w:p>
+      <w:r>
+        <w:br/>
+      </w:r>
+    </w:p>
+    <w:p>
+      <w:r>
+        <w:t xml:space="preserve">Once you add that </w:t>
+      </w:r>
+      <m:oMath>
+        <m:r>
+          <w:rPr>
+            <w:rFonts w:ascii="Cambria Math" w:hAnsi="Cambria Math"/>
+          </w:rPr>
+          <m:t>1</m:t>
+        </m:r>
+        <m:r>
+          <m:rPr>
+            <m:nor/>
+          </m:rPr>
+          <m:t> k</m:t>
+        </m:r>
+        <m:r>
+          <m:rPr>
+            <m:sty m:val="p"/>
+          </m:rPr>
+          <w:rPr>
+            <w:rFonts w:ascii="Cambria Math" w:hAnsi="Cambria Math"/>
+          </w:rPr>
+          <m:t>Ω</m:t>
+        </m:r>
+      </m:oMath>
+      <w:r>
+        <w:t xml:space="preserve"> series resistor, the simulation will stabilize, the input wave will return, and the Derivative scope will show the proper mathematical derivative (e.g., a triangle wave input will turn into a square wave output).</w:t>
+      </w:r>
+    </w:p>
+    <w:p/>
+    <w:p/>
+    <w:p/>
+    <w:p/>
+    <w:p>
+      <w:pPr>
+        <w:pStyle w:val="ListParagraph"/>
+      </w:pPr>
+    </w:p>
+    <w:p>
+      <w:pPr>
+        <w:pStyle w:val="ListParagraph"/>
+      </w:pPr>
+      <w:r>
+        <w:t xml:space="preserve"> </w:t>
+      </w:r>
+    </w:p>
+    <w:p/>
+    <w:p/>
+    <w:p/>
     <w:p/>
     <w:sectPr>
       <w:pgSz w:w="11906" w:h="16838"/>
@@ -11,6 +1447,1775 @@
     </w:sectPr>
   </w:body>
 </w:document>
+</file>
+
+<file path=word/numbering.xml><?xml version="1.0" encoding="utf-8"?>
+<w:numbering xmlns:wpc="http://schemas.microsoft.com/office/word/2010/wordprocessingCanvas" xmlns:cx="http://schemas.microsoft.com/office/drawing/2014/chartex" xmlns:cx1="http://schemas.microsoft.com/office/drawing/2015/9/8/chartex" xmlns:cx2="http://schemas.microsoft.com/office/drawing/2015/10/21/chartex" xmlns:cx3="http://schemas.microsoft.com/office/drawing/2016/5/9/chartex" xmlns:cx4="http://schemas.microsoft.com/office/drawing/2016/5/10/chartex" xmlns:cx5="http://schemas.microsoft.com/office/drawing/2016/5/11/chartex" xmlns:cx6="http://schemas.microsoft.com/office/drawing/2016/5/12/chartex" xmlns:cx7="http://schemas.microsoft.com/office/drawing/2016/5/13/chartex" xmlns:cx8="http://schemas.microsoft.com/office/drawing/2016/5/14/chartex" xmlns:mc="http://schemas.openxmlformats.org/markup-compatibility/2006" xmlns:aink="http://schemas.microsoft.com/office/drawing/2016/ink" xmlns:am3d="http://schemas.microsoft.com/office/drawing/2017/model3d" xmlns:o="urn:schemas-microsoft-com:office:office" xmlns:oel="http://schemas.microsoft.com/office/2019/extlst" xmlns:r="http://schemas.openxmlformats.org/officeDocument/2006/relationships" xmlns:m="http://schemas.openxmlformats.org/officeDocument/2006/math" xmlns:v="urn:schemas-microsoft-com:vml" xmlns:wp14="http://schemas.microsoft.com/office/word/2010/wordprocessingDrawing" xmlns:wp="http://schemas.openxmlformats.org/drawingml/2006/wordprocessingDrawing" xmlns:w10="urn:schemas-microsoft-com:office:word" xmlns:w="http://schemas.openxmlformats.org/wordprocessingml/2006/main" xmlns:w14="http://schemas.microsoft.com/office/word/2010/wordml" xmlns:w15="http://schemas.microsoft.com/office/word/2012/wordml" xmlns:w16cei="http://schemas.microsoft.com/office/word/2026/wordml/cei" xmlns:w16cex="http://schemas.microsoft.com/office/word/2018/wordml/cex" xmlns:w16cid="http://schemas.microsoft.com/office/word/2016/wordml/cid" xmlns:w16="http://schemas.microsoft.com/office/word/2018/wordml" xmlns:w16du="http://schemas.microsoft.com/office/word/2023/wordml/word16du" xmlns:w16sdtdh="http://schemas.microsoft.com/office/word/2020/wordml/sdtdatahash" xmlns:w16sdtfl="http://schemas.microsoft.com/office/word/2024/wordml/sdtformatlock" xmlns:w16se="http://schemas.microsoft.com/office/word/2015/wordml/symex" xmlns:wpg="http://schemas.microsoft.com/office/word/2010/wordprocessingGroup" xmlns:wpi="http://schemas.microsoft.com/office/word/2010/wordprocessingInk" xmlns:wne="http://schemas.microsoft.com/office/word/2006/wordml" xmlns:wps="http://schemas.microsoft.com/office/word/2010/wordprocessingShape" mc:Ignorable="w14 w15 w16se w16cid w16 w16cex w16sdtdh w16sdtfl w16du wp14">
+  <w:abstractNum w:abstractNumId="0" w15:restartNumberingAfterBreak="0">
+    <w:nsid w:val="0A3A157F"/>
+    <w:multiLevelType w:val="multilevel"/>
+    <w:tmpl w:val="B3F673C6"/>
+    <w:lvl w:ilvl="0">
+      <w:start w:val="1"/>
+      <w:numFmt w:val="bullet"/>
+      <w:lvlText w:val=""/>
+      <w:lvlJc w:val="left"/>
+      <w:pPr>
+        <w:tabs>
+          <w:tab w:val="num" w:pos="720"/>
+        </w:tabs>
+        <w:ind w:left="720" w:hanging="360"/>
+      </w:pPr>
+      <w:rPr>
+        <w:rFonts w:ascii="Symbol" w:hAnsi="Symbol" w:hint="default"/>
+        <w:sz w:val="20"/>
+      </w:rPr>
+    </w:lvl>
+    <w:lvl w:ilvl="1" w:tentative="1">
+      <w:start w:val="1"/>
+      <w:numFmt w:val="bullet"/>
+      <w:lvlText w:val="o"/>
+      <w:lvlJc w:val="left"/>
+      <w:pPr>
+        <w:tabs>
+          <w:tab w:val="num" w:pos="1440"/>
+        </w:tabs>
+        <w:ind w:left="1440" w:hanging="360"/>
+      </w:pPr>
+      <w:rPr>
+        <w:rFonts w:ascii="Courier New" w:hAnsi="Courier New" w:hint="default"/>
+        <w:sz w:val="20"/>
+      </w:rPr>
+    </w:lvl>
+    <w:lvl w:ilvl="2" w:tentative="1">
+      <w:start w:val="1"/>
+      <w:numFmt w:val="bullet"/>
+      <w:lvlText w:val=""/>
+      <w:lvlJc w:val="left"/>
+      <w:pPr>
+        <w:tabs>
+          <w:tab w:val="num" w:pos="2160"/>
+        </w:tabs>
+        <w:ind w:left="2160" w:hanging="360"/>
+      </w:pPr>
+      <w:rPr>
+        <w:rFonts w:ascii="Wingdings" w:hAnsi="Wingdings" w:hint="default"/>
+        <w:sz w:val="20"/>
+      </w:rPr>
+    </w:lvl>
+    <w:lvl w:ilvl="3" w:tentative="1">
+      <w:start w:val="1"/>
+      <w:numFmt w:val="bullet"/>
+      <w:lvlText w:val=""/>
+      <w:lvlJc w:val="left"/>
+      <w:pPr>
+        <w:tabs>
+          <w:tab w:val="num" w:pos="2880"/>
+        </w:tabs>
+        <w:ind w:left="2880" w:hanging="360"/>
+      </w:pPr>
+      <w:rPr>
+        <w:rFonts w:ascii="Wingdings" w:hAnsi="Wingdings" w:hint="default"/>
+        <w:sz w:val="20"/>
+      </w:rPr>
+    </w:lvl>
+    <w:lvl w:ilvl="4" w:tentative="1">
+      <w:start w:val="1"/>
+      <w:numFmt w:val="bullet"/>
+      <w:lvlText w:val=""/>
+      <w:lvlJc w:val="left"/>
+      <w:pPr>
+        <w:tabs>
+          <w:tab w:val="num" w:pos="3600"/>
+        </w:tabs>
+        <w:ind w:left="3600" w:hanging="360"/>
+      </w:pPr>
+      <w:rPr>
+        <w:rFonts w:ascii="Wingdings" w:hAnsi="Wingdings" w:hint="default"/>
+        <w:sz w:val="20"/>
+      </w:rPr>
+    </w:lvl>
+    <w:lvl w:ilvl="5" w:tentative="1">
+      <w:start w:val="1"/>
+      <w:numFmt w:val="bullet"/>
+      <w:lvlText w:val=""/>
+      <w:lvlJc w:val="left"/>
+      <w:pPr>
+        <w:tabs>
+          <w:tab w:val="num" w:pos="4320"/>
+        </w:tabs>
+        <w:ind w:left="4320" w:hanging="360"/>
+      </w:pPr>
+      <w:rPr>
+        <w:rFonts w:ascii="Wingdings" w:hAnsi="Wingdings" w:hint="default"/>
+        <w:sz w:val="20"/>
+      </w:rPr>
+    </w:lvl>
+    <w:lvl w:ilvl="6" w:tentative="1">
+      <w:start w:val="1"/>
+      <w:numFmt w:val="bullet"/>
+      <w:lvlText w:val=""/>
+      <w:lvlJc w:val="left"/>
+      <w:pPr>
+        <w:tabs>
+          <w:tab w:val="num" w:pos="5040"/>
+        </w:tabs>
+        <w:ind w:left="5040" w:hanging="360"/>
+      </w:pPr>
+      <w:rPr>
+        <w:rFonts w:ascii="Wingdings" w:hAnsi="Wingdings" w:hint="default"/>
+        <w:sz w:val="20"/>
+      </w:rPr>
+    </w:lvl>
+    <w:lvl w:ilvl="7" w:tentative="1">
+      <w:start w:val="1"/>
+      <w:numFmt w:val="bullet"/>
+      <w:lvlText w:val=""/>
+      <w:lvlJc w:val="left"/>
+      <w:pPr>
+        <w:tabs>
+          <w:tab w:val="num" w:pos="5760"/>
+        </w:tabs>
+        <w:ind w:left="5760" w:hanging="360"/>
+      </w:pPr>
+      <w:rPr>
+        <w:rFonts w:ascii="Wingdings" w:hAnsi="Wingdings" w:hint="default"/>
+        <w:sz w:val="20"/>
+      </w:rPr>
+    </w:lvl>
+    <w:lvl w:ilvl="8" w:tentative="1">
+      <w:start w:val="1"/>
+      <w:numFmt w:val="bullet"/>
+      <w:lvlText w:val=""/>
+      <w:lvlJc w:val="left"/>
+      <w:pPr>
+        <w:tabs>
+          <w:tab w:val="num" w:pos="6480"/>
+        </w:tabs>
+        <w:ind w:left="6480" w:hanging="360"/>
+      </w:pPr>
+      <w:rPr>
+        <w:rFonts w:ascii="Wingdings" w:hAnsi="Wingdings" w:hint="default"/>
+        <w:sz w:val="20"/>
+      </w:rPr>
+    </w:lvl>
+  </w:abstractNum>
+  <w:abstractNum w:abstractNumId="1" w15:restartNumberingAfterBreak="0">
+    <w:nsid w:val="15D3617C"/>
+    <w:multiLevelType w:val="multilevel"/>
+    <w:tmpl w:val="3BAA4C4C"/>
+    <w:lvl w:ilvl="0">
+      <w:start w:val="1"/>
+      <w:numFmt w:val="bullet"/>
+      <w:lvlText w:val=""/>
+      <w:lvlJc w:val="left"/>
+      <w:pPr>
+        <w:tabs>
+          <w:tab w:val="num" w:pos="720"/>
+        </w:tabs>
+        <w:ind w:left="720" w:hanging="360"/>
+      </w:pPr>
+      <w:rPr>
+        <w:rFonts w:ascii="Symbol" w:hAnsi="Symbol" w:hint="default"/>
+        <w:sz w:val="20"/>
+      </w:rPr>
+    </w:lvl>
+    <w:lvl w:ilvl="1" w:tentative="1">
+      <w:start w:val="1"/>
+      <w:numFmt w:val="bullet"/>
+      <w:lvlText w:val="o"/>
+      <w:lvlJc w:val="left"/>
+      <w:pPr>
+        <w:tabs>
+          <w:tab w:val="num" w:pos="1440"/>
+        </w:tabs>
+        <w:ind w:left="1440" w:hanging="360"/>
+      </w:pPr>
+      <w:rPr>
+        <w:rFonts w:ascii="Courier New" w:hAnsi="Courier New" w:hint="default"/>
+        <w:sz w:val="20"/>
+      </w:rPr>
+    </w:lvl>
+    <w:lvl w:ilvl="2" w:tentative="1">
+      <w:start w:val="1"/>
+      <w:numFmt w:val="bullet"/>
+      <w:lvlText w:val=""/>
+      <w:lvlJc w:val="left"/>
+      <w:pPr>
+        <w:tabs>
+          <w:tab w:val="num" w:pos="2160"/>
+        </w:tabs>
+        <w:ind w:left="2160" w:hanging="360"/>
+      </w:pPr>
+      <w:rPr>
+        <w:rFonts w:ascii="Wingdings" w:hAnsi="Wingdings" w:hint="default"/>
+        <w:sz w:val="20"/>
+      </w:rPr>
+    </w:lvl>
+    <w:lvl w:ilvl="3" w:tentative="1">
+      <w:start w:val="1"/>
+      <w:numFmt w:val="bullet"/>
+      <w:lvlText w:val=""/>
+      <w:lvlJc w:val="left"/>
+      <w:pPr>
+        <w:tabs>
+          <w:tab w:val="num" w:pos="2880"/>
+        </w:tabs>
+        <w:ind w:left="2880" w:hanging="360"/>
+      </w:pPr>
+      <w:rPr>
+        <w:rFonts w:ascii="Wingdings" w:hAnsi="Wingdings" w:hint="default"/>
+        <w:sz w:val="20"/>
+      </w:rPr>
+    </w:lvl>
+    <w:lvl w:ilvl="4" w:tentative="1">
+      <w:start w:val="1"/>
+      <w:numFmt w:val="bullet"/>
+      <w:lvlText w:val=""/>
+      <w:lvlJc w:val="left"/>
+      <w:pPr>
+        <w:tabs>
+          <w:tab w:val="num" w:pos="3600"/>
+        </w:tabs>
+        <w:ind w:left="3600" w:hanging="360"/>
+      </w:pPr>
+      <w:rPr>
+        <w:rFonts w:ascii="Wingdings" w:hAnsi="Wingdings" w:hint="default"/>
+        <w:sz w:val="20"/>
+      </w:rPr>
+    </w:lvl>
+    <w:lvl w:ilvl="5" w:tentative="1">
+      <w:start w:val="1"/>
+      <w:numFmt w:val="bullet"/>
+      <w:lvlText w:val=""/>
+      <w:lvlJc w:val="left"/>
+      <w:pPr>
+        <w:tabs>
+          <w:tab w:val="num" w:pos="4320"/>
+        </w:tabs>
+        <w:ind w:left="4320" w:hanging="360"/>
+      </w:pPr>
+      <w:rPr>
+        <w:rFonts w:ascii="Wingdings" w:hAnsi="Wingdings" w:hint="default"/>
+        <w:sz w:val="20"/>
+      </w:rPr>
+    </w:lvl>
+    <w:lvl w:ilvl="6" w:tentative="1">
+      <w:start w:val="1"/>
+      <w:numFmt w:val="bullet"/>
+      <w:lvlText w:val=""/>
+      <w:lvlJc w:val="left"/>
+      <w:pPr>
+        <w:tabs>
+          <w:tab w:val="num" w:pos="5040"/>
+        </w:tabs>
+        <w:ind w:left="5040" w:hanging="360"/>
+      </w:pPr>
+      <w:rPr>
+        <w:rFonts w:ascii="Wingdings" w:hAnsi="Wingdings" w:hint="default"/>
+        <w:sz w:val="20"/>
+      </w:rPr>
+    </w:lvl>
+    <w:lvl w:ilvl="7" w:tentative="1">
+      <w:start w:val="1"/>
+      <w:numFmt w:val="bullet"/>
+      <w:lvlText w:val=""/>
+      <w:lvlJc w:val="left"/>
+      <w:pPr>
+        <w:tabs>
+          <w:tab w:val="num" w:pos="5760"/>
+        </w:tabs>
+        <w:ind w:left="5760" w:hanging="360"/>
+      </w:pPr>
+      <w:rPr>
+        <w:rFonts w:ascii="Wingdings" w:hAnsi="Wingdings" w:hint="default"/>
+        <w:sz w:val="20"/>
+      </w:rPr>
+    </w:lvl>
+    <w:lvl w:ilvl="8" w:tentative="1">
+      <w:start w:val="1"/>
+      <w:numFmt w:val="bullet"/>
+      <w:lvlText w:val=""/>
+      <w:lvlJc w:val="left"/>
+      <w:pPr>
+        <w:tabs>
+          <w:tab w:val="num" w:pos="6480"/>
+        </w:tabs>
+        <w:ind w:left="6480" w:hanging="360"/>
+      </w:pPr>
+      <w:rPr>
+        <w:rFonts w:ascii="Wingdings" w:hAnsi="Wingdings" w:hint="default"/>
+        <w:sz w:val="20"/>
+      </w:rPr>
+    </w:lvl>
+  </w:abstractNum>
+  <w:abstractNum w:abstractNumId="2" w15:restartNumberingAfterBreak="0">
+    <w:nsid w:val="1AF97D5D"/>
+    <w:multiLevelType w:val="multilevel"/>
+    <w:tmpl w:val="79CAB076"/>
+    <w:lvl w:ilvl="0">
+      <w:start w:val="1"/>
+      <w:numFmt w:val="bullet"/>
+      <w:lvlText w:val=""/>
+      <w:lvlJc w:val="left"/>
+      <w:pPr>
+        <w:tabs>
+          <w:tab w:val="num" w:pos="720"/>
+        </w:tabs>
+        <w:ind w:left="720" w:hanging="360"/>
+      </w:pPr>
+      <w:rPr>
+        <w:rFonts w:ascii="Symbol" w:hAnsi="Symbol" w:hint="default"/>
+        <w:sz w:val="20"/>
+      </w:rPr>
+    </w:lvl>
+    <w:lvl w:ilvl="1" w:tentative="1">
+      <w:start w:val="1"/>
+      <w:numFmt w:val="bullet"/>
+      <w:lvlText w:val="o"/>
+      <w:lvlJc w:val="left"/>
+      <w:pPr>
+        <w:tabs>
+          <w:tab w:val="num" w:pos="1440"/>
+        </w:tabs>
+        <w:ind w:left="1440" w:hanging="360"/>
+      </w:pPr>
+      <w:rPr>
+        <w:rFonts w:ascii="Courier New" w:hAnsi="Courier New" w:hint="default"/>
+        <w:sz w:val="20"/>
+      </w:rPr>
+    </w:lvl>
+    <w:lvl w:ilvl="2" w:tentative="1">
+      <w:start w:val="1"/>
+      <w:numFmt w:val="bullet"/>
+      <w:lvlText w:val=""/>
+      <w:lvlJc w:val="left"/>
+      <w:pPr>
+        <w:tabs>
+          <w:tab w:val="num" w:pos="2160"/>
+        </w:tabs>
+        <w:ind w:left="2160" w:hanging="360"/>
+      </w:pPr>
+      <w:rPr>
+        <w:rFonts w:ascii="Wingdings" w:hAnsi="Wingdings" w:hint="default"/>
+        <w:sz w:val="20"/>
+      </w:rPr>
+    </w:lvl>
+    <w:lvl w:ilvl="3" w:tentative="1">
+      <w:start w:val="1"/>
+      <w:numFmt w:val="bullet"/>
+      <w:lvlText w:val=""/>
+      <w:lvlJc w:val="left"/>
+      <w:pPr>
+        <w:tabs>
+          <w:tab w:val="num" w:pos="2880"/>
+        </w:tabs>
+        <w:ind w:left="2880" w:hanging="360"/>
+      </w:pPr>
+      <w:rPr>
+        <w:rFonts w:ascii="Wingdings" w:hAnsi="Wingdings" w:hint="default"/>
+        <w:sz w:val="20"/>
+      </w:rPr>
+    </w:lvl>
+    <w:lvl w:ilvl="4" w:tentative="1">
+      <w:start w:val="1"/>
+      <w:numFmt w:val="bullet"/>
+      <w:lvlText w:val=""/>
+      <w:lvlJc w:val="left"/>
+      <w:pPr>
+        <w:tabs>
+          <w:tab w:val="num" w:pos="3600"/>
+        </w:tabs>
+        <w:ind w:left="3600" w:hanging="360"/>
+      </w:pPr>
+      <w:rPr>
+        <w:rFonts w:ascii="Wingdings" w:hAnsi="Wingdings" w:hint="default"/>
+        <w:sz w:val="20"/>
+      </w:rPr>
+    </w:lvl>
+    <w:lvl w:ilvl="5" w:tentative="1">
+      <w:start w:val="1"/>
+      <w:numFmt w:val="bullet"/>
+      <w:lvlText w:val=""/>
+      <w:lvlJc w:val="left"/>
+      <w:pPr>
+        <w:tabs>
+          <w:tab w:val="num" w:pos="4320"/>
+        </w:tabs>
+        <w:ind w:left="4320" w:hanging="360"/>
+      </w:pPr>
+      <w:rPr>
+        <w:rFonts w:ascii="Wingdings" w:hAnsi="Wingdings" w:hint="default"/>
+        <w:sz w:val="20"/>
+      </w:rPr>
+    </w:lvl>
+    <w:lvl w:ilvl="6" w:tentative="1">
+      <w:start w:val="1"/>
+      <w:numFmt w:val="bullet"/>
+      <w:lvlText w:val=""/>
+      <w:lvlJc w:val="left"/>
+      <w:pPr>
+        <w:tabs>
+          <w:tab w:val="num" w:pos="5040"/>
+        </w:tabs>
+        <w:ind w:left="5040" w:hanging="360"/>
+      </w:pPr>
+      <w:rPr>
+        <w:rFonts w:ascii="Wingdings" w:hAnsi="Wingdings" w:hint="default"/>
+        <w:sz w:val="20"/>
+      </w:rPr>
+    </w:lvl>
+    <w:lvl w:ilvl="7" w:tentative="1">
+      <w:start w:val="1"/>
+      <w:numFmt w:val="bullet"/>
+      <w:lvlText w:val=""/>
+      <w:lvlJc w:val="left"/>
+      <w:pPr>
+        <w:tabs>
+          <w:tab w:val="num" w:pos="5760"/>
+        </w:tabs>
+        <w:ind w:left="5760" w:hanging="360"/>
+      </w:pPr>
+      <w:rPr>
+        <w:rFonts w:ascii="Wingdings" w:hAnsi="Wingdings" w:hint="default"/>
+        <w:sz w:val="20"/>
+      </w:rPr>
+    </w:lvl>
+    <w:lvl w:ilvl="8" w:tentative="1">
+      <w:start w:val="1"/>
+      <w:numFmt w:val="bullet"/>
+      <w:lvlText w:val=""/>
+      <w:lvlJc w:val="left"/>
+      <w:pPr>
+        <w:tabs>
+          <w:tab w:val="num" w:pos="6480"/>
+        </w:tabs>
+        <w:ind w:left="6480" w:hanging="360"/>
+      </w:pPr>
+      <w:rPr>
+        <w:rFonts w:ascii="Wingdings" w:hAnsi="Wingdings" w:hint="default"/>
+        <w:sz w:val="20"/>
+      </w:rPr>
+    </w:lvl>
+  </w:abstractNum>
+  <w:abstractNum w:abstractNumId="3" w15:restartNumberingAfterBreak="0">
+    <w:nsid w:val="21E62F53"/>
+    <w:multiLevelType w:val="hybridMultilevel"/>
+    <w:tmpl w:val="A4587256"/>
+    <w:lvl w:ilvl="0" w:tplc="40090001">
+      <w:start w:val="1"/>
+      <w:numFmt w:val="bullet"/>
+      <w:lvlText w:val=""/>
+      <w:lvlJc w:val="left"/>
+      <w:pPr>
+        <w:ind w:left="720" w:hanging="360"/>
+      </w:pPr>
+      <w:rPr>
+        <w:rFonts w:ascii="Symbol" w:hAnsi="Symbol" w:hint="default"/>
+      </w:rPr>
+    </w:lvl>
+    <w:lvl w:ilvl="1" w:tplc="40090003" w:tentative="1">
+      <w:start w:val="1"/>
+      <w:numFmt w:val="bullet"/>
+      <w:lvlText w:val="o"/>
+      <w:lvlJc w:val="left"/>
+      <w:pPr>
+        <w:ind w:left="1440" w:hanging="360"/>
+      </w:pPr>
+      <w:rPr>
+        <w:rFonts w:ascii="Courier New" w:hAnsi="Courier New" w:cs="Courier New" w:hint="default"/>
+      </w:rPr>
+    </w:lvl>
+    <w:lvl w:ilvl="2" w:tplc="40090005" w:tentative="1">
+      <w:start w:val="1"/>
+      <w:numFmt w:val="bullet"/>
+      <w:lvlText w:val=""/>
+      <w:lvlJc w:val="left"/>
+      <w:pPr>
+        <w:ind w:left="2160" w:hanging="360"/>
+      </w:pPr>
+      <w:rPr>
+        <w:rFonts w:ascii="Wingdings" w:hAnsi="Wingdings" w:hint="default"/>
+      </w:rPr>
+    </w:lvl>
+    <w:lvl w:ilvl="3" w:tplc="40090001" w:tentative="1">
+      <w:start w:val="1"/>
+      <w:numFmt w:val="bullet"/>
+      <w:lvlText w:val=""/>
+      <w:lvlJc w:val="left"/>
+      <w:pPr>
+        <w:ind w:left="2880" w:hanging="360"/>
+      </w:pPr>
+      <w:rPr>
+        <w:rFonts w:ascii="Symbol" w:hAnsi="Symbol" w:hint="default"/>
+      </w:rPr>
+    </w:lvl>
+    <w:lvl w:ilvl="4" w:tplc="40090003" w:tentative="1">
+      <w:start w:val="1"/>
+      <w:numFmt w:val="bullet"/>
+      <w:lvlText w:val="o"/>
+      <w:lvlJc w:val="left"/>
+      <w:pPr>
+        <w:ind w:left="3600" w:hanging="360"/>
+      </w:pPr>
+      <w:rPr>
+        <w:rFonts w:ascii="Courier New" w:hAnsi="Courier New" w:cs="Courier New" w:hint="default"/>
+      </w:rPr>
+    </w:lvl>
+    <w:lvl w:ilvl="5" w:tplc="40090005" w:tentative="1">
+      <w:start w:val="1"/>
+      <w:numFmt w:val="bullet"/>
+      <w:lvlText w:val=""/>
+      <w:lvlJc w:val="left"/>
+      <w:pPr>
+        <w:ind w:left="4320" w:hanging="360"/>
+      </w:pPr>
+      <w:rPr>
+        <w:rFonts w:ascii="Wingdings" w:hAnsi="Wingdings" w:hint="default"/>
+      </w:rPr>
+    </w:lvl>
+    <w:lvl w:ilvl="6" w:tplc="40090001" w:tentative="1">
+      <w:start w:val="1"/>
+      <w:numFmt w:val="bullet"/>
+      <w:lvlText w:val=""/>
+      <w:lvlJc w:val="left"/>
+      <w:pPr>
+        <w:ind w:left="5040" w:hanging="360"/>
+      </w:pPr>
+      <w:rPr>
+        <w:rFonts w:ascii="Symbol" w:hAnsi="Symbol" w:hint="default"/>
+      </w:rPr>
+    </w:lvl>
+    <w:lvl w:ilvl="7" w:tplc="40090003" w:tentative="1">
+      <w:start w:val="1"/>
+      <w:numFmt w:val="bullet"/>
+      <w:lvlText w:val="o"/>
+      <w:lvlJc w:val="left"/>
+      <w:pPr>
+        <w:ind w:left="5760" w:hanging="360"/>
+      </w:pPr>
+      <w:rPr>
+        <w:rFonts w:ascii="Courier New" w:hAnsi="Courier New" w:cs="Courier New" w:hint="default"/>
+      </w:rPr>
+    </w:lvl>
+    <w:lvl w:ilvl="8" w:tplc="40090005" w:tentative="1">
+      <w:start w:val="1"/>
+      <w:numFmt w:val="bullet"/>
+      <w:lvlText w:val=""/>
+      <w:lvlJc w:val="left"/>
+      <w:pPr>
+        <w:ind w:left="6480" w:hanging="360"/>
+      </w:pPr>
+      <w:rPr>
+        <w:rFonts w:ascii="Wingdings" w:hAnsi="Wingdings" w:hint="default"/>
+      </w:rPr>
+    </w:lvl>
+  </w:abstractNum>
+  <w:abstractNum w:abstractNumId="4" w15:restartNumberingAfterBreak="0">
+    <w:nsid w:val="25EE4EA5"/>
+    <w:multiLevelType w:val="multilevel"/>
+    <w:tmpl w:val="979CD9E6"/>
+    <w:lvl w:ilvl="0">
+      <w:start w:val="1"/>
+      <w:numFmt w:val="decimal"/>
+      <w:lvlText w:val="%1."/>
+      <w:lvlJc w:val="left"/>
+      <w:pPr>
+        <w:tabs>
+          <w:tab w:val="num" w:pos="720"/>
+        </w:tabs>
+        <w:ind w:left="720" w:hanging="360"/>
+      </w:pPr>
+    </w:lvl>
+    <w:lvl w:ilvl="1" w:tentative="1">
+      <w:start w:val="1"/>
+      <w:numFmt w:val="decimal"/>
+      <w:lvlText w:val="%2."/>
+      <w:lvlJc w:val="left"/>
+      <w:pPr>
+        <w:tabs>
+          <w:tab w:val="num" w:pos="1440"/>
+        </w:tabs>
+        <w:ind w:left="1440" w:hanging="360"/>
+      </w:pPr>
+    </w:lvl>
+    <w:lvl w:ilvl="2" w:tentative="1">
+      <w:start w:val="1"/>
+      <w:numFmt w:val="decimal"/>
+      <w:lvlText w:val="%3."/>
+      <w:lvlJc w:val="left"/>
+      <w:pPr>
+        <w:tabs>
+          <w:tab w:val="num" w:pos="2160"/>
+        </w:tabs>
+        <w:ind w:left="2160" w:hanging="360"/>
+      </w:pPr>
+    </w:lvl>
+    <w:lvl w:ilvl="3" w:tentative="1">
+      <w:start w:val="1"/>
+      <w:numFmt w:val="decimal"/>
+      <w:lvlText w:val="%4."/>
+      <w:lvlJc w:val="left"/>
+      <w:pPr>
+        <w:tabs>
+          <w:tab w:val="num" w:pos="2880"/>
+        </w:tabs>
+        <w:ind w:left="2880" w:hanging="360"/>
+      </w:pPr>
+    </w:lvl>
+    <w:lvl w:ilvl="4" w:tentative="1">
+      <w:start w:val="1"/>
+      <w:numFmt w:val="decimal"/>
+      <w:lvlText w:val="%5."/>
+      <w:lvlJc w:val="left"/>
+      <w:pPr>
+        <w:tabs>
+          <w:tab w:val="num" w:pos="3600"/>
+        </w:tabs>
+        <w:ind w:left="3600" w:hanging="360"/>
+      </w:pPr>
+    </w:lvl>
+    <w:lvl w:ilvl="5" w:tentative="1">
+      <w:start w:val="1"/>
+      <w:numFmt w:val="decimal"/>
+      <w:lvlText w:val="%6."/>
+      <w:lvlJc w:val="left"/>
+      <w:pPr>
+        <w:tabs>
+          <w:tab w:val="num" w:pos="4320"/>
+        </w:tabs>
+        <w:ind w:left="4320" w:hanging="360"/>
+      </w:pPr>
+    </w:lvl>
+    <w:lvl w:ilvl="6" w:tentative="1">
+      <w:start w:val="1"/>
+      <w:numFmt w:val="decimal"/>
+      <w:lvlText w:val="%7."/>
+      <w:lvlJc w:val="left"/>
+      <w:pPr>
+        <w:tabs>
+          <w:tab w:val="num" w:pos="5040"/>
+        </w:tabs>
+        <w:ind w:left="5040" w:hanging="360"/>
+      </w:pPr>
+    </w:lvl>
+    <w:lvl w:ilvl="7" w:tentative="1">
+      <w:start w:val="1"/>
+      <w:numFmt w:val="decimal"/>
+      <w:lvlText w:val="%8."/>
+      <w:lvlJc w:val="left"/>
+      <w:pPr>
+        <w:tabs>
+          <w:tab w:val="num" w:pos="5760"/>
+        </w:tabs>
+        <w:ind w:left="5760" w:hanging="360"/>
+      </w:pPr>
+    </w:lvl>
+    <w:lvl w:ilvl="8" w:tentative="1">
+      <w:start w:val="1"/>
+      <w:numFmt w:val="decimal"/>
+      <w:lvlText w:val="%9."/>
+      <w:lvlJc w:val="left"/>
+      <w:pPr>
+        <w:tabs>
+          <w:tab w:val="num" w:pos="6480"/>
+        </w:tabs>
+        <w:ind w:left="6480" w:hanging="360"/>
+      </w:pPr>
+    </w:lvl>
+  </w:abstractNum>
+  <w:abstractNum w:abstractNumId="5" w15:restartNumberingAfterBreak="0">
+    <w:nsid w:val="262C0EDD"/>
+    <w:multiLevelType w:val="multilevel"/>
+    <w:tmpl w:val="D27A48D8"/>
+    <w:lvl w:ilvl="0">
+      <w:start w:val="1"/>
+      <w:numFmt w:val="bullet"/>
+      <w:lvlText w:val=""/>
+      <w:lvlJc w:val="left"/>
+      <w:pPr>
+        <w:tabs>
+          <w:tab w:val="num" w:pos="720"/>
+        </w:tabs>
+        <w:ind w:left="720" w:hanging="360"/>
+      </w:pPr>
+      <w:rPr>
+        <w:rFonts w:ascii="Symbol" w:hAnsi="Symbol" w:hint="default"/>
+        <w:sz w:val="20"/>
+      </w:rPr>
+    </w:lvl>
+    <w:lvl w:ilvl="1" w:tentative="1">
+      <w:start w:val="1"/>
+      <w:numFmt w:val="bullet"/>
+      <w:lvlText w:val="o"/>
+      <w:lvlJc w:val="left"/>
+      <w:pPr>
+        <w:tabs>
+          <w:tab w:val="num" w:pos="1440"/>
+        </w:tabs>
+        <w:ind w:left="1440" w:hanging="360"/>
+      </w:pPr>
+      <w:rPr>
+        <w:rFonts w:ascii="Courier New" w:hAnsi="Courier New" w:hint="default"/>
+        <w:sz w:val="20"/>
+      </w:rPr>
+    </w:lvl>
+    <w:lvl w:ilvl="2" w:tentative="1">
+      <w:start w:val="1"/>
+      <w:numFmt w:val="bullet"/>
+      <w:lvlText w:val=""/>
+      <w:lvlJc w:val="left"/>
+      <w:pPr>
+        <w:tabs>
+          <w:tab w:val="num" w:pos="2160"/>
+        </w:tabs>
+        <w:ind w:left="2160" w:hanging="360"/>
+      </w:pPr>
+      <w:rPr>
+        <w:rFonts w:ascii="Wingdings" w:hAnsi="Wingdings" w:hint="default"/>
+        <w:sz w:val="20"/>
+      </w:rPr>
+    </w:lvl>
+    <w:lvl w:ilvl="3" w:tentative="1">
+      <w:start w:val="1"/>
+      <w:numFmt w:val="bullet"/>
+      <w:lvlText w:val=""/>
+      <w:lvlJc w:val="left"/>
+      <w:pPr>
+        <w:tabs>
+          <w:tab w:val="num" w:pos="2880"/>
+        </w:tabs>
+        <w:ind w:left="2880" w:hanging="360"/>
+      </w:pPr>
+      <w:rPr>
+        <w:rFonts w:ascii="Wingdings" w:hAnsi="Wingdings" w:hint="default"/>
+        <w:sz w:val="20"/>
+      </w:rPr>
+    </w:lvl>
+    <w:lvl w:ilvl="4" w:tentative="1">
+      <w:start w:val="1"/>
+      <w:numFmt w:val="bullet"/>
+      <w:lvlText w:val=""/>
+      <w:lvlJc w:val="left"/>
+      <w:pPr>
+        <w:tabs>
+          <w:tab w:val="num" w:pos="3600"/>
+        </w:tabs>
+        <w:ind w:left="3600" w:hanging="360"/>
+      </w:pPr>
+      <w:rPr>
+        <w:rFonts w:ascii="Wingdings" w:hAnsi="Wingdings" w:hint="default"/>
+        <w:sz w:val="20"/>
+      </w:rPr>
+    </w:lvl>
+    <w:lvl w:ilvl="5" w:tentative="1">
+      <w:start w:val="1"/>
+      <w:numFmt w:val="bullet"/>
+      <w:lvlText w:val=""/>
+      <w:lvlJc w:val="left"/>
+      <w:pPr>
+        <w:tabs>
+          <w:tab w:val="num" w:pos="4320"/>
+        </w:tabs>
+        <w:ind w:left="4320" w:hanging="360"/>
+      </w:pPr>
+      <w:rPr>
+        <w:rFonts w:ascii="Wingdings" w:hAnsi="Wingdings" w:hint="default"/>
+        <w:sz w:val="20"/>
+      </w:rPr>
+    </w:lvl>
+    <w:lvl w:ilvl="6" w:tentative="1">
+      <w:start w:val="1"/>
+      <w:numFmt w:val="bullet"/>
+      <w:lvlText w:val=""/>
+      <w:lvlJc w:val="left"/>
+      <w:pPr>
+        <w:tabs>
+          <w:tab w:val="num" w:pos="5040"/>
+        </w:tabs>
+        <w:ind w:left="5040" w:hanging="360"/>
+      </w:pPr>
+      <w:rPr>
+        <w:rFonts w:ascii="Wingdings" w:hAnsi="Wingdings" w:hint="default"/>
+        <w:sz w:val="20"/>
+      </w:rPr>
+    </w:lvl>
+    <w:lvl w:ilvl="7" w:tentative="1">
+      <w:start w:val="1"/>
+      <w:numFmt w:val="bullet"/>
+      <w:lvlText w:val=""/>
+      <w:lvlJc w:val="left"/>
+      <w:pPr>
+        <w:tabs>
+          <w:tab w:val="num" w:pos="5760"/>
+        </w:tabs>
+        <w:ind w:left="5760" w:hanging="360"/>
+      </w:pPr>
+      <w:rPr>
+        <w:rFonts w:ascii="Wingdings" w:hAnsi="Wingdings" w:hint="default"/>
+        <w:sz w:val="20"/>
+      </w:rPr>
+    </w:lvl>
+    <w:lvl w:ilvl="8" w:tentative="1">
+      <w:start w:val="1"/>
+      <w:numFmt w:val="bullet"/>
+      <w:lvlText w:val=""/>
+      <w:lvlJc w:val="left"/>
+      <w:pPr>
+        <w:tabs>
+          <w:tab w:val="num" w:pos="6480"/>
+        </w:tabs>
+        <w:ind w:left="6480" w:hanging="360"/>
+      </w:pPr>
+      <w:rPr>
+        <w:rFonts w:ascii="Wingdings" w:hAnsi="Wingdings" w:hint="default"/>
+        <w:sz w:val="20"/>
+      </w:rPr>
+    </w:lvl>
+  </w:abstractNum>
+  <w:abstractNum w:abstractNumId="6" w15:restartNumberingAfterBreak="0">
+    <w:nsid w:val="402D32CC"/>
+    <w:multiLevelType w:val="multilevel"/>
+    <w:tmpl w:val="0B2E4806"/>
+    <w:lvl w:ilvl="0">
+      <w:start w:val="1"/>
+      <w:numFmt w:val="bullet"/>
+      <w:lvlText w:val=""/>
+      <w:lvlJc w:val="left"/>
+      <w:pPr>
+        <w:tabs>
+          <w:tab w:val="num" w:pos="720"/>
+        </w:tabs>
+        <w:ind w:left="720" w:hanging="360"/>
+      </w:pPr>
+      <w:rPr>
+        <w:rFonts w:ascii="Symbol" w:hAnsi="Symbol" w:hint="default"/>
+        <w:sz w:val="20"/>
+      </w:rPr>
+    </w:lvl>
+    <w:lvl w:ilvl="1" w:tentative="1">
+      <w:start w:val="1"/>
+      <w:numFmt w:val="bullet"/>
+      <w:lvlText w:val="o"/>
+      <w:lvlJc w:val="left"/>
+      <w:pPr>
+        <w:tabs>
+          <w:tab w:val="num" w:pos="1440"/>
+        </w:tabs>
+        <w:ind w:left="1440" w:hanging="360"/>
+      </w:pPr>
+      <w:rPr>
+        <w:rFonts w:ascii="Courier New" w:hAnsi="Courier New" w:hint="default"/>
+        <w:sz w:val="20"/>
+      </w:rPr>
+    </w:lvl>
+    <w:lvl w:ilvl="2" w:tentative="1">
+      <w:start w:val="1"/>
+      <w:numFmt w:val="bullet"/>
+      <w:lvlText w:val=""/>
+      <w:lvlJc w:val="left"/>
+      <w:pPr>
+        <w:tabs>
+          <w:tab w:val="num" w:pos="2160"/>
+        </w:tabs>
+        <w:ind w:left="2160" w:hanging="360"/>
+      </w:pPr>
+      <w:rPr>
+        <w:rFonts w:ascii="Wingdings" w:hAnsi="Wingdings" w:hint="default"/>
+        <w:sz w:val="20"/>
+      </w:rPr>
+    </w:lvl>
+    <w:lvl w:ilvl="3" w:tentative="1">
+      <w:start w:val="1"/>
+      <w:numFmt w:val="bullet"/>
+      <w:lvlText w:val=""/>
+      <w:lvlJc w:val="left"/>
+      <w:pPr>
+        <w:tabs>
+          <w:tab w:val="num" w:pos="2880"/>
+        </w:tabs>
+        <w:ind w:left="2880" w:hanging="360"/>
+      </w:pPr>
+      <w:rPr>
+        <w:rFonts w:ascii="Wingdings" w:hAnsi="Wingdings" w:hint="default"/>
+        <w:sz w:val="20"/>
+      </w:rPr>
+    </w:lvl>
+    <w:lvl w:ilvl="4" w:tentative="1">
+      <w:start w:val="1"/>
+      <w:numFmt w:val="bullet"/>
+      <w:lvlText w:val=""/>
+      <w:lvlJc w:val="left"/>
+      <w:pPr>
+        <w:tabs>
+          <w:tab w:val="num" w:pos="3600"/>
+        </w:tabs>
+        <w:ind w:left="3600" w:hanging="360"/>
+      </w:pPr>
+      <w:rPr>
+        <w:rFonts w:ascii="Wingdings" w:hAnsi="Wingdings" w:hint="default"/>
+        <w:sz w:val="20"/>
+      </w:rPr>
+    </w:lvl>
+    <w:lvl w:ilvl="5" w:tentative="1">
+      <w:start w:val="1"/>
+      <w:numFmt w:val="bullet"/>
+      <w:lvlText w:val=""/>
+      <w:lvlJc w:val="left"/>
+      <w:pPr>
+        <w:tabs>
+          <w:tab w:val="num" w:pos="4320"/>
+        </w:tabs>
+        <w:ind w:left="4320" w:hanging="360"/>
+      </w:pPr>
+      <w:rPr>
+        <w:rFonts w:ascii="Wingdings" w:hAnsi="Wingdings" w:hint="default"/>
+        <w:sz w:val="20"/>
+      </w:rPr>
+    </w:lvl>
+    <w:lvl w:ilvl="6" w:tentative="1">
+      <w:start w:val="1"/>
+      <w:numFmt w:val="bullet"/>
+      <w:lvlText w:val=""/>
+      <w:lvlJc w:val="left"/>
+      <w:pPr>
+        <w:tabs>
+          <w:tab w:val="num" w:pos="5040"/>
+        </w:tabs>
+        <w:ind w:left="5040" w:hanging="360"/>
+      </w:pPr>
+      <w:rPr>
+        <w:rFonts w:ascii="Wingdings" w:hAnsi="Wingdings" w:hint="default"/>
+        <w:sz w:val="20"/>
+      </w:rPr>
+    </w:lvl>
+    <w:lvl w:ilvl="7" w:tentative="1">
+      <w:start w:val="1"/>
+      <w:numFmt w:val="bullet"/>
+      <w:lvlText w:val=""/>
+      <w:lvlJc w:val="left"/>
+      <w:pPr>
+        <w:tabs>
+          <w:tab w:val="num" w:pos="5760"/>
+        </w:tabs>
+        <w:ind w:left="5760" w:hanging="360"/>
+      </w:pPr>
+      <w:rPr>
+        <w:rFonts w:ascii="Wingdings" w:hAnsi="Wingdings" w:hint="default"/>
+        <w:sz w:val="20"/>
+      </w:rPr>
+    </w:lvl>
+    <w:lvl w:ilvl="8" w:tentative="1">
+      <w:start w:val="1"/>
+      <w:numFmt w:val="bullet"/>
+      <w:lvlText w:val=""/>
+      <w:lvlJc w:val="left"/>
+      <w:pPr>
+        <w:tabs>
+          <w:tab w:val="num" w:pos="6480"/>
+        </w:tabs>
+        <w:ind w:left="6480" w:hanging="360"/>
+      </w:pPr>
+      <w:rPr>
+        <w:rFonts w:ascii="Wingdings" w:hAnsi="Wingdings" w:hint="default"/>
+        <w:sz w:val="20"/>
+      </w:rPr>
+    </w:lvl>
+  </w:abstractNum>
+  <w:abstractNum w:abstractNumId="7" w15:restartNumberingAfterBreak="0">
+    <w:nsid w:val="435A1347"/>
+    <w:multiLevelType w:val="multilevel"/>
+    <w:tmpl w:val="8236CB14"/>
+    <w:lvl w:ilvl="0">
+      <w:start w:val="1"/>
+      <w:numFmt w:val="decimal"/>
+      <w:lvlText w:val="%1."/>
+      <w:lvlJc w:val="left"/>
+      <w:pPr>
+        <w:tabs>
+          <w:tab w:val="num" w:pos="720"/>
+        </w:tabs>
+        <w:ind w:left="720" w:hanging="360"/>
+      </w:pPr>
+    </w:lvl>
+    <w:lvl w:ilvl="1">
+      <w:start w:val="1"/>
+      <w:numFmt w:val="bullet"/>
+      <w:lvlText w:val="o"/>
+      <w:lvlJc w:val="left"/>
+      <w:pPr>
+        <w:tabs>
+          <w:tab w:val="num" w:pos="1440"/>
+        </w:tabs>
+        <w:ind w:left="1440" w:hanging="360"/>
+      </w:pPr>
+      <w:rPr>
+        <w:rFonts w:ascii="Courier New" w:hAnsi="Courier New" w:hint="default"/>
+        <w:sz w:val="20"/>
+      </w:rPr>
+    </w:lvl>
+    <w:lvl w:ilvl="2" w:tentative="1">
+      <w:start w:val="1"/>
+      <w:numFmt w:val="decimal"/>
+      <w:lvlText w:val="%3."/>
+      <w:lvlJc w:val="left"/>
+      <w:pPr>
+        <w:tabs>
+          <w:tab w:val="num" w:pos="2160"/>
+        </w:tabs>
+        <w:ind w:left="2160" w:hanging="360"/>
+      </w:pPr>
+    </w:lvl>
+    <w:lvl w:ilvl="3" w:tentative="1">
+      <w:start w:val="1"/>
+      <w:numFmt w:val="decimal"/>
+      <w:lvlText w:val="%4."/>
+      <w:lvlJc w:val="left"/>
+      <w:pPr>
+        <w:tabs>
+          <w:tab w:val="num" w:pos="2880"/>
+        </w:tabs>
+        <w:ind w:left="2880" w:hanging="360"/>
+      </w:pPr>
+    </w:lvl>
+    <w:lvl w:ilvl="4" w:tentative="1">
+      <w:start w:val="1"/>
+      <w:numFmt w:val="decimal"/>
+      <w:lvlText w:val="%5."/>
+      <w:lvlJc w:val="left"/>
+      <w:pPr>
+        <w:tabs>
+          <w:tab w:val="num" w:pos="3600"/>
+        </w:tabs>
+        <w:ind w:left="3600" w:hanging="360"/>
+      </w:pPr>
+    </w:lvl>
+    <w:lvl w:ilvl="5" w:tentative="1">
+      <w:start w:val="1"/>
+      <w:numFmt w:val="decimal"/>
+      <w:lvlText w:val="%6."/>
+      <w:lvlJc w:val="left"/>
+      <w:pPr>
+        <w:tabs>
+          <w:tab w:val="num" w:pos="4320"/>
+        </w:tabs>
+        <w:ind w:left="4320" w:hanging="360"/>
+      </w:pPr>
+    </w:lvl>
+    <w:lvl w:ilvl="6" w:tentative="1">
+      <w:start w:val="1"/>
+      <w:numFmt w:val="decimal"/>
+      <w:lvlText w:val="%7."/>
+      <w:lvlJc w:val="left"/>
+      <w:pPr>
+        <w:tabs>
+          <w:tab w:val="num" w:pos="5040"/>
+        </w:tabs>
+        <w:ind w:left="5040" w:hanging="360"/>
+      </w:pPr>
+    </w:lvl>
+    <w:lvl w:ilvl="7" w:tentative="1">
+      <w:start w:val="1"/>
+      <w:numFmt w:val="decimal"/>
+      <w:lvlText w:val="%8."/>
+      <w:lvlJc w:val="left"/>
+      <w:pPr>
+        <w:tabs>
+          <w:tab w:val="num" w:pos="5760"/>
+        </w:tabs>
+        <w:ind w:left="5760" w:hanging="360"/>
+      </w:pPr>
+    </w:lvl>
+    <w:lvl w:ilvl="8" w:tentative="1">
+      <w:start w:val="1"/>
+      <w:numFmt w:val="decimal"/>
+      <w:lvlText w:val="%9."/>
+      <w:lvlJc w:val="left"/>
+      <w:pPr>
+        <w:tabs>
+          <w:tab w:val="num" w:pos="6480"/>
+        </w:tabs>
+        <w:ind w:left="6480" w:hanging="360"/>
+      </w:pPr>
+    </w:lvl>
+  </w:abstractNum>
+  <w:abstractNum w:abstractNumId="8" w15:restartNumberingAfterBreak="0">
+    <w:nsid w:val="4848445D"/>
+    <w:multiLevelType w:val="multilevel"/>
+    <w:tmpl w:val="BA3E94C2"/>
+    <w:lvl w:ilvl="0">
+      <w:start w:val="1"/>
+      <w:numFmt w:val="bullet"/>
+      <w:lvlText w:val=""/>
+      <w:lvlJc w:val="left"/>
+      <w:pPr>
+        <w:tabs>
+          <w:tab w:val="num" w:pos="720"/>
+        </w:tabs>
+        <w:ind w:left="720" w:hanging="360"/>
+      </w:pPr>
+      <w:rPr>
+        <w:rFonts w:ascii="Symbol" w:hAnsi="Symbol" w:hint="default"/>
+        <w:sz w:val="20"/>
+      </w:rPr>
+    </w:lvl>
+    <w:lvl w:ilvl="1" w:tentative="1">
+      <w:start w:val="1"/>
+      <w:numFmt w:val="bullet"/>
+      <w:lvlText w:val="o"/>
+      <w:lvlJc w:val="left"/>
+      <w:pPr>
+        <w:tabs>
+          <w:tab w:val="num" w:pos="1440"/>
+        </w:tabs>
+        <w:ind w:left="1440" w:hanging="360"/>
+      </w:pPr>
+      <w:rPr>
+        <w:rFonts w:ascii="Courier New" w:hAnsi="Courier New" w:hint="default"/>
+        <w:sz w:val="20"/>
+      </w:rPr>
+    </w:lvl>
+    <w:lvl w:ilvl="2" w:tentative="1">
+      <w:start w:val="1"/>
+      <w:numFmt w:val="bullet"/>
+      <w:lvlText w:val=""/>
+      <w:lvlJc w:val="left"/>
+      <w:pPr>
+        <w:tabs>
+          <w:tab w:val="num" w:pos="2160"/>
+        </w:tabs>
+        <w:ind w:left="2160" w:hanging="360"/>
+      </w:pPr>
+      <w:rPr>
+        <w:rFonts w:ascii="Wingdings" w:hAnsi="Wingdings" w:hint="default"/>
+        <w:sz w:val="20"/>
+      </w:rPr>
+    </w:lvl>
+    <w:lvl w:ilvl="3" w:tentative="1">
+      <w:start w:val="1"/>
+      <w:numFmt w:val="bullet"/>
+      <w:lvlText w:val=""/>
+      <w:lvlJc w:val="left"/>
+      <w:pPr>
+        <w:tabs>
+          <w:tab w:val="num" w:pos="2880"/>
+        </w:tabs>
+        <w:ind w:left="2880" w:hanging="360"/>
+      </w:pPr>
+      <w:rPr>
+        <w:rFonts w:ascii="Wingdings" w:hAnsi="Wingdings" w:hint="default"/>
+        <w:sz w:val="20"/>
+      </w:rPr>
+    </w:lvl>
+    <w:lvl w:ilvl="4" w:tentative="1">
+      <w:start w:val="1"/>
+      <w:numFmt w:val="bullet"/>
+      <w:lvlText w:val=""/>
+      <w:lvlJc w:val="left"/>
+      <w:pPr>
+        <w:tabs>
+          <w:tab w:val="num" w:pos="3600"/>
+        </w:tabs>
+        <w:ind w:left="3600" w:hanging="360"/>
+      </w:pPr>
+      <w:rPr>
+        <w:rFonts w:ascii="Wingdings" w:hAnsi="Wingdings" w:hint="default"/>
+        <w:sz w:val="20"/>
+      </w:rPr>
+    </w:lvl>
+    <w:lvl w:ilvl="5" w:tentative="1">
+      <w:start w:val="1"/>
+      <w:numFmt w:val="bullet"/>
+      <w:lvlText w:val=""/>
+      <w:lvlJc w:val="left"/>
+      <w:pPr>
+        <w:tabs>
+          <w:tab w:val="num" w:pos="4320"/>
+        </w:tabs>
+        <w:ind w:left="4320" w:hanging="360"/>
+      </w:pPr>
+      <w:rPr>
+        <w:rFonts w:ascii="Wingdings" w:hAnsi="Wingdings" w:hint="default"/>
+        <w:sz w:val="20"/>
+      </w:rPr>
+    </w:lvl>
+    <w:lvl w:ilvl="6" w:tentative="1">
+      <w:start w:val="1"/>
+      <w:numFmt w:val="bullet"/>
+      <w:lvlText w:val=""/>
+      <w:lvlJc w:val="left"/>
+      <w:pPr>
+        <w:tabs>
+          <w:tab w:val="num" w:pos="5040"/>
+        </w:tabs>
+        <w:ind w:left="5040" w:hanging="360"/>
+      </w:pPr>
+      <w:rPr>
+        <w:rFonts w:ascii="Wingdings" w:hAnsi="Wingdings" w:hint="default"/>
+        <w:sz w:val="20"/>
+      </w:rPr>
+    </w:lvl>
+    <w:lvl w:ilvl="7" w:tentative="1">
+      <w:start w:val="1"/>
+      <w:numFmt w:val="bullet"/>
+      <w:lvlText w:val=""/>
+      <w:lvlJc w:val="left"/>
+      <w:pPr>
+        <w:tabs>
+          <w:tab w:val="num" w:pos="5760"/>
+        </w:tabs>
+        <w:ind w:left="5760" w:hanging="360"/>
+      </w:pPr>
+      <w:rPr>
+        <w:rFonts w:ascii="Wingdings" w:hAnsi="Wingdings" w:hint="default"/>
+        <w:sz w:val="20"/>
+      </w:rPr>
+    </w:lvl>
+    <w:lvl w:ilvl="8" w:tentative="1">
+      <w:start w:val="1"/>
+      <w:numFmt w:val="bullet"/>
+      <w:lvlText w:val=""/>
+      <w:lvlJc w:val="left"/>
+      <w:pPr>
+        <w:tabs>
+          <w:tab w:val="num" w:pos="6480"/>
+        </w:tabs>
+        <w:ind w:left="6480" w:hanging="360"/>
+      </w:pPr>
+      <w:rPr>
+        <w:rFonts w:ascii="Wingdings" w:hAnsi="Wingdings" w:hint="default"/>
+        <w:sz w:val="20"/>
+      </w:rPr>
+    </w:lvl>
+  </w:abstractNum>
+  <w:abstractNum w:abstractNumId="9" w15:restartNumberingAfterBreak="0">
+    <w:nsid w:val="52F07B1E"/>
+    <w:multiLevelType w:val="hybridMultilevel"/>
+    <w:tmpl w:val="CB32D3C4"/>
+    <w:lvl w:ilvl="0" w:tplc="BCFC95EA">
+      <w:start w:val="17"/>
+      <w:numFmt w:val="bullet"/>
+      <w:lvlText w:val="-"/>
+      <w:lvlJc w:val="left"/>
+      <w:pPr>
+        <w:ind w:left="720" w:hanging="360"/>
+      </w:pPr>
+      <w:rPr>
+        <w:rFonts w:ascii="Calibri" w:eastAsiaTheme="minorHAnsi" w:hAnsi="Calibri" w:cs="Calibri" w:hint="default"/>
+      </w:rPr>
+    </w:lvl>
+    <w:lvl w:ilvl="1" w:tplc="40090003" w:tentative="1">
+      <w:start w:val="1"/>
+      <w:numFmt w:val="bullet"/>
+      <w:lvlText w:val="o"/>
+      <w:lvlJc w:val="left"/>
+      <w:pPr>
+        <w:ind w:left="1440" w:hanging="360"/>
+      </w:pPr>
+      <w:rPr>
+        <w:rFonts w:ascii="Courier New" w:hAnsi="Courier New" w:cs="Courier New" w:hint="default"/>
+      </w:rPr>
+    </w:lvl>
+    <w:lvl w:ilvl="2" w:tplc="40090005" w:tentative="1">
+      <w:start w:val="1"/>
+      <w:numFmt w:val="bullet"/>
+      <w:lvlText w:val=""/>
+      <w:lvlJc w:val="left"/>
+      <w:pPr>
+        <w:ind w:left="2160" w:hanging="360"/>
+      </w:pPr>
+      <w:rPr>
+        <w:rFonts w:ascii="Wingdings" w:hAnsi="Wingdings" w:hint="default"/>
+      </w:rPr>
+    </w:lvl>
+    <w:lvl w:ilvl="3" w:tplc="40090001" w:tentative="1">
+      <w:start w:val="1"/>
+      <w:numFmt w:val="bullet"/>
+      <w:lvlText w:val=""/>
+      <w:lvlJc w:val="left"/>
+      <w:pPr>
+        <w:ind w:left="2880" w:hanging="360"/>
+      </w:pPr>
+      <w:rPr>
+        <w:rFonts w:ascii="Symbol" w:hAnsi="Symbol" w:hint="default"/>
+      </w:rPr>
+    </w:lvl>
+    <w:lvl w:ilvl="4" w:tplc="40090003" w:tentative="1">
+      <w:start w:val="1"/>
+      <w:numFmt w:val="bullet"/>
+      <w:lvlText w:val="o"/>
+      <w:lvlJc w:val="left"/>
+      <w:pPr>
+        <w:ind w:left="3600" w:hanging="360"/>
+      </w:pPr>
+      <w:rPr>
+        <w:rFonts w:ascii="Courier New" w:hAnsi="Courier New" w:cs="Courier New" w:hint="default"/>
+      </w:rPr>
+    </w:lvl>
+    <w:lvl w:ilvl="5" w:tplc="40090005" w:tentative="1">
+      <w:start w:val="1"/>
+      <w:numFmt w:val="bullet"/>
+      <w:lvlText w:val=""/>
+      <w:lvlJc w:val="left"/>
+      <w:pPr>
+        <w:ind w:left="4320" w:hanging="360"/>
+      </w:pPr>
+      <w:rPr>
+        <w:rFonts w:ascii="Wingdings" w:hAnsi="Wingdings" w:hint="default"/>
+      </w:rPr>
+    </w:lvl>
+    <w:lvl w:ilvl="6" w:tplc="40090001" w:tentative="1">
+      <w:start w:val="1"/>
+      <w:numFmt w:val="bullet"/>
+      <w:lvlText w:val=""/>
+      <w:lvlJc w:val="left"/>
+      <w:pPr>
+        <w:ind w:left="5040" w:hanging="360"/>
+      </w:pPr>
+      <w:rPr>
+        <w:rFonts w:ascii="Symbol" w:hAnsi="Symbol" w:hint="default"/>
+      </w:rPr>
+    </w:lvl>
+    <w:lvl w:ilvl="7" w:tplc="40090003" w:tentative="1">
+      <w:start w:val="1"/>
+      <w:numFmt w:val="bullet"/>
+      <w:lvlText w:val="o"/>
+      <w:lvlJc w:val="left"/>
+      <w:pPr>
+        <w:ind w:left="5760" w:hanging="360"/>
+      </w:pPr>
+      <w:rPr>
+        <w:rFonts w:ascii="Courier New" w:hAnsi="Courier New" w:cs="Courier New" w:hint="default"/>
+      </w:rPr>
+    </w:lvl>
+    <w:lvl w:ilvl="8" w:tplc="40090005" w:tentative="1">
+      <w:start w:val="1"/>
+      <w:numFmt w:val="bullet"/>
+      <w:lvlText w:val=""/>
+      <w:lvlJc w:val="left"/>
+      <w:pPr>
+        <w:ind w:left="6480" w:hanging="360"/>
+      </w:pPr>
+      <w:rPr>
+        <w:rFonts w:ascii="Wingdings" w:hAnsi="Wingdings" w:hint="default"/>
+      </w:rPr>
+    </w:lvl>
+  </w:abstractNum>
+  <w:abstractNum w:abstractNumId="10" w15:restartNumberingAfterBreak="0">
+    <w:nsid w:val="63A21C82"/>
+    <w:multiLevelType w:val="hybridMultilevel"/>
+    <w:tmpl w:val="E9F01B06"/>
+    <w:lvl w:ilvl="0" w:tplc="40090001">
+      <w:start w:val="1"/>
+      <w:numFmt w:val="bullet"/>
+      <w:lvlText w:val=""/>
+      <w:lvlJc w:val="left"/>
+      <w:pPr>
+        <w:ind w:left="720" w:hanging="360"/>
+      </w:pPr>
+      <w:rPr>
+        <w:rFonts w:ascii="Symbol" w:hAnsi="Symbol" w:hint="default"/>
+      </w:rPr>
+    </w:lvl>
+    <w:lvl w:ilvl="1" w:tplc="40090003" w:tentative="1">
+      <w:start w:val="1"/>
+      <w:numFmt w:val="bullet"/>
+      <w:lvlText w:val="o"/>
+      <w:lvlJc w:val="left"/>
+      <w:pPr>
+        <w:ind w:left="1440" w:hanging="360"/>
+      </w:pPr>
+      <w:rPr>
+        <w:rFonts w:ascii="Courier New" w:hAnsi="Courier New" w:cs="Courier New" w:hint="default"/>
+      </w:rPr>
+    </w:lvl>
+    <w:lvl w:ilvl="2" w:tplc="40090005" w:tentative="1">
+      <w:start w:val="1"/>
+      <w:numFmt w:val="bullet"/>
+      <w:lvlText w:val=""/>
+      <w:lvlJc w:val="left"/>
+      <w:pPr>
+        <w:ind w:left="2160" w:hanging="360"/>
+      </w:pPr>
+      <w:rPr>
+        <w:rFonts w:ascii="Wingdings" w:hAnsi="Wingdings" w:hint="default"/>
+      </w:rPr>
+    </w:lvl>
+    <w:lvl w:ilvl="3" w:tplc="40090001" w:tentative="1">
+      <w:start w:val="1"/>
+      <w:numFmt w:val="bullet"/>
+      <w:lvlText w:val=""/>
+      <w:lvlJc w:val="left"/>
+      <w:pPr>
+        <w:ind w:left="2880" w:hanging="360"/>
+      </w:pPr>
+      <w:rPr>
+        <w:rFonts w:ascii="Symbol" w:hAnsi="Symbol" w:hint="default"/>
+      </w:rPr>
+    </w:lvl>
+    <w:lvl w:ilvl="4" w:tplc="40090003" w:tentative="1">
+      <w:start w:val="1"/>
+      <w:numFmt w:val="bullet"/>
+      <w:lvlText w:val="o"/>
+      <w:lvlJc w:val="left"/>
+      <w:pPr>
+        <w:ind w:left="3600" w:hanging="360"/>
+      </w:pPr>
+      <w:rPr>
+        <w:rFonts w:ascii="Courier New" w:hAnsi="Courier New" w:cs="Courier New" w:hint="default"/>
+      </w:rPr>
+    </w:lvl>
+    <w:lvl w:ilvl="5" w:tplc="40090005" w:tentative="1">
+      <w:start w:val="1"/>
+      <w:numFmt w:val="bullet"/>
+      <w:lvlText w:val=""/>
+      <w:lvlJc w:val="left"/>
+      <w:pPr>
+        <w:ind w:left="4320" w:hanging="360"/>
+      </w:pPr>
+      <w:rPr>
+        <w:rFonts w:ascii="Wingdings" w:hAnsi="Wingdings" w:hint="default"/>
+      </w:rPr>
+    </w:lvl>
+    <w:lvl w:ilvl="6" w:tplc="40090001" w:tentative="1">
+      <w:start w:val="1"/>
+      <w:numFmt w:val="bullet"/>
+      <w:lvlText w:val=""/>
+      <w:lvlJc w:val="left"/>
+      <w:pPr>
+        <w:ind w:left="5040" w:hanging="360"/>
+      </w:pPr>
+      <w:rPr>
+        <w:rFonts w:ascii="Symbol" w:hAnsi="Symbol" w:hint="default"/>
+      </w:rPr>
+    </w:lvl>
+    <w:lvl w:ilvl="7" w:tplc="40090003" w:tentative="1">
+      <w:start w:val="1"/>
+      <w:numFmt w:val="bullet"/>
+      <w:lvlText w:val="o"/>
+      <w:lvlJc w:val="left"/>
+      <w:pPr>
+        <w:ind w:left="5760" w:hanging="360"/>
+      </w:pPr>
+      <w:rPr>
+        <w:rFonts w:ascii="Courier New" w:hAnsi="Courier New" w:cs="Courier New" w:hint="default"/>
+      </w:rPr>
+    </w:lvl>
+    <w:lvl w:ilvl="8" w:tplc="40090005" w:tentative="1">
+      <w:start w:val="1"/>
+      <w:numFmt w:val="bullet"/>
+      <w:lvlText w:val=""/>
+      <w:lvlJc w:val="left"/>
+      <w:pPr>
+        <w:ind w:left="6480" w:hanging="360"/>
+      </w:pPr>
+      <w:rPr>
+        <w:rFonts w:ascii="Wingdings" w:hAnsi="Wingdings" w:hint="default"/>
+      </w:rPr>
+    </w:lvl>
+  </w:abstractNum>
+  <w:abstractNum w:abstractNumId="11" w15:restartNumberingAfterBreak="0">
+    <w:nsid w:val="655545BE"/>
+    <w:multiLevelType w:val="multilevel"/>
+    <w:tmpl w:val="87985016"/>
+    <w:lvl w:ilvl="0">
+      <w:start w:val="1"/>
+      <w:numFmt w:val="bullet"/>
+      <w:lvlText w:val=""/>
+      <w:lvlJc w:val="left"/>
+      <w:pPr>
+        <w:tabs>
+          <w:tab w:val="num" w:pos="720"/>
+        </w:tabs>
+        <w:ind w:left="720" w:hanging="360"/>
+      </w:pPr>
+      <w:rPr>
+        <w:rFonts w:ascii="Symbol" w:hAnsi="Symbol" w:hint="default"/>
+        <w:sz w:val="20"/>
+      </w:rPr>
+    </w:lvl>
+    <w:lvl w:ilvl="1" w:tentative="1">
+      <w:start w:val="1"/>
+      <w:numFmt w:val="bullet"/>
+      <w:lvlText w:val="o"/>
+      <w:lvlJc w:val="left"/>
+      <w:pPr>
+        <w:tabs>
+          <w:tab w:val="num" w:pos="1440"/>
+        </w:tabs>
+        <w:ind w:left="1440" w:hanging="360"/>
+      </w:pPr>
+      <w:rPr>
+        <w:rFonts w:ascii="Courier New" w:hAnsi="Courier New" w:hint="default"/>
+        <w:sz w:val="20"/>
+      </w:rPr>
+    </w:lvl>
+    <w:lvl w:ilvl="2" w:tentative="1">
+      <w:start w:val="1"/>
+      <w:numFmt w:val="bullet"/>
+      <w:lvlText w:val=""/>
+      <w:lvlJc w:val="left"/>
+      <w:pPr>
+        <w:tabs>
+          <w:tab w:val="num" w:pos="2160"/>
+        </w:tabs>
+        <w:ind w:left="2160" w:hanging="360"/>
+      </w:pPr>
+      <w:rPr>
+        <w:rFonts w:ascii="Wingdings" w:hAnsi="Wingdings" w:hint="default"/>
+        <w:sz w:val="20"/>
+      </w:rPr>
+    </w:lvl>
+    <w:lvl w:ilvl="3" w:tentative="1">
+      <w:start w:val="1"/>
+      <w:numFmt w:val="bullet"/>
+      <w:lvlText w:val=""/>
+      <w:lvlJc w:val="left"/>
+      <w:pPr>
+        <w:tabs>
+          <w:tab w:val="num" w:pos="2880"/>
+        </w:tabs>
+        <w:ind w:left="2880" w:hanging="360"/>
+      </w:pPr>
+      <w:rPr>
+        <w:rFonts w:ascii="Wingdings" w:hAnsi="Wingdings" w:hint="default"/>
+        <w:sz w:val="20"/>
+      </w:rPr>
+    </w:lvl>
+    <w:lvl w:ilvl="4" w:tentative="1">
+      <w:start w:val="1"/>
+      <w:numFmt w:val="bullet"/>
+      <w:lvlText w:val=""/>
+      <w:lvlJc w:val="left"/>
+      <w:pPr>
+        <w:tabs>
+          <w:tab w:val="num" w:pos="3600"/>
+        </w:tabs>
+        <w:ind w:left="3600" w:hanging="360"/>
+      </w:pPr>
+      <w:rPr>
+        <w:rFonts w:ascii="Wingdings" w:hAnsi="Wingdings" w:hint="default"/>
+        <w:sz w:val="20"/>
+      </w:rPr>
+    </w:lvl>
+    <w:lvl w:ilvl="5" w:tentative="1">
+      <w:start w:val="1"/>
+      <w:numFmt w:val="bullet"/>
+      <w:lvlText w:val=""/>
+      <w:lvlJc w:val="left"/>
+      <w:pPr>
+        <w:tabs>
+          <w:tab w:val="num" w:pos="4320"/>
+        </w:tabs>
+        <w:ind w:left="4320" w:hanging="360"/>
+      </w:pPr>
+      <w:rPr>
+        <w:rFonts w:ascii="Wingdings" w:hAnsi="Wingdings" w:hint="default"/>
+        <w:sz w:val="20"/>
+      </w:rPr>
+    </w:lvl>
+    <w:lvl w:ilvl="6" w:tentative="1">
+      <w:start w:val="1"/>
+      <w:numFmt w:val="bullet"/>
+      <w:lvlText w:val=""/>
+      <w:lvlJc w:val="left"/>
+      <w:pPr>
+        <w:tabs>
+          <w:tab w:val="num" w:pos="5040"/>
+        </w:tabs>
+        <w:ind w:left="5040" w:hanging="360"/>
+      </w:pPr>
+      <w:rPr>
+        <w:rFonts w:ascii="Wingdings" w:hAnsi="Wingdings" w:hint="default"/>
+        <w:sz w:val="20"/>
+      </w:rPr>
+    </w:lvl>
+    <w:lvl w:ilvl="7" w:tentative="1">
+      <w:start w:val="1"/>
+      <w:numFmt w:val="bullet"/>
+      <w:lvlText w:val=""/>
+      <w:lvlJc w:val="left"/>
+      <w:pPr>
+        <w:tabs>
+          <w:tab w:val="num" w:pos="5760"/>
+        </w:tabs>
+        <w:ind w:left="5760" w:hanging="360"/>
+      </w:pPr>
+      <w:rPr>
+        <w:rFonts w:ascii="Wingdings" w:hAnsi="Wingdings" w:hint="default"/>
+        <w:sz w:val="20"/>
+      </w:rPr>
+    </w:lvl>
+    <w:lvl w:ilvl="8" w:tentative="1">
+      <w:start w:val="1"/>
+      <w:numFmt w:val="bullet"/>
+      <w:lvlText w:val=""/>
+      <w:lvlJc w:val="left"/>
+      <w:pPr>
+        <w:tabs>
+          <w:tab w:val="num" w:pos="6480"/>
+        </w:tabs>
+        <w:ind w:left="6480" w:hanging="360"/>
+      </w:pPr>
+      <w:rPr>
+        <w:rFonts w:ascii="Wingdings" w:hAnsi="Wingdings" w:hint="default"/>
+        <w:sz w:val="20"/>
+      </w:rPr>
+    </w:lvl>
+  </w:abstractNum>
+  <w:abstractNum w:abstractNumId="12" w15:restartNumberingAfterBreak="0">
+    <w:nsid w:val="7EAB40F7"/>
+    <w:multiLevelType w:val="hybridMultilevel"/>
+    <w:tmpl w:val="EE56E3B2"/>
+    <w:lvl w:ilvl="0" w:tplc="660C4F26">
+      <w:start w:val="17"/>
+      <w:numFmt w:val="bullet"/>
+      <w:lvlText w:val=""/>
+      <w:lvlJc w:val="left"/>
+      <w:pPr>
+        <w:ind w:left="720" w:hanging="360"/>
+      </w:pPr>
+      <w:rPr>
+        <w:rFonts w:ascii="Wingdings" w:eastAsiaTheme="minorHAnsi" w:hAnsi="Wingdings" w:cstheme="minorBidi" w:hint="default"/>
+      </w:rPr>
+    </w:lvl>
+    <w:lvl w:ilvl="1" w:tplc="40090003" w:tentative="1">
+      <w:start w:val="1"/>
+      <w:numFmt w:val="bullet"/>
+      <w:lvlText w:val="o"/>
+      <w:lvlJc w:val="left"/>
+      <w:pPr>
+        <w:ind w:left="1440" w:hanging="360"/>
+      </w:pPr>
+      <w:rPr>
+        <w:rFonts w:ascii="Courier New" w:hAnsi="Courier New" w:cs="Courier New" w:hint="default"/>
+      </w:rPr>
+    </w:lvl>
+    <w:lvl w:ilvl="2" w:tplc="40090005" w:tentative="1">
+      <w:start w:val="1"/>
+      <w:numFmt w:val="bullet"/>
+      <w:lvlText w:val=""/>
+      <w:lvlJc w:val="left"/>
+      <w:pPr>
+        <w:ind w:left="2160" w:hanging="360"/>
+      </w:pPr>
+      <w:rPr>
+        <w:rFonts w:ascii="Wingdings" w:hAnsi="Wingdings" w:hint="default"/>
+      </w:rPr>
+    </w:lvl>
+    <w:lvl w:ilvl="3" w:tplc="40090001" w:tentative="1">
+      <w:start w:val="1"/>
+      <w:numFmt w:val="bullet"/>
+      <w:lvlText w:val=""/>
+      <w:lvlJc w:val="left"/>
+      <w:pPr>
+        <w:ind w:left="2880" w:hanging="360"/>
+      </w:pPr>
+      <w:rPr>
+        <w:rFonts w:ascii="Symbol" w:hAnsi="Symbol" w:hint="default"/>
+      </w:rPr>
+    </w:lvl>
+    <w:lvl w:ilvl="4" w:tplc="40090003" w:tentative="1">
+      <w:start w:val="1"/>
+      <w:numFmt w:val="bullet"/>
+      <w:lvlText w:val="o"/>
+      <w:lvlJc w:val="left"/>
+      <w:pPr>
+        <w:ind w:left="3600" w:hanging="360"/>
+      </w:pPr>
+      <w:rPr>
+        <w:rFonts w:ascii="Courier New" w:hAnsi="Courier New" w:cs="Courier New" w:hint="default"/>
+      </w:rPr>
+    </w:lvl>
+    <w:lvl w:ilvl="5" w:tplc="40090005" w:tentative="1">
+      <w:start w:val="1"/>
+      <w:numFmt w:val="bullet"/>
+      <w:lvlText w:val=""/>
+      <w:lvlJc w:val="left"/>
+      <w:pPr>
+        <w:ind w:left="4320" w:hanging="360"/>
+      </w:pPr>
+      <w:rPr>
+        <w:rFonts w:ascii="Wingdings" w:hAnsi="Wingdings" w:hint="default"/>
+      </w:rPr>
+    </w:lvl>
+    <w:lvl w:ilvl="6" w:tplc="40090001" w:tentative="1">
+      <w:start w:val="1"/>
+      <w:numFmt w:val="bullet"/>
+      <w:lvlText w:val=""/>
+      <w:lvlJc w:val="left"/>
+      <w:pPr>
+        <w:ind w:left="5040" w:hanging="360"/>
+      </w:pPr>
+      <w:rPr>
+        <w:rFonts w:ascii="Symbol" w:hAnsi="Symbol" w:hint="default"/>
+      </w:rPr>
+    </w:lvl>
+    <w:lvl w:ilvl="7" w:tplc="40090003" w:tentative="1">
+      <w:start w:val="1"/>
+      <w:numFmt w:val="bullet"/>
+      <w:lvlText w:val="o"/>
+      <w:lvlJc w:val="left"/>
+      <w:pPr>
+        <w:ind w:left="5760" w:hanging="360"/>
+      </w:pPr>
+      <w:rPr>
+        <w:rFonts w:ascii="Courier New" w:hAnsi="Courier New" w:cs="Courier New" w:hint="default"/>
+      </w:rPr>
+    </w:lvl>
+    <w:lvl w:ilvl="8" w:tplc="40090005" w:tentative="1">
+      <w:start w:val="1"/>
+      <w:numFmt w:val="bullet"/>
+      <w:lvlText w:val=""/>
+      <w:lvlJc w:val="left"/>
+      <w:pPr>
+        <w:ind w:left="6480" w:hanging="360"/>
+      </w:pPr>
+      <w:rPr>
+        <w:rFonts w:ascii="Wingdings" w:hAnsi="Wingdings" w:hint="default"/>
+      </w:rPr>
+    </w:lvl>
+  </w:abstractNum>
+  <w:num w:numId="1" w16cid:durableId="156262986">
+    <w:abstractNumId w:val="0"/>
+  </w:num>
+  <w:num w:numId="2" w16cid:durableId="1221557811">
+    <w:abstractNumId w:val="1"/>
+  </w:num>
+  <w:num w:numId="3" w16cid:durableId="857621780">
+    <w:abstractNumId w:val="8"/>
+  </w:num>
+  <w:num w:numId="4" w16cid:durableId="610010434">
+    <w:abstractNumId w:val="2"/>
+  </w:num>
+  <w:num w:numId="5" w16cid:durableId="343289266">
+    <w:abstractNumId w:val="12"/>
+  </w:num>
+  <w:num w:numId="6" w16cid:durableId="1265455221">
+    <w:abstractNumId w:val="9"/>
+  </w:num>
+  <w:num w:numId="7" w16cid:durableId="526993781">
+    <w:abstractNumId w:val="10"/>
+  </w:num>
+  <w:num w:numId="8" w16cid:durableId="617375938">
+    <w:abstractNumId w:val="3"/>
+  </w:num>
+  <w:num w:numId="9" w16cid:durableId="906109154">
+    <w:abstractNumId w:val="6"/>
+  </w:num>
+  <w:num w:numId="10" w16cid:durableId="1918980926">
+    <w:abstractNumId w:val="5"/>
+  </w:num>
+  <w:num w:numId="11" w16cid:durableId="57017028">
+    <w:abstractNumId w:val="4"/>
+  </w:num>
+  <w:num w:numId="12" w16cid:durableId="1656836019">
+    <w:abstractNumId w:val="11"/>
+  </w:num>
+  <w:num w:numId="13" w16cid:durableId="546725854">
+    <w:abstractNumId w:val="7"/>
+  </w:num>
+</w:numbering>
 </file>
 
 <file path=word/styles.xml><?xml version="1.0" encoding="utf-8"?>
@@ -441,7 +3646,6 @@
     <w:next w:val="Normal"/>
     <w:link w:val="Heading2Char"/>
     <w:uiPriority w:val="9"/>
-    <w:semiHidden/>
     <w:unhideWhenUsed/>
     <w:qFormat/>
     <w:rsid w:val="00D913B6"/>
@@ -616,7 +3820,6 @@
   <w:style w:type="character" w:default="1" w:styleId="DefaultParagraphFont">
     <w:name w:val="Default Paragraph Font"/>
     <w:uiPriority w:val="1"/>
-    <w:semiHidden/>
     <w:unhideWhenUsed/>
   </w:style>
   <w:style w:type="table" w:default="1" w:styleId="TableNormal">
@@ -658,7 +3861,6 @@
     <w:basedOn w:val="DefaultParagraphFont"/>
     <w:link w:val="Heading2"/>
     <w:uiPriority w:val="9"/>
-    <w:semiHidden/>
     <w:rsid w:val="00D913B6"/>
     <w:rPr>
       <w:rFonts w:asciiTheme="majorHAnsi" w:eastAsiaTheme="majorEastAsia" w:hAnsiTheme="majorHAnsi" w:cstheme="majorBidi"/>
@@ -929,6 +4131,15 @@
       <w:color w:val="2F5496" w:themeColor="accent1" w:themeShade="BF"/>
       <w:spacing w:val="5"/>
     </w:rPr>
+  </w:style>
+  <w:style w:type="paragraph" w:styleId="NoSpacing">
+    <w:name w:val="No Spacing"/>
+    <w:uiPriority w:val="1"/>
+    <w:qFormat/>
+    <w:rsid w:val="009828AC"/>
+    <w:pPr>
+      <w:spacing w:after="0" w:line="240" w:lineRule="auto"/>
+    </w:pPr>
   </w:style>
 </w:styles>
 </file>

</xml_diff>

<commit_message>
completed Sine wave test documentation
</commit_message>
<xml_diff>
--- a/PID-Controller-using-OP-AMPS- Hari Mohan 2026A8PS1148H.docx
+++ b/PID-Controller-using-OP-AMPS- Hari Mohan 2026A8PS1148H.docx
@@ -169,8 +169,28 @@
     </w:p>
     <w:p/>
     <w:p>
-      <w:r>
-        <w:t>Circuit Components</w:t>
+      <w:pPr>
+        <w:rPr>
+          <w:b/>
+          <w:bCs/>
+          <w:u w:val="single"/>
+        </w:rPr>
+      </w:pPr>
+      <w:r>
+        <w:rPr>
+          <w:b/>
+          <w:bCs/>
+          <w:u w:val="single"/>
+        </w:rPr>
+        <w:t>C</w:t>
+      </w:r>
+      <w:r>
+        <w:rPr>
+          <w:b/>
+          <w:bCs/>
+          <w:u w:val="single"/>
+        </w:rPr>
+        <w:t>IRCUIT COMPONENTS</w:t>
       </w:r>
     </w:p>
     <w:p>
@@ -247,11 +267,9 @@
       <w:r>
         <w:t>Connecting Wires</w:t>
       </w:r>
-    </w:p>
-    <w:p>
-      <w:pPr>
-        <w:pStyle w:val="ListParagraph"/>
-      </w:pPr>
+      <w:r>
+        <w:br/>
+      </w:r>
     </w:p>
     <w:p>
       <w:pPr>
@@ -327,7 +345,507 @@
         <w:rPr>
           <w:u w:val="single"/>
         </w:rPr>
-        <w:t>Note: R** values are different for each wave test, see the tables under each wave test, R** values have been highlighted in Red.</w:t>
+        <w:t>Note: R** values are different for each wave test, see the tables under each wave test, R** values have been highlighted in Red</w:t>
+      </w:r>
+      <w:r>
+        <w:rPr>
+          <w:u w:val="single"/>
+        </w:rPr>
+        <w:t>.</w:t>
+      </w:r>
+    </w:p>
+    <w:p>
+      <w:pPr>
+        <w:rPr>
+          <w:u w:val="single"/>
+        </w:rPr>
+      </w:pPr>
+    </w:p>
+    <w:p>
+      <w:pPr>
+        <w:rPr>
+          <w:u w:val="single"/>
+        </w:rPr>
+      </w:pPr>
+    </w:p>
+    <w:p>
+      <w:pPr>
+        <w:rPr>
+          <w:u w:val="single"/>
+        </w:rPr>
+      </w:pPr>
+    </w:p>
+    <w:p>
+      <w:pPr>
+        <w:rPr>
+          <w:u w:val="single"/>
+        </w:rPr>
+      </w:pPr>
+      <w:r>
+        <w:rPr>
+          <w:u w:val="single"/>
+        </w:rPr>
+        <w:lastRenderedPageBreak/>
+        <w:t>GENERAL EQUATIONS OF EACH CONTROLLER</w:t>
+      </w:r>
+    </w:p>
+    <w:p>
+      <w:pPr>
+        <w:pStyle w:val="ListParagraph"/>
+        <w:numPr>
+          <w:ilvl w:val="0"/>
+          <w:numId w:val="16"/>
+        </w:numPr>
+      </w:pPr>
+      <w:r>
+        <w:t xml:space="preserve">P Controller: </w:t>
+      </w:r>
+      <w:r>
+        <w:t xml:space="preserve">                </w:t>
+      </w:r>
+      <m:oMath>
+        <m:sSub>
+          <m:sSubPr>
+            <m:ctrlPr>
+              <w:rPr>
+                <w:rFonts w:ascii="Cambria Math" w:hAnsi="Cambria Math"/>
+              </w:rPr>
+            </m:ctrlPr>
+          </m:sSubPr>
+          <m:e>
+            <m:r>
+              <w:rPr>
+                <w:rFonts w:ascii="Cambria Math" w:hAnsi="Cambria Math"/>
+              </w:rPr>
+              <m:t>V</m:t>
+            </m:r>
+          </m:e>
+          <m:sub>
+            <m:r>
+              <w:rPr>
+                <w:rFonts w:ascii="Cambria Math" w:hAnsi="Cambria Math"/>
+              </w:rPr>
+              <m:t>o</m:t>
+            </m:r>
+          </m:sub>
+        </m:sSub>
+        <m:r>
+          <w:rPr>
+            <w:rFonts w:ascii="Cambria Math" w:hAnsi="Cambria Math"/>
+          </w:rPr>
+          <m:t>=-</m:t>
+        </m:r>
+        <m:d>
+          <m:dPr>
+            <m:ctrlPr>
+              <w:rPr>
+                <w:rFonts w:ascii="Cambria Math" w:hAnsi="Cambria Math"/>
+              </w:rPr>
+            </m:ctrlPr>
+          </m:dPr>
+          <m:e>
+            <m:f>
+              <m:fPr>
+                <m:ctrlPr>
+                  <w:rPr>
+                    <w:rFonts w:ascii="Cambria Math" w:hAnsi="Cambria Math"/>
+                  </w:rPr>
+                </m:ctrlPr>
+              </m:fPr>
+              <m:num>
+                <m:sSub>
+                  <m:sSubPr>
+                    <m:ctrlPr>
+                      <w:rPr>
+                        <w:rFonts w:ascii="Cambria Math" w:hAnsi="Cambria Math"/>
+                      </w:rPr>
+                    </m:ctrlPr>
+                  </m:sSubPr>
+                  <m:e>
+                    <m:r>
+                      <w:rPr>
+                        <w:rFonts w:ascii="Cambria Math" w:hAnsi="Cambria Math"/>
+                      </w:rPr>
+                      <m:t>R</m:t>
+                    </m:r>
+                  </m:e>
+                  <m:sub>
+                    <m:r>
+                      <m:rPr>
+                        <m:nor/>
+                      </m:rPr>
+                      <m:t>fb1</m:t>
+                    </m:r>
+                  </m:sub>
+                </m:sSub>
+              </m:num>
+              <m:den>
+                <m:sSub>
+                  <m:sSubPr>
+                    <m:ctrlPr>
+                      <w:rPr>
+                        <w:rFonts w:ascii="Cambria Math" w:hAnsi="Cambria Math"/>
+                      </w:rPr>
+                    </m:ctrlPr>
+                  </m:sSubPr>
+                  <m:e>
+                    <m:r>
+                      <w:rPr>
+                        <w:rFonts w:ascii="Cambria Math" w:hAnsi="Cambria Math"/>
+                      </w:rPr>
+                      <m:t>R</m:t>
+                    </m:r>
+                  </m:e>
+                  <m:sub>
+                    <m:r>
+                      <m:rPr>
+                        <m:nor/>
+                      </m:rPr>
+                      <m:t>in1</m:t>
+                    </m:r>
+                  </m:sub>
+                </m:sSub>
+              </m:den>
+            </m:f>
+          </m:e>
+        </m:d>
+        <m:sSub>
+          <m:sSubPr>
+            <m:ctrlPr>
+              <w:rPr>
+                <w:rFonts w:ascii="Cambria Math" w:hAnsi="Cambria Math"/>
+              </w:rPr>
+            </m:ctrlPr>
+          </m:sSubPr>
+          <m:e>
+            <m:r>
+              <w:rPr>
+                <w:rFonts w:ascii="Cambria Math" w:hAnsi="Cambria Math"/>
+              </w:rPr>
+              <m:t>V</m:t>
+            </m:r>
+          </m:e>
+          <m:sub>
+            <m:r>
+              <m:rPr>
+                <m:nor/>
+              </m:rPr>
+              <m:t>in</m:t>
+            </m:r>
+          </m:sub>
+        </m:sSub>
+      </m:oMath>
+    </w:p>
+    <w:p>
+      <w:pPr>
+        <w:pStyle w:val="ListParagraph"/>
+        <w:numPr>
+          <w:ilvl w:val="0"/>
+          <w:numId w:val="16"/>
+        </w:numPr>
+      </w:pPr>
+      <w:r>
+        <w:t xml:space="preserve">I Controller:                  </w:t>
+      </w:r>
+      <m:oMath>
+        <m:sSub>
+          <m:sSubPr>
+            <m:ctrlPr>
+              <w:rPr>
+                <w:rFonts w:ascii="Cambria Math" w:hAnsi="Cambria Math"/>
+              </w:rPr>
+            </m:ctrlPr>
+          </m:sSubPr>
+          <m:e>
+            <m:r>
+              <w:rPr>
+                <w:rFonts w:ascii="Cambria Math" w:hAnsi="Cambria Math"/>
+              </w:rPr>
+              <m:t>V</m:t>
+            </m:r>
+          </m:e>
+          <m:sub>
+            <m:r>
+              <w:rPr>
+                <w:rFonts w:ascii="Cambria Math" w:hAnsi="Cambria Math"/>
+              </w:rPr>
+              <m:t>o</m:t>
+            </m:r>
+          </m:sub>
+        </m:sSub>
+        <m:r>
+          <w:rPr>
+            <w:rFonts w:ascii="Cambria Math" w:hAnsi="Cambria Math"/>
+          </w:rPr>
+          <m:t>=-</m:t>
+        </m:r>
+        <m:f>
+          <m:fPr>
+            <m:ctrlPr>
+              <w:rPr>
+                <w:rFonts w:ascii="Cambria Math" w:hAnsi="Cambria Math"/>
+              </w:rPr>
+            </m:ctrlPr>
+          </m:fPr>
+          <m:num>
+            <m:r>
+              <w:rPr>
+                <w:rFonts w:ascii="Cambria Math" w:hAnsi="Cambria Math"/>
+              </w:rPr>
+              <m:t>1</m:t>
+            </m:r>
+          </m:num>
+          <m:den>
+            <m:sSub>
+              <m:sSubPr>
+                <m:ctrlPr>
+                  <w:rPr>
+                    <w:rFonts w:ascii="Cambria Math" w:hAnsi="Cambria Math"/>
+                  </w:rPr>
+                </m:ctrlPr>
+              </m:sSubPr>
+              <m:e>
+                <m:r>
+                  <w:rPr>
+                    <w:rFonts w:ascii="Cambria Math" w:hAnsi="Cambria Math"/>
+                  </w:rPr>
+                  <m:t>R</m:t>
+                </m:r>
+              </m:e>
+              <m:sub>
+                <m:r>
+                  <m:rPr>
+                    <m:nor/>
+                  </m:rPr>
+                  <m:t>in2</m:t>
+                </m:r>
+              </m:sub>
+            </m:sSub>
+            <m:sSub>
+              <m:sSubPr>
+                <m:ctrlPr>
+                  <w:rPr>
+                    <w:rFonts w:ascii="Cambria Math" w:hAnsi="Cambria Math"/>
+                  </w:rPr>
+                </m:ctrlPr>
+              </m:sSubPr>
+              <m:e>
+                <m:r>
+                  <w:rPr>
+                    <w:rFonts w:ascii="Cambria Math" w:hAnsi="Cambria Math"/>
+                  </w:rPr>
+                  <m:t>C</m:t>
+                </m:r>
+              </m:e>
+              <m:sub>
+                <m:r>
+                  <m:rPr>
+                    <m:nor/>
+                  </m:rPr>
+                  <m:t>fb</m:t>
+                </m:r>
+              </m:sub>
+            </m:sSub>
+          </m:den>
+        </m:f>
+        <m:nary>
+          <m:naryPr>
+            <m:limLoc m:val="subSup"/>
+            <m:subHide m:val="1"/>
+            <m:supHide m:val="1"/>
+            <m:ctrlPr>
+              <w:rPr>
+                <w:rFonts w:ascii="Cambria Math" w:hAnsi="Cambria Math"/>
+              </w:rPr>
+            </m:ctrlPr>
+          </m:naryPr>
+          <m:sub/>
+          <m:sup/>
+          <m:e>
+            <m:sSub>
+              <m:sSubPr>
+                <m:ctrlPr>
+                  <w:rPr>
+                    <w:rFonts w:ascii="Cambria Math" w:hAnsi="Cambria Math"/>
+                  </w:rPr>
+                </m:ctrlPr>
+              </m:sSubPr>
+              <m:e>
+                <m:r>
+                  <w:rPr>
+                    <w:rFonts w:ascii="Cambria Math" w:hAnsi="Cambria Math"/>
+                  </w:rPr>
+                  <m:t>V</m:t>
+                </m:r>
+              </m:e>
+              <m:sub>
+                <m:r>
+                  <m:rPr>
+                    <m:nor/>
+                  </m:rPr>
+                  <m:t>in</m:t>
+                </m:r>
+              </m:sub>
+            </m:sSub>
+          </m:e>
+        </m:nary>
+        <m:r>
+          <w:rPr>
+            <w:rFonts w:ascii="Cambria Math" w:hAnsi="Cambria Math"/>
+          </w:rPr>
+          <m:t> dt</m:t>
+        </m:r>
+      </m:oMath>
+    </w:p>
+    <w:p>
+      <w:pPr>
+        <w:pStyle w:val="ListParagraph"/>
+        <w:numPr>
+          <w:ilvl w:val="0"/>
+          <w:numId w:val="16"/>
+        </w:numPr>
+      </w:pPr>
+      <w:r>
+        <w:t xml:space="preserve">D Controller:                </w:t>
+      </w:r>
+      <m:oMath>
+        <m:sSub>
+          <m:sSubPr>
+            <m:ctrlPr>
+              <w:rPr>
+                <w:rFonts w:ascii="Cambria Math" w:hAnsi="Cambria Math"/>
+              </w:rPr>
+            </m:ctrlPr>
+          </m:sSubPr>
+          <m:e>
+            <m:r>
+              <w:rPr>
+                <w:rFonts w:ascii="Cambria Math" w:hAnsi="Cambria Math"/>
+              </w:rPr>
+              <m:t>V</m:t>
+            </m:r>
+          </m:e>
+          <m:sub>
+            <m:r>
+              <w:rPr>
+                <w:rFonts w:ascii="Cambria Math" w:hAnsi="Cambria Math"/>
+              </w:rPr>
+              <m:t>o</m:t>
+            </m:r>
+          </m:sub>
+        </m:sSub>
+        <m:r>
+          <w:rPr>
+            <w:rFonts w:ascii="Cambria Math" w:hAnsi="Cambria Math"/>
+          </w:rPr>
+          <m:t>=-</m:t>
+        </m:r>
+        <m:sSub>
+          <m:sSubPr>
+            <m:ctrlPr>
+              <w:rPr>
+                <w:rFonts w:ascii="Cambria Math" w:hAnsi="Cambria Math"/>
+              </w:rPr>
+            </m:ctrlPr>
+          </m:sSubPr>
+          <m:e>
+            <m:r>
+              <w:rPr>
+                <w:rFonts w:ascii="Cambria Math" w:hAnsi="Cambria Math"/>
+              </w:rPr>
+              <m:t>R</m:t>
+            </m:r>
+          </m:e>
+          <m:sub>
+            <m:r>
+              <m:rPr>
+                <m:nor/>
+              </m:rPr>
+              <m:t>fb3</m:t>
+            </m:r>
+          </m:sub>
+        </m:sSub>
+        <m:sSub>
+          <m:sSubPr>
+            <m:ctrlPr>
+              <w:rPr>
+                <w:rFonts w:ascii="Cambria Math" w:hAnsi="Cambria Math"/>
+              </w:rPr>
+            </m:ctrlPr>
+          </m:sSubPr>
+          <m:e>
+            <m:r>
+              <w:rPr>
+                <w:rFonts w:ascii="Cambria Math" w:hAnsi="Cambria Math"/>
+              </w:rPr>
+              <m:t>C</m:t>
+            </m:r>
+          </m:e>
+          <m:sub>
+            <m:r>
+              <m:rPr>
+                <m:nor/>
+              </m:rPr>
+              <m:t>in</m:t>
+            </m:r>
+          </m:sub>
+        </m:sSub>
+        <m:f>
+          <m:fPr>
+            <m:ctrlPr>
+              <w:rPr>
+                <w:rFonts w:ascii="Cambria Math" w:hAnsi="Cambria Math"/>
+              </w:rPr>
+            </m:ctrlPr>
+          </m:fPr>
+          <m:num>
+            <m:r>
+              <w:rPr>
+                <w:rFonts w:ascii="Cambria Math" w:hAnsi="Cambria Math"/>
+              </w:rPr>
+              <m:t>d</m:t>
+            </m:r>
+            <m:sSub>
+              <m:sSubPr>
+                <m:ctrlPr>
+                  <w:rPr>
+                    <w:rFonts w:ascii="Cambria Math" w:hAnsi="Cambria Math"/>
+                  </w:rPr>
+                </m:ctrlPr>
+              </m:sSubPr>
+              <m:e>
+                <m:r>
+                  <w:rPr>
+                    <w:rFonts w:ascii="Cambria Math" w:hAnsi="Cambria Math"/>
+                  </w:rPr>
+                  <m:t>V</m:t>
+                </m:r>
+              </m:e>
+              <m:sub>
+                <m:r>
+                  <m:rPr>
+                    <m:nor/>
+                  </m:rPr>
+                  <m:t>in</m:t>
+                </m:r>
+              </m:sub>
+            </m:sSub>
+          </m:num>
+          <m:den>
+            <m:r>
+              <w:rPr>
+                <w:rFonts w:ascii="Cambria Math" w:hAnsi="Cambria Math"/>
+              </w:rPr>
+              <m:t>dt</m:t>
+            </m:r>
+          </m:den>
+        </m:f>
+      </m:oMath>
+      <w:r>
+        <w:rPr>
+          <w:rFonts w:eastAsiaTheme="minorEastAsia"/>
+        </w:rPr>
+        <w:br/>
       </w:r>
     </w:p>
     <w:p>
@@ -339,6 +857,7 @@
         <w:rPr>
           <w:sz w:val="32"/>
           <w:szCs w:val="32"/>
+          <w:u w:val="single"/>
         </w:rPr>
       </w:pPr>
       <w:r>
@@ -347,8 +866,8 @@
           <w:bCs/>
           <w:sz w:val="32"/>
           <w:szCs w:val="32"/>
+          <w:u w:val="single"/>
         </w:rPr>
-        <w:lastRenderedPageBreak/>
         <w:t>Sine Wave Test:</w:t>
       </w:r>
     </w:p>
@@ -396,49 +915,69 @@
         <w:t>Function Type: Sine</w:t>
       </w:r>
     </w:p>
-    <w:p/>
-    <w:p>
-      <w:r>
-        <w:t>NOTE THE AMPLITUDE VALUE PUT INTO THE FUNCTION GENERATOR IN TINKER CAD MEASURE THE FULL HEIGHT OF THE WAY WHICH COMPARED TO CONVENTIONAL DEFINITON OF AMPLITUDE WILL EQUALT TO 2A (PEAK TO PEAK)</w:t>
-      </w:r>
-    </w:p>
-    <w:p/>
-    <w:p>
-      <w:proofErr w:type="gramStart"/>
-      <w:r>
-        <w:t>THUS</w:t>
-      </w:r>
-      <w:proofErr w:type="gramEnd"/>
-      <w:r>
-        <w:t xml:space="preserve"> PUTTING AMPLITUDE AS V, OUTPUTS A WAVE OP AMPLITUDE AXIS TO PEAK OF 2V </w:t>
-      </w:r>
-    </w:p>
-    <w:p/>
-    <w:p/>
-    <w:p/>
-    <w:p/>
-    <w:p/>
-    <w:p/>
-    <w:p/>
-    <w:p>
-      <w:r>
-        <w:t>CIRCUIT SPECIFICS</w:t>
-      </w:r>
-    </w:p>
-    <w:p>
-      <w:r>
-        <w:t xml:space="preserve">INPUT VOLTAGE +12, -12, 0 GROUND </w:t>
-      </w:r>
-    </w:p>
-    <w:p>
-      <w:r>
-        <w:t>SINE WAVE</w:t>
+    <w:p>
+      <w:pPr>
+        <w:numPr>
+          <w:ilvl w:val="1"/>
+          <w:numId w:val="13"/>
+        </w:numPr>
+      </w:pPr>
+      <w:r>
+        <w:t>Vin = 2Sin200</w:t>
+      </w:r>
+      <w:r>
+        <w:t>π</w:t>
+      </w:r>
+      <w:r>
+        <w:t>t</w:t>
+      </w:r>
+      <w:r>
+        <w:br/>
+      </w:r>
+    </w:p>
+    <w:p>
+      <w:pPr>
+        <w:rPr>
+          <w:u w:val="single"/>
+        </w:rPr>
+      </w:pPr>
+      <w:r>
+        <w:rPr>
+          <w:u w:val="single"/>
+        </w:rPr>
+        <w:t xml:space="preserve">Tinker Cad Link: </w:t>
+      </w:r>
+    </w:p>
+    <w:p>
+      <w:hyperlink r:id="rId6" w:history="1">
+        <w:r>
+          <w:rPr>
+            <w:rStyle w:val="Hyperlink"/>
+          </w:rPr>
+          <w:t>https://www.tinkercad.com/things/7pLT7ZwJvSK-sine-wave-test-pid-using-op-amps?sharecode=Y0dhuDTfMtLGkQgUxdCAVcYEuKSC0x8eQNOmDoOD-zA</w:t>
+        </w:r>
+      </w:hyperlink>
+      <w:r>
+        <w:br/>
+      </w:r>
+    </w:p>
+    <w:p>
+      <w:pPr>
+        <w:rPr>
+          <w:u w:val="single"/>
+        </w:rPr>
+      </w:pPr>
+      <w:r>
+        <w:rPr>
+          <w:u w:val="single"/>
+        </w:rPr>
+        <w:t>Component Values:</w:t>
       </w:r>
     </w:p>
     <w:tbl>
       <w:tblPr>
         <w:tblStyle w:val="GridTable4-Accent5"/>
-        <w:tblpPr w:leftFromText="180" w:rightFromText="180" w:vertAnchor="text" w:horzAnchor="margin" w:tblpXSpec="center" w:tblpY="484"/>
+        <w:tblpPr w:leftFromText="180" w:rightFromText="180" w:vertAnchor="text" w:horzAnchor="margin" w:tblpY="377"/>
         <w:tblW w:w="10920" w:type="dxa"/>
         <w:tblLook w:val="04A0" w:firstRow="1" w:lastRow="0" w:firstColumn="1" w:lastColumn="0" w:noHBand="0" w:noVBand="1"/>
       </w:tblPr>
@@ -1813,6 +2352,667 @@
         </w:tc>
       </w:tr>
     </w:tbl>
+    <w:p>
+      <w:r>
+        <w:drawing>
+          <wp:anchor distT="0" distB="0" distL="114300" distR="114300" simplePos="0" relativeHeight="251662336" behindDoc="1" locked="0" layoutInCell="1" allowOverlap="1" wp14:anchorId="2E6B3027" wp14:editId="2151D72C">
+            <wp:simplePos x="0" y="0"/>
+            <wp:positionH relativeFrom="margin">
+              <wp:posOffset>4334510</wp:posOffset>
+            </wp:positionH>
+            <wp:positionV relativeFrom="paragraph">
+              <wp:posOffset>1980924</wp:posOffset>
+            </wp:positionV>
+            <wp:extent cx="2311400" cy="2311400"/>
+            <wp:effectExtent l="0" t="0" r="0" b="0"/>
+            <wp:wrapNone/>
+            <wp:docPr id="1618470668" name="Picture 1"/>
+            <wp:cNvGraphicFramePr>
+              <a:graphicFrameLocks xmlns:a="http://schemas.openxmlformats.org/drawingml/2006/main" noChangeAspect="1"/>
+            </wp:cNvGraphicFramePr>
+            <a:graphic xmlns:a="http://schemas.openxmlformats.org/drawingml/2006/main">
+              <a:graphicData uri="http://schemas.openxmlformats.org/drawingml/2006/picture">
+                <pic:pic xmlns:pic="http://schemas.openxmlformats.org/drawingml/2006/picture">
+                  <pic:nvPicPr>
+                    <pic:cNvPr id="1618470668" name=""/>
+                    <pic:cNvPicPr/>
+                  </pic:nvPicPr>
+                  <pic:blipFill>
+                    <a:blip r:embed="rId7">
+                      <a:extLst>
+                        <a:ext uri="{28A0092B-C50C-407E-A947-70E740481C1C}">
+                          <a14:useLocalDpi xmlns:a14="http://schemas.microsoft.com/office/drawing/2010/main" val="0"/>
+                        </a:ext>
+                      </a:extLst>
+                    </a:blip>
+                    <a:stretch>
+                      <a:fillRect/>
+                    </a:stretch>
+                  </pic:blipFill>
+                  <pic:spPr>
+                    <a:xfrm>
+                      <a:off x="0" y="0"/>
+                      <a:ext cx="2311400" cy="2311400"/>
+                    </a:xfrm>
+                    <a:prstGeom prst="rect">
+                      <a:avLst/>
+                    </a:prstGeom>
+                  </pic:spPr>
+                </pic:pic>
+              </a:graphicData>
+            </a:graphic>
+            <wp14:sizeRelH relativeFrom="page">
+              <wp14:pctWidth>0</wp14:pctWidth>
+            </wp14:sizeRelH>
+            <wp14:sizeRelV relativeFrom="page">
+              <wp14:pctHeight>0</wp14:pctHeight>
+            </wp14:sizeRelV>
+          </wp:anchor>
+        </w:drawing>
+      </w:r>
+      <w:r>
+        <w:br/>
+      </w:r>
+      <w:r>
+        <w:br/>
+      </w:r>
+    </w:p>
+    <w:p/>
+    <w:p>
+      <w:pPr>
+        <w:pStyle w:val="ListParagraph"/>
+        <w:numPr>
+          <w:ilvl w:val="0"/>
+          <w:numId w:val="17"/>
+        </w:numPr>
+        <w:rPr>
+          <w:b/>
+          <w:bCs/>
+          <w:u w:val="single"/>
+        </w:rPr>
+      </w:pPr>
+      <w:r>
+        <w:rPr>
+          <w:b/>
+          <w:bCs/>
+          <w:u w:val="single"/>
+        </w:rPr>
+        <w:t>Proportional Control Output</w:t>
+      </w:r>
+    </w:p>
+    <w:p>
+      <w:pPr>
+        <w:pStyle w:val="ListParagraph"/>
+      </w:pPr>
+      <w:r>
+        <w:t>Voltage Gain = -(15/5) = 3</w:t>
+      </w:r>
+    </w:p>
+    <w:p>
+      <w:pPr>
+        <w:pStyle w:val="ListParagraph"/>
+      </w:pPr>
+      <w:r>
+        <w:t>Output wave form equation =</w:t>
+      </w:r>
+      <w:r>
+        <w:t xml:space="preserve"> -6Sin200</w:t>
+      </w:r>
+      <w:r>
+        <w:t>π</w:t>
+      </w:r>
+      <w:r>
+        <w:t>t</w:t>
+      </w:r>
+    </w:p>
+    <w:p>
+      <w:pPr>
+        <w:pStyle w:val="ListParagraph"/>
+      </w:pPr>
+      <w:r>
+        <w:t>Output waveform’s amplitude is thrice that of input</w:t>
+      </w:r>
+    </w:p>
+    <w:p>
+      <w:pPr>
+        <w:pStyle w:val="ListParagraph"/>
+      </w:pPr>
+      <w:r>
+        <w:t>waveform. further, the output waveform is flipped upside</w:t>
+      </w:r>
+    </w:p>
+    <w:p>
+      <w:pPr>
+        <w:pStyle w:val="ListParagraph"/>
+      </w:pPr>
+      <w:r>
+        <w:t>down i.e., there is a phase difference of 180 between</w:t>
+      </w:r>
+    </w:p>
+    <w:p>
+      <w:pPr>
+        <w:pStyle w:val="ListParagraph"/>
+      </w:pPr>
+      <w:r>
+        <w:t>input and output wave.</w:t>
+      </w:r>
+    </w:p>
+    <w:p/>
+    <w:p/>
+    <w:p/>
+    <w:p/>
+    <w:p>
+      <w:pPr>
+        <w:pStyle w:val="ListParagraph"/>
+      </w:pPr>
+      <w:r>
+        <w:drawing>
+          <wp:anchor distT="0" distB="0" distL="114300" distR="114300" simplePos="0" relativeHeight="251663360" behindDoc="1" locked="0" layoutInCell="1" allowOverlap="1" wp14:anchorId="5B0A529C" wp14:editId="3311C531">
+            <wp:simplePos x="0" y="0"/>
+            <wp:positionH relativeFrom="margin">
+              <wp:align>right</wp:align>
+            </wp:positionH>
+            <wp:positionV relativeFrom="paragraph">
+              <wp:posOffset>170815</wp:posOffset>
+            </wp:positionV>
+            <wp:extent cx="2292350" cy="2292350"/>
+            <wp:effectExtent l="0" t="0" r="0" b="0"/>
+            <wp:wrapNone/>
+            <wp:docPr id="1741302301" name="Picture 1"/>
+            <wp:cNvGraphicFramePr>
+              <a:graphicFrameLocks xmlns:a="http://schemas.openxmlformats.org/drawingml/2006/main" noChangeAspect="1"/>
+            </wp:cNvGraphicFramePr>
+            <a:graphic xmlns:a="http://schemas.openxmlformats.org/drawingml/2006/main">
+              <a:graphicData uri="http://schemas.openxmlformats.org/drawingml/2006/picture">
+                <pic:pic xmlns:pic="http://schemas.openxmlformats.org/drawingml/2006/picture">
+                  <pic:nvPicPr>
+                    <pic:cNvPr id="1741302301" name=""/>
+                    <pic:cNvPicPr/>
+                  </pic:nvPicPr>
+                  <pic:blipFill>
+                    <a:blip r:embed="rId8">
+                      <a:extLst>
+                        <a:ext uri="{28A0092B-C50C-407E-A947-70E740481C1C}">
+                          <a14:useLocalDpi xmlns:a14="http://schemas.microsoft.com/office/drawing/2010/main" val="0"/>
+                        </a:ext>
+                      </a:extLst>
+                    </a:blip>
+                    <a:stretch>
+                      <a:fillRect/>
+                    </a:stretch>
+                  </pic:blipFill>
+                  <pic:spPr>
+                    <a:xfrm>
+                      <a:off x="0" y="0"/>
+                      <a:ext cx="2292350" cy="2292350"/>
+                    </a:xfrm>
+                    <a:prstGeom prst="rect">
+                      <a:avLst/>
+                    </a:prstGeom>
+                  </pic:spPr>
+                </pic:pic>
+              </a:graphicData>
+            </a:graphic>
+            <wp14:sizeRelH relativeFrom="page">
+              <wp14:pctWidth>0</wp14:pctWidth>
+            </wp14:sizeRelH>
+            <wp14:sizeRelV relativeFrom="page">
+              <wp14:pctHeight>0</wp14:pctHeight>
+            </wp14:sizeRelV>
+          </wp:anchor>
+        </w:drawing>
+      </w:r>
+      <w:r>
+        <w:br/>
+      </w:r>
+      <w:r>
+        <w:br/>
+      </w:r>
+    </w:p>
+    <w:p>
+      <w:pPr>
+        <w:pStyle w:val="ListParagraph"/>
+        <w:numPr>
+          <w:ilvl w:val="0"/>
+          <w:numId w:val="17"/>
+        </w:numPr>
+        <w:rPr>
+          <w:b/>
+          <w:bCs/>
+          <w:u w:val="single"/>
+        </w:rPr>
+      </w:pPr>
+      <w:r>
+        <w:rPr>
+          <w:b/>
+          <w:bCs/>
+          <w:u w:val="single"/>
+        </w:rPr>
+        <w:t>Integral Control Output</w:t>
+      </w:r>
+    </w:p>
+    <w:p>
+      <w:pPr>
+        <w:pStyle w:val="ListParagraph"/>
+      </w:pPr>
+      <w:r>
+        <w:t>Output wave form equation = 10.61</w:t>
+      </w:r>
+      <w:r>
+        <w:t xml:space="preserve"> </w:t>
+      </w:r>
+      <w:r>
+        <w:t>Cos200</w:t>
+      </w:r>
+      <w:r>
+        <w:t>π</w:t>
+      </w:r>
+      <w:r>
+        <w:t>t</w:t>
+      </w:r>
+    </w:p>
+    <w:p>
+      <w:pPr>
+        <w:pStyle w:val="ListParagraph"/>
+      </w:pPr>
+      <w:r>
+        <w:t xml:space="preserve">Output waveform’s amplitude is almost 5 times input </w:t>
+      </w:r>
+    </w:p>
+    <w:p>
+      <w:pPr>
+        <w:pStyle w:val="ListParagraph"/>
+      </w:pPr>
+      <w:r>
+        <w:t xml:space="preserve">waveform. further, output waveform leads by </w:t>
+      </w:r>
+      <w:r>
+        <w:t xml:space="preserve">phase </w:t>
+      </w:r>
+    </w:p>
+    <w:p>
+      <w:pPr>
+        <w:pStyle w:val="ListParagraph"/>
+      </w:pPr>
+      <w:r>
+        <w:t>difference</w:t>
+      </w:r>
+      <w:r>
+        <w:t xml:space="preserve"> of</w:t>
+      </w:r>
+      <w:r>
+        <w:t xml:space="preserve"> </w:t>
+      </w:r>
+      <w:r>
+        <w:t>90</w:t>
+      </w:r>
+      <w:r>
+        <w:br/>
+      </w:r>
+    </w:p>
+    <w:p>
+      <w:pPr>
+        <w:pStyle w:val="ListParagraph"/>
+      </w:pPr>
+    </w:p>
+    <w:p>
+      <w:pPr>
+        <w:pStyle w:val="ListParagraph"/>
+      </w:pPr>
+    </w:p>
+    <w:p>
+      <w:pPr>
+        <w:pStyle w:val="ListParagraph"/>
+      </w:pPr>
+    </w:p>
+    <w:p>
+      <w:pPr>
+        <w:pStyle w:val="ListParagraph"/>
+      </w:pPr>
+      <w:r>
+        <w:br/>
+      </w:r>
+      <w:r>
+        <w:br/>
+      </w:r>
+    </w:p>
+    <w:p>
+      <w:pPr>
+        <w:pStyle w:val="ListParagraph"/>
+      </w:pPr>
+    </w:p>
+    <w:p>
+      <w:pPr>
+        <w:pStyle w:val="ListParagraph"/>
+      </w:pPr>
+      <w:r>
+        <w:drawing>
+          <wp:anchor distT="0" distB="0" distL="114300" distR="114300" simplePos="0" relativeHeight="251664384" behindDoc="1" locked="0" layoutInCell="1" allowOverlap="1" wp14:anchorId="6BFE69C5" wp14:editId="402E660D">
+            <wp:simplePos x="0" y="0"/>
+            <wp:positionH relativeFrom="margin">
+              <wp:posOffset>4375150</wp:posOffset>
+            </wp:positionH>
+            <wp:positionV relativeFrom="paragraph">
+              <wp:posOffset>59386</wp:posOffset>
+            </wp:positionV>
+            <wp:extent cx="2268220" cy="2293254"/>
+            <wp:effectExtent l="0" t="0" r="0" b="0"/>
+            <wp:wrapNone/>
+            <wp:docPr id="920456701" name="Picture 1"/>
+            <wp:cNvGraphicFramePr>
+              <a:graphicFrameLocks xmlns:a="http://schemas.openxmlformats.org/drawingml/2006/main" noChangeAspect="1"/>
+            </wp:cNvGraphicFramePr>
+            <a:graphic xmlns:a="http://schemas.openxmlformats.org/drawingml/2006/main">
+              <a:graphicData uri="http://schemas.openxmlformats.org/drawingml/2006/picture">
+                <pic:pic xmlns:pic="http://schemas.openxmlformats.org/drawingml/2006/picture">
+                  <pic:nvPicPr>
+                    <pic:cNvPr id="920456701" name=""/>
+                    <pic:cNvPicPr/>
+                  </pic:nvPicPr>
+                  <pic:blipFill>
+                    <a:blip r:embed="rId9">
+                      <a:extLst>
+                        <a:ext uri="{28A0092B-C50C-407E-A947-70E740481C1C}">
+                          <a14:useLocalDpi xmlns:a14="http://schemas.microsoft.com/office/drawing/2010/main" val="0"/>
+                        </a:ext>
+                      </a:extLst>
+                    </a:blip>
+                    <a:stretch>
+                      <a:fillRect/>
+                    </a:stretch>
+                  </pic:blipFill>
+                  <pic:spPr>
+                    <a:xfrm>
+                      <a:off x="0" y="0"/>
+                      <a:ext cx="2268220" cy="2293254"/>
+                    </a:xfrm>
+                    <a:prstGeom prst="rect">
+                      <a:avLst/>
+                    </a:prstGeom>
+                  </pic:spPr>
+                </pic:pic>
+              </a:graphicData>
+            </a:graphic>
+            <wp14:sizeRelH relativeFrom="page">
+              <wp14:pctWidth>0</wp14:pctWidth>
+            </wp14:sizeRelH>
+            <wp14:sizeRelV relativeFrom="page">
+              <wp14:pctHeight>0</wp14:pctHeight>
+            </wp14:sizeRelV>
+          </wp:anchor>
+        </w:drawing>
+      </w:r>
+    </w:p>
+    <w:p>
+      <w:pPr>
+        <w:pStyle w:val="ListParagraph"/>
+        <w:numPr>
+          <w:ilvl w:val="0"/>
+          <w:numId w:val="17"/>
+        </w:numPr>
+        <w:rPr>
+          <w:b/>
+          <w:bCs/>
+          <w:u w:val="single"/>
+        </w:rPr>
+      </w:pPr>
+      <w:r>
+        <w:rPr>
+          <w:b/>
+          <w:bCs/>
+          <w:u w:val="single"/>
+        </w:rPr>
+        <w:t xml:space="preserve">Derivative </w:t>
+      </w:r>
+      <w:r>
+        <w:rPr>
+          <w:b/>
+          <w:bCs/>
+          <w:u w:val="single"/>
+        </w:rPr>
+        <w:t>Control</w:t>
+      </w:r>
+      <w:r>
+        <w:rPr>
+          <w:b/>
+          <w:bCs/>
+          <w:u w:val="single"/>
+        </w:rPr>
+        <w:t xml:space="preserve"> Output</w:t>
+      </w:r>
+    </w:p>
+    <w:p>
+      <w:pPr>
+        <w:pStyle w:val="ListParagraph"/>
+      </w:pPr>
+      <w:r>
+        <w:t xml:space="preserve">Output wave form equation = -   -10.05 </w:t>
+      </w:r>
+      <w:r>
+        <w:t>Cos200</w:t>
+      </w:r>
+      <w:r>
+        <w:t>π</w:t>
+      </w:r>
+      <w:r>
+        <w:t>t</w:t>
+      </w:r>
+    </w:p>
+    <w:p>
+      <w:pPr>
+        <w:pStyle w:val="ListParagraph"/>
+      </w:pPr>
+      <w:r>
+        <w:t xml:space="preserve">Output waveform’s amplitude is almost 5 times of </w:t>
+      </w:r>
+    </w:p>
+    <w:p>
+      <w:pPr>
+        <w:pStyle w:val="ListParagraph"/>
+      </w:pPr>
+      <w:r>
+        <w:t xml:space="preserve">input waveform. Further, output wave form lags by a </w:t>
+      </w:r>
+    </w:p>
+    <w:p>
+      <w:pPr>
+        <w:pStyle w:val="ListParagraph"/>
+      </w:pPr>
+      <w:r>
+        <w:t>phase difference of 90.</w:t>
+      </w:r>
+    </w:p>
+    <w:p>
+      <w:pPr>
+        <w:pStyle w:val="ListParagraph"/>
+      </w:pPr>
+    </w:p>
+    <w:p>
+      <w:pPr>
+        <w:pStyle w:val="ListParagraph"/>
+      </w:pPr>
+      <w:r>
+        <w:t xml:space="preserve">Note: Noise in the graph exists, it can be reduced by </w:t>
+      </w:r>
+    </w:p>
+    <w:p>
+      <w:pPr>
+        <w:pStyle w:val="ListParagraph"/>
+      </w:pPr>
+      <w:r>
+        <w:t>increasing the value of R-in3, which will smoothen</w:t>
+      </w:r>
+    </w:p>
+    <w:p>
+      <w:pPr>
+        <w:pStyle w:val="ListParagraph"/>
+      </w:pPr>
+      <w:r>
+        <w:t xml:space="preserve">out the curve. </w:t>
+      </w:r>
+    </w:p>
+    <w:p>
+      <w:pPr>
+        <w:pStyle w:val="ListParagraph"/>
+      </w:pPr>
+    </w:p>
+    <w:p>
+      <w:r>
+        <w:br/>
+      </w:r>
+      <w:r>
+        <w:br/>
+      </w:r>
+      <w:r>
+        <w:br/>
+      </w:r>
+    </w:p>
+    <w:p>
+      <w:pPr>
+        <w:pStyle w:val="ListParagraph"/>
+        <w:numPr>
+          <w:ilvl w:val="0"/>
+          <w:numId w:val="17"/>
+        </w:numPr>
+        <w:rPr>
+          <w:b/>
+          <w:bCs/>
+          <w:u w:val="single"/>
+        </w:rPr>
+      </w:pPr>
+      <w:r>
+        <w:rPr>
+          <w:b/>
+          <w:bCs/>
+          <w:u w:val="single"/>
+        </w:rPr>
+        <w:drawing>
+          <wp:anchor distT="0" distB="0" distL="114300" distR="114300" simplePos="0" relativeHeight="251665408" behindDoc="1" locked="0" layoutInCell="1" allowOverlap="1" wp14:anchorId="28227348" wp14:editId="5989F810">
+            <wp:simplePos x="0" y="0"/>
+            <wp:positionH relativeFrom="margin">
+              <wp:align>right</wp:align>
+            </wp:positionH>
+            <wp:positionV relativeFrom="paragraph">
+              <wp:posOffset>43401</wp:posOffset>
+            </wp:positionV>
+            <wp:extent cx="2208915" cy="2273300"/>
+            <wp:effectExtent l="0" t="0" r="1270" b="0"/>
+            <wp:wrapNone/>
+            <wp:docPr id="1418747527" name="Picture 1"/>
+            <wp:cNvGraphicFramePr>
+              <a:graphicFrameLocks xmlns:a="http://schemas.openxmlformats.org/drawingml/2006/main" noChangeAspect="1"/>
+            </wp:cNvGraphicFramePr>
+            <a:graphic xmlns:a="http://schemas.openxmlformats.org/drawingml/2006/main">
+              <a:graphicData uri="http://schemas.openxmlformats.org/drawingml/2006/picture">
+                <pic:pic xmlns:pic="http://schemas.openxmlformats.org/drawingml/2006/picture">
+                  <pic:nvPicPr>
+                    <pic:cNvPr id="1418747527" name=""/>
+                    <pic:cNvPicPr/>
+                  </pic:nvPicPr>
+                  <pic:blipFill>
+                    <a:blip r:embed="rId10">
+                      <a:extLst>
+                        <a:ext uri="{28A0092B-C50C-407E-A947-70E740481C1C}">
+                          <a14:useLocalDpi xmlns:a14="http://schemas.microsoft.com/office/drawing/2010/main" val="0"/>
+                        </a:ext>
+                      </a:extLst>
+                    </a:blip>
+                    <a:stretch>
+                      <a:fillRect/>
+                    </a:stretch>
+                  </pic:blipFill>
+                  <pic:spPr>
+                    <a:xfrm>
+                      <a:off x="0" y="0"/>
+                      <a:ext cx="2208915" cy="2273300"/>
+                    </a:xfrm>
+                    <a:prstGeom prst="rect">
+                      <a:avLst/>
+                    </a:prstGeom>
+                  </pic:spPr>
+                </pic:pic>
+              </a:graphicData>
+            </a:graphic>
+            <wp14:sizeRelH relativeFrom="page">
+              <wp14:pctWidth>0</wp14:pctWidth>
+            </wp14:sizeRelH>
+            <wp14:sizeRelV relativeFrom="page">
+              <wp14:pctHeight>0</wp14:pctHeight>
+            </wp14:sizeRelV>
+          </wp:anchor>
+        </w:drawing>
+      </w:r>
+      <w:r>
+        <w:rPr>
+          <w:b/>
+          <w:bCs/>
+          <w:u w:val="single"/>
+        </w:rPr>
+        <w:t>Net PID Output after Summation</w:t>
+      </w:r>
+    </w:p>
+    <w:p>
+      <w:pPr>
+        <w:pStyle w:val="ListParagraph"/>
+      </w:pPr>
+      <w:r>
+        <w:t xml:space="preserve">Output wave form is superposition of all previous </w:t>
+      </w:r>
+    </w:p>
+    <w:p>
+      <w:pPr>
+        <w:pStyle w:val="ListParagraph"/>
+      </w:pPr>
+      <w:r>
+        <w:t xml:space="preserve">equations. Equation will be equal to algebraic sum of </w:t>
+      </w:r>
+    </w:p>
+    <w:p>
+      <w:pPr>
+        <w:pStyle w:val="ListParagraph"/>
+      </w:pPr>
+      <w:r>
+        <w:t>all previous output wave equations</w:t>
+      </w:r>
+    </w:p>
+    <w:p>
+      <w:pPr>
+        <w:pStyle w:val="ListParagraph"/>
+      </w:pPr>
+    </w:p>
+    <w:p>
+      <w:pPr>
+        <w:pStyle w:val="ListParagraph"/>
+      </w:pPr>
+      <w:r>
+        <w:t>Note: Noise is due to noise in the derivative control output</w:t>
+      </w:r>
+    </w:p>
+    <w:p/>
+    <w:p/>
+    <w:p/>
+    <w:p/>
+    <w:p/>
+    <w:p/>
+    <w:p/>
+    <w:p/>
+    <w:p/>
+    <w:p/>
+    <w:p/>
+    <w:p/>
+    <w:p/>
+    <w:p/>
+    <w:p/>
+    <w:p/>
+    <w:p/>
+    <w:p/>
+    <w:p/>
+    <w:p/>
+    <w:p/>
+    <w:p/>
+    <w:p/>
+    <w:p/>
+    <w:p/>
     <w:p/>
     <w:p/>
     <w:p>
@@ -3256,6 +4456,7 @@
                 <w:lang w:eastAsia="en-IN"/>
                 <w14:ligatures w14:val="none"/>
               </w:rPr>
+              <w:lastRenderedPageBreak/>
               <w:t>P Controller</w:t>
             </w:r>
           </w:p>
@@ -4716,7 +5917,6 @@
     </w:p>
     <w:p>
       <w:r>
-        <w:lastRenderedPageBreak/>
         <w:t>rf = 79577.47</w:t>
       </w:r>
     </w:p>
@@ -4782,6 +5982,7 @@
         </w:numPr>
       </w:pPr>
       <w:r>
+        <w:lastRenderedPageBreak/>
         <w:t>DC Offset: 0.0 V</w:t>
       </w:r>
     </w:p>
@@ -5016,7 +6217,6 @@
         <w:pStyle w:val="ListParagraph"/>
       </w:pPr>
       <w:r>
-        <w:lastRenderedPageBreak/>
         <w:t>An Ideal integral controller would use only</w:t>
       </w:r>
       <w:r>
@@ -5130,7 +6330,11 @@
         <w:t xml:space="preserve">essentially </w:t>
       </w:r>
       <w:r>
-        <w:t>connecting the positive end of the function generator directly to the inverting input which acts as a virtual ground (stays close to 0). The negative terminal of function generator is connected to ground and the positive terminal got connected to a virtual ground (as explained above), so we essentially shorted our function generator which caused the signal it generated to collapse and caused the other controllers to show haphazard outputs.</w:t>
+        <w:t xml:space="preserve">connecting the positive end of the function </w:t>
+      </w:r>
+      <w:r>
+        <w:lastRenderedPageBreak/>
+        <w:t>generator directly to the inverting input which acts as a virtual ground (stays close to 0). The negative terminal of function generator is connected to ground and the positive terminal got connected to a virtual ground (as explained above), so we essentially shorted our function generator which caused the signal it generated to collapse and caused the other controllers to show haphazard outputs.</w:t>
       </w:r>
     </w:p>
     <w:p>
@@ -5387,7 +6591,6 @@
     </w:p>
     <w:p>
       <w:r>
-        <w:lastRenderedPageBreak/>
         <w:br/>
       </w:r>
     </w:p>
@@ -5468,6 +6671,7 @@
         </w:numPr>
       </w:pPr>
       <w:r>
+        <w:lastRenderedPageBreak/>
         <w:t xml:space="preserve">The path should be: </w:t>
       </w:r>
       <w:r>
@@ -5789,7 +6993,7 @@
     <w:p/>
     <w:sectPr>
       <w:pgSz w:w="11906" w:h="16838"/>
-      <w:pgMar w:top="1440" w:right="1440" w:bottom="1440" w:left="1440" w:header="708" w:footer="708" w:gutter="0"/>
+      <w:pgMar w:top="720" w:right="720" w:bottom="720" w:left="720" w:header="708" w:footer="708" w:gutter="0"/>
       <w:cols w:space="708"/>
       <w:docGrid w:linePitch="360"/>
     </w:sectPr>
@@ -6360,6 +7564,119 @@
     </w:lvl>
   </w:abstractNum>
   <w:abstractNum w:abstractNumId="4" w15:restartNumberingAfterBreak="0">
+    <w:nsid w:val="220E1F0D"/>
+    <w:multiLevelType w:val="hybridMultilevel"/>
+    <w:tmpl w:val="7A7A0446"/>
+    <w:lvl w:ilvl="0" w:tplc="40090001">
+      <w:start w:val="1"/>
+      <w:numFmt w:val="bullet"/>
+      <w:lvlText w:val=""/>
+      <w:lvlJc w:val="left"/>
+      <w:pPr>
+        <w:ind w:left="720" w:hanging="360"/>
+      </w:pPr>
+      <w:rPr>
+        <w:rFonts w:ascii="Symbol" w:hAnsi="Symbol" w:hint="default"/>
+      </w:rPr>
+    </w:lvl>
+    <w:lvl w:ilvl="1" w:tplc="40090003" w:tentative="1">
+      <w:start w:val="1"/>
+      <w:numFmt w:val="bullet"/>
+      <w:lvlText w:val="o"/>
+      <w:lvlJc w:val="left"/>
+      <w:pPr>
+        <w:ind w:left="1440" w:hanging="360"/>
+      </w:pPr>
+      <w:rPr>
+        <w:rFonts w:ascii="Courier New" w:hAnsi="Courier New" w:cs="Courier New" w:hint="default"/>
+      </w:rPr>
+    </w:lvl>
+    <w:lvl w:ilvl="2" w:tplc="40090005" w:tentative="1">
+      <w:start w:val="1"/>
+      <w:numFmt w:val="bullet"/>
+      <w:lvlText w:val=""/>
+      <w:lvlJc w:val="left"/>
+      <w:pPr>
+        <w:ind w:left="2160" w:hanging="360"/>
+      </w:pPr>
+      <w:rPr>
+        <w:rFonts w:ascii="Wingdings" w:hAnsi="Wingdings" w:hint="default"/>
+      </w:rPr>
+    </w:lvl>
+    <w:lvl w:ilvl="3" w:tplc="40090001" w:tentative="1">
+      <w:start w:val="1"/>
+      <w:numFmt w:val="bullet"/>
+      <w:lvlText w:val=""/>
+      <w:lvlJc w:val="left"/>
+      <w:pPr>
+        <w:ind w:left="2880" w:hanging="360"/>
+      </w:pPr>
+      <w:rPr>
+        <w:rFonts w:ascii="Symbol" w:hAnsi="Symbol" w:hint="default"/>
+      </w:rPr>
+    </w:lvl>
+    <w:lvl w:ilvl="4" w:tplc="40090003" w:tentative="1">
+      <w:start w:val="1"/>
+      <w:numFmt w:val="bullet"/>
+      <w:lvlText w:val="o"/>
+      <w:lvlJc w:val="left"/>
+      <w:pPr>
+        <w:ind w:left="3600" w:hanging="360"/>
+      </w:pPr>
+      <w:rPr>
+        <w:rFonts w:ascii="Courier New" w:hAnsi="Courier New" w:cs="Courier New" w:hint="default"/>
+      </w:rPr>
+    </w:lvl>
+    <w:lvl w:ilvl="5" w:tplc="40090005" w:tentative="1">
+      <w:start w:val="1"/>
+      <w:numFmt w:val="bullet"/>
+      <w:lvlText w:val=""/>
+      <w:lvlJc w:val="left"/>
+      <w:pPr>
+        <w:ind w:left="4320" w:hanging="360"/>
+      </w:pPr>
+      <w:rPr>
+        <w:rFonts w:ascii="Wingdings" w:hAnsi="Wingdings" w:hint="default"/>
+      </w:rPr>
+    </w:lvl>
+    <w:lvl w:ilvl="6" w:tplc="40090001" w:tentative="1">
+      <w:start w:val="1"/>
+      <w:numFmt w:val="bullet"/>
+      <w:lvlText w:val=""/>
+      <w:lvlJc w:val="left"/>
+      <w:pPr>
+        <w:ind w:left="5040" w:hanging="360"/>
+      </w:pPr>
+      <w:rPr>
+        <w:rFonts w:ascii="Symbol" w:hAnsi="Symbol" w:hint="default"/>
+      </w:rPr>
+    </w:lvl>
+    <w:lvl w:ilvl="7" w:tplc="40090003" w:tentative="1">
+      <w:start w:val="1"/>
+      <w:numFmt w:val="bullet"/>
+      <w:lvlText w:val="o"/>
+      <w:lvlJc w:val="left"/>
+      <w:pPr>
+        <w:ind w:left="5760" w:hanging="360"/>
+      </w:pPr>
+      <w:rPr>
+        <w:rFonts w:ascii="Courier New" w:hAnsi="Courier New" w:cs="Courier New" w:hint="default"/>
+      </w:rPr>
+    </w:lvl>
+    <w:lvl w:ilvl="8" w:tplc="40090005" w:tentative="1">
+      <w:start w:val="1"/>
+      <w:numFmt w:val="bullet"/>
+      <w:lvlText w:val=""/>
+      <w:lvlJc w:val="left"/>
+      <w:pPr>
+        <w:ind w:left="6480" w:hanging="360"/>
+      </w:pPr>
+      <w:rPr>
+        <w:rFonts w:ascii="Wingdings" w:hAnsi="Wingdings" w:hint="default"/>
+      </w:rPr>
+    </w:lvl>
+  </w:abstractNum>
+  <w:abstractNum w:abstractNumId="5" w15:restartNumberingAfterBreak="0">
     <w:nsid w:val="25EE4EA5"/>
     <w:multiLevelType w:val="multilevel"/>
     <w:tmpl w:val="979CD9E6"/>
@@ -6472,7 +7789,7 @@
       </w:pPr>
     </w:lvl>
   </w:abstractNum>
-  <w:abstractNum w:abstractNumId="5" w15:restartNumberingAfterBreak="0">
+  <w:abstractNum w:abstractNumId="6" w15:restartNumberingAfterBreak="0">
     <w:nsid w:val="262C0EDD"/>
     <w:multiLevelType w:val="multilevel"/>
     <w:tmpl w:val="D27A48D8"/>
@@ -6621,7 +7938,7 @@
       </w:rPr>
     </w:lvl>
   </w:abstractNum>
-  <w:abstractNum w:abstractNumId="6" w15:restartNumberingAfterBreak="0">
+  <w:abstractNum w:abstractNumId="7" w15:restartNumberingAfterBreak="0">
     <w:nsid w:val="3F8D3B1D"/>
     <w:multiLevelType w:val="hybridMultilevel"/>
     <w:tmpl w:val="28F8F77A"/>
@@ -6734,7 +8051,7 @@
       </w:rPr>
     </w:lvl>
   </w:abstractNum>
-  <w:abstractNum w:abstractNumId="7" w15:restartNumberingAfterBreak="0">
+  <w:abstractNum w:abstractNumId="8" w15:restartNumberingAfterBreak="0">
     <w:nsid w:val="402D32CC"/>
     <w:multiLevelType w:val="multilevel"/>
     <w:tmpl w:val="0B2E4806"/>
@@ -6883,7 +8200,7 @@
       </w:rPr>
     </w:lvl>
   </w:abstractNum>
-  <w:abstractNum w:abstractNumId="8" w15:restartNumberingAfterBreak="0">
+  <w:abstractNum w:abstractNumId="9" w15:restartNumberingAfterBreak="0">
     <w:nsid w:val="435A1347"/>
     <w:multiLevelType w:val="multilevel"/>
     <w:tmpl w:val="8236CB14"/>
@@ -7000,7 +8317,7 @@
       </w:pPr>
     </w:lvl>
   </w:abstractNum>
-  <w:abstractNum w:abstractNumId="9" w15:restartNumberingAfterBreak="0">
+  <w:abstractNum w:abstractNumId="10" w15:restartNumberingAfterBreak="0">
     <w:nsid w:val="4848445D"/>
     <w:multiLevelType w:val="multilevel"/>
     <w:tmpl w:val="BA3E94C2"/>
@@ -7149,7 +8466,7 @@
       </w:rPr>
     </w:lvl>
   </w:abstractNum>
-  <w:abstractNum w:abstractNumId="10" w15:restartNumberingAfterBreak="0">
+  <w:abstractNum w:abstractNumId="11" w15:restartNumberingAfterBreak="0">
     <w:nsid w:val="52F07B1E"/>
     <w:multiLevelType w:val="hybridMultilevel"/>
     <w:tmpl w:val="CB32D3C4"/>
@@ -7262,7 +8579,233 @@
       </w:rPr>
     </w:lvl>
   </w:abstractNum>
-  <w:abstractNum w:abstractNumId="11" w15:restartNumberingAfterBreak="0">
+  <w:abstractNum w:abstractNumId="12" w15:restartNumberingAfterBreak="0">
+    <w:nsid w:val="56B17EE8"/>
+    <w:multiLevelType w:val="hybridMultilevel"/>
+    <w:tmpl w:val="DB4EB750"/>
+    <w:lvl w:ilvl="0" w:tplc="40090001">
+      <w:start w:val="1"/>
+      <w:numFmt w:val="bullet"/>
+      <w:lvlText w:val=""/>
+      <w:lvlJc w:val="left"/>
+      <w:pPr>
+        <w:ind w:left="720" w:hanging="360"/>
+      </w:pPr>
+      <w:rPr>
+        <w:rFonts w:ascii="Symbol" w:hAnsi="Symbol" w:hint="default"/>
+      </w:rPr>
+    </w:lvl>
+    <w:lvl w:ilvl="1" w:tplc="40090003" w:tentative="1">
+      <w:start w:val="1"/>
+      <w:numFmt w:val="bullet"/>
+      <w:lvlText w:val="o"/>
+      <w:lvlJc w:val="left"/>
+      <w:pPr>
+        <w:ind w:left="1440" w:hanging="360"/>
+      </w:pPr>
+      <w:rPr>
+        <w:rFonts w:ascii="Courier New" w:hAnsi="Courier New" w:cs="Courier New" w:hint="default"/>
+      </w:rPr>
+    </w:lvl>
+    <w:lvl w:ilvl="2" w:tplc="40090005" w:tentative="1">
+      <w:start w:val="1"/>
+      <w:numFmt w:val="bullet"/>
+      <w:lvlText w:val=""/>
+      <w:lvlJc w:val="left"/>
+      <w:pPr>
+        <w:ind w:left="2160" w:hanging="360"/>
+      </w:pPr>
+      <w:rPr>
+        <w:rFonts w:ascii="Wingdings" w:hAnsi="Wingdings" w:hint="default"/>
+      </w:rPr>
+    </w:lvl>
+    <w:lvl w:ilvl="3" w:tplc="40090001" w:tentative="1">
+      <w:start w:val="1"/>
+      <w:numFmt w:val="bullet"/>
+      <w:lvlText w:val=""/>
+      <w:lvlJc w:val="left"/>
+      <w:pPr>
+        <w:ind w:left="2880" w:hanging="360"/>
+      </w:pPr>
+      <w:rPr>
+        <w:rFonts w:ascii="Symbol" w:hAnsi="Symbol" w:hint="default"/>
+      </w:rPr>
+    </w:lvl>
+    <w:lvl w:ilvl="4" w:tplc="40090003" w:tentative="1">
+      <w:start w:val="1"/>
+      <w:numFmt w:val="bullet"/>
+      <w:lvlText w:val="o"/>
+      <w:lvlJc w:val="left"/>
+      <w:pPr>
+        <w:ind w:left="3600" w:hanging="360"/>
+      </w:pPr>
+      <w:rPr>
+        <w:rFonts w:ascii="Courier New" w:hAnsi="Courier New" w:cs="Courier New" w:hint="default"/>
+      </w:rPr>
+    </w:lvl>
+    <w:lvl w:ilvl="5" w:tplc="40090005" w:tentative="1">
+      <w:start w:val="1"/>
+      <w:numFmt w:val="bullet"/>
+      <w:lvlText w:val=""/>
+      <w:lvlJc w:val="left"/>
+      <w:pPr>
+        <w:ind w:left="4320" w:hanging="360"/>
+      </w:pPr>
+      <w:rPr>
+        <w:rFonts w:ascii="Wingdings" w:hAnsi="Wingdings" w:hint="default"/>
+      </w:rPr>
+    </w:lvl>
+    <w:lvl w:ilvl="6" w:tplc="40090001" w:tentative="1">
+      <w:start w:val="1"/>
+      <w:numFmt w:val="bullet"/>
+      <w:lvlText w:val=""/>
+      <w:lvlJc w:val="left"/>
+      <w:pPr>
+        <w:ind w:left="5040" w:hanging="360"/>
+      </w:pPr>
+      <w:rPr>
+        <w:rFonts w:ascii="Symbol" w:hAnsi="Symbol" w:hint="default"/>
+      </w:rPr>
+    </w:lvl>
+    <w:lvl w:ilvl="7" w:tplc="40090003" w:tentative="1">
+      <w:start w:val="1"/>
+      <w:numFmt w:val="bullet"/>
+      <w:lvlText w:val="o"/>
+      <w:lvlJc w:val="left"/>
+      <w:pPr>
+        <w:ind w:left="5760" w:hanging="360"/>
+      </w:pPr>
+      <w:rPr>
+        <w:rFonts w:ascii="Courier New" w:hAnsi="Courier New" w:cs="Courier New" w:hint="default"/>
+      </w:rPr>
+    </w:lvl>
+    <w:lvl w:ilvl="8" w:tplc="40090005" w:tentative="1">
+      <w:start w:val="1"/>
+      <w:numFmt w:val="bullet"/>
+      <w:lvlText w:val=""/>
+      <w:lvlJc w:val="left"/>
+      <w:pPr>
+        <w:ind w:left="6480" w:hanging="360"/>
+      </w:pPr>
+      <w:rPr>
+        <w:rFonts w:ascii="Wingdings" w:hAnsi="Wingdings" w:hint="default"/>
+      </w:rPr>
+    </w:lvl>
+  </w:abstractNum>
+  <w:abstractNum w:abstractNumId="13" w15:restartNumberingAfterBreak="0">
+    <w:nsid w:val="5B186342"/>
+    <w:multiLevelType w:val="hybridMultilevel"/>
+    <w:tmpl w:val="42F2C4F4"/>
+    <w:lvl w:ilvl="0" w:tplc="40090001">
+      <w:start w:val="1"/>
+      <w:numFmt w:val="bullet"/>
+      <w:lvlText w:val=""/>
+      <w:lvlJc w:val="left"/>
+      <w:pPr>
+        <w:ind w:left="720" w:hanging="360"/>
+      </w:pPr>
+      <w:rPr>
+        <w:rFonts w:ascii="Symbol" w:hAnsi="Symbol" w:hint="default"/>
+      </w:rPr>
+    </w:lvl>
+    <w:lvl w:ilvl="1" w:tplc="40090003" w:tentative="1">
+      <w:start w:val="1"/>
+      <w:numFmt w:val="bullet"/>
+      <w:lvlText w:val="o"/>
+      <w:lvlJc w:val="left"/>
+      <w:pPr>
+        <w:ind w:left="1440" w:hanging="360"/>
+      </w:pPr>
+      <w:rPr>
+        <w:rFonts w:ascii="Courier New" w:hAnsi="Courier New" w:cs="Courier New" w:hint="default"/>
+      </w:rPr>
+    </w:lvl>
+    <w:lvl w:ilvl="2" w:tplc="40090005" w:tentative="1">
+      <w:start w:val="1"/>
+      <w:numFmt w:val="bullet"/>
+      <w:lvlText w:val=""/>
+      <w:lvlJc w:val="left"/>
+      <w:pPr>
+        <w:ind w:left="2160" w:hanging="360"/>
+      </w:pPr>
+      <w:rPr>
+        <w:rFonts w:ascii="Wingdings" w:hAnsi="Wingdings" w:hint="default"/>
+      </w:rPr>
+    </w:lvl>
+    <w:lvl w:ilvl="3" w:tplc="40090001" w:tentative="1">
+      <w:start w:val="1"/>
+      <w:numFmt w:val="bullet"/>
+      <w:lvlText w:val=""/>
+      <w:lvlJc w:val="left"/>
+      <w:pPr>
+        <w:ind w:left="2880" w:hanging="360"/>
+      </w:pPr>
+      <w:rPr>
+        <w:rFonts w:ascii="Symbol" w:hAnsi="Symbol" w:hint="default"/>
+      </w:rPr>
+    </w:lvl>
+    <w:lvl w:ilvl="4" w:tplc="40090003" w:tentative="1">
+      <w:start w:val="1"/>
+      <w:numFmt w:val="bullet"/>
+      <w:lvlText w:val="o"/>
+      <w:lvlJc w:val="left"/>
+      <w:pPr>
+        <w:ind w:left="3600" w:hanging="360"/>
+      </w:pPr>
+      <w:rPr>
+        <w:rFonts w:ascii="Courier New" w:hAnsi="Courier New" w:cs="Courier New" w:hint="default"/>
+      </w:rPr>
+    </w:lvl>
+    <w:lvl w:ilvl="5" w:tplc="40090005" w:tentative="1">
+      <w:start w:val="1"/>
+      <w:numFmt w:val="bullet"/>
+      <w:lvlText w:val=""/>
+      <w:lvlJc w:val="left"/>
+      <w:pPr>
+        <w:ind w:left="4320" w:hanging="360"/>
+      </w:pPr>
+      <w:rPr>
+        <w:rFonts w:ascii="Wingdings" w:hAnsi="Wingdings" w:hint="default"/>
+      </w:rPr>
+    </w:lvl>
+    <w:lvl w:ilvl="6" w:tplc="40090001" w:tentative="1">
+      <w:start w:val="1"/>
+      <w:numFmt w:val="bullet"/>
+      <w:lvlText w:val=""/>
+      <w:lvlJc w:val="left"/>
+      <w:pPr>
+        <w:ind w:left="5040" w:hanging="360"/>
+      </w:pPr>
+      <w:rPr>
+        <w:rFonts w:ascii="Symbol" w:hAnsi="Symbol" w:hint="default"/>
+      </w:rPr>
+    </w:lvl>
+    <w:lvl w:ilvl="7" w:tplc="40090003" w:tentative="1">
+      <w:start w:val="1"/>
+      <w:numFmt w:val="bullet"/>
+      <w:lvlText w:val="o"/>
+      <w:lvlJc w:val="left"/>
+      <w:pPr>
+        <w:ind w:left="5760" w:hanging="360"/>
+      </w:pPr>
+      <w:rPr>
+        <w:rFonts w:ascii="Courier New" w:hAnsi="Courier New" w:cs="Courier New" w:hint="default"/>
+      </w:rPr>
+    </w:lvl>
+    <w:lvl w:ilvl="8" w:tplc="40090005" w:tentative="1">
+      <w:start w:val="1"/>
+      <w:numFmt w:val="bullet"/>
+      <w:lvlText w:val=""/>
+      <w:lvlJc w:val="left"/>
+      <w:pPr>
+        <w:ind w:left="6480" w:hanging="360"/>
+      </w:pPr>
+      <w:rPr>
+        <w:rFonts w:ascii="Wingdings" w:hAnsi="Wingdings" w:hint="default"/>
+      </w:rPr>
+    </w:lvl>
+  </w:abstractNum>
+  <w:abstractNum w:abstractNumId="14" w15:restartNumberingAfterBreak="0">
     <w:nsid w:val="63A21C82"/>
     <w:multiLevelType w:val="hybridMultilevel"/>
     <w:tmpl w:val="E9F01B06"/>
@@ -7375,7 +8918,7 @@
       </w:rPr>
     </w:lvl>
   </w:abstractNum>
-  <w:abstractNum w:abstractNumId="12" w15:restartNumberingAfterBreak="0">
+  <w:abstractNum w:abstractNumId="15" w15:restartNumberingAfterBreak="0">
     <w:nsid w:val="655545BE"/>
     <w:multiLevelType w:val="multilevel"/>
     <w:tmpl w:val="87985016"/>
@@ -7524,7 +9067,7 @@
       </w:rPr>
     </w:lvl>
   </w:abstractNum>
-  <w:abstractNum w:abstractNumId="13" w15:restartNumberingAfterBreak="0">
+  <w:abstractNum w:abstractNumId="16" w15:restartNumberingAfterBreak="0">
     <w:nsid w:val="7EAB40F7"/>
     <w:multiLevelType w:val="hybridMultilevel"/>
     <w:tmpl w:val="EE56E3B2"/>
@@ -7644,40 +9187,49 @@
     <w:abstractNumId w:val="1"/>
   </w:num>
   <w:num w:numId="3" w16cid:durableId="857621780">
-    <w:abstractNumId w:val="9"/>
+    <w:abstractNumId w:val="10"/>
   </w:num>
   <w:num w:numId="4" w16cid:durableId="610010434">
     <w:abstractNumId w:val="2"/>
   </w:num>
   <w:num w:numId="5" w16cid:durableId="343289266">
-    <w:abstractNumId w:val="13"/>
+    <w:abstractNumId w:val="16"/>
   </w:num>
   <w:num w:numId="6" w16cid:durableId="1265455221">
-    <w:abstractNumId w:val="10"/>
+    <w:abstractNumId w:val="11"/>
   </w:num>
   <w:num w:numId="7" w16cid:durableId="526993781">
-    <w:abstractNumId w:val="11"/>
+    <w:abstractNumId w:val="14"/>
   </w:num>
   <w:num w:numId="8" w16cid:durableId="617375938">
     <w:abstractNumId w:val="3"/>
   </w:num>
   <w:num w:numId="9" w16cid:durableId="906109154">
+    <w:abstractNumId w:val="8"/>
+  </w:num>
+  <w:num w:numId="10" w16cid:durableId="1918980926">
+    <w:abstractNumId w:val="6"/>
+  </w:num>
+  <w:num w:numId="11" w16cid:durableId="57017028">
+    <w:abstractNumId w:val="5"/>
+  </w:num>
+  <w:num w:numId="12" w16cid:durableId="1656836019">
+    <w:abstractNumId w:val="15"/>
+  </w:num>
+  <w:num w:numId="13" w16cid:durableId="546725854">
+    <w:abstractNumId w:val="9"/>
+  </w:num>
+  <w:num w:numId="14" w16cid:durableId="856313605">
     <w:abstractNumId w:val="7"/>
   </w:num>
-  <w:num w:numId="10" w16cid:durableId="1918980926">
-    <w:abstractNumId w:val="5"/>
+  <w:num w:numId="15" w16cid:durableId="2019193832">
+    <w:abstractNumId w:val="13"/>
   </w:num>
-  <w:num w:numId="11" w16cid:durableId="57017028">
-    <w:abstractNumId w:val="4"/>
-  </w:num>
-  <w:num w:numId="12" w16cid:durableId="1656836019">
+  <w:num w:numId="16" w16cid:durableId="178979434">
     <w:abstractNumId w:val="12"/>
   </w:num>
-  <w:num w:numId="13" w16cid:durableId="546725854">
-    <w:abstractNumId w:val="8"/>
-  </w:num>
-  <w:num w:numId="14" w16cid:durableId="856313605">
-    <w:abstractNumId w:val="6"/>
+  <w:num w:numId="17" w16cid:durableId="445082274">
+    <w:abstractNumId w:val="4"/>
   </w:num>
 </w:numbering>
 </file>
@@ -8284,7 +9836,6 @@
   <w:style w:type="character" w:default="1" w:styleId="DefaultParagraphFont">
     <w:name w:val="Default Paragraph Font"/>
     <w:uiPriority w:val="1"/>
-    <w:semiHidden/>
     <w:unhideWhenUsed/>
   </w:style>
   <w:style w:type="table" w:default="1" w:styleId="TableNormal">
@@ -8818,6 +10369,39 @@
       </w:tcPr>
     </w:tblStylePr>
   </w:style>
+  <w:style w:type="character" w:styleId="Hyperlink">
+    <w:name w:val="Hyperlink"/>
+    <w:basedOn w:val="DefaultParagraphFont"/>
+    <w:uiPriority w:val="99"/>
+    <w:unhideWhenUsed/>
+    <w:rsid w:val="003513DA"/>
+    <w:rPr>
+      <w:color w:val="0563C1" w:themeColor="hyperlink"/>
+      <w:u w:val="single"/>
+    </w:rPr>
+  </w:style>
+  <w:style w:type="character" w:styleId="UnresolvedMention">
+    <w:name w:val="Unresolved Mention"/>
+    <w:basedOn w:val="DefaultParagraphFont"/>
+    <w:uiPriority w:val="99"/>
+    <w:semiHidden/>
+    <w:unhideWhenUsed/>
+    <w:rsid w:val="003513DA"/>
+    <w:rPr>
+      <w:color w:val="605E5C"/>
+      <w:shd w:val="clear" w:color="auto" w:fill="E1DFDD"/>
+    </w:rPr>
+  </w:style>
+  <w:style w:type="character" w:styleId="PlaceholderText">
+    <w:name w:val="Placeholder Text"/>
+    <w:basedOn w:val="DefaultParagraphFont"/>
+    <w:uiPriority w:val="99"/>
+    <w:semiHidden/>
+    <w:rsid w:val="00904971"/>
+    <w:rPr>
+      <w:color w:val="666666"/>
+    </w:rPr>
+  </w:style>
 </w:styles>
 </file>
 

</xml_diff>

<commit_message>
completed square wave test documentation
</commit_message>
<xml_diff>
--- a/PID-Controller-using-OP-AMPS- Hari Mohan 2026A8PS1148H.docx
+++ b/PID-Controller-using-OP-AMPS- Hari Mohan 2026A8PS1148H.docx
@@ -1278,22 +1278,8 @@
                 <w:lang w:eastAsia="en-IN"/>
                 <w14:ligatures w14:val="none"/>
               </w:rPr>
-              <w:t xml:space="preserve">5 </w:t>
+              <w:t>5 kOhm</w:t>
             </w:r>
-            <w:proofErr w:type="spellStart"/>
-            <w:r>
-              <w:rPr>
-                <w:rFonts w:ascii="Calibri" w:eastAsia="Times New Roman" w:hAnsi="Calibri" w:cs="Calibri"/>
-                <w:color w:val="000000"/>
-                <w:kern w:val="0"/>
-                <w:sz w:val="22"/>
-                <w:szCs w:val="22"/>
-                <w:lang w:eastAsia="en-IN"/>
-                <w14:ligatures w14:val="none"/>
-              </w:rPr>
-              <w:t>kOhm</w:t>
-            </w:r>
-            <w:proofErr w:type="spellEnd"/>
           </w:p>
         </w:tc>
         <w:tc>
@@ -1358,22 +1344,8 @@
                 <w:lang w:eastAsia="en-IN"/>
                 <w14:ligatures w14:val="none"/>
               </w:rPr>
-              <w:t xml:space="preserve">3 </w:t>
+              <w:t>3 kOhm</w:t>
             </w:r>
-            <w:proofErr w:type="spellStart"/>
-            <w:r>
-              <w:rPr>
-                <w:rFonts w:ascii="Calibri" w:eastAsia="Times New Roman" w:hAnsi="Calibri" w:cs="Calibri"/>
-                <w:color w:val="EE0000"/>
-                <w:kern w:val="0"/>
-                <w:sz w:val="22"/>
-                <w:szCs w:val="22"/>
-                <w:lang w:eastAsia="en-IN"/>
-                <w14:ligatures w14:val="none"/>
-              </w:rPr>
-              <w:t>kOhm</w:t>
-            </w:r>
-            <w:proofErr w:type="spellEnd"/>
           </w:p>
         </w:tc>
         <w:tc>
@@ -1438,22 +1410,8 @@
                 <w:lang w:eastAsia="en-IN"/>
                 <w14:ligatures w14:val="none"/>
               </w:rPr>
-              <w:t xml:space="preserve">5 </w:t>
+              <w:t>5 kOhm</w:t>
             </w:r>
-            <w:proofErr w:type="spellStart"/>
-            <w:r>
-              <w:rPr>
-                <w:rFonts w:ascii="Calibri" w:eastAsia="Times New Roman" w:hAnsi="Calibri" w:cs="Calibri"/>
-                <w:color w:val="000000"/>
-                <w:kern w:val="0"/>
-                <w:sz w:val="22"/>
-                <w:szCs w:val="22"/>
-                <w:lang w:eastAsia="en-IN"/>
-                <w14:ligatures w14:val="none"/>
-              </w:rPr>
-              <w:t>kOhm</w:t>
-            </w:r>
-            <w:proofErr w:type="spellEnd"/>
           </w:p>
         </w:tc>
         <w:tc>
@@ -1516,22 +1474,8 @@
                 <w:lang w:eastAsia="en-IN"/>
                 <w14:ligatures w14:val="none"/>
               </w:rPr>
-              <w:t xml:space="preserve">10 </w:t>
+              <w:t>10 kOhm</w:t>
             </w:r>
-            <w:proofErr w:type="spellStart"/>
-            <w:r>
-              <w:rPr>
-                <w:rFonts w:ascii="Calibri" w:eastAsia="Times New Roman" w:hAnsi="Calibri" w:cs="Calibri"/>
-                <w:color w:val="000000"/>
-                <w:kern w:val="0"/>
-                <w:sz w:val="22"/>
-                <w:szCs w:val="22"/>
-                <w:lang w:eastAsia="en-IN"/>
-                <w14:ligatures w14:val="none"/>
-              </w:rPr>
-              <w:t>kOhm</w:t>
-            </w:r>
-            <w:proofErr w:type="spellEnd"/>
           </w:p>
         </w:tc>
       </w:tr>
@@ -1601,22 +1545,8 @@
                 <w:lang w:eastAsia="en-IN"/>
                 <w14:ligatures w14:val="none"/>
               </w:rPr>
-              <w:t xml:space="preserve">15 </w:t>
+              <w:t>15 kOhm</w:t>
             </w:r>
-            <w:proofErr w:type="spellStart"/>
-            <w:r>
-              <w:rPr>
-                <w:rFonts w:ascii="Calibri" w:eastAsia="Times New Roman" w:hAnsi="Calibri" w:cs="Calibri"/>
-                <w:color w:val="EE0000"/>
-                <w:kern w:val="0"/>
-                <w:sz w:val="22"/>
-                <w:szCs w:val="22"/>
-                <w:lang w:eastAsia="en-IN"/>
-                <w14:ligatures w14:val="none"/>
-              </w:rPr>
-              <w:t>kOhm</w:t>
-            </w:r>
-            <w:proofErr w:type="spellEnd"/>
           </w:p>
         </w:tc>
         <w:tc>
@@ -1681,22 +1611,8 @@
                 <w:lang w:eastAsia="en-IN"/>
                 <w14:ligatures w14:val="none"/>
               </w:rPr>
-              <w:t xml:space="preserve">100 </w:t>
+              <w:t>100 kOhm</w:t>
             </w:r>
-            <w:proofErr w:type="spellStart"/>
-            <w:r>
-              <w:rPr>
-                <w:rFonts w:ascii="Calibri" w:eastAsia="Times New Roman" w:hAnsi="Calibri" w:cs="Calibri"/>
-                <w:color w:val="000000"/>
-                <w:kern w:val="0"/>
-                <w:sz w:val="22"/>
-                <w:szCs w:val="22"/>
-                <w:lang w:eastAsia="en-IN"/>
-                <w14:ligatures w14:val="none"/>
-              </w:rPr>
-              <w:t>kOhm</w:t>
-            </w:r>
-            <w:proofErr w:type="spellEnd"/>
           </w:p>
         </w:tc>
         <w:tc>
@@ -1761,22 +1677,8 @@
                 <w:lang w:eastAsia="en-IN"/>
                 <w14:ligatures w14:val="none"/>
               </w:rPr>
-              <w:t xml:space="preserve">80 </w:t>
+              <w:t>80 kOhm</w:t>
             </w:r>
-            <w:proofErr w:type="spellStart"/>
-            <w:r>
-              <w:rPr>
-                <w:rFonts w:ascii="Calibri" w:eastAsia="Times New Roman" w:hAnsi="Calibri" w:cs="Calibri"/>
-                <w:color w:val="EE0000"/>
-                <w:kern w:val="0"/>
-                <w:sz w:val="22"/>
-                <w:szCs w:val="22"/>
-                <w:lang w:eastAsia="en-IN"/>
-                <w14:ligatures w14:val="none"/>
-              </w:rPr>
-              <w:t>kOhm</w:t>
-            </w:r>
-            <w:proofErr w:type="spellEnd"/>
           </w:p>
         </w:tc>
         <w:tc>
@@ -1887,22 +1789,8 @@
                 <w:lang w:eastAsia="en-IN"/>
                 <w14:ligatures w14:val="none"/>
               </w:rPr>
-              <w:t xml:space="preserve">10 </w:t>
+              <w:t>10 kOhm</w:t>
             </w:r>
-            <w:proofErr w:type="spellStart"/>
-            <w:r>
-              <w:rPr>
-                <w:rFonts w:ascii="Calibri" w:eastAsia="Times New Roman" w:hAnsi="Calibri" w:cs="Calibri"/>
-                <w:color w:val="000000"/>
-                <w:kern w:val="0"/>
-                <w:sz w:val="22"/>
-                <w:szCs w:val="22"/>
-                <w:lang w:eastAsia="en-IN"/>
-                <w14:ligatures w14:val="none"/>
-              </w:rPr>
-              <w:t>kOhm</w:t>
-            </w:r>
-            <w:proofErr w:type="spellEnd"/>
           </w:p>
         </w:tc>
         <w:tc>
@@ -1967,22 +1855,8 @@
                 <w:lang w:eastAsia="en-IN"/>
                 <w14:ligatures w14:val="none"/>
               </w:rPr>
-              <w:t xml:space="preserve">10 </w:t>
+              <w:t>10 kOhm</w:t>
             </w:r>
-            <w:proofErr w:type="spellStart"/>
-            <w:r>
-              <w:rPr>
-                <w:rFonts w:ascii="Calibri" w:eastAsia="Times New Roman" w:hAnsi="Calibri" w:cs="Calibri"/>
-                <w:color w:val="000000"/>
-                <w:kern w:val="0"/>
-                <w:sz w:val="22"/>
-                <w:szCs w:val="22"/>
-                <w:lang w:eastAsia="en-IN"/>
-                <w14:ligatures w14:val="none"/>
-              </w:rPr>
-              <w:t>kOhm</w:t>
-            </w:r>
-            <w:proofErr w:type="spellEnd"/>
           </w:p>
         </w:tc>
         <w:tc>
@@ -2047,22 +1921,8 @@
                 <w:lang w:eastAsia="en-IN"/>
                 <w14:ligatures w14:val="none"/>
               </w:rPr>
-              <w:t xml:space="preserve">10 </w:t>
+              <w:t>10 kOhm</w:t>
             </w:r>
-            <w:proofErr w:type="spellStart"/>
-            <w:r>
-              <w:rPr>
-                <w:rFonts w:ascii="Calibri" w:eastAsia="Times New Roman" w:hAnsi="Calibri" w:cs="Calibri"/>
-                <w:color w:val="000000"/>
-                <w:kern w:val="0"/>
-                <w:sz w:val="22"/>
-                <w:szCs w:val="22"/>
-                <w:lang w:eastAsia="en-IN"/>
-                <w14:ligatures w14:val="none"/>
-              </w:rPr>
-              <w:t>kOhm</w:t>
-            </w:r>
-            <w:proofErr w:type="spellEnd"/>
           </w:p>
         </w:tc>
         <w:tc>
@@ -2212,22 +2072,8 @@
                 <w:lang w:eastAsia="en-IN"/>
                 <w14:ligatures w14:val="none"/>
               </w:rPr>
-              <w:t xml:space="preserve">100 </w:t>
+              <w:t>100 nF</w:t>
             </w:r>
-            <w:proofErr w:type="spellStart"/>
-            <w:r>
-              <w:rPr>
-                <w:rFonts w:ascii="Calibri" w:eastAsia="Times New Roman" w:hAnsi="Calibri" w:cs="Calibri"/>
-                <w:color w:val="000000"/>
-                <w:kern w:val="0"/>
-                <w:sz w:val="22"/>
-                <w:szCs w:val="22"/>
-                <w:lang w:eastAsia="en-IN"/>
-                <w14:ligatures w14:val="none"/>
-              </w:rPr>
-              <w:t>nF</w:t>
-            </w:r>
-            <w:proofErr w:type="spellEnd"/>
           </w:p>
         </w:tc>
         <w:tc>
@@ -2292,22 +2138,8 @@
                 <w:lang w:eastAsia="en-IN"/>
                 <w14:ligatures w14:val="none"/>
               </w:rPr>
-              <w:t xml:space="preserve">100 </w:t>
+              <w:t>100 nF</w:t>
             </w:r>
-            <w:proofErr w:type="spellStart"/>
-            <w:r>
-              <w:rPr>
-                <w:rFonts w:ascii="Calibri" w:eastAsia="Times New Roman" w:hAnsi="Calibri" w:cs="Calibri"/>
-                <w:color w:val="000000"/>
-                <w:kern w:val="0"/>
-                <w:sz w:val="22"/>
-                <w:szCs w:val="22"/>
-                <w:lang w:eastAsia="en-IN"/>
-                <w14:ligatures w14:val="none"/>
-              </w:rPr>
-              <w:t>nF</w:t>
-            </w:r>
-            <w:proofErr w:type="spellEnd"/>
           </w:p>
         </w:tc>
         <w:tc>
@@ -2993,6 +2825,1940 @@
     <w:p/>
     <w:p/>
     <w:p/>
+    <w:p>
+      <w:pPr>
+        <w:numPr>
+          <w:ilvl w:val="0"/>
+          <w:numId w:val="13"/>
+        </w:numPr>
+        <w:rPr>
+          <w:sz w:val="32"/>
+          <w:szCs w:val="32"/>
+          <w:u w:val="single"/>
+        </w:rPr>
+      </w:pPr>
+      <w:r>
+        <w:rPr>
+          <w:b/>
+          <w:bCs/>
+          <w:sz w:val="32"/>
+          <w:szCs w:val="32"/>
+          <w:u w:val="single"/>
+        </w:rPr>
+        <w:t>Square Wave Test:</w:t>
+      </w:r>
+    </w:p>
+    <w:p>
+      <w:pPr>
+        <w:numPr>
+          <w:ilvl w:val="1"/>
+          <w:numId w:val="13"/>
+        </w:numPr>
+      </w:pPr>
+      <w:r>
+        <w:t>Frequency: 50 Hz</w:t>
+      </w:r>
+    </w:p>
+    <w:p>
+      <w:pPr>
+        <w:numPr>
+          <w:ilvl w:val="1"/>
+          <w:numId w:val="13"/>
+        </w:numPr>
+      </w:pPr>
+      <w:r>
+        <w:t>Amplitude: 2.5 V</w:t>
+      </w:r>
+    </w:p>
+    <w:p>
+      <w:pPr>
+        <w:numPr>
+          <w:ilvl w:val="1"/>
+          <w:numId w:val="13"/>
+        </w:numPr>
+      </w:pPr>
+      <w:r>
+        <w:t>DC Offset: 0.0 V</w:t>
+      </w:r>
+    </w:p>
+    <w:p>
+      <w:pPr>
+        <w:numPr>
+          <w:ilvl w:val="1"/>
+          <w:numId w:val="13"/>
+        </w:numPr>
+      </w:pPr>
+      <w:r>
+        <w:t>Function Type: Square</w:t>
+      </w:r>
+      <w:r>
+        <w:br/>
+      </w:r>
+    </w:p>
+    <w:p>
+      <w:pPr>
+        <w:rPr>
+          <w:u w:val="single"/>
+        </w:rPr>
+      </w:pPr>
+      <w:r>
+        <w:rPr>
+          <w:u w:val="single"/>
+        </w:rPr>
+        <w:t>Tinker Cad Link:</w:t>
+      </w:r>
+    </w:p>
+    <w:p>
+      <w:hyperlink r:id="rId11" w:history="1">
+        <w:r>
+          <w:rPr>
+            <w:rStyle w:val="Hyperlink"/>
+          </w:rPr>
+          <w:t>https://www.tinkercad.com/things/0EchvulRUdH-square-wave-test-pid-using-op-amps-2026a8ps1148h-hari-mohan?sharecode=9NQDNDahdHH81qDx8PzoyDR-Fjtf2_VbeuRBUoWWmKg</w:t>
+        </w:r>
+      </w:hyperlink>
+      <w:r>
+        <w:br/>
+      </w:r>
+    </w:p>
+    <w:p>
+      <w:pPr>
+        <w:rPr>
+          <w:u w:val="single"/>
+        </w:rPr>
+      </w:pPr>
+      <w:r>
+        <w:rPr>
+          <w:u w:val="single"/>
+        </w:rPr>
+        <w:t>Component Values</w:t>
+      </w:r>
+      <w:r>
+        <w:rPr>
+          <w:u w:val="single"/>
+        </w:rPr>
+        <w:t>:</w:t>
+      </w:r>
+    </w:p>
+    <w:tbl>
+      <w:tblPr>
+        <w:tblStyle w:val="GridTable4-Accent5"/>
+        <w:tblpPr w:leftFromText="180" w:rightFromText="180" w:vertAnchor="text" w:horzAnchor="margin" w:tblpY="-43"/>
+        <w:tblW w:w="10920" w:type="dxa"/>
+        <w:tblLook w:val="04A0" w:firstRow="1" w:lastRow="0" w:firstColumn="1" w:lastColumn="0" w:noHBand="0" w:noVBand="1"/>
+      </w:tblPr>
+      <w:tblGrid>
+        <w:gridCol w:w="1413"/>
+        <w:gridCol w:w="1047"/>
+        <w:gridCol w:w="1360"/>
+        <w:gridCol w:w="1280"/>
+        <w:gridCol w:w="1520"/>
+        <w:gridCol w:w="1180"/>
+        <w:gridCol w:w="1560"/>
+        <w:gridCol w:w="1560"/>
+      </w:tblGrid>
+      <w:tr>
+        <w:trPr>
+          <w:cnfStyle w:val="100000000000" w:firstRow="1" w:lastRow="0" w:firstColumn="0" w:lastColumn="0" w:oddVBand="0" w:evenVBand="0" w:oddHBand="0" w:evenHBand="0" w:firstRowFirstColumn="0" w:firstRowLastColumn="0" w:lastRowFirstColumn="0" w:lastRowLastColumn="0"/>
+          <w:trHeight w:val="290"/>
+        </w:trPr>
+        <w:tc>
+          <w:tcPr>
+            <w:cnfStyle w:val="001000000000" w:firstRow="0" w:lastRow="0" w:firstColumn="1" w:lastColumn="0" w:oddVBand="0" w:evenVBand="0" w:oddHBand="0" w:evenHBand="0" w:firstRowFirstColumn="0" w:firstRowLastColumn="0" w:lastRowFirstColumn="0" w:lastRowLastColumn="0"/>
+            <w:tcW w:w="1413" w:type="dxa"/>
+            <w:noWrap/>
+            <w:hideMark/>
+          </w:tcPr>
+          <w:p>
+            <w:pPr>
+              <w:rPr>
+                <w:rFonts w:ascii="Calibri" w:eastAsia="Times New Roman" w:hAnsi="Calibri" w:cs="Calibri"/>
+                <w:color w:val="000000"/>
+                <w:kern w:val="0"/>
+                <w:sz w:val="22"/>
+                <w:szCs w:val="22"/>
+                <w:lang w:eastAsia="en-IN"/>
+                <w14:ligatures w14:val="none"/>
+              </w:rPr>
+            </w:pPr>
+            <w:r>
+              <w:rPr>
+                <w:rFonts w:ascii="Calibri" w:eastAsia="Times New Roman" w:hAnsi="Calibri" w:cs="Calibri"/>
+                <w:color w:val="000000"/>
+                <w:kern w:val="0"/>
+                <w:sz w:val="22"/>
+                <w:szCs w:val="22"/>
+                <w:lang w:eastAsia="en-IN"/>
+                <w14:ligatures w14:val="none"/>
+              </w:rPr>
+              <w:t>P Controller</w:t>
+            </w:r>
+          </w:p>
+        </w:tc>
+        <w:tc>
+          <w:tcPr>
+            <w:tcW w:w="1047" w:type="dxa"/>
+            <w:noWrap/>
+            <w:hideMark/>
+          </w:tcPr>
+          <w:p>
+            <w:pPr>
+              <w:cnfStyle w:val="100000000000" w:firstRow="1" w:lastRow="0" w:firstColumn="0" w:lastColumn="0" w:oddVBand="0" w:evenVBand="0" w:oddHBand="0" w:evenHBand="0" w:firstRowFirstColumn="0" w:firstRowLastColumn="0" w:lastRowFirstColumn="0" w:lastRowLastColumn="0"/>
+              <w:rPr>
+                <w:rFonts w:ascii="Calibri" w:eastAsia="Times New Roman" w:hAnsi="Calibri" w:cs="Calibri"/>
+                <w:color w:val="000000"/>
+                <w:kern w:val="0"/>
+                <w:sz w:val="22"/>
+                <w:szCs w:val="22"/>
+                <w:lang w:eastAsia="en-IN"/>
+                <w14:ligatures w14:val="none"/>
+              </w:rPr>
+            </w:pPr>
+          </w:p>
+        </w:tc>
+        <w:tc>
+          <w:tcPr>
+            <w:tcW w:w="1360" w:type="dxa"/>
+            <w:noWrap/>
+            <w:hideMark/>
+          </w:tcPr>
+          <w:p>
+            <w:pPr>
+              <w:cnfStyle w:val="100000000000" w:firstRow="1" w:lastRow="0" w:firstColumn="0" w:lastColumn="0" w:oddVBand="0" w:evenVBand="0" w:oddHBand="0" w:evenHBand="0" w:firstRowFirstColumn="0" w:firstRowLastColumn="0" w:lastRowFirstColumn="0" w:lastRowLastColumn="0"/>
+              <w:rPr>
+                <w:rFonts w:ascii="Calibri" w:eastAsia="Times New Roman" w:hAnsi="Calibri" w:cs="Calibri"/>
+                <w:color w:val="000000"/>
+                <w:kern w:val="0"/>
+                <w:sz w:val="22"/>
+                <w:szCs w:val="22"/>
+                <w:lang w:eastAsia="en-IN"/>
+                <w14:ligatures w14:val="none"/>
+              </w:rPr>
+            </w:pPr>
+            <w:r>
+              <w:rPr>
+                <w:rFonts w:ascii="Calibri" w:eastAsia="Times New Roman" w:hAnsi="Calibri" w:cs="Calibri"/>
+                <w:color w:val="000000"/>
+                <w:kern w:val="0"/>
+                <w:sz w:val="22"/>
+                <w:szCs w:val="22"/>
+                <w:lang w:eastAsia="en-IN"/>
+                <w14:ligatures w14:val="none"/>
+              </w:rPr>
+              <w:t>I Controller</w:t>
+            </w:r>
+          </w:p>
+        </w:tc>
+        <w:tc>
+          <w:tcPr>
+            <w:tcW w:w="1280" w:type="dxa"/>
+            <w:noWrap/>
+            <w:hideMark/>
+          </w:tcPr>
+          <w:p>
+            <w:pPr>
+              <w:cnfStyle w:val="100000000000" w:firstRow="1" w:lastRow="0" w:firstColumn="0" w:lastColumn="0" w:oddVBand="0" w:evenVBand="0" w:oddHBand="0" w:evenHBand="0" w:firstRowFirstColumn="0" w:firstRowLastColumn="0" w:lastRowFirstColumn="0" w:lastRowLastColumn="0"/>
+              <w:rPr>
+                <w:rFonts w:ascii="Calibri" w:eastAsia="Times New Roman" w:hAnsi="Calibri" w:cs="Calibri"/>
+                <w:color w:val="000000"/>
+                <w:kern w:val="0"/>
+                <w:sz w:val="22"/>
+                <w:szCs w:val="22"/>
+                <w:lang w:eastAsia="en-IN"/>
+                <w14:ligatures w14:val="none"/>
+              </w:rPr>
+            </w:pPr>
+          </w:p>
+        </w:tc>
+        <w:tc>
+          <w:tcPr>
+            <w:tcW w:w="1520" w:type="dxa"/>
+            <w:noWrap/>
+            <w:hideMark/>
+          </w:tcPr>
+          <w:p>
+            <w:pPr>
+              <w:cnfStyle w:val="100000000000" w:firstRow="1" w:lastRow="0" w:firstColumn="0" w:lastColumn="0" w:oddVBand="0" w:evenVBand="0" w:oddHBand="0" w:evenHBand="0" w:firstRowFirstColumn="0" w:firstRowLastColumn="0" w:lastRowFirstColumn="0" w:lastRowLastColumn="0"/>
+              <w:rPr>
+                <w:rFonts w:ascii="Calibri" w:eastAsia="Times New Roman" w:hAnsi="Calibri" w:cs="Calibri"/>
+                <w:color w:val="000000"/>
+                <w:kern w:val="0"/>
+                <w:sz w:val="22"/>
+                <w:szCs w:val="22"/>
+                <w:lang w:eastAsia="en-IN"/>
+                <w14:ligatures w14:val="none"/>
+              </w:rPr>
+            </w:pPr>
+            <w:r>
+              <w:rPr>
+                <w:rFonts w:ascii="Calibri" w:eastAsia="Times New Roman" w:hAnsi="Calibri" w:cs="Calibri"/>
+                <w:color w:val="000000"/>
+                <w:kern w:val="0"/>
+                <w:sz w:val="22"/>
+                <w:szCs w:val="22"/>
+                <w:lang w:eastAsia="en-IN"/>
+                <w14:ligatures w14:val="none"/>
+              </w:rPr>
+              <w:t>D Controller</w:t>
+            </w:r>
+          </w:p>
+        </w:tc>
+        <w:tc>
+          <w:tcPr>
+            <w:tcW w:w="1180" w:type="dxa"/>
+            <w:noWrap/>
+            <w:hideMark/>
+          </w:tcPr>
+          <w:p>
+            <w:pPr>
+              <w:cnfStyle w:val="100000000000" w:firstRow="1" w:lastRow="0" w:firstColumn="0" w:lastColumn="0" w:oddVBand="0" w:evenVBand="0" w:oddHBand="0" w:evenHBand="0" w:firstRowFirstColumn="0" w:firstRowLastColumn="0" w:lastRowFirstColumn="0" w:lastRowLastColumn="0"/>
+              <w:rPr>
+                <w:rFonts w:ascii="Calibri" w:eastAsia="Times New Roman" w:hAnsi="Calibri" w:cs="Calibri"/>
+                <w:color w:val="000000"/>
+                <w:kern w:val="0"/>
+                <w:sz w:val="22"/>
+                <w:szCs w:val="22"/>
+                <w:lang w:eastAsia="en-IN"/>
+                <w14:ligatures w14:val="none"/>
+              </w:rPr>
+            </w:pPr>
+          </w:p>
+        </w:tc>
+        <w:tc>
+          <w:tcPr>
+            <w:tcW w:w="1560" w:type="dxa"/>
+            <w:noWrap/>
+            <w:hideMark/>
+          </w:tcPr>
+          <w:p>
+            <w:pPr>
+              <w:cnfStyle w:val="100000000000" w:firstRow="1" w:lastRow="0" w:firstColumn="0" w:lastColumn="0" w:oddVBand="0" w:evenVBand="0" w:oddHBand="0" w:evenHBand="0" w:firstRowFirstColumn="0" w:firstRowLastColumn="0" w:lastRowFirstColumn="0" w:lastRowLastColumn="0"/>
+              <w:rPr>
+                <w:rFonts w:ascii="Calibri" w:eastAsia="Times New Roman" w:hAnsi="Calibri" w:cs="Calibri"/>
+                <w:color w:val="000000"/>
+                <w:kern w:val="0"/>
+                <w:sz w:val="22"/>
+                <w:szCs w:val="22"/>
+                <w:lang w:eastAsia="en-IN"/>
+                <w14:ligatures w14:val="none"/>
+              </w:rPr>
+            </w:pPr>
+            <w:r>
+              <w:rPr>
+                <w:rFonts w:ascii="Calibri" w:eastAsia="Times New Roman" w:hAnsi="Calibri" w:cs="Calibri"/>
+                <w:color w:val="000000"/>
+                <w:kern w:val="0"/>
+                <w:sz w:val="22"/>
+                <w:szCs w:val="22"/>
+                <w:lang w:eastAsia="en-IN"/>
+                <w14:ligatures w14:val="none"/>
+              </w:rPr>
+              <w:t>Summation</w:t>
+            </w:r>
+          </w:p>
+        </w:tc>
+        <w:tc>
+          <w:tcPr>
+            <w:tcW w:w="1560" w:type="dxa"/>
+          </w:tcPr>
+          <w:p>
+            <w:pPr>
+              <w:cnfStyle w:val="100000000000" w:firstRow="1" w:lastRow="0" w:firstColumn="0" w:lastColumn="0" w:oddVBand="0" w:evenVBand="0" w:oddHBand="0" w:evenHBand="0" w:firstRowFirstColumn="0" w:firstRowLastColumn="0" w:lastRowFirstColumn="0" w:lastRowLastColumn="0"/>
+              <w:rPr>
+                <w:rFonts w:ascii="Calibri" w:eastAsia="Times New Roman" w:hAnsi="Calibri" w:cs="Calibri"/>
+                <w:color w:val="000000"/>
+                <w:kern w:val="0"/>
+                <w:sz w:val="22"/>
+                <w:szCs w:val="22"/>
+                <w:lang w:eastAsia="en-IN"/>
+                <w14:ligatures w14:val="none"/>
+              </w:rPr>
+            </w:pPr>
+          </w:p>
+        </w:tc>
+      </w:tr>
+      <w:tr>
+        <w:trPr>
+          <w:cnfStyle w:val="000000100000" w:firstRow="0" w:lastRow="0" w:firstColumn="0" w:lastColumn="0" w:oddVBand="0" w:evenVBand="0" w:oddHBand="1" w:evenHBand="0" w:firstRowFirstColumn="0" w:firstRowLastColumn="0" w:lastRowFirstColumn="0" w:lastRowLastColumn="0"/>
+          <w:trHeight w:val="290"/>
+        </w:trPr>
+        <w:tc>
+          <w:tcPr>
+            <w:cnfStyle w:val="001000000000" w:firstRow="0" w:lastRow="0" w:firstColumn="1" w:lastColumn="0" w:oddVBand="0" w:evenVBand="0" w:oddHBand="0" w:evenHBand="0" w:firstRowFirstColumn="0" w:firstRowLastColumn="0" w:lastRowFirstColumn="0" w:lastRowLastColumn="0"/>
+            <w:tcW w:w="1413" w:type="dxa"/>
+            <w:noWrap/>
+            <w:hideMark/>
+          </w:tcPr>
+          <w:p>
+            <w:pPr>
+              <w:rPr>
+                <w:rFonts w:ascii="Calibri" w:eastAsia="Times New Roman" w:hAnsi="Calibri" w:cs="Calibri"/>
+                <w:color w:val="000000"/>
+                <w:kern w:val="0"/>
+                <w:sz w:val="22"/>
+                <w:szCs w:val="22"/>
+                <w:lang w:eastAsia="en-IN"/>
+                <w14:ligatures w14:val="none"/>
+              </w:rPr>
+            </w:pPr>
+            <w:r>
+              <w:rPr>
+                <w:rFonts w:ascii="Calibri" w:eastAsia="Times New Roman" w:hAnsi="Calibri" w:cs="Calibri"/>
+                <w:color w:val="000000"/>
+                <w:kern w:val="0"/>
+                <w:sz w:val="22"/>
+                <w:szCs w:val="22"/>
+                <w:lang w:eastAsia="en-IN"/>
+                <w14:ligatures w14:val="none"/>
+              </w:rPr>
+              <w:t>R-in1</w:t>
+            </w:r>
+          </w:p>
+        </w:tc>
+        <w:tc>
+          <w:tcPr>
+            <w:tcW w:w="1047" w:type="dxa"/>
+            <w:noWrap/>
+            <w:hideMark/>
+          </w:tcPr>
+          <w:p>
+            <w:pPr>
+              <w:cnfStyle w:val="000000100000" w:firstRow="0" w:lastRow="0" w:firstColumn="0" w:lastColumn="0" w:oddVBand="0" w:evenVBand="0" w:oddHBand="1" w:evenHBand="0" w:firstRowFirstColumn="0" w:firstRowLastColumn="0" w:lastRowFirstColumn="0" w:lastRowLastColumn="0"/>
+              <w:rPr>
+                <w:rFonts w:ascii="Calibri" w:eastAsia="Times New Roman" w:hAnsi="Calibri" w:cs="Calibri"/>
+                <w:color w:val="000000"/>
+                <w:kern w:val="0"/>
+                <w:sz w:val="22"/>
+                <w:szCs w:val="22"/>
+                <w:lang w:eastAsia="en-IN"/>
+                <w14:ligatures w14:val="none"/>
+              </w:rPr>
+            </w:pPr>
+            <w:r>
+              <w:rPr>
+                <w:rFonts w:ascii="Calibri" w:eastAsia="Times New Roman" w:hAnsi="Calibri" w:cs="Calibri"/>
+                <w:color w:val="000000"/>
+                <w:kern w:val="0"/>
+                <w:sz w:val="22"/>
+                <w:szCs w:val="22"/>
+                <w:lang w:eastAsia="en-IN"/>
+                <w14:ligatures w14:val="none"/>
+              </w:rPr>
+              <w:t>5 kOhm</w:t>
+            </w:r>
+          </w:p>
+        </w:tc>
+        <w:tc>
+          <w:tcPr>
+            <w:tcW w:w="1360" w:type="dxa"/>
+            <w:noWrap/>
+            <w:hideMark/>
+          </w:tcPr>
+          <w:p>
+            <w:pPr>
+              <w:cnfStyle w:val="000000100000" w:firstRow="0" w:lastRow="0" w:firstColumn="0" w:lastColumn="0" w:oddVBand="0" w:evenVBand="0" w:oddHBand="1" w:evenHBand="0" w:firstRowFirstColumn="0" w:firstRowLastColumn="0" w:lastRowFirstColumn="0" w:lastRowLastColumn="0"/>
+              <w:rPr>
+                <w:rFonts w:ascii="Calibri" w:eastAsia="Times New Roman" w:hAnsi="Calibri" w:cs="Calibri"/>
+                <w:color w:val="000000"/>
+                <w:kern w:val="0"/>
+                <w:sz w:val="22"/>
+                <w:szCs w:val="22"/>
+                <w:lang w:eastAsia="en-IN"/>
+                <w14:ligatures w14:val="none"/>
+              </w:rPr>
+            </w:pPr>
+            <w:r>
+              <w:rPr>
+                <w:rFonts w:ascii="Calibri" w:eastAsia="Times New Roman" w:hAnsi="Calibri" w:cs="Calibri"/>
+                <w:color w:val="000000"/>
+                <w:kern w:val="0"/>
+                <w:sz w:val="22"/>
+                <w:szCs w:val="22"/>
+                <w:lang w:eastAsia="en-IN"/>
+                <w14:ligatures w14:val="none"/>
+              </w:rPr>
+              <w:t>R-in2</w:t>
+            </w:r>
+          </w:p>
+        </w:tc>
+        <w:tc>
+          <w:tcPr>
+            <w:tcW w:w="1280" w:type="dxa"/>
+            <w:noWrap/>
+            <w:hideMark/>
+          </w:tcPr>
+          <w:p>
+            <w:pPr>
+              <w:cnfStyle w:val="000000100000" w:firstRow="0" w:lastRow="0" w:firstColumn="0" w:lastColumn="0" w:oddVBand="0" w:evenVBand="0" w:oddHBand="1" w:evenHBand="0" w:firstRowFirstColumn="0" w:firstRowLastColumn="0" w:lastRowFirstColumn="0" w:lastRowLastColumn="0"/>
+              <w:rPr>
+                <w:rFonts w:ascii="Calibri" w:eastAsia="Times New Roman" w:hAnsi="Calibri" w:cs="Calibri"/>
+                <w:color w:val="FFFF00"/>
+                <w:kern w:val="0"/>
+                <w:sz w:val="22"/>
+                <w:szCs w:val="22"/>
+                <w:lang w:eastAsia="en-IN"/>
+                <w14:ligatures w14:val="none"/>
+              </w:rPr>
+            </w:pPr>
+            <w:r>
+              <w:rPr>
+                <w:rFonts w:ascii="Calibri" w:eastAsia="Times New Roman" w:hAnsi="Calibri" w:cs="Calibri"/>
+                <w:color w:val="EE0000"/>
+                <w:kern w:val="0"/>
+                <w:sz w:val="22"/>
+                <w:szCs w:val="22"/>
+                <w:lang w:eastAsia="en-IN"/>
+                <w14:ligatures w14:val="none"/>
+              </w:rPr>
+              <w:t>20 kOhm</w:t>
+            </w:r>
+          </w:p>
+        </w:tc>
+        <w:tc>
+          <w:tcPr>
+            <w:tcW w:w="1520" w:type="dxa"/>
+            <w:noWrap/>
+            <w:hideMark/>
+          </w:tcPr>
+          <w:p>
+            <w:pPr>
+              <w:cnfStyle w:val="000000100000" w:firstRow="0" w:lastRow="0" w:firstColumn="0" w:lastColumn="0" w:oddVBand="0" w:evenVBand="0" w:oddHBand="1" w:evenHBand="0" w:firstRowFirstColumn="0" w:firstRowLastColumn="0" w:lastRowFirstColumn="0" w:lastRowLastColumn="0"/>
+              <w:rPr>
+                <w:rFonts w:ascii="Calibri" w:eastAsia="Times New Roman" w:hAnsi="Calibri" w:cs="Calibri"/>
+                <w:color w:val="000000"/>
+                <w:kern w:val="0"/>
+                <w:sz w:val="22"/>
+                <w:szCs w:val="22"/>
+                <w:lang w:eastAsia="en-IN"/>
+                <w14:ligatures w14:val="none"/>
+              </w:rPr>
+            </w:pPr>
+            <w:r>
+              <w:rPr>
+                <w:rFonts w:ascii="Calibri" w:eastAsia="Times New Roman" w:hAnsi="Calibri" w:cs="Calibri"/>
+                <w:color w:val="000000"/>
+                <w:kern w:val="0"/>
+                <w:sz w:val="22"/>
+                <w:szCs w:val="22"/>
+                <w:lang w:eastAsia="en-IN"/>
+                <w14:ligatures w14:val="none"/>
+              </w:rPr>
+              <w:t>R-in3</w:t>
+            </w:r>
+          </w:p>
+        </w:tc>
+        <w:tc>
+          <w:tcPr>
+            <w:tcW w:w="1180" w:type="dxa"/>
+            <w:noWrap/>
+            <w:hideMark/>
+          </w:tcPr>
+          <w:p>
+            <w:pPr>
+              <w:cnfStyle w:val="000000100000" w:firstRow="0" w:lastRow="0" w:firstColumn="0" w:lastColumn="0" w:oddVBand="0" w:evenVBand="0" w:oddHBand="1" w:evenHBand="0" w:firstRowFirstColumn="0" w:firstRowLastColumn="0" w:lastRowFirstColumn="0" w:lastRowLastColumn="0"/>
+              <w:rPr>
+                <w:rFonts w:ascii="Calibri" w:eastAsia="Times New Roman" w:hAnsi="Calibri" w:cs="Calibri"/>
+                <w:color w:val="000000"/>
+                <w:kern w:val="0"/>
+                <w:sz w:val="22"/>
+                <w:szCs w:val="22"/>
+                <w:lang w:eastAsia="en-IN"/>
+                <w14:ligatures w14:val="none"/>
+              </w:rPr>
+            </w:pPr>
+            <w:r>
+              <w:rPr>
+                <w:rFonts w:ascii="Calibri" w:eastAsia="Times New Roman" w:hAnsi="Calibri" w:cs="Calibri"/>
+                <w:color w:val="000000"/>
+                <w:kern w:val="0"/>
+                <w:sz w:val="22"/>
+                <w:szCs w:val="22"/>
+                <w:lang w:eastAsia="en-IN"/>
+                <w14:ligatures w14:val="none"/>
+              </w:rPr>
+              <w:t>5 kOhm</w:t>
+            </w:r>
+          </w:p>
+        </w:tc>
+        <w:tc>
+          <w:tcPr>
+            <w:tcW w:w="1560" w:type="dxa"/>
+            <w:noWrap/>
+            <w:hideMark/>
+          </w:tcPr>
+          <w:p>
+            <w:pPr>
+              <w:cnfStyle w:val="000000100000" w:firstRow="0" w:lastRow="0" w:firstColumn="0" w:lastColumn="0" w:oddVBand="0" w:evenVBand="0" w:oddHBand="1" w:evenHBand="0" w:firstRowFirstColumn="0" w:firstRowLastColumn="0" w:lastRowFirstColumn="0" w:lastRowLastColumn="0"/>
+              <w:rPr>
+                <w:rFonts w:ascii="Calibri" w:eastAsia="Times New Roman" w:hAnsi="Calibri" w:cs="Calibri"/>
+                <w:color w:val="000000"/>
+                <w:kern w:val="0"/>
+                <w:sz w:val="22"/>
+                <w:szCs w:val="22"/>
+                <w:lang w:eastAsia="en-IN"/>
+                <w14:ligatures w14:val="none"/>
+              </w:rPr>
+            </w:pPr>
+            <w:r>
+              <w:rPr>
+                <w:rFonts w:ascii="Calibri" w:eastAsia="Times New Roman" w:hAnsi="Calibri" w:cs="Calibri"/>
+                <w:color w:val="000000"/>
+                <w:kern w:val="0"/>
+                <w:sz w:val="22"/>
+                <w:szCs w:val="22"/>
+                <w:lang w:eastAsia="en-IN"/>
+                <w14:ligatures w14:val="none"/>
+              </w:rPr>
+              <w:t>R-fb4</w:t>
+            </w:r>
+          </w:p>
+        </w:tc>
+        <w:tc>
+          <w:tcPr>
+            <w:tcW w:w="1560" w:type="dxa"/>
+          </w:tcPr>
+          <w:p>
+            <w:pPr>
+              <w:cnfStyle w:val="000000100000" w:firstRow="0" w:lastRow="0" w:firstColumn="0" w:lastColumn="0" w:oddVBand="0" w:evenVBand="0" w:oddHBand="1" w:evenHBand="0" w:firstRowFirstColumn="0" w:firstRowLastColumn="0" w:lastRowFirstColumn="0" w:lastRowLastColumn="0"/>
+              <w:rPr>
+                <w:rFonts w:ascii="Calibri" w:eastAsia="Times New Roman" w:hAnsi="Calibri" w:cs="Calibri"/>
+                <w:color w:val="000000"/>
+                <w:kern w:val="0"/>
+                <w:sz w:val="22"/>
+                <w:szCs w:val="22"/>
+                <w:lang w:eastAsia="en-IN"/>
+                <w14:ligatures w14:val="none"/>
+              </w:rPr>
+            </w:pPr>
+            <w:r>
+              <w:rPr>
+                <w:rFonts w:ascii="Calibri" w:eastAsia="Times New Roman" w:hAnsi="Calibri" w:cs="Calibri"/>
+                <w:color w:val="000000"/>
+                <w:kern w:val="0"/>
+                <w:sz w:val="22"/>
+                <w:szCs w:val="22"/>
+                <w:lang w:eastAsia="en-IN"/>
+                <w14:ligatures w14:val="none"/>
+              </w:rPr>
+              <w:t>10 kOhm</w:t>
+            </w:r>
+          </w:p>
+        </w:tc>
+      </w:tr>
+      <w:tr>
+        <w:trPr>
+          <w:trHeight w:val="290"/>
+        </w:trPr>
+        <w:tc>
+          <w:tcPr>
+            <w:cnfStyle w:val="001000000000" w:firstRow="0" w:lastRow="0" w:firstColumn="1" w:lastColumn="0" w:oddVBand="0" w:evenVBand="0" w:oddHBand="0" w:evenHBand="0" w:firstRowFirstColumn="0" w:firstRowLastColumn="0" w:lastRowFirstColumn="0" w:lastRowLastColumn="0"/>
+            <w:tcW w:w="1413" w:type="dxa"/>
+            <w:noWrap/>
+            <w:hideMark/>
+          </w:tcPr>
+          <w:p>
+            <w:pPr>
+              <w:rPr>
+                <w:rFonts w:ascii="Calibri" w:eastAsia="Times New Roman" w:hAnsi="Calibri" w:cs="Calibri"/>
+                <w:color w:val="000000"/>
+                <w:kern w:val="0"/>
+                <w:sz w:val="22"/>
+                <w:szCs w:val="22"/>
+                <w:lang w:eastAsia="en-IN"/>
+                <w14:ligatures w14:val="none"/>
+              </w:rPr>
+            </w:pPr>
+            <w:r>
+              <w:rPr>
+                <w:rFonts w:ascii="Calibri" w:eastAsia="Times New Roman" w:hAnsi="Calibri" w:cs="Calibri"/>
+                <w:color w:val="000000"/>
+                <w:kern w:val="0"/>
+                <w:sz w:val="22"/>
+                <w:szCs w:val="22"/>
+                <w:lang w:eastAsia="en-IN"/>
+                <w14:ligatures w14:val="none"/>
+              </w:rPr>
+              <w:t>R-fb1</w:t>
+            </w:r>
+          </w:p>
+        </w:tc>
+        <w:tc>
+          <w:tcPr>
+            <w:tcW w:w="1047" w:type="dxa"/>
+            <w:noWrap/>
+            <w:hideMark/>
+          </w:tcPr>
+          <w:p>
+            <w:pPr>
+              <w:cnfStyle w:val="000000000000" w:firstRow="0" w:lastRow="0" w:firstColumn="0" w:lastColumn="0" w:oddVBand="0" w:evenVBand="0" w:oddHBand="0" w:evenHBand="0" w:firstRowFirstColumn="0" w:firstRowLastColumn="0" w:lastRowFirstColumn="0" w:lastRowLastColumn="0"/>
+              <w:rPr>
+                <w:rFonts w:ascii="Calibri" w:eastAsia="Times New Roman" w:hAnsi="Calibri" w:cs="Calibri"/>
+                <w:color w:val="000000"/>
+                <w:kern w:val="0"/>
+                <w:sz w:val="22"/>
+                <w:szCs w:val="22"/>
+                <w:lang w:eastAsia="en-IN"/>
+                <w14:ligatures w14:val="none"/>
+              </w:rPr>
+            </w:pPr>
+            <w:r>
+              <w:rPr>
+                <w:rFonts w:ascii="Calibri" w:eastAsia="Times New Roman" w:hAnsi="Calibri" w:cs="Calibri"/>
+                <w:color w:val="EE0000"/>
+                <w:kern w:val="0"/>
+                <w:sz w:val="22"/>
+                <w:szCs w:val="22"/>
+                <w:lang w:eastAsia="en-IN"/>
+                <w14:ligatures w14:val="none"/>
+              </w:rPr>
+              <w:t>10 kOhm</w:t>
+            </w:r>
+          </w:p>
+        </w:tc>
+        <w:tc>
+          <w:tcPr>
+            <w:tcW w:w="1360" w:type="dxa"/>
+            <w:noWrap/>
+            <w:hideMark/>
+          </w:tcPr>
+          <w:p>
+            <w:pPr>
+              <w:cnfStyle w:val="000000000000" w:firstRow="0" w:lastRow="0" w:firstColumn="0" w:lastColumn="0" w:oddVBand="0" w:evenVBand="0" w:oddHBand="0" w:evenHBand="0" w:firstRowFirstColumn="0" w:firstRowLastColumn="0" w:lastRowFirstColumn="0" w:lastRowLastColumn="0"/>
+              <w:rPr>
+                <w:rFonts w:ascii="Calibri" w:eastAsia="Times New Roman" w:hAnsi="Calibri" w:cs="Calibri"/>
+                <w:color w:val="000000"/>
+                <w:kern w:val="0"/>
+                <w:sz w:val="22"/>
+                <w:szCs w:val="22"/>
+                <w:lang w:eastAsia="en-IN"/>
+                <w14:ligatures w14:val="none"/>
+              </w:rPr>
+            </w:pPr>
+            <w:r>
+              <w:rPr>
+                <w:rFonts w:ascii="Calibri" w:eastAsia="Times New Roman" w:hAnsi="Calibri" w:cs="Calibri"/>
+                <w:color w:val="000000"/>
+                <w:kern w:val="0"/>
+                <w:sz w:val="22"/>
+                <w:szCs w:val="22"/>
+                <w:lang w:eastAsia="en-IN"/>
+                <w14:ligatures w14:val="none"/>
+              </w:rPr>
+              <w:t>R-fb2</w:t>
+            </w:r>
+          </w:p>
+        </w:tc>
+        <w:tc>
+          <w:tcPr>
+            <w:tcW w:w="1280" w:type="dxa"/>
+            <w:noWrap/>
+            <w:hideMark/>
+          </w:tcPr>
+          <w:p>
+            <w:pPr>
+              <w:cnfStyle w:val="000000000000" w:firstRow="0" w:lastRow="0" w:firstColumn="0" w:lastColumn="0" w:oddVBand="0" w:evenVBand="0" w:oddHBand="0" w:evenHBand="0" w:firstRowFirstColumn="0" w:firstRowLastColumn="0" w:lastRowFirstColumn="0" w:lastRowLastColumn="0"/>
+              <w:rPr>
+                <w:rFonts w:ascii="Calibri" w:eastAsia="Times New Roman" w:hAnsi="Calibri" w:cs="Calibri"/>
+                <w:color w:val="000000"/>
+                <w:kern w:val="0"/>
+                <w:sz w:val="22"/>
+                <w:szCs w:val="22"/>
+                <w:lang w:eastAsia="en-IN"/>
+                <w14:ligatures w14:val="none"/>
+              </w:rPr>
+            </w:pPr>
+            <w:r>
+              <w:rPr>
+                <w:rFonts w:ascii="Calibri" w:eastAsia="Times New Roman" w:hAnsi="Calibri" w:cs="Calibri"/>
+                <w:color w:val="000000"/>
+                <w:kern w:val="0"/>
+                <w:sz w:val="22"/>
+                <w:szCs w:val="22"/>
+                <w:lang w:eastAsia="en-IN"/>
+                <w14:ligatures w14:val="none"/>
+              </w:rPr>
+              <w:t>100 kOhm</w:t>
+            </w:r>
+          </w:p>
+        </w:tc>
+        <w:tc>
+          <w:tcPr>
+            <w:tcW w:w="1520" w:type="dxa"/>
+            <w:noWrap/>
+            <w:hideMark/>
+          </w:tcPr>
+          <w:p>
+            <w:pPr>
+              <w:cnfStyle w:val="000000000000" w:firstRow="0" w:lastRow="0" w:firstColumn="0" w:lastColumn="0" w:oddVBand="0" w:evenVBand="0" w:oddHBand="0" w:evenHBand="0" w:firstRowFirstColumn="0" w:firstRowLastColumn="0" w:lastRowFirstColumn="0" w:lastRowLastColumn="0"/>
+              <w:rPr>
+                <w:rFonts w:ascii="Calibri" w:eastAsia="Times New Roman" w:hAnsi="Calibri" w:cs="Calibri"/>
+                <w:color w:val="000000"/>
+                <w:kern w:val="0"/>
+                <w:sz w:val="22"/>
+                <w:szCs w:val="22"/>
+                <w:lang w:eastAsia="en-IN"/>
+                <w14:ligatures w14:val="none"/>
+              </w:rPr>
+            </w:pPr>
+            <w:r>
+              <w:rPr>
+                <w:rFonts w:ascii="Calibri" w:eastAsia="Times New Roman" w:hAnsi="Calibri" w:cs="Calibri"/>
+                <w:color w:val="000000"/>
+                <w:kern w:val="0"/>
+                <w:sz w:val="22"/>
+                <w:szCs w:val="22"/>
+                <w:lang w:eastAsia="en-IN"/>
+                <w14:ligatures w14:val="none"/>
+              </w:rPr>
+              <w:t>R-fb3</w:t>
+            </w:r>
+          </w:p>
+        </w:tc>
+        <w:tc>
+          <w:tcPr>
+            <w:tcW w:w="1180" w:type="dxa"/>
+            <w:noWrap/>
+            <w:hideMark/>
+          </w:tcPr>
+          <w:p>
+            <w:pPr>
+              <w:cnfStyle w:val="000000000000" w:firstRow="0" w:lastRow="0" w:firstColumn="0" w:lastColumn="0" w:oddVBand="0" w:evenVBand="0" w:oddHBand="0" w:evenHBand="0" w:firstRowFirstColumn="0" w:firstRowLastColumn="0" w:lastRowFirstColumn="0" w:lastRowLastColumn="0"/>
+              <w:rPr>
+                <w:rFonts w:ascii="Calibri" w:eastAsia="Times New Roman" w:hAnsi="Calibri" w:cs="Calibri"/>
+                <w:color w:val="000000"/>
+                <w:kern w:val="0"/>
+                <w:sz w:val="22"/>
+                <w:szCs w:val="22"/>
+                <w:lang w:eastAsia="en-IN"/>
+                <w14:ligatures w14:val="none"/>
+              </w:rPr>
+            </w:pPr>
+            <w:r>
+              <w:rPr>
+                <w:rFonts w:ascii="Calibri" w:eastAsia="Times New Roman" w:hAnsi="Calibri" w:cs="Calibri"/>
+                <w:color w:val="EE0000"/>
+                <w:kern w:val="0"/>
+                <w:sz w:val="22"/>
+                <w:szCs w:val="22"/>
+                <w:lang w:eastAsia="en-IN"/>
+                <w14:ligatures w14:val="none"/>
+              </w:rPr>
+              <w:t>5 kOhm</w:t>
+            </w:r>
+          </w:p>
+        </w:tc>
+        <w:tc>
+          <w:tcPr>
+            <w:tcW w:w="1560" w:type="dxa"/>
+            <w:noWrap/>
+            <w:hideMark/>
+          </w:tcPr>
+          <w:p>
+            <w:pPr>
+              <w:cnfStyle w:val="000000000000" w:firstRow="0" w:lastRow="0" w:firstColumn="0" w:lastColumn="0" w:oddVBand="0" w:evenVBand="0" w:oddHBand="0" w:evenHBand="0" w:firstRowFirstColumn="0" w:firstRowLastColumn="0" w:lastRowFirstColumn="0" w:lastRowLastColumn="0"/>
+              <w:rPr>
+                <w:rFonts w:ascii="Calibri" w:eastAsia="Times New Roman" w:hAnsi="Calibri" w:cs="Calibri"/>
+                <w:color w:val="000000"/>
+                <w:kern w:val="0"/>
+                <w:sz w:val="22"/>
+                <w:szCs w:val="22"/>
+                <w:lang w:eastAsia="en-IN"/>
+                <w14:ligatures w14:val="none"/>
+              </w:rPr>
+            </w:pPr>
+          </w:p>
+        </w:tc>
+        <w:tc>
+          <w:tcPr>
+            <w:tcW w:w="1560" w:type="dxa"/>
+          </w:tcPr>
+          <w:p>
+            <w:pPr>
+              <w:cnfStyle w:val="000000000000" w:firstRow="0" w:lastRow="0" w:firstColumn="0" w:lastColumn="0" w:oddVBand="0" w:evenVBand="0" w:oddHBand="0" w:evenHBand="0" w:firstRowFirstColumn="0" w:firstRowLastColumn="0" w:lastRowFirstColumn="0" w:lastRowLastColumn="0"/>
+              <w:rPr>
+                <w:rFonts w:ascii="Calibri" w:eastAsia="Times New Roman" w:hAnsi="Calibri" w:cs="Calibri"/>
+                <w:color w:val="000000"/>
+                <w:kern w:val="0"/>
+                <w:sz w:val="22"/>
+                <w:szCs w:val="22"/>
+                <w:lang w:eastAsia="en-IN"/>
+                <w14:ligatures w14:val="none"/>
+              </w:rPr>
+            </w:pPr>
+          </w:p>
+        </w:tc>
+      </w:tr>
+      <w:tr>
+        <w:trPr>
+          <w:cnfStyle w:val="000000100000" w:firstRow="0" w:lastRow="0" w:firstColumn="0" w:lastColumn="0" w:oddVBand="0" w:evenVBand="0" w:oddHBand="1" w:evenHBand="0" w:firstRowFirstColumn="0" w:firstRowLastColumn="0" w:lastRowFirstColumn="0" w:lastRowLastColumn="0"/>
+          <w:trHeight w:val="290"/>
+        </w:trPr>
+        <w:tc>
+          <w:tcPr>
+            <w:cnfStyle w:val="001000000000" w:firstRow="0" w:lastRow="0" w:firstColumn="1" w:lastColumn="0" w:oddVBand="0" w:evenVBand="0" w:oddHBand="0" w:evenHBand="0" w:firstRowFirstColumn="0" w:firstRowLastColumn="0" w:lastRowFirstColumn="0" w:lastRowLastColumn="0"/>
+            <w:tcW w:w="1413" w:type="dxa"/>
+            <w:noWrap/>
+            <w:hideMark/>
+          </w:tcPr>
+          <w:p>
+            <w:pPr>
+              <w:rPr>
+                <w:rFonts w:ascii="Calibri" w:eastAsia="Times New Roman" w:hAnsi="Calibri" w:cs="Calibri"/>
+                <w:color w:val="000000"/>
+                <w:kern w:val="0"/>
+                <w:sz w:val="22"/>
+                <w:szCs w:val="22"/>
+                <w:lang w:eastAsia="en-IN"/>
+                <w14:ligatures w14:val="none"/>
+              </w:rPr>
+            </w:pPr>
+            <w:r>
+              <w:rPr>
+                <w:rFonts w:ascii="Calibri" w:eastAsia="Times New Roman" w:hAnsi="Calibri" w:cs="Calibri"/>
+                <w:color w:val="000000"/>
+                <w:kern w:val="0"/>
+                <w:sz w:val="22"/>
+                <w:szCs w:val="22"/>
+                <w:lang w:eastAsia="en-IN"/>
+                <w14:ligatures w14:val="none"/>
+              </w:rPr>
+              <w:t>R-out1</w:t>
+            </w:r>
+          </w:p>
+        </w:tc>
+        <w:tc>
+          <w:tcPr>
+            <w:tcW w:w="1047" w:type="dxa"/>
+            <w:noWrap/>
+            <w:hideMark/>
+          </w:tcPr>
+          <w:p>
+            <w:pPr>
+              <w:cnfStyle w:val="000000100000" w:firstRow="0" w:lastRow="0" w:firstColumn="0" w:lastColumn="0" w:oddVBand="0" w:evenVBand="0" w:oddHBand="1" w:evenHBand="0" w:firstRowFirstColumn="0" w:firstRowLastColumn="0" w:lastRowFirstColumn="0" w:lastRowLastColumn="0"/>
+              <w:rPr>
+                <w:rFonts w:ascii="Calibri" w:eastAsia="Times New Roman" w:hAnsi="Calibri" w:cs="Calibri"/>
+                <w:color w:val="000000"/>
+                <w:kern w:val="0"/>
+                <w:sz w:val="22"/>
+                <w:szCs w:val="22"/>
+                <w:lang w:eastAsia="en-IN"/>
+                <w14:ligatures w14:val="none"/>
+              </w:rPr>
+            </w:pPr>
+            <w:r>
+              <w:rPr>
+                <w:rFonts w:ascii="Calibri" w:eastAsia="Times New Roman" w:hAnsi="Calibri" w:cs="Calibri"/>
+                <w:color w:val="000000"/>
+                <w:kern w:val="0"/>
+                <w:sz w:val="22"/>
+                <w:szCs w:val="22"/>
+                <w:lang w:eastAsia="en-IN"/>
+                <w14:ligatures w14:val="none"/>
+              </w:rPr>
+              <w:t>10 kOhm</w:t>
+            </w:r>
+          </w:p>
+        </w:tc>
+        <w:tc>
+          <w:tcPr>
+            <w:tcW w:w="1360" w:type="dxa"/>
+            <w:noWrap/>
+            <w:hideMark/>
+          </w:tcPr>
+          <w:p>
+            <w:pPr>
+              <w:cnfStyle w:val="000000100000" w:firstRow="0" w:lastRow="0" w:firstColumn="0" w:lastColumn="0" w:oddVBand="0" w:evenVBand="0" w:oddHBand="1" w:evenHBand="0" w:firstRowFirstColumn="0" w:firstRowLastColumn="0" w:lastRowFirstColumn="0" w:lastRowLastColumn="0"/>
+              <w:rPr>
+                <w:rFonts w:ascii="Calibri" w:eastAsia="Times New Roman" w:hAnsi="Calibri" w:cs="Calibri"/>
+                <w:color w:val="000000"/>
+                <w:kern w:val="0"/>
+                <w:sz w:val="22"/>
+                <w:szCs w:val="22"/>
+                <w:lang w:eastAsia="en-IN"/>
+                <w14:ligatures w14:val="none"/>
+              </w:rPr>
+            </w:pPr>
+            <w:r>
+              <w:rPr>
+                <w:rFonts w:ascii="Calibri" w:eastAsia="Times New Roman" w:hAnsi="Calibri" w:cs="Calibri"/>
+                <w:color w:val="000000"/>
+                <w:kern w:val="0"/>
+                <w:sz w:val="22"/>
+                <w:szCs w:val="22"/>
+                <w:lang w:eastAsia="en-IN"/>
+                <w14:ligatures w14:val="none"/>
+              </w:rPr>
+              <w:t>R-out2</w:t>
+            </w:r>
+          </w:p>
+        </w:tc>
+        <w:tc>
+          <w:tcPr>
+            <w:tcW w:w="1280" w:type="dxa"/>
+            <w:noWrap/>
+            <w:hideMark/>
+          </w:tcPr>
+          <w:p>
+            <w:pPr>
+              <w:cnfStyle w:val="000000100000" w:firstRow="0" w:lastRow="0" w:firstColumn="0" w:lastColumn="0" w:oddVBand="0" w:evenVBand="0" w:oddHBand="1" w:evenHBand="0" w:firstRowFirstColumn="0" w:firstRowLastColumn="0" w:lastRowFirstColumn="0" w:lastRowLastColumn="0"/>
+              <w:rPr>
+                <w:rFonts w:ascii="Calibri" w:eastAsia="Times New Roman" w:hAnsi="Calibri" w:cs="Calibri"/>
+                <w:color w:val="000000"/>
+                <w:kern w:val="0"/>
+                <w:sz w:val="22"/>
+                <w:szCs w:val="22"/>
+                <w:lang w:eastAsia="en-IN"/>
+                <w14:ligatures w14:val="none"/>
+              </w:rPr>
+            </w:pPr>
+            <w:r>
+              <w:rPr>
+                <w:rFonts w:ascii="Calibri" w:eastAsia="Times New Roman" w:hAnsi="Calibri" w:cs="Calibri"/>
+                <w:color w:val="000000"/>
+                <w:kern w:val="0"/>
+                <w:sz w:val="22"/>
+                <w:szCs w:val="22"/>
+                <w:lang w:eastAsia="en-IN"/>
+                <w14:ligatures w14:val="none"/>
+              </w:rPr>
+              <w:t>10 kOhm</w:t>
+            </w:r>
+          </w:p>
+        </w:tc>
+        <w:tc>
+          <w:tcPr>
+            <w:tcW w:w="1520" w:type="dxa"/>
+            <w:noWrap/>
+            <w:hideMark/>
+          </w:tcPr>
+          <w:p>
+            <w:pPr>
+              <w:cnfStyle w:val="000000100000" w:firstRow="0" w:lastRow="0" w:firstColumn="0" w:lastColumn="0" w:oddVBand="0" w:evenVBand="0" w:oddHBand="1" w:evenHBand="0" w:firstRowFirstColumn="0" w:firstRowLastColumn="0" w:lastRowFirstColumn="0" w:lastRowLastColumn="0"/>
+              <w:rPr>
+                <w:rFonts w:ascii="Calibri" w:eastAsia="Times New Roman" w:hAnsi="Calibri" w:cs="Calibri"/>
+                <w:color w:val="000000"/>
+                <w:kern w:val="0"/>
+                <w:sz w:val="22"/>
+                <w:szCs w:val="22"/>
+                <w:lang w:eastAsia="en-IN"/>
+                <w14:ligatures w14:val="none"/>
+              </w:rPr>
+            </w:pPr>
+            <w:r>
+              <w:rPr>
+                <w:rFonts w:ascii="Calibri" w:eastAsia="Times New Roman" w:hAnsi="Calibri" w:cs="Calibri"/>
+                <w:color w:val="000000"/>
+                <w:kern w:val="0"/>
+                <w:sz w:val="22"/>
+                <w:szCs w:val="22"/>
+                <w:lang w:eastAsia="en-IN"/>
+                <w14:ligatures w14:val="none"/>
+              </w:rPr>
+              <w:t>R-out3</w:t>
+            </w:r>
+          </w:p>
+        </w:tc>
+        <w:tc>
+          <w:tcPr>
+            <w:tcW w:w="1180" w:type="dxa"/>
+            <w:noWrap/>
+            <w:hideMark/>
+          </w:tcPr>
+          <w:p>
+            <w:pPr>
+              <w:cnfStyle w:val="000000100000" w:firstRow="0" w:lastRow="0" w:firstColumn="0" w:lastColumn="0" w:oddVBand="0" w:evenVBand="0" w:oddHBand="1" w:evenHBand="0" w:firstRowFirstColumn="0" w:firstRowLastColumn="0" w:lastRowFirstColumn="0" w:lastRowLastColumn="0"/>
+              <w:rPr>
+                <w:rFonts w:ascii="Calibri" w:eastAsia="Times New Roman" w:hAnsi="Calibri" w:cs="Calibri"/>
+                <w:color w:val="000000"/>
+                <w:kern w:val="0"/>
+                <w:sz w:val="22"/>
+                <w:szCs w:val="22"/>
+                <w:lang w:eastAsia="en-IN"/>
+                <w14:ligatures w14:val="none"/>
+              </w:rPr>
+            </w:pPr>
+            <w:r>
+              <w:rPr>
+                <w:rFonts w:ascii="Calibri" w:eastAsia="Times New Roman" w:hAnsi="Calibri" w:cs="Calibri"/>
+                <w:color w:val="000000"/>
+                <w:kern w:val="0"/>
+                <w:sz w:val="22"/>
+                <w:szCs w:val="22"/>
+                <w:lang w:eastAsia="en-IN"/>
+                <w14:ligatures w14:val="none"/>
+              </w:rPr>
+              <w:t>10 kOhm</w:t>
+            </w:r>
+          </w:p>
+        </w:tc>
+        <w:tc>
+          <w:tcPr>
+            <w:tcW w:w="1560" w:type="dxa"/>
+            <w:noWrap/>
+            <w:hideMark/>
+          </w:tcPr>
+          <w:p>
+            <w:pPr>
+              <w:cnfStyle w:val="000000100000" w:firstRow="0" w:lastRow="0" w:firstColumn="0" w:lastColumn="0" w:oddVBand="0" w:evenVBand="0" w:oddHBand="1" w:evenHBand="0" w:firstRowFirstColumn="0" w:firstRowLastColumn="0" w:lastRowFirstColumn="0" w:lastRowLastColumn="0"/>
+              <w:rPr>
+                <w:rFonts w:ascii="Calibri" w:eastAsia="Times New Roman" w:hAnsi="Calibri" w:cs="Calibri"/>
+                <w:color w:val="000000"/>
+                <w:kern w:val="0"/>
+                <w:sz w:val="22"/>
+                <w:szCs w:val="22"/>
+                <w:lang w:eastAsia="en-IN"/>
+                <w14:ligatures w14:val="none"/>
+              </w:rPr>
+            </w:pPr>
+          </w:p>
+        </w:tc>
+        <w:tc>
+          <w:tcPr>
+            <w:tcW w:w="1560" w:type="dxa"/>
+          </w:tcPr>
+          <w:p>
+            <w:pPr>
+              <w:cnfStyle w:val="000000100000" w:firstRow="0" w:lastRow="0" w:firstColumn="0" w:lastColumn="0" w:oddVBand="0" w:evenVBand="0" w:oddHBand="1" w:evenHBand="0" w:firstRowFirstColumn="0" w:firstRowLastColumn="0" w:lastRowFirstColumn="0" w:lastRowLastColumn="0"/>
+              <w:rPr>
+                <w:rFonts w:ascii="Calibri" w:eastAsia="Times New Roman" w:hAnsi="Calibri" w:cs="Calibri"/>
+                <w:color w:val="000000"/>
+                <w:kern w:val="0"/>
+                <w:sz w:val="22"/>
+                <w:szCs w:val="22"/>
+                <w:lang w:eastAsia="en-IN"/>
+                <w14:ligatures w14:val="none"/>
+              </w:rPr>
+            </w:pPr>
+          </w:p>
+        </w:tc>
+      </w:tr>
+      <w:tr>
+        <w:trPr>
+          <w:trHeight w:val="290"/>
+        </w:trPr>
+        <w:tc>
+          <w:tcPr>
+            <w:cnfStyle w:val="001000000000" w:firstRow="0" w:lastRow="0" w:firstColumn="1" w:lastColumn="0" w:oddVBand="0" w:evenVBand="0" w:oddHBand="0" w:evenHBand="0" w:firstRowFirstColumn="0" w:firstRowLastColumn="0" w:lastRowFirstColumn="0" w:lastRowLastColumn="0"/>
+            <w:tcW w:w="1413" w:type="dxa"/>
+            <w:noWrap/>
+            <w:hideMark/>
+          </w:tcPr>
+          <w:p>
+            <w:pPr>
+              <w:rPr>
+                <w:rFonts w:ascii="Times New Roman" w:eastAsia="Times New Roman" w:hAnsi="Times New Roman" w:cs="Times New Roman"/>
+                <w:kern w:val="0"/>
+                <w:sz w:val="20"/>
+                <w:szCs w:val="20"/>
+                <w:lang w:eastAsia="en-IN"/>
+                <w14:ligatures w14:val="none"/>
+              </w:rPr>
+            </w:pPr>
+          </w:p>
+        </w:tc>
+        <w:tc>
+          <w:tcPr>
+            <w:tcW w:w="1047" w:type="dxa"/>
+            <w:noWrap/>
+            <w:hideMark/>
+          </w:tcPr>
+          <w:p>
+            <w:pPr>
+              <w:cnfStyle w:val="000000000000" w:firstRow="0" w:lastRow="0" w:firstColumn="0" w:lastColumn="0" w:oddVBand="0" w:evenVBand="0" w:oddHBand="0" w:evenHBand="0" w:firstRowFirstColumn="0" w:firstRowLastColumn="0" w:lastRowFirstColumn="0" w:lastRowLastColumn="0"/>
+              <w:rPr>
+                <w:rFonts w:ascii="Times New Roman" w:eastAsia="Times New Roman" w:hAnsi="Times New Roman" w:cs="Times New Roman"/>
+                <w:kern w:val="0"/>
+                <w:sz w:val="20"/>
+                <w:szCs w:val="20"/>
+                <w:lang w:eastAsia="en-IN"/>
+                <w14:ligatures w14:val="none"/>
+              </w:rPr>
+            </w:pPr>
+          </w:p>
+        </w:tc>
+        <w:tc>
+          <w:tcPr>
+            <w:tcW w:w="1360" w:type="dxa"/>
+            <w:noWrap/>
+            <w:hideMark/>
+          </w:tcPr>
+          <w:p>
+            <w:pPr>
+              <w:cnfStyle w:val="000000000000" w:firstRow="0" w:lastRow="0" w:firstColumn="0" w:lastColumn="0" w:oddVBand="0" w:evenVBand="0" w:oddHBand="0" w:evenHBand="0" w:firstRowFirstColumn="0" w:firstRowLastColumn="0" w:lastRowFirstColumn="0" w:lastRowLastColumn="0"/>
+              <w:rPr>
+                <w:rFonts w:ascii="Calibri" w:eastAsia="Times New Roman" w:hAnsi="Calibri" w:cs="Calibri"/>
+                <w:color w:val="000000"/>
+                <w:kern w:val="0"/>
+                <w:sz w:val="22"/>
+                <w:szCs w:val="22"/>
+                <w:lang w:eastAsia="en-IN"/>
+                <w14:ligatures w14:val="none"/>
+              </w:rPr>
+            </w:pPr>
+            <w:r>
+              <w:rPr>
+                <w:rFonts w:ascii="Calibri" w:eastAsia="Times New Roman" w:hAnsi="Calibri" w:cs="Calibri"/>
+                <w:color w:val="000000"/>
+                <w:kern w:val="0"/>
+                <w:sz w:val="22"/>
+                <w:szCs w:val="22"/>
+                <w:lang w:eastAsia="en-IN"/>
+                <w14:ligatures w14:val="none"/>
+              </w:rPr>
+              <w:t>C-fb</w:t>
+            </w:r>
+          </w:p>
+        </w:tc>
+        <w:tc>
+          <w:tcPr>
+            <w:tcW w:w="1280" w:type="dxa"/>
+            <w:noWrap/>
+            <w:hideMark/>
+          </w:tcPr>
+          <w:p>
+            <w:pPr>
+              <w:cnfStyle w:val="000000000000" w:firstRow="0" w:lastRow="0" w:firstColumn="0" w:lastColumn="0" w:oddVBand="0" w:evenVBand="0" w:oddHBand="0" w:evenHBand="0" w:firstRowFirstColumn="0" w:firstRowLastColumn="0" w:lastRowFirstColumn="0" w:lastRowLastColumn="0"/>
+              <w:rPr>
+                <w:rFonts w:ascii="Calibri" w:eastAsia="Times New Roman" w:hAnsi="Calibri" w:cs="Calibri"/>
+                <w:color w:val="000000"/>
+                <w:kern w:val="0"/>
+                <w:sz w:val="22"/>
+                <w:szCs w:val="22"/>
+                <w:lang w:eastAsia="en-IN"/>
+                <w14:ligatures w14:val="none"/>
+              </w:rPr>
+            </w:pPr>
+            <w:r>
+              <w:rPr>
+                <w:rFonts w:ascii="Calibri" w:eastAsia="Times New Roman" w:hAnsi="Calibri" w:cs="Calibri"/>
+                <w:color w:val="000000"/>
+                <w:kern w:val="0"/>
+                <w:sz w:val="22"/>
+                <w:szCs w:val="22"/>
+                <w:lang w:eastAsia="en-IN"/>
+                <w14:ligatures w14:val="none"/>
+              </w:rPr>
+              <w:t>100 nF</w:t>
+            </w:r>
+          </w:p>
+        </w:tc>
+        <w:tc>
+          <w:tcPr>
+            <w:tcW w:w="1520" w:type="dxa"/>
+            <w:noWrap/>
+            <w:hideMark/>
+          </w:tcPr>
+          <w:p>
+            <w:pPr>
+              <w:cnfStyle w:val="000000000000" w:firstRow="0" w:lastRow="0" w:firstColumn="0" w:lastColumn="0" w:oddVBand="0" w:evenVBand="0" w:oddHBand="0" w:evenHBand="0" w:firstRowFirstColumn="0" w:firstRowLastColumn="0" w:lastRowFirstColumn="0" w:lastRowLastColumn="0"/>
+              <w:rPr>
+                <w:rFonts w:ascii="Calibri" w:eastAsia="Times New Roman" w:hAnsi="Calibri" w:cs="Calibri"/>
+                <w:color w:val="000000"/>
+                <w:kern w:val="0"/>
+                <w:sz w:val="22"/>
+                <w:szCs w:val="22"/>
+                <w:lang w:eastAsia="en-IN"/>
+                <w14:ligatures w14:val="none"/>
+              </w:rPr>
+            </w:pPr>
+            <w:r>
+              <w:rPr>
+                <w:rFonts w:ascii="Calibri" w:eastAsia="Times New Roman" w:hAnsi="Calibri" w:cs="Calibri"/>
+                <w:color w:val="000000"/>
+                <w:kern w:val="0"/>
+                <w:sz w:val="22"/>
+                <w:szCs w:val="22"/>
+                <w:lang w:eastAsia="en-IN"/>
+                <w14:ligatures w14:val="none"/>
+              </w:rPr>
+              <w:t>C-in</w:t>
+            </w:r>
+          </w:p>
+        </w:tc>
+        <w:tc>
+          <w:tcPr>
+            <w:tcW w:w="1180" w:type="dxa"/>
+            <w:noWrap/>
+            <w:hideMark/>
+          </w:tcPr>
+          <w:p>
+            <w:pPr>
+              <w:cnfStyle w:val="000000000000" w:firstRow="0" w:lastRow="0" w:firstColumn="0" w:lastColumn="0" w:oddVBand="0" w:evenVBand="0" w:oddHBand="0" w:evenHBand="0" w:firstRowFirstColumn="0" w:firstRowLastColumn="0" w:lastRowFirstColumn="0" w:lastRowLastColumn="0"/>
+              <w:rPr>
+                <w:rFonts w:ascii="Calibri" w:eastAsia="Times New Roman" w:hAnsi="Calibri" w:cs="Calibri"/>
+                <w:color w:val="000000"/>
+                <w:kern w:val="0"/>
+                <w:sz w:val="22"/>
+                <w:szCs w:val="22"/>
+                <w:lang w:eastAsia="en-IN"/>
+                <w14:ligatures w14:val="none"/>
+              </w:rPr>
+            </w:pPr>
+            <w:r>
+              <w:rPr>
+                <w:rFonts w:ascii="Calibri" w:eastAsia="Times New Roman" w:hAnsi="Calibri" w:cs="Calibri"/>
+                <w:color w:val="000000"/>
+                <w:kern w:val="0"/>
+                <w:sz w:val="22"/>
+                <w:szCs w:val="22"/>
+                <w:lang w:eastAsia="en-IN"/>
+                <w14:ligatures w14:val="none"/>
+              </w:rPr>
+              <w:t>100 nF</w:t>
+            </w:r>
+          </w:p>
+        </w:tc>
+        <w:tc>
+          <w:tcPr>
+            <w:tcW w:w="1560" w:type="dxa"/>
+            <w:noWrap/>
+            <w:hideMark/>
+          </w:tcPr>
+          <w:p>
+            <w:pPr>
+              <w:cnfStyle w:val="000000000000" w:firstRow="0" w:lastRow="0" w:firstColumn="0" w:lastColumn="0" w:oddVBand="0" w:evenVBand="0" w:oddHBand="0" w:evenHBand="0" w:firstRowFirstColumn="0" w:firstRowLastColumn="0" w:lastRowFirstColumn="0" w:lastRowLastColumn="0"/>
+              <w:rPr>
+                <w:rFonts w:ascii="Calibri" w:eastAsia="Times New Roman" w:hAnsi="Calibri" w:cs="Calibri"/>
+                <w:color w:val="000000"/>
+                <w:kern w:val="0"/>
+                <w:sz w:val="22"/>
+                <w:szCs w:val="22"/>
+                <w:lang w:eastAsia="en-IN"/>
+                <w14:ligatures w14:val="none"/>
+              </w:rPr>
+            </w:pPr>
+          </w:p>
+        </w:tc>
+        <w:tc>
+          <w:tcPr>
+            <w:tcW w:w="1560" w:type="dxa"/>
+          </w:tcPr>
+          <w:p>
+            <w:pPr>
+              <w:cnfStyle w:val="000000000000" w:firstRow="0" w:lastRow="0" w:firstColumn="0" w:lastColumn="0" w:oddVBand="0" w:evenVBand="0" w:oddHBand="0" w:evenHBand="0" w:firstRowFirstColumn="0" w:firstRowLastColumn="0" w:lastRowFirstColumn="0" w:lastRowLastColumn="0"/>
+              <w:rPr>
+                <w:rFonts w:ascii="Calibri" w:eastAsia="Times New Roman" w:hAnsi="Calibri" w:cs="Calibri"/>
+                <w:color w:val="000000"/>
+                <w:kern w:val="0"/>
+                <w:sz w:val="22"/>
+                <w:szCs w:val="22"/>
+                <w:lang w:eastAsia="en-IN"/>
+                <w14:ligatures w14:val="none"/>
+              </w:rPr>
+            </w:pPr>
+          </w:p>
+        </w:tc>
+      </w:tr>
+    </w:tbl>
+    <w:p>
+      <w:r>
+        <w:drawing>
+          <wp:anchor distT="0" distB="0" distL="114300" distR="114300" simplePos="0" relativeHeight="251670528" behindDoc="1" locked="0" layoutInCell="1" allowOverlap="1" wp14:anchorId="2716BE07" wp14:editId="63559A30">
+            <wp:simplePos x="0" y="0"/>
+            <wp:positionH relativeFrom="margin">
+              <wp:posOffset>4324350</wp:posOffset>
+            </wp:positionH>
+            <wp:positionV relativeFrom="paragraph">
+              <wp:posOffset>1300811</wp:posOffset>
+            </wp:positionV>
+            <wp:extent cx="2349500" cy="2298700"/>
+            <wp:effectExtent l="0" t="0" r="0" b="6350"/>
+            <wp:wrapNone/>
+            <wp:docPr id="1811063850" name="Picture 1"/>
+            <wp:cNvGraphicFramePr>
+              <a:graphicFrameLocks xmlns:a="http://schemas.openxmlformats.org/drawingml/2006/main" noChangeAspect="1"/>
+            </wp:cNvGraphicFramePr>
+            <a:graphic xmlns:a="http://schemas.openxmlformats.org/drawingml/2006/main">
+              <a:graphicData uri="http://schemas.openxmlformats.org/drawingml/2006/picture">
+                <pic:pic xmlns:pic="http://schemas.openxmlformats.org/drawingml/2006/picture">
+                  <pic:nvPicPr>
+                    <pic:cNvPr id="1811063850" name=""/>
+                    <pic:cNvPicPr/>
+                  </pic:nvPicPr>
+                  <pic:blipFill>
+                    <a:blip r:embed="rId12">
+                      <a:extLst>
+                        <a:ext uri="{28A0092B-C50C-407E-A947-70E740481C1C}">
+                          <a14:useLocalDpi xmlns:a14="http://schemas.microsoft.com/office/drawing/2010/main" val="0"/>
+                        </a:ext>
+                      </a:extLst>
+                    </a:blip>
+                    <a:stretch>
+                      <a:fillRect/>
+                    </a:stretch>
+                  </pic:blipFill>
+                  <pic:spPr>
+                    <a:xfrm>
+                      <a:off x="0" y="0"/>
+                      <a:ext cx="2349500" cy="2298700"/>
+                    </a:xfrm>
+                    <a:prstGeom prst="rect">
+                      <a:avLst/>
+                    </a:prstGeom>
+                  </pic:spPr>
+                </pic:pic>
+              </a:graphicData>
+            </a:graphic>
+            <wp14:sizeRelH relativeFrom="page">
+              <wp14:pctWidth>0</wp14:pctWidth>
+            </wp14:sizeRelH>
+            <wp14:sizeRelV relativeFrom="page">
+              <wp14:pctHeight>0</wp14:pctHeight>
+            </wp14:sizeRelV>
+          </wp:anchor>
+        </w:drawing>
+      </w:r>
+      <w:r>
+        <w:br/>
+      </w:r>
+    </w:p>
+    <w:p>
+      <w:pPr>
+        <w:pStyle w:val="ListParagraph"/>
+        <w:numPr>
+          <w:ilvl w:val="0"/>
+          <w:numId w:val="17"/>
+        </w:numPr>
+        <w:rPr>
+          <w:b/>
+          <w:bCs/>
+        </w:rPr>
+      </w:pPr>
+      <w:r>
+        <w:rPr>
+          <w:b/>
+          <w:bCs/>
+        </w:rPr>
+        <w:t>Proportional Control Output</w:t>
+      </w:r>
+    </w:p>
+    <w:p>
+      <w:pPr>
+        <w:pStyle w:val="ListParagraph"/>
+      </w:pPr>
+      <w:r>
+        <w:t>Flat voltage pulses get amplified</w:t>
+      </w:r>
+      <w:r>
+        <w:t xml:space="preserve"> by 2 (equal to gain)</w:t>
+      </w:r>
+    </w:p>
+    <w:p>
+      <w:pPr>
+        <w:pStyle w:val="ListParagraph"/>
+      </w:pPr>
+      <w:r>
+        <w:t xml:space="preserve">and </w:t>
+      </w:r>
+      <w:r>
+        <w:t xml:space="preserve">flipped, it is in phase difference 180 degree </w:t>
+      </w:r>
+    </w:p>
+    <w:p>
+      <w:pPr>
+        <w:pStyle w:val="ListParagraph"/>
+      </w:pPr>
+      <w:r>
+        <w:t xml:space="preserve">with the original square wave, ie. high voltage during </w:t>
+      </w:r>
+    </w:p>
+    <w:p>
+      <w:pPr>
+        <w:pStyle w:val="ListParagraph"/>
+      </w:pPr>
+      <w:r>
+        <w:t xml:space="preserve">negative half cycle of input and low voltage during </w:t>
+      </w:r>
+    </w:p>
+    <w:p>
+      <w:pPr>
+        <w:pStyle w:val="ListParagraph"/>
+      </w:pPr>
+      <w:r>
+        <w:t>positive half cycle of input.</w:t>
+      </w:r>
+    </w:p>
+    <w:p>
+      <w:pPr>
+        <w:pStyle w:val="ListParagraph"/>
+      </w:pPr>
+    </w:p>
+    <w:p>
+      <w:pPr>
+        <w:pStyle w:val="ListParagraph"/>
+      </w:pPr>
+    </w:p>
+    <w:p/>
+    <w:p>
+      <w:r>
+        <w:drawing>
+          <wp:anchor distT="0" distB="0" distL="114300" distR="114300" simplePos="0" relativeHeight="251671552" behindDoc="1" locked="0" layoutInCell="1" allowOverlap="1" wp14:anchorId="49D5D2C9" wp14:editId="4E8E2E48">
+            <wp:simplePos x="0" y="0"/>
+            <wp:positionH relativeFrom="margin">
+              <wp:posOffset>4331666</wp:posOffset>
+            </wp:positionH>
+            <wp:positionV relativeFrom="paragraph">
+              <wp:posOffset>205740</wp:posOffset>
+            </wp:positionV>
+            <wp:extent cx="2381372" cy="2368672"/>
+            <wp:effectExtent l="0" t="0" r="0" b="0"/>
+            <wp:wrapNone/>
+            <wp:docPr id="1356912487" name="Picture 1"/>
+            <wp:cNvGraphicFramePr>
+              <a:graphicFrameLocks xmlns:a="http://schemas.openxmlformats.org/drawingml/2006/main" noChangeAspect="1"/>
+            </wp:cNvGraphicFramePr>
+            <a:graphic xmlns:a="http://schemas.openxmlformats.org/drawingml/2006/main">
+              <a:graphicData uri="http://schemas.openxmlformats.org/drawingml/2006/picture">
+                <pic:pic xmlns:pic="http://schemas.openxmlformats.org/drawingml/2006/picture">
+                  <pic:nvPicPr>
+                    <pic:cNvPr id="1356912487" name=""/>
+                    <pic:cNvPicPr/>
+                  </pic:nvPicPr>
+                  <pic:blipFill>
+                    <a:blip r:embed="rId13">
+                      <a:extLst>
+                        <a:ext uri="{28A0092B-C50C-407E-A947-70E740481C1C}">
+                          <a14:useLocalDpi xmlns:a14="http://schemas.microsoft.com/office/drawing/2010/main" val="0"/>
+                        </a:ext>
+                      </a:extLst>
+                    </a:blip>
+                    <a:stretch>
+                      <a:fillRect/>
+                    </a:stretch>
+                  </pic:blipFill>
+                  <pic:spPr>
+                    <a:xfrm>
+                      <a:off x="0" y="0"/>
+                      <a:ext cx="2381372" cy="2368672"/>
+                    </a:xfrm>
+                    <a:prstGeom prst="rect">
+                      <a:avLst/>
+                    </a:prstGeom>
+                  </pic:spPr>
+                </pic:pic>
+              </a:graphicData>
+            </a:graphic>
+            <wp14:sizeRelH relativeFrom="page">
+              <wp14:pctWidth>0</wp14:pctWidth>
+            </wp14:sizeRelH>
+            <wp14:sizeRelV relativeFrom="page">
+              <wp14:pctHeight>0</wp14:pctHeight>
+            </wp14:sizeRelV>
+          </wp:anchor>
+        </w:drawing>
+      </w:r>
+      <w:r>
+        <w:br/>
+      </w:r>
+    </w:p>
+    <w:p>
+      <w:pPr>
+        <w:pStyle w:val="ListParagraph"/>
+        <w:numPr>
+          <w:ilvl w:val="0"/>
+          <w:numId w:val="17"/>
+        </w:numPr>
+        <w:rPr>
+          <w:b/>
+          <w:bCs/>
+          <w:u w:val="single"/>
+        </w:rPr>
+      </w:pPr>
+      <w:r>
+        <w:rPr>
+          <w:b/>
+          <w:bCs/>
+          <w:u w:val="single"/>
+        </w:rPr>
+        <w:t>Integral Control Output</w:t>
+      </w:r>
+    </w:p>
+    <w:p>
+      <w:pPr>
+        <w:pStyle w:val="ListParagraph"/>
+      </w:pPr>
+      <w:r>
+        <w:t xml:space="preserve">It transforms the flat </w:t>
+      </w:r>
+      <w:r>
+        <w:t>voltage pulse in the input</w:t>
+      </w:r>
+    </w:p>
+    <w:p>
+      <w:pPr>
+        <w:pStyle w:val="ListParagraph"/>
+      </w:pPr>
+      <w:r>
+        <w:t>square wave into a sawtooth/triangle output</w:t>
+      </w:r>
+    </w:p>
+    <w:p>
+      <w:pPr>
+        <w:pStyle w:val="ListParagraph"/>
+      </w:pPr>
+      <w:r>
+        <w:t>waveform by integrating the constant voltage</w:t>
+      </w:r>
+    </w:p>
+    <w:p>
+      <w:pPr>
+        <w:pStyle w:val="ListParagraph"/>
+      </w:pPr>
+      <w:r>
+        <w:t>in each pulse produces a liner function of time.</w:t>
+      </w:r>
+    </w:p>
+    <w:p>
+      <w:pPr>
+        <w:pStyle w:val="ListParagraph"/>
+      </w:pPr>
+      <w:r>
+        <w:t xml:space="preserve">For positive input pulse, output moves down </w:t>
+      </w:r>
+    </w:p>
+    <w:p>
+      <w:pPr>
+        <w:pStyle w:val="ListParagraph"/>
+      </w:pPr>
+      <w:r>
+        <w:t>almost linearly, for negative input pulse, output</w:t>
+      </w:r>
+    </w:p>
+    <w:p>
+      <w:pPr>
+        <w:pStyle w:val="ListParagraph"/>
+      </w:pPr>
+      <w:r>
+        <w:t>moves up linearly, as we are using an inverting amplifier.</w:t>
+      </w:r>
+      <w:r>
+        <w:br/>
+      </w:r>
+    </w:p>
+    <w:p>
+      <w:pPr>
+        <w:pStyle w:val="ListParagraph"/>
+        <w:numPr>
+          <w:ilvl w:val="0"/>
+          <w:numId w:val="17"/>
+        </w:numPr>
+        <w:rPr>
+          <w:b/>
+          <w:bCs/>
+          <w:u w:val="single"/>
+        </w:rPr>
+      </w:pPr>
+      <w:r>
+        <w:lastRenderedPageBreak/>
+        <w:drawing>
+          <wp:anchor distT="0" distB="0" distL="114300" distR="114300" simplePos="0" relativeHeight="251672576" behindDoc="1" locked="0" layoutInCell="1" allowOverlap="1" wp14:anchorId="68D6B6FA" wp14:editId="6262888C">
+            <wp:simplePos x="0" y="0"/>
+            <wp:positionH relativeFrom="column">
+              <wp:posOffset>4468164</wp:posOffset>
+            </wp:positionH>
+            <wp:positionV relativeFrom="paragraph">
+              <wp:posOffset>-50800</wp:posOffset>
+            </wp:positionV>
+            <wp:extent cx="2311400" cy="2343150"/>
+            <wp:effectExtent l="0" t="0" r="0" b="0"/>
+            <wp:wrapNone/>
+            <wp:docPr id="235363301" name="Picture 1"/>
+            <wp:cNvGraphicFramePr>
+              <a:graphicFrameLocks xmlns:a="http://schemas.openxmlformats.org/drawingml/2006/main" noChangeAspect="1"/>
+            </wp:cNvGraphicFramePr>
+            <a:graphic xmlns:a="http://schemas.openxmlformats.org/drawingml/2006/main">
+              <a:graphicData uri="http://schemas.openxmlformats.org/drawingml/2006/picture">
+                <pic:pic xmlns:pic="http://schemas.openxmlformats.org/drawingml/2006/picture">
+                  <pic:nvPicPr>
+                    <pic:cNvPr id="235363301" name=""/>
+                    <pic:cNvPicPr/>
+                  </pic:nvPicPr>
+                  <pic:blipFill>
+                    <a:blip r:embed="rId14">
+                      <a:extLst>
+                        <a:ext uri="{28A0092B-C50C-407E-A947-70E740481C1C}">
+                          <a14:useLocalDpi xmlns:a14="http://schemas.microsoft.com/office/drawing/2010/main" val="0"/>
+                        </a:ext>
+                      </a:extLst>
+                    </a:blip>
+                    <a:stretch>
+                      <a:fillRect/>
+                    </a:stretch>
+                  </pic:blipFill>
+                  <pic:spPr>
+                    <a:xfrm>
+                      <a:off x="0" y="0"/>
+                      <a:ext cx="2311400" cy="2343150"/>
+                    </a:xfrm>
+                    <a:prstGeom prst="rect">
+                      <a:avLst/>
+                    </a:prstGeom>
+                  </pic:spPr>
+                </pic:pic>
+              </a:graphicData>
+            </a:graphic>
+            <wp14:sizeRelH relativeFrom="page">
+              <wp14:pctWidth>0</wp14:pctWidth>
+            </wp14:sizeRelH>
+            <wp14:sizeRelV relativeFrom="page">
+              <wp14:pctHeight>0</wp14:pctHeight>
+            </wp14:sizeRelV>
+          </wp:anchor>
+        </w:drawing>
+      </w:r>
+      <w:r>
+        <w:rPr>
+          <w:b/>
+          <w:bCs/>
+          <w:u w:val="single"/>
+        </w:rPr>
+        <w:t>Derivative Control Output</w:t>
+      </w:r>
+    </w:p>
+    <w:p>
+      <w:pPr>
+        <w:pStyle w:val="ListParagraph"/>
+      </w:pPr>
+      <w:r>
+        <w:t>Output wave form has 0 magnitude when input pulse is high</w:t>
+      </w:r>
+    </w:p>
+    <w:p>
+      <w:pPr>
+        <w:pStyle w:val="ListParagraph"/>
+      </w:pPr>
+      <w:r>
+        <w:t>or low (</w:t>
+      </w:r>
+      <w:r>
+        <w:t xml:space="preserve">derivative of </w:t>
+      </w:r>
+      <w:r>
+        <w:t xml:space="preserve">constant). However, when input voltage </w:t>
+      </w:r>
+    </w:p>
+    <w:p>
+      <w:pPr>
+        <w:pStyle w:val="ListParagraph"/>
+      </w:pPr>
+      <w:r>
+        <w:t>switches</w:t>
+      </w:r>
+      <w:r>
+        <w:t xml:space="preserve"> </w:t>
+      </w:r>
+      <w:r>
+        <w:t xml:space="preserve">from a low to high voltage or vice versa, its </w:t>
+      </w:r>
+    </w:p>
+    <w:p>
+      <w:pPr>
+        <w:pStyle w:val="ListParagraph"/>
+      </w:pPr>
+      <w:r>
+        <w:t xml:space="preserve">rate of change (slope) </w:t>
+      </w:r>
+      <w:r>
+        <w:t xml:space="preserve">becomes nearly +-infinity, </w:t>
+      </w:r>
+    </w:p>
+    <w:p>
+      <w:pPr>
+        <w:pStyle w:val="ListParagraph"/>
+      </w:pPr>
+      <w:r>
+        <w:t xml:space="preserve">(derivative value sharply increases) </w:t>
+      </w:r>
+      <w:r>
+        <w:t xml:space="preserve">which causes a </w:t>
+      </w:r>
+    </w:p>
+    <w:p>
+      <w:pPr>
+        <w:pStyle w:val="ListParagraph"/>
+      </w:pPr>
+      <w:r>
+        <w:t xml:space="preserve">large spike to appear corresponding to the time of these </w:t>
+      </w:r>
+    </w:p>
+    <w:p>
+      <w:pPr>
+        <w:pStyle w:val="ListParagraph"/>
+      </w:pPr>
+      <w:r>
+        <w:t xml:space="preserve">changes in input square wave. when input switches from </w:t>
+      </w:r>
+    </w:p>
+    <w:p>
+      <w:pPr>
+        <w:pStyle w:val="ListParagraph"/>
+      </w:pPr>
+      <w:r>
+        <w:t>high to low,</w:t>
+      </w:r>
+      <w:r>
+        <w:t xml:space="preserve"> </w:t>
+      </w:r>
+      <w:r>
+        <w:t xml:space="preserve">slope of input is close to -infinity, thus, </w:t>
+      </w:r>
+    </w:p>
+    <w:p>
+      <w:pPr>
+        <w:pStyle w:val="ListParagraph"/>
+      </w:pPr>
+      <w:r>
+        <w:t>output pulse is positive</w:t>
+      </w:r>
+      <w:r>
+        <w:t xml:space="preserve"> </w:t>
+      </w:r>
+      <w:r>
+        <w:t xml:space="preserve">and vice versa. </w:t>
+      </w:r>
+    </w:p>
+    <w:p>
+      <w:pPr>
+        <w:pStyle w:val="ListParagraph"/>
+      </w:pPr>
+    </w:p>
+    <w:p>
+      <w:pPr>
+        <w:pStyle w:val="ListParagraph"/>
+      </w:pPr>
+    </w:p>
+    <w:p>
+      <w:r>
+        <w:drawing>
+          <wp:anchor distT="0" distB="0" distL="114300" distR="114300" simplePos="0" relativeHeight="251673600" behindDoc="1" locked="0" layoutInCell="1" allowOverlap="1" wp14:anchorId="13E6EDCC" wp14:editId="1D5B70FA">
+            <wp:simplePos x="0" y="0"/>
+            <wp:positionH relativeFrom="margin">
+              <wp:posOffset>4423106</wp:posOffset>
+            </wp:positionH>
+            <wp:positionV relativeFrom="paragraph">
+              <wp:posOffset>306070</wp:posOffset>
+            </wp:positionV>
+            <wp:extent cx="2362200" cy="2438400"/>
+            <wp:effectExtent l="0" t="0" r="0" b="0"/>
+            <wp:wrapNone/>
+            <wp:docPr id="294476595" name="Picture 1"/>
+            <wp:cNvGraphicFramePr>
+              <a:graphicFrameLocks xmlns:a="http://schemas.openxmlformats.org/drawingml/2006/main" noChangeAspect="1"/>
+            </wp:cNvGraphicFramePr>
+            <a:graphic xmlns:a="http://schemas.openxmlformats.org/drawingml/2006/main">
+              <a:graphicData uri="http://schemas.openxmlformats.org/drawingml/2006/picture">
+                <pic:pic xmlns:pic="http://schemas.openxmlformats.org/drawingml/2006/picture">
+                  <pic:nvPicPr>
+                    <pic:cNvPr id="294476595" name=""/>
+                    <pic:cNvPicPr/>
+                  </pic:nvPicPr>
+                  <pic:blipFill>
+                    <a:blip r:embed="rId15">
+                      <a:extLst>
+                        <a:ext uri="{28A0092B-C50C-407E-A947-70E740481C1C}">
+                          <a14:useLocalDpi xmlns:a14="http://schemas.microsoft.com/office/drawing/2010/main" val="0"/>
+                        </a:ext>
+                      </a:extLst>
+                    </a:blip>
+                    <a:stretch>
+                      <a:fillRect/>
+                    </a:stretch>
+                  </pic:blipFill>
+                  <pic:spPr>
+                    <a:xfrm>
+                      <a:off x="0" y="0"/>
+                      <a:ext cx="2362200" cy="2438400"/>
+                    </a:xfrm>
+                    <a:prstGeom prst="rect">
+                      <a:avLst/>
+                    </a:prstGeom>
+                  </pic:spPr>
+                </pic:pic>
+              </a:graphicData>
+            </a:graphic>
+            <wp14:sizeRelH relativeFrom="page">
+              <wp14:pctWidth>0</wp14:pctWidth>
+            </wp14:sizeRelH>
+            <wp14:sizeRelV relativeFrom="page">
+              <wp14:pctHeight>0</wp14:pctHeight>
+            </wp14:sizeRelV>
+          </wp:anchor>
+        </w:drawing>
+      </w:r>
+      <w:r>
+        <w:br/>
+      </w:r>
+    </w:p>
+    <w:p>
+      <w:pPr>
+        <w:pStyle w:val="ListParagraph"/>
+        <w:numPr>
+          <w:ilvl w:val="0"/>
+          <w:numId w:val="17"/>
+        </w:numPr>
+        <w:rPr>
+          <w:b/>
+          <w:bCs/>
+          <w:u w:val="single"/>
+        </w:rPr>
+      </w:pPr>
+      <w:r>
+        <w:rPr>
+          <w:b/>
+          <w:bCs/>
+          <w:u w:val="single"/>
+        </w:rPr>
+        <w:t>Net PID Output after Summation</w:t>
+      </w:r>
+    </w:p>
+    <w:p>
+      <w:pPr>
+        <w:pStyle w:val="ListParagraph"/>
+      </w:pPr>
+      <w:r>
+        <w:t>Net superposition of all p</w:t>
+      </w:r>
+      <w:r>
+        <w:t>revious waveforms,</w:t>
+      </w:r>
+    </w:p>
+    <w:p>
+      <w:pPr>
+        <w:pStyle w:val="ListParagraph"/>
+      </w:pPr>
+      <w:r>
+        <w:t>sloped roof comes from the integrator output,</w:t>
+      </w:r>
+    </w:p>
+    <w:p>
+      <w:pPr>
+        <w:pStyle w:val="ListParagraph"/>
+      </w:pPr>
+      <w:r>
+        <w:t xml:space="preserve">sharp spikes from differentiator output, and </w:t>
+      </w:r>
+    </w:p>
+    <w:p>
+      <w:pPr>
+        <w:pStyle w:val="ListParagraph"/>
+      </w:pPr>
+      <w:r>
+        <w:t>vertical lines from the inverted square wave output of</w:t>
+      </w:r>
+    </w:p>
+    <w:p>
+      <w:pPr>
+        <w:pStyle w:val="ListParagraph"/>
+      </w:pPr>
+      <w:r>
+        <w:t>proportional control.</w:t>
+      </w:r>
+    </w:p>
+    <w:p>
+      <w:pPr>
+        <w:pStyle w:val="ListParagraph"/>
+      </w:pPr>
+    </w:p>
     <w:p/>
     <w:p/>
     <w:p/>
@@ -3012,1398 +4778,6 @@
     <w:p/>
     <w:p/>
     <w:p/>
-    <w:p/>
-    <w:p/>
-    <w:p/>
-    <w:p>
-      <w:r>
-        <w:t>Square wave</w:t>
-      </w:r>
-    </w:p>
-    <w:p>
-      <w:r>
-        <w:t xml:space="preserve">why change value see equation </w:t>
-      </w:r>
-    </w:p>
-    <w:p/>
-    <w:tbl>
-      <w:tblPr>
-        <w:tblStyle w:val="GridTable4-Accent5"/>
-        <w:tblpPr w:leftFromText="180" w:rightFromText="180" w:vertAnchor="text" w:horzAnchor="margin" w:tblpXSpec="center" w:tblpY="-6"/>
-        <w:tblW w:w="10920" w:type="dxa"/>
-        <w:tblLook w:val="04A0" w:firstRow="1" w:lastRow="0" w:firstColumn="1" w:lastColumn="0" w:noHBand="0" w:noVBand="1"/>
-      </w:tblPr>
-      <w:tblGrid>
-        <w:gridCol w:w="1413"/>
-        <w:gridCol w:w="1047"/>
-        <w:gridCol w:w="1360"/>
-        <w:gridCol w:w="1280"/>
-        <w:gridCol w:w="1520"/>
-        <w:gridCol w:w="1180"/>
-        <w:gridCol w:w="1560"/>
-        <w:gridCol w:w="1560"/>
-      </w:tblGrid>
-      <w:tr>
-        <w:trPr>
-          <w:cnfStyle w:val="100000000000" w:firstRow="1" w:lastRow="0" w:firstColumn="0" w:lastColumn="0" w:oddVBand="0" w:evenVBand="0" w:oddHBand="0" w:evenHBand="0" w:firstRowFirstColumn="0" w:firstRowLastColumn="0" w:lastRowFirstColumn="0" w:lastRowLastColumn="0"/>
-          <w:trHeight w:val="290"/>
-        </w:trPr>
-        <w:tc>
-          <w:tcPr>
-            <w:cnfStyle w:val="001000000000" w:firstRow="0" w:lastRow="0" w:firstColumn="1" w:lastColumn="0" w:oddVBand="0" w:evenVBand="0" w:oddHBand="0" w:evenHBand="0" w:firstRowFirstColumn="0" w:firstRowLastColumn="0" w:lastRowFirstColumn="0" w:lastRowLastColumn="0"/>
-            <w:tcW w:w="1413" w:type="dxa"/>
-            <w:noWrap/>
-            <w:hideMark/>
-          </w:tcPr>
-          <w:p>
-            <w:pPr>
-              <w:rPr>
-                <w:rFonts w:ascii="Calibri" w:eastAsia="Times New Roman" w:hAnsi="Calibri" w:cs="Calibri"/>
-                <w:color w:val="000000"/>
-                <w:kern w:val="0"/>
-                <w:sz w:val="22"/>
-                <w:szCs w:val="22"/>
-                <w:lang w:eastAsia="en-IN"/>
-                <w14:ligatures w14:val="none"/>
-              </w:rPr>
-            </w:pPr>
-            <w:r>
-              <w:rPr>
-                <w:rFonts w:ascii="Calibri" w:eastAsia="Times New Roman" w:hAnsi="Calibri" w:cs="Calibri"/>
-                <w:color w:val="000000"/>
-                <w:kern w:val="0"/>
-                <w:sz w:val="22"/>
-                <w:szCs w:val="22"/>
-                <w:lang w:eastAsia="en-IN"/>
-                <w14:ligatures w14:val="none"/>
-              </w:rPr>
-              <w:t>P Controller</w:t>
-            </w:r>
-          </w:p>
-        </w:tc>
-        <w:tc>
-          <w:tcPr>
-            <w:tcW w:w="1047" w:type="dxa"/>
-            <w:noWrap/>
-            <w:hideMark/>
-          </w:tcPr>
-          <w:p>
-            <w:pPr>
-              <w:cnfStyle w:val="100000000000" w:firstRow="1" w:lastRow="0" w:firstColumn="0" w:lastColumn="0" w:oddVBand="0" w:evenVBand="0" w:oddHBand="0" w:evenHBand="0" w:firstRowFirstColumn="0" w:firstRowLastColumn="0" w:lastRowFirstColumn="0" w:lastRowLastColumn="0"/>
-              <w:rPr>
-                <w:rFonts w:ascii="Calibri" w:eastAsia="Times New Roman" w:hAnsi="Calibri" w:cs="Calibri"/>
-                <w:color w:val="000000"/>
-                <w:kern w:val="0"/>
-                <w:sz w:val="22"/>
-                <w:szCs w:val="22"/>
-                <w:lang w:eastAsia="en-IN"/>
-                <w14:ligatures w14:val="none"/>
-              </w:rPr>
-            </w:pPr>
-          </w:p>
-        </w:tc>
-        <w:tc>
-          <w:tcPr>
-            <w:tcW w:w="1360" w:type="dxa"/>
-            <w:noWrap/>
-            <w:hideMark/>
-          </w:tcPr>
-          <w:p>
-            <w:pPr>
-              <w:cnfStyle w:val="100000000000" w:firstRow="1" w:lastRow="0" w:firstColumn="0" w:lastColumn="0" w:oddVBand="0" w:evenVBand="0" w:oddHBand="0" w:evenHBand="0" w:firstRowFirstColumn="0" w:firstRowLastColumn="0" w:lastRowFirstColumn="0" w:lastRowLastColumn="0"/>
-              <w:rPr>
-                <w:rFonts w:ascii="Calibri" w:eastAsia="Times New Roman" w:hAnsi="Calibri" w:cs="Calibri"/>
-                <w:color w:val="000000"/>
-                <w:kern w:val="0"/>
-                <w:sz w:val="22"/>
-                <w:szCs w:val="22"/>
-                <w:lang w:eastAsia="en-IN"/>
-                <w14:ligatures w14:val="none"/>
-              </w:rPr>
-            </w:pPr>
-            <w:r>
-              <w:rPr>
-                <w:rFonts w:ascii="Calibri" w:eastAsia="Times New Roman" w:hAnsi="Calibri" w:cs="Calibri"/>
-                <w:color w:val="000000"/>
-                <w:kern w:val="0"/>
-                <w:sz w:val="22"/>
-                <w:szCs w:val="22"/>
-                <w:lang w:eastAsia="en-IN"/>
-                <w14:ligatures w14:val="none"/>
-              </w:rPr>
-              <w:t>I Controller</w:t>
-            </w:r>
-          </w:p>
-        </w:tc>
-        <w:tc>
-          <w:tcPr>
-            <w:tcW w:w="1280" w:type="dxa"/>
-            <w:noWrap/>
-            <w:hideMark/>
-          </w:tcPr>
-          <w:p>
-            <w:pPr>
-              <w:cnfStyle w:val="100000000000" w:firstRow="1" w:lastRow="0" w:firstColumn="0" w:lastColumn="0" w:oddVBand="0" w:evenVBand="0" w:oddHBand="0" w:evenHBand="0" w:firstRowFirstColumn="0" w:firstRowLastColumn="0" w:lastRowFirstColumn="0" w:lastRowLastColumn="0"/>
-              <w:rPr>
-                <w:rFonts w:ascii="Calibri" w:eastAsia="Times New Roman" w:hAnsi="Calibri" w:cs="Calibri"/>
-                <w:color w:val="000000"/>
-                <w:kern w:val="0"/>
-                <w:sz w:val="22"/>
-                <w:szCs w:val="22"/>
-                <w:lang w:eastAsia="en-IN"/>
-                <w14:ligatures w14:val="none"/>
-              </w:rPr>
-            </w:pPr>
-          </w:p>
-        </w:tc>
-        <w:tc>
-          <w:tcPr>
-            <w:tcW w:w="1520" w:type="dxa"/>
-            <w:noWrap/>
-            <w:hideMark/>
-          </w:tcPr>
-          <w:p>
-            <w:pPr>
-              <w:cnfStyle w:val="100000000000" w:firstRow="1" w:lastRow="0" w:firstColumn="0" w:lastColumn="0" w:oddVBand="0" w:evenVBand="0" w:oddHBand="0" w:evenHBand="0" w:firstRowFirstColumn="0" w:firstRowLastColumn="0" w:lastRowFirstColumn="0" w:lastRowLastColumn="0"/>
-              <w:rPr>
-                <w:rFonts w:ascii="Calibri" w:eastAsia="Times New Roman" w:hAnsi="Calibri" w:cs="Calibri"/>
-                <w:color w:val="000000"/>
-                <w:kern w:val="0"/>
-                <w:sz w:val="22"/>
-                <w:szCs w:val="22"/>
-                <w:lang w:eastAsia="en-IN"/>
-                <w14:ligatures w14:val="none"/>
-              </w:rPr>
-            </w:pPr>
-            <w:r>
-              <w:rPr>
-                <w:rFonts w:ascii="Calibri" w:eastAsia="Times New Roman" w:hAnsi="Calibri" w:cs="Calibri"/>
-                <w:color w:val="000000"/>
-                <w:kern w:val="0"/>
-                <w:sz w:val="22"/>
-                <w:szCs w:val="22"/>
-                <w:lang w:eastAsia="en-IN"/>
-                <w14:ligatures w14:val="none"/>
-              </w:rPr>
-              <w:t>D Controller</w:t>
-            </w:r>
-          </w:p>
-        </w:tc>
-        <w:tc>
-          <w:tcPr>
-            <w:tcW w:w="1180" w:type="dxa"/>
-            <w:noWrap/>
-            <w:hideMark/>
-          </w:tcPr>
-          <w:p>
-            <w:pPr>
-              <w:cnfStyle w:val="100000000000" w:firstRow="1" w:lastRow="0" w:firstColumn="0" w:lastColumn="0" w:oddVBand="0" w:evenVBand="0" w:oddHBand="0" w:evenHBand="0" w:firstRowFirstColumn="0" w:firstRowLastColumn="0" w:lastRowFirstColumn="0" w:lastRowLastColumn="0"/>
-              <w:rPr>
-                <w:rFonts w:ascii="Calibri" w:eastAsia="Times New Roman" w:hAnsi="Calibri" w:cs="Calibri"/>
-                <w:color w:val="000000"/>
-                <w:kern w:val="0"/>
-                <w:sz w:val="22"/>
-                <w:szCs w:val="22"/>
-                <w:lang w:eastAsia="en-IN"/>
-                <w14:ligatures w14:val="none"/>
-              </w:rPr>
-            </w:pPr>
-          </w:p>
-        </w:tc>
-        <w:tc>
-          <w:tcPr>
-            <w:tcW w:w="1560" w:type="dxa"/>
-            <w:noWrap/>
-            <w:hideMark/>
-          </w:tcPr>
-          <w:p>
-            <w:pPr>
-              <w:cnfStyle w:val="100000000000" w:firstRow="1" w:lastRow="0" w:firstColumn="0" w:lastColumn="0" w:oddVBand="0" w:evenVBand="0" w:oddHBand="0" w:evenHBand="0" w:firstRowFirstColumn="0" w:firstRowLastColumn="0" w:lastRowFirstColumn="0" w:lastRowLastColumn="0"/>
-              <w:rPr>
-                <w:rFonts w:ascii="Calibri" w:eastAsia="Times New Roman" w:hAnsi="Calibri" w:cs="Calibri"/>
-                <w:color w:val="000000"/>
-                <w:kern w:val="0"/>
-                <w:sz w:val="22"/>
-                <w:szCs w:val="22"/>
-                <w:lang w:eastAsia="en-IN"/>
-                <w14:ligatures w14:val="none"/>
-              </w:rPr>
-            </w:pPr>
-            <w:r>
-              <w:rPr>
-                <w:rFonts w:ascii="Calibri" w:eastAsia="Times New Roman" w:hAnsi="Calibri" w:cs="Calibri"/>
-                <w:color w:val="000000"/>
-                <w:kern w:val="0"/>
-                <w:sz w:val="22"/>
-                <w:szCs w:val="22"/>
-                <w:lang w:eastAsia="en-IN"/>
-                <w14:ligatures w14:val="none"/>
-              </w:rPr>
-              <w:t>Summation</w:t>
-            </w:r>
-          </w:p>
-        </w:tc>
-        <w:tc>
-          <w:tcPr>
-            <w:tcW w:w="1560" w:type="dxa"/>
-          </w:tcPr>
-          <w:p>
-            <w:pPr>
-              <w:cnfStyle w:val="100000000000" w:firstRow="1" w:lastRow="0" w:firstColumn="0" w:lastColumn="0" w:oddVBand="0" w:evenVBand="0" w:oddHBand="0" w:evenHBand="0" w:firstRowFirstColumn="0" w:firstRowLastColumn="0" w:lastRowFirstColumn="0" w:lastRowLastColumn="0"/>
-              <w:rPr>
-                <w:rFonts w:ascii="Calibri" w:eastAsia="Times New Roman" w:hAnsi="Calibri" w:cs="Calibri"/>
-                <w:color w:val="000000"/>
-                <w:kern w:val="0"/>
-                <w:sz w:val="22"/>
-                <w:szCs w:val="22"/>
-                <w:lang w:eastAsia="en-IN"/>
-                <w14:ligatures w14:val="none"/>
-              </w:rPr>
-            </w:pPr>
-          </w:p>
-        </w:tc>
-      </w:tr>
-      <w:tr>
-        <w:trPr>
-          <w:cnfStyle w:val="000000100000" w:firstRow="0" w:lastRow="0" w:firstColumn="0" w:lastColumn="0" w:oddVBand="0" w:evenVBand="0" w:oddHBand="1" w:evenHBand="0" w:firstRowFirstColumn="0" w:firstRowLastColumn="0" w:lastRowFirstColumn="0" w:lastRowLastColumn="0"/>
-          <w:trHeight w:val="290"/>
-        </w:trPr>
-        <w:tc>
-          <w:tcPr>
-            <w:cnfStyle w:val="001000000000" w:firstRow="0" w:lastRow="0" w:firstColumn="1" w:lastColumn="0" w:oddVBand="0" w:evenVBand="0" w:oddHBand="0" w:evenHBand="0" w:firstRowFirstColumn="0" w:firstRowLastColumn="0" w:lastRowFirstColumn="0" w:lastRowLastColumn="0"/>
-            <w:tcW w:w="1413" w:type="dxa"/>
-            <w:noWrap/>
-            <w:hideMark/>
-          </w:tcPr>
-          <w:p>
-            <w:pPr>
-              <w:rPr>
-                <w:rFonts w:ascii="Calibri" w:eastAsia="Times New Roman" w:hAnsi="Calibri" w:cs="Calibri"/>
-                <w:color w:val="000000"/>
-                <w:kern w:val="0"/>
-                <w:sz w:val="22"/>
-                <w:szCs w:val="22"/>
-                <w:lang w:eastAsia="en-IN"/>
-                <w14:ligatures w14:val="none"/>
-              </w:rPr>
-            </w:pPr>
-            <w:r>
-              <w:rPr>
-                <w:rFonts w:ascii="Calibri" w:eastAsia="Times New Roman" w:hAnsi="Calibri" w:cs="Calibri"/>
-                <w:color w:val="000000"/>
-                <w:kern w:val="0"/>
-                <w:sz w:val="22"/>
-                <w:szCs w:val="22"/>
-                <w:lang w:eastAsia="en-IN"/>
-                <w14:ligatures w14:val="none"/>
-              </w:rPr>
-              <w:t>R-in1</w:t>
-            </w:r>
-          </w:p>
-        </w:tc>
-        <w:tc>
-          <w:tcPr>
-            <w:tcW w:w="1047" w:type="dxa"/>
-            <w:noWrap/>
-            <w:hideMark/>
-          </w:tcPr>
-          <w:p>
-            <w:pPr>
-              <w:cnfStyle w:val="000000100000" w:firstRow="0" w:lastRow="0" w:firstColumn="0" w:lastColumn="0" w:oddVBand="0" w:evenVBand="0" w:oddHBand="1" w:evenHBand="0" w:firstRowFirstColumn="0" w:firstRowLastColumn="0" w:lastRowFirstColumn="0" w:lastRowLastColumn="0"/>
-              <w:rPr>
-                <w:rFonts w:ascii="Calibri" w:eastAsia="Times New Roman" w:hAnsi="Calibri" w:cs="Calibri"/>
-                <w:color w:val="000000"/>
-                <w:kern w:val="0"/>
-                <w:sz w:val="22"/>
-                <w:szCs w:val="22"/>
-                <w:lang w:eastAsia="en-IN"/>
-                <w14:ligatures w14:val="none"/>
-              </w:rPr>
-            </w:pPr>
-            <w:r>
-              <w:rPr>
-                <w:rFonts w:ascii="Calibri" w:eastAsia="Times New Roman" w:hAnsi="Calibri" w:cs="Calibri"/>
-                <w:color w:val="000000"/>
-                <w:kern w:val="0"/>
-                <w:sz w:val="22"/>
-                <w:szCs w:val="22"/>
-                <w:lang w:eastAsia="en-IN"/>
-                <w14:ligatures w14:val="none"/>
-              </w:rPr>
-              <w:t xml:space="preserve">5 </w:t>
-            </w:r>
-            <w:proofErr w:type="spellStart"/>
-            <w:r>
-              <w:rPr>
-                <w:rFonts w:ascii="Calibri" w:eastAsia="Times New Roman" w:hAnsi="Calibri" w:cs="Calibri"/>
-                <w:color w:val="000000"/>
-                <w:kern w:val="0"/>
-                <w:sz w:val="22"/>
-                <w:szCs w:val="22"/>
-                <w:lang w:eastAsia="en-IN"/>
-                <w14:ligatures w14:val="none"/>
-              </w:rPr>
-              <w:t>kOhm</w:t>
-            </w:r>
-            <w:proofErr w:type="spellEnd"/>
-          </w:p>
-        </w:tc>
-        <w:tc>
-          <w:tcPr>
-            <w:tcW w:w="1360" w:type="dxa"/>
-            <w:noWrap/>
-            <w:hideMark/>
-          </w:tcPr>
-          <w:p>
-            <w:pPr>
-              <w:cnfStyle w:val="000000100000" w:firstRow="0" w:lastRow="0" w:firstColumn="0" w:lastColumn="0" w:oddVBand="0" w:evenVBand="0" w:oddHBand="1" w:evenHBand="0" w:firstRowFirstColumn="0" w:firstRowLastColumn="0" w:lastRowFirstColumn="0" w:lastRowLastColumn="0"/>
-              <w:rPr>
-                <w:rFonts w:ascii="Calibri" w:eastAsia="Times New Roman" w:hAnsi="Calibri" w:cs="Calibri"/>
-                <w:color w:val="000000"/>
-                <w:kern w:val="0"/>
-                <w:sz w:val="22"/>
-                <w:szCs w:val="22"/>
-                <w:lang w:eastAsia="en-IN"/>
-                <w14:ligatures w14:val="none"/>
-              </w:rPr>
-            </w:pPr>
-            <w:r>
-              <w:rPr>
-                <w:rFonts w:ascii="Calibri" w:eastAsia="Times New Roman" w:hAnsi="Calibri" w:cs="Calibri"/>
-                <w:color w:val="000000"/>
-                <w:kern w:val="0"/>
-                <w:sz w:val="22"/>
-                <w:szCs w:val="22"/>
-                <w:lang w:eastAsia="en-IN"/>
-                <w14:ligatures w14:val="none"/>
-              </w:rPr>
-              <w:t>R-in2</w:t>
-            </w:r>
-          </w:p>
-        </w:tc>
-        <w:tc>
-          <w:tcPr>
-            <w:tcW w:w="1280" w:type="dxa"/>
-            <w:noWrap/>
-            <w:hideMark/>
-          </w:tcPr>
-          <w:p>
-            <w:pPr>
-              <w:cnfStyle w:val="000000100000" w:firstRow="0" w:lastRow="0" w:firstColumn="0" w:lastColumn="0" w:oddVBand="0" w:evenVBand="0" w:oddHBand="1" w:evenHBand="0" w:firstRowFirstColumn="0" w:firstRowLastColumn="0" w:lastRowFirstColumn="0" w:lastRowLastColumn="0"/>
-              <w:rPr>
-                <w:rFonts w:ascii="Calibri" w:eastAsia="Times New Roman" w:hAnsi="Calibri" w:cs="Calibri"/>
-                <w:color w:val="FFFF00"/>
-                <w:kern w:val="0"/>
-                <w:sz w:val="22"/>
-                <w:szCs w:val="22"/>
-                <w:lang w:eastAsia="en-IN"/>
-                <w14:ligatures w14:val="none"/>
-              </w:rPr>
-            </w:pPr>
-            <w:r>
-              <w:rPr>
-                <w:rFonts w:ascii="Calibri" w:eastAsia="Times New Roman" w:hAnsi="Calibri" w:cs="Calibri"/>
-                <w:color w:val="EE0000"/>
-                <w:kern w:val="0"/>
-                <w:sz w:val="22"/>
-                <w:szCs w:val="22"/>
-                <w:lang w:eastAsia="en-IN"/>
-                <w14:ligatures w14:val="none"/>
-              </w:rPr>
-              <w:t xml:space="preserve">20 </w:t>
-            </w:r>
-            <w:proofErr w:type="spellStart"/>
-            <w:r>
-              <w:rPr>
-                <w:rFonts w:ascii="Calibri" w:eastAsia="Times New Roman" w:hAnsi="Calibri" w:cs="Calibri"/>
-                <w:color w:val="EE0000"/>
-                <w:kern w:val="0"/>
-                <w:sz w:val="22"/>
-                <w:szCs w:val="22"/>
-                <w:lang w:eastAsia="en-IN"/>
-                <w14:ligatures w14:val="none"/>
-              </w:rPr>
-              <w:t>kOhm</w:t>
-            </w:r>
-            <w:proofErr w:type="spellEnd"/>
-          </w:p>
-        </w:tc>
-        <w:tc>
-          <w:tcPr>
-            <w:tcW w:w="1520" w:type="dxa"/>
-            <w:noWrap/>
-            <w:hideMark/>
-          </w:tcPr>
-          <w:p>
-            <w:pPr>
-              <w:cnfStyle w:val="000000100000" w:firstRow="0" w:lastRow="0" w:firstColumn="0" w:lastColumn="0" w:oddVBand="0" w:evenVBand="0" w:oddHBand="1" w:evenHBand="0" w:firstRowFirstColumn="0" w:firstRowLastColumn="0" w:lastRowFirstColumn="0" w:lastRowLastColumn="0"/>
-              <w:rPr>
-                <w:rFonts w:ascii="Calibri" w:eastAsia="Times New Roman" w:hAnsi="Calibri" w:cs="Calibri"/>
-                <w:color w:val="000000"/>
-                <w:kern w:val="0"/>
-                <w:sz w:val="22"/>
-                <w:szCs w:val="22"/>
-                <w:lang w:eastAsia="en-IN"/>
-                <w14:ligatures w14:val="none"/>
-              </w:rPr>
-            </w:pPr>
-            <w:r>
-              <w:rPr>
-                <w:rFonts w:ascii="Calibri" w:eastAsia="Times New Roman" w:hAnsi="Calibri" w:cs="Calibri"/>
-                <w:color w:val="000000"/>
-                <w:kern w:val="0"/>
-                <w:sz w:val="22"/>
-                <w:szCs w:val="22"/>
-                <w:lang w:eastAsia="en-IN"/>
-                <w14:ligatures w14:val="none"/>
-              </w:rPr>
-              <w:t>R-in3</w:t>
-            </w:r>
-          </w:p>
-        </w:tc>
-        <w:tc>
-          <w:tcPr>
-            <w:tcW w:w="1180" w:type="dxa"/>
-            <w:noWrap/>
-            <w:hideMark/>
-          </w:tcPr>
-          <w:p>
-            <w:pPr>
-              <w:cnfStyle w:val="000000100000" w:firstRow="0" w:lastRow="0" w:firstColumn="0" w:lastColumn="0" w:oddVBand="0" w:evenVBand="0" w:oddHBand="1" w:evenHBand="0" w:firstRowFirstColumn="0" w:firstRowLastColumn="0" w:lastRowFirstColumn="0" w:lastRowLastColumn="0"/>
-              <w:rPr>
-                <w:rFonts w:ascii="Calibri" w:eastAsia="Times New Roman" w:hAnsi="Calibri" w:cs="Calibri"/>
-                <w:color w:val="000000"/>
-                <w:kern w:val="0"/>
-                <w:sz w:val="22"/>
-                <w:szCs w:val="22"/>
-                <w:lang w:eastAsia="en-IN"/>
-                <w14:ligatures w14:val="none"/>
-              </w:rPr>
-            </w:pPr>
-            <w:r>
-              <w:rPr>
-                <w:rFonts w:ascii="Calibri" w:eastAsia="Times New Roman" w:hAnsi="Calibri" w:cs="Calibri"/>
-                <w:color w:val="000000"/>
-                <w:kern w:val="0"/>
-                <w:sz w:val="22"/>
-                <w:szCs w:val="22"/>
-                <w:lang w:eastAsia="en-IN"/>
-                <w14:ligatures w14:val="none"/>
-              </w:rPr>
-              <w:t xml:space="preserve">5 </w:t>
-            </w:r>
-            <w:proofErr w:type="spellStart"/>
-            <w:r>
-              <w:rPr>
-                <w:rFonts w:ascii="Calibri" w:eastAsia="Times New Roman" w:hAnsi="Calibri" w:cs="Calibri"/>
-                <w:color w:val="000000"/>
-                <w:kern w:val="0"/>
-                <w:sz w:val="22"/>
-                <w:szCs w:val="22"/>
-                <w:lang w:eastAsia="en-IN"/>
-                <w14:ligatures w14:val="none"/>
-              </w:rPr>
-              <w:t>kOhm</w:t>
-            </w:r>
-            <w:proofErr w:type="spellEnd"/>
-          </w:p>
-        </w:tc>
-        <w:tc>
-          <w:tcPr>
-            <w:tcW w:w="1560" w:type="dxa"/>
-            <w:noWrap/>
-            <w:hideMark/>
-          </w:tcPr>
-          <w:p>
-            <w:pPr>
-              <w:cnfStyle w:val="000000100000" w:firstRow="0" w:lastRow="0" w:firstColumn="0" w:lastColumn="0" w:oddVBand="0" w:evenVBand="0" w:oddHBand="1" w:evenHBand="0" w:firstRowFirstColumn="0" w:firstRowLastColumn="0" w:lastRowFirstColumn="0" w:lastRowLastColumn="0"/>
-              <w:rPr>
-                <w:rFonts w:ascii="Calibri" w:eastAsia="Times New Roman" w:hAnsi="Calibri" w:cs="Calibri"/>
-                <w:color w:val="000000"/>
-                <w:kern w:val="0"/>
-                <w:sz w:val="22"/>
-                <w:szCs w:val="22"/>
-                <w:lang w:eastAsia="en-IN"/>
-                <w14:ligatures w14:val="none"/>
-              </w:rPr>
-            </w:pPr>
-            <w:r>
-              <w:rPr>
-                <w:rFonts w:ascii="Calibri" w:eastAsia="Times New Roman" w:hAnsi="Calibri" w:cs="Calibri"/>
-                <w:color w:val="000000"/>
-                <w:kern w:val="0"/>
-                <w:sz w:val="22"/>
-                <w:szCs w:val="22"/>
-                <w:lang w:eastAsia="en-IN"/>
-                <w14:ligatures w14:val="none"/>
-              </w:rPr>
-              <w:t>R-fb4</w:t>
-            </w:r>
-          </w:p>
-        </w:tc>
-        <w:tc>
-          <w:tcPr>
-            <w:tcW w:w="1560" w:type="dxa"/>
-          </w:tcPr>
-          <w:p>
-            <w:pPr>
-              <w:cnfStyle w:val="000000100000" w:firstRow="0" w:lastRow="0" w:firstColumn="0" w:lastColumn="0" w:oddVBand="0" w:evenVBand="0" w:oddHBand="1" w:evenHBand="0" w:firstRowFirstColumn="0" w:firstRowLastColumn="0" w:lastRowFirstColumn="0" w:lastRowLastColumn="0"/>
-              <w:rPr>
-                <w:rFonts w:ascii="Calibri" w:eastAsia="Times New Roman" w:hAnsi="Calibri" w:cs="Calibri"/>
-                <w:color w:val="000000"/>
-                <w:kern w:val="0"/>
-                <w:sz w:val="22"/>
-                <w:szCs w:val="22"/>
-                <w:lang w:eastAsia="en-IN"/>
-                <w14:ligatures w14:val="none"/>
-              </w:rPr>
-            </w:pPr>
-            <w:r>
-              <w:rPr>
-                <w:rFonts w:ascii="Calibri" w:eastAsia="Times New Roman" w:hAnsi="Calibri" w:cs="Calibri"/>
-                <w:color w:val="000000"/>
-                <w:kern w:val="0"/>
-                <w:sz w:val="22"/>
-                <w:szCs w:val="22"/>
-                <w:lang w:eastAsia="en-IN"/>
-                <w14:ligatures w14:val="none"/>
-              </w:rPr>
-              <w:t xml:space="preserve">10 </w:t>
-            </w:r>
-            <w:proofErr w:type="spellStart"/>
-            <w:r>
-              <w:rPr>
-                <w:rFonts w:ascii="Calibri" w:eastAsia="Times New Roman" w:hAnsi="Calibri" w:cs="Calibri"/>
-                <w:color w:val="000000"/>
-                <w:kern w:val="0"/>
-                <w:sz w:val="22"/>
-                <w:szCs w:val="22"/>
-                <w:lang w:eastAsia="en-IN"/>
-                <w14:ligatures w14:val="none"/>
-              </w:rPr>
-              <w:t>kOhm</w:t>
-            </w:r>
-            <w:proofErr w:type="spellEnd"/>
-          </w:p>
-        </w:tc>
-      </w:tr>
-      <w:tr>
-        <w:trPr>
-          <w:trHeight w:val="290"/>
-        </w:trPr>
-        <w:tc>
-          <w:tcPr>
-            <w:cnfStyle w:val="001000000000" w:firstRow="0" w:lastRow="0" w:firstColumn="1" w:lastColumn="0" w:oddVBand="0" w:evenVBand="0" w:oddHBand="0" w:evenHBand="0" w:firstRowFirstColumn="0" w:firstRowLastColumn="0" w:lastRowFirstColumn="0" w:lastRowLastColumn="0"/>
-            <w:tcW w:w="1413" w:type="dxa"/>
-            <w:noWrap/>
-            <w:hideMark/>
-          </w:tcPr>
-          <w:p>
-            <w:pPr>
-              <w:rPr>
-                <w:rFonts w:ascii="Calibri" w:eastAsia="Times New Roman" w:hAnsi="Calibri" w:cs="Calibri"/>
-                <w:color w:val="000000"/>
-                <w:kern w:val="0"/>
-                <w:sz w:val="22"/>
-                <w:szCs w:val="22"/>
-                <w:lang w:eastAsia="en-IN"/>
-                <w14:ligatures w14:val="none"/>
-              </w:rPr>
-            </w:pPr>
-            <w:r>
-              <w:rPr>
-                <w:rFonts w:ascii="Calibri" w:eastAsia="Times New Roman" w:hAnsi="Calibri" w:cs="Calibri"/>
-                <w:color w:val="000000"/>
-                <w:kern w:val="0"/>
-                <w:sz w:val="22"/>
-                <w:szCs w:val="22"/>
-                <w:lang w:eastAsia="en-IN"/>
-                <w14:ligatures w14:val="none"/>
-              </w:rPr>
-              <w:t>R-fb1</w:t>
-            </w:r>
-          </w:p>
-        </w:tc>
-        <w:tc>
-          <w:tcPr>
-            <w:tcW w:w="1047" w:type="dxa"/>
-            <w:noWrap/>
-            <w:hideMark/>
-          </w:tcPr>
-          <w:p>
-            <w:pPr>
-              <w:cnfStyle w:val="000000000000" w:firstRow="0" w:lastRow="0" w:firstColumn="0" w:lastColumn="0" w:oddVBand="0" w:evenVBand="0" w:oddHBand="0" w:evenHBand="0" w:firstRowFirstColumn="0" w:firstRowLastColumn="0" w:lastRowFirstColumn="0" w:lastRowLastColumn="0"/>
-              <w:rPr>
-                <w:rFonts w:ascii="Calibri" w:eastAsia="Times New Roman" w:hAnsi="Calibri" w:cs="Calibri"/>
-                <w:color w:val="000000"/>
-                <w:kern w:val="0"/>
-                <w:sz w:val="22"/>
-                <w:szCs w:val="22"/>
-                <w:lang w:eastAsia="en-IN"/>
-                <w14:ligatures w14:val="none"/>
-              </w:rPr>
-            </w:pPr>
-            <w:r>
-              <w:rPr>
-                <w:rFonts w:ascii="Calibri" w:eastAsia="Times New Roman" w:hAnsi="Calibri" w:cs="Calibri"/>
-                <w:color w:val="EE0000"/>
-                <w:kern w:val="0"/>
-                <w:sz w:val="22"/>
-                <w:szCs w:val="22"/>
-                <w:lang w:eastAsia="en-IN"/>
-                <w14:ligatures w14:val="none"/>
-              </w:rPr>
-              <w:t xml:space="preserve">10 </w:t>
-            </w:r>
-            <w:proofErr w:type="spellStart"/>
-            <w:r>
-              <w:rPr>
-                <w:rFonts w:ascii="Calibri" w:eastAsia="Times New Roman" w:hAnsi="Calibri" w:cs="Calibri"/>
-                <w:color w:val="EE0000"/>
-                <w:kern w:val="0"/>
-                <w:sz w:val="22"/>
-                <w:szCs w:val="22"/>
-                <w:lang w:eastAsia="en-IN"/>
-                <w14:ligatures w14:val="none"/>
-              </w:rPr>
-              <w:t>kOhm</w:t>
-            </w:r>
-            <w:proofErr w:type="spellEnd"/>
-          </w:p>
-        </w:tc>
-        <w:tc>
-          <w:tcPr>
-            <w:tcW w:w="1360" w:type="dxa"/>
-            <w:noWrap/>
-            <w:hideMark/>
-          </w:tcPr>
-          <w:p>
-            <w:pPr>
-              <w:cnfStyle w:val="000000000000" w:firstRow="0" w:lastRow="0" w:firstColumn="0" w:lastColumn="0" w:oddVBand="0" w:evenVBand="0" w:oddHBand="0" w:evenHBand="0" w:firstRowFirstColumn="0" w:firstRowLastColumn="0" w:lastRowFirstColumn="0" w:lastRowLastColumn="0"/>
-              <w:rPr>
-                <w:rFonts w:ascii="Calibri" w:eastAsia="Times New Roman" w:hAnsi="Calibri" w:cs="Calibri"/>
-                <w:color w:val="000000"/>
-                <w:kern w:val="0"/>
-                <w:sz w:val="22"/>
-                <w:szCs w:val="22"/>
-                <w:lang w:eastAsia="en-IN"/>
-                <w14:ligatures w14:val="none"/>
-              </w:rPr>
-            </w:pPr>
-            <w:r>
-              <w:rPr>
-                <w:rFonts w:ascii="Calibri" w:eastAsia="Times New Roman" w:hAnsi="Calibri" w:cs="Calibri"/>
-                <w:color w:val="000000"/>
-                <w:kern w:val="0"/>
-                <w:sz w:val="22"/>
-                <w:szCs w:val="22"/>
-                <w:lang w:eastAsia="en-IN"/>
-                <w14:ligatures w14:val="none"/>
-              </w:rPr>
-              <w:t>R-fb2</w:t>
-            </w:r>
-          </w:p>
-        </w:tc>
-        <w:tc>
-          <w:tcPr>
-            <w:tcW w:w="1280" w:type="dxa"/>
-            <w:noWrap/>
-            <w:hideMark/>
-          </w:tcPr>
-          <w:p>
-            <w:pPr>
-              <w:cnfStyle w:val="000000000000" w:firstRow="0" w:lastRow="0" w:firstColumn="0" w:lastColumn="0" w:oddVBand="0" w:evenVBand="0" w:oddHBand="0" w:evenHBand="0" w:firstRowFirstColumn="0" w:firstRowLastColumn="0" w:lastRowFirstColumn="0" w:lastRowLastColumn="0"/>
-              <w:rPr>
-                <w:rFonts w:ascii="Calibri" w:eastAsia="Times New Roman" w:hAnsi="Calibri" w:cs="Calibri"/>
-                <w:color w:val="000000"/>
-                <w:kern w:val="0"/>
-                <w:sz w:val="22"/>
-                <w:szCs w:val="22"/>
-                <w:lang w:eastAsia="en-IN"/>
-                <w14:ligatures w14:val="none"/>
-              </w:rPr>
-            </w:pPr>
-            <w:r>
-              <w:rPr>
-                <w:rFonts w:ascii="Calibri" w:eastAsia="Times New Roman" w:hAnsi="Calibri" w:cs="Calibri"/>
-                <w:color w:val="000000"/>
-                <w:kern w:val="0"/>
-                <w:sz w:val="22"/>
-                <w:szCs w:val="22"/>
-                <w:lang w:eastAsia="en-IN"/>
-                <w14:ligatures w14:val="none"/>
-              </w:rPr>
-              <w:t xml:space="preserve">100 </w:t>
-            </w:r>
-            <w:proofErr w:type="spellStart"/>
-            <w:r>
-              <w:rPr>
-                <w:rFonts w:ascii="Calibri" w:eastAsia="Times New Roman" w:hAnsi="Calibri" w:cs="Calibri"/>
-                <w:color w:val="000000"/>
-                <w:kern w:val="0"/>
-                <w:sz w:val="22"/>
-                <w:szCs w:val="22"/>
-                <w:lang w:eastAsia="en-IN"/>
-                <w14:ligatures w14:val="none"/>
-              </w:rPr>
-              <w:t>kOhm</w:t>
-            </w:r>
-            <w:proofErr w:type="spellEnd"/>
-          </w:p>
-        </w:tc>
-        <w:tc>
-          <w:tcPr>
-            <w:tcW w:w="1520" w:type="dxa"/>
-            <w:noWrap/>
-            <w:hideMark/>
-          </w:tcPr>
-          <w:p>
-            <w:pPr>
-              <w:cnfStyle w:val="000000000000" w:firstRow="0" w:lastRow="0" w:firstColumn="0" w:lastColumn="0" w:oddVBand="0" w:evenVBand="0" w:oddHBand="0" w:evenHBand="0" w:firstRowFirstColumn="0" w:firstRowLastColumn="0" w:lastRowFirstColumn="0" w:lastRowLastColumn="0"/>
-              <w:rPr>
-                <w:rFonts w:ascii="Calibri" w:eastAsia="Times New Roman" w:hAnsi="Calibri" w:cs="Calibri"/>
-                <w:color w:val="000000"/>
-                <w:kern w:val="0"/>
-                <w:sz w:val="22"/>
-                <w:szCs w:val="22"/>
-                <w:lang w:eastAsia="en-IN"/>
-                <w14:ligatures w14:val="none"/>
-              </w:rPr>
-            </w:pPr>
-            <w:r>
-              <w:rPr>
-                <w:rFonts w:ascii="Calibri" w:eastAsia="Times New Roman" w:hAnsi="Calibri" w:cs="Calibri"/>
-                <w:color w:val="000000"/>
-                <w:kern w:val="0"/>
-                <w:sz w:val="22"/>
-                <w:szCs w:val="22"/>
-                <w:lang w:eastAsia="en-IN"/>
-                <w14:ligatures w14:val="none"/>
-              </w:rPr>
-              <w:t>R-fb3</w:t>
-            </w:r>
-          </w:p>
-        </w:tc>
-        <w:tc>
-          <w:tcPr>
-            <w:tcW w:w="1180" w:type="dxa"/>
-            <w:noWrap/>
-            <w:hideMark/>
-          </w:tcPr>
-          <w:p>
-            <w:pPr>
-              <w:cnfStyle w:val="000000000000" w:firstRow="0" w:lastRow="0" w:firstColumn="0" w:lastColumn="0" w:oddVBand="0" w:evenVBand="0" w:oddHBand="0" w:evenHBand="0" w:firstRowFirstColumn="0" w:firstRowLastColumn="0" w:lastRowFirstColumn="0" w:lastRowLastColumn="0"/>
-              <w:rPr>
-                <w:rFonts w:ascii="Calibri" w:eastAsia="Times New Roman" w:hAnsi="Calibri" w:cs="Calibri"/>
-                <w:color w:val="000000"/>
-                <w:kern w:val="0"/>
-                <w:sz w:val="22"/>
-                <w:szCs w:val="22"/>
-                <w:lang w:eastAsia="en-IN"/>
-                <w14:ligatures w14:val="none"/>
-              </w:rPr>
-            </w:pPr>
-            <w:r>
-              <w:rPr>
-                <w:rFonts w:ascii="Calibri" w:eastAsia="Times New Roman" w:hAnsi="Calibri" w:cs="Calibri"/>
-                <w:color w:val="EE0000"/>
-                <w:kern w:val="0"/>
-                <w:sz w:val="22"/>
-                <w:szCs w:val="22"/>
-                <w:lang w:eastAsia="en-IN"/>
-                <w14:ligatures w14:val="none"/>
-              </w:rPr>
-              <w:t xml:space="preserve">5 </w:t>
-            </w:r>
-            <w:proofErr w:type="spellStart"/>
-            <w:r>
-              <w:rPr>
-                <w:rFonts w:ascii="Calibri" w:eastAsia="Times New Roman" w:hAnsi="Calibri" w:cs="Calibri"/>
-                <w:color w:val="EE0000"/>
-                <w:kern w:val="0"/>
-                <w:sz w:val="22"/>
-                <w:szCs w:val="22"/>
-                <w:lang w:eastAsia="en-IN"/>
-                <w14:ligatures w14:val="none"/>
-              </w:rPr>
-              <w:t>kOhm</w:t>
-            </w:r>
-            <w:proofErr w:type="spellEnd"/>
-          </w:p>
-        </w:tc>
-        <w:tc>
-          <w:tcPr>
-            <w:tcW w:w="1560" w:type="dxa"/>
-            <w:noWrap/>
-            <w:hideMark/>
-          </w:tcPr>
-          <w:p>
-            <w:pPr>
-              <w:cnfStyle w:val="000000000000" w:firstRow="0" w:lastRow="0" w:firstColumn="0" w:lastColumn="0" w:oddVBand="0" w:evenVBand="0" w:oddHBand="0" w:evenHBand="0" w:firstRowFirstColumn="0" w:firstRowLastColumn="0" w:lastRowFirstColumn="0" w:lastRowLastColumn="0"/>
-              <w:rPr>
-                <w:rFonts w:ascii="Calibri" w:eastAsia="Times New Roman" w:hAnsi="Calibri" w:cs="Calibri"/>
-                <w:color w:val="000000"/>
-                <w:kern w:val="0"/>
-                <w:sz w:val="22"/>
-                <w:szCs w:val="22"/>
-                <w:lang w:eastAsia="en-IN"/>
-                <w14:ligatures w14:val="none"/>
-              </w:rPr>
-            </w:pPr>
-          </w:p>
-        </w:tc>
-        <w:tc>
-          <w:tcPr>
-            <w:tcW w:w="1560" w:type="dxa"/>
-          </w:tcPr>
-          <w:p>
-            <w:pPr>
-              <w:cnfStyle w:val="000000000000" w:firstRow="0" w:lastRow="0" w:firstColumn="0" w:lastColumn="0" w:oddVBand="0" w:evenVBand="0" w:oddHBand="0" w:evenHBand="0" w:firstRowFirstColumn="0" w:firstRowLastColumn="0" w:lastRowFirstColumn="0" w:lastRowLastColumn="0"/>
-              <w:rPr>
-                <w:rFonts w:ascii="Calibri" w:eastAsia="Times New Roman" w:hAnsi="Calibri" w:cs="Calibri"/>
-                <w:color w:val="000000"/>
-                <w:kern w:val="0"/>
-                <w:sz w:val="22"/>
-                <w:szCs w:val="22"/>
-                <w:lang w:eastAsia="en-IN"/>
-                <w14:ligatures w14:val="none"/>
-              </w:rPr>
-            </w:pPr>
-          </w:p>
-        </w:tc>
-      </w:tr>
-      <w:tr>
-        <w:trPr>
-          <w:cnfStyle w:val="000000100000" w:firstRow="0" w:lastRow="0" w:firstColumn="0" w:lastColumn="0" w:oddVBand="0" w:evenVBand="0" w:oddHBand="1" w:evenHBand="0" w:firstRowFirstColumn="0" w:firstRowLastColumn="0" w:lastRowFirstColumn="0" w:lastRowLastColumn="0"/>
-          <w:trHeight w:val="290"/>
-        </w:trPr>
-        <w:tc>
-          <w:tcPr>
-            <w:cnfStyle w:val="001000000000" w:firstRow="0" w:lastRow="0" w:firstColumn="1" w:lastColumn="0" w:oddVBand="0" w:evenVBand="0" w:oddHBand="0" w:evenHBand="0" w:firstRowFirstColumn="0" w:firstRowLastColumn="0" w:lastRowFirstColumn="0" w:lastRowLastColumn="0"/>
-            <w:tcW w:w="1413" w:type="dxa"/>
-            <w:noWrap/>
-            <w:hideMark/>
-          </w:tcPr>
-          <w:p>
-            <w:pPr>
-              <w:rPr>
-                <w:rFonts w:ascii="Calibri" w:eastAsia="Times New Roman" w:hAnsi="Calibri" w:cs="Calibri"/>
-                <w:color w:val="000000"/>
-                <w:kern w:val="0"/>
-                <w:sz w:val="22"/>
-                <w:szCs w:val="22"/>
-                <w:lang w:eastAsia="en-IN"/>
-                <w14:ligatures w14:val="none"/>
-              </w:rPr>
-            </w:pPr>
-            <w:r>
-              <w:rPr>
-                <w:rFonts w:ascii="Calibri" w:eastAsia="Times New Roman" w:hAnsi="Calibri" w:cs="Calibri"/>
-                <w:color w:val="000000"/>
-                <w:kern w:val="0"/>
-                <w:sz w:val="22"/>
-                <w:szCs w:val="22"/>
-                <w:lang w:eastAsia="en-IN"/>
-                <w14:ligatures w14:val="none"/>
-              </w:rPr>
-              <w:t>R-out1</w:t>
-            </w:r>
-          </w:p>
-        </w:tc>
-        <w:tc>
-          <w:tcPr>
-            <w:tcW w:w="1047" w:type="dxa"/>
-            <w:noWrap/>
-            <w:hideMark/>
-          </w:tcPr>
-          <w:p>
-            <w:pPr>
-              <w:cnfStyle w:val="000000100000" w:firstRow="0" w:lastRow="0" w:firstColumn="0" w:lastColumn="0" w:oddVBand="0" w:evenVBand="0" w:oddHBand="1" w:evenHBand="0" w:firstRowFirstColumn="0" w:firstRowLastColumn="0" w:lastRowFirstColumn="0" w:lastRowLastColumn="0"/>
-              <w:rPr>
-                <w:rFonts w:ascii="Calibri" w:eastAsia="Times New Roman" w:hAnsi="Calibri" w:cs="Calibri"/>
-                <w:color w:val="000000"/>
-                <w:kern w:val="0"/>
-                <w:sz w:val="22"/>
-                <w:szCs w:val="22"/>
-                <w:lang w:eastAsia="en-IN"/>
-                <w14:ligatures w14:val="none"/>
-              </w:rPr>
-            </w:pPr>
-            <w:r>
-              <w:rPr>
-                <w:rFonts w:ascii="Calibri" w:eastAsia="Times New Roman" w:hAnsi="Calibri" w:cs="Calibri"/>
-                <w:color w:val="000000"/>
-                <w:kern w:val="0"/>
-                <w:sz w:val="22"/>
-                <w:szCs w:val="22"/>
-                <w:lang w:eastAsia="en-IN"/>
-                <w14:ligatures w14:val="none"/>
-              </w:rPr>
-              <w:t xml:space="preserve">10 </w:t>
-            </w:r>
-            <w:proofErr w:type="spellStart"/>
-            <w:r>
-              <w:rPr>
-                <w:rFonts w:ascii="Calibri" w:eastAsia="Times New Roman" w:hAnsi="Calibri" w:cs="Calibri"/>
-                <w:color w:val="000000"/>
-                <w:kern w:val="0"/>
-                <w:sz w:val="22"/>
-                <w:szCs w:val="22"/>
-                <w:lang w:eastAsia="en-IN"/>
-                <w14:ligatures w14:val="none"/>
-              </w:rPr>
-              <w:t>kOhm</w:t>
-            </w:r>
-            <w:proofErr w:type="spellEnd"/>
-          </w:p>
-        </w:tc>
-        <w:tc>
-          <w:tcPr>
-            <w:tcW w:w="1360" w:type="dxa"/>
-            <w:noWrap/>
-            <w:hideMark/>
-          </w:tcPr>
-          <w:p>
-            <w:pPr>
-              <w:cnfStyle w:val="000000100000" w:firstRow="0" w:lastRow="0" w:firstColumn="0" w:lastColumn="0" w:oddVBand="0" w:evenVBand="0" w:oddHBand="1" w:evenHBand="0" w:firstRowFirstColumn="0" w:firstRowLastColumn="0" w:lastRowFirstColumn="0" w:lastRowLastColumn="0"/>
-              <w:rPr>
-                <w:rFonts w:ascii="Calibri" w:eastAsia="Times New Roman" w:hAnsi="Calibri" w:cs="Calibri"/>
-                <w:color w:val="000000"/>
-                <w:kern w:val="0"/>
-                <w:sz w:val="22"/>
-                <w:szCs w:val="22"/>
-                <w:lang w:eastAsia="en-IN"/>
-                <w14:ligatures w14:val="none"/>
-              </w:rPr>
-            </w:pPr>
-            <w:r>
-              <w:rPr>
-                <w:rFonts w:ascii="Calibri" w:eastAsia="Times New Roman" w:hAnsi="Calibri" w:cs="Calibri"/>
-                <w:color w:val="000000"/>
-                <w:kern w:val="0"/>
-                <w:sz w:val="22"/>
-                <w:szCs w:val="22"/>
-                <w:lang w:eastAsia="en-IN"/>
-                <w14:ligatures w14:val="none"/>
-              </w:rPr>
-              <w:t>R-out2</w:t>
-            </w:r>
-          </w:p>
-        </w:tc>
-        <w:tc>
-          <w:tcPr>
-            <w:tcW w:w="1280" w:type="dxa"/>
-            <w:noWrap/>
-            <w:hideMark/>
-          </w:tcPr>
-          <w:p>
-            <w:pPr>
-              <w:cnfStyle w:val="000000100000" w:firstRow="0" w:lastRow="0" w:firstColumn="0" w:lastColumn="0" w:oddVBand="0" w:evenVBand="0" w:oddHBand="1" w:evenHBand="0" w:firstRowFirstColumn="0" w:firstRowLastColumn="0" w:lastRowFirstColumn="0" w:lastRowLastColumn="0"/>
-              <w:rPr>
-                <w:rFonts w:ascii="Calibri" w:eastAsia="Times New Roman" w:hAnsi="Calibri" w:cs="Calibri"/>
-                <w:color w:val="000000"/>
-                <w:kern w:val="0"/>
-                <w:sz w:val="22"/>
-                <w:szCs w:val="22"/>
-                <w:lang w:eastAsia="en-IN"/>
-                <w14:ligatures w14:val="none"/>
-              </w:rPr>
-            </w:pPr>
-            <w:r>
-              <w:rPr>
-                <w:rFonts w:ascii="Calibri" w:eastAsia="Times New Roman" w:hAnsi="Calibri" w:cs="Calibri"/>
-                <w:color w:val="000000"/>
-                <w:kern w:val="0"/>
-                <w:sz w:val="22"/>
-                <w:szCs w:val="22"/>
-                <w:lang w:eastAsia="en-IN"/>
-                <w14:ligatures w14:val="none"/>
-              </w:rPr>
-              <w:t xml:space="preserve">10 </w:t>
-            </w:r>
-            <w:proofErr w:type="spellStart"/>
-            <w:r>
-              <w:rPr>
-                <w:rFonts w:ascii="Calibri" w:eastAsia="Times New Roman" w:hAnsi="Calibri" w:cs="Calibri"/>
-                <w:color w:val="000000"/>
-                <w:kern w:val="0"/>
-                <w:sz w:val="22"/>
-                <w:szCs w:val="22"/>
-                <w:lang w:eastAsia="en-IN"/>
-                <w14:ligatures w14:val="none"/>
-              </w:rPr>
-              <w:t>kOhm</w:t>
-            </w:r>
-            <w:proofErr w:type="spellEnd"/>
-          </w:p>
-        </w:tc>
-        <w:tc>
-          <w:tcPr>
-            <w:tcW w:w="1520" w:type="dxa"/>
-            <w:noWrap/>
-            <w:hideMark/>
-          </w:tcPr>
-          <w:p>
-            <w:pPr>
-              <w:cnfStyle w:val="000000100000" w:firstRow="0" w:lastRow="0" w:firstColumn="0" w:lastColumn="0" w:oddVBand="0" w:evenVBand="0" w:oddHBand="1" w:evenHBand="0" w:firstRowFirstColumn="0" w:firstRowLastColumn="0" w:lastRowFirstColumn="0" w:lastRowLastColumn="0"/>
-              <w:rPr>
-                <w:rFonts w:ascii="Calibri" w:eastAsia="Times New Roman" w:hAnsi="Calibri" w:cs="Calibri"/>
-                <w:color w:val="000000"/>
-                <w:kern w:val="0"/>
-                <w:sz w:val="22"/>
-                <w:szCs w:val="22"/>
-                <w:lang w:eastAsia="en-IN"/>
-                <w14:ligatures w14:val="none"/>
-              </w:rPr>
-            </w:pPr>
-            <w:r>
-              <w:rPr>
-                <w:rFonts w:ascii="Calibri" w:eastAsia="Times New Roman" w:hAnsi="Calibri" w:cs="Calibri"/>
-                <w:color w:val="000000"/>
-                <w:kern w:val="0"/>
-                <w:sz w:val="22"/>
-                <w:szCs w:val="22"/>
-                <w:lang w:eastAsia="en-IN"/>
-                <w14:ligatures w14:val="none"/>
-              </w:rPr>
-              <w:t>R-out3</w:t>
-            </w:r>
-          </w:p>
-        </w:tc>
-        <w:tc>
-          <w:tcPr>
-            <w:tcW w:w="1180" w:type="dxa"/>
-            <w:noWrap/>
-            <w:hideMark/>
-          </w:tcPr>
-          <w:p>
-            <w:pPr>
-              <w:cnfStyle w:val="000000100000" w:firstRow="0" w:lastRow="0" w:firstColumn="0" w:lastColumn="0" w:oddVBand="0" w:evenVBand="0" w:oddHBand="1" w:evenHBand="0" w:firstRowFirstColumn="0" w:firstRowLastColumn="0" w:lastRowFirstColumn="0" w:lastRowLastColumn="0"/>
-              <w:rPr>
-                <w:rFonts w:ascii="Calibri" w:eastAsia="Times New Roman" w:hAnsi="Calibri" w:cs="Calibri"/>
-                <w:color w:val="000000"/>
-                <w:kern w:val="0"/>
-                <w:sz w:val="22"/>
-                <w:szCs w:val="22"/>
-                <w:lang w:eastAsia="en-IN"/>
-                <w14:ligatures w14:val="none"/>
-              </w:rPr>
-            </w:pPr>
-            <w:r>
-              <w:rPr>
-                <w:rFonts w:ascii="Calibri" w:eastAsia="Times New Roman" w:hAnsi="Calibri" w:cs="Calibri"/>
-                <w:color w:val="000000"/>
-                <w:kern w:val="0"/>
-                <w:sz w:val="22"/>
-                <w:szCs w:val="22"/>
-                <w:lang w:eastAsia="en-IN"/>
-                <w14:ligatures w14:val="none"/>
-              </w:rPr>
-              <w:t xml:space="preserve">10 </w:t>
-            </w:r>
-            <w:proofErr w:type="spellStart"/>
-            <w:r>
-              <w:rPr>
-                <w:rFonts w:ascii="Calibri" w:eastAsia="Times New Roman" w:hAnsi="Calibri" w:cs="Calibri"/>
-                <w:color w:val="000000"/>
-                <w:kern w:val="0"/>
-                <w:sz w:val="22"/>
-                <w:szCs w:val="22"/>
-                <w:lang w:eastAsia="en-IN"/>
-                <w14:ligatures w14:val="none"/>
-              </w:rPr>
-              <w:t>kOhm</w:t>
-            </w:r>
-            <w:proofErr w:type="spellEnd"/>
-          </w:p>
-        </w:tc>
-        <w:tc>
-          <w:tcPr>
-            <w:tcW w:w="1560" w:type="dxa"/>
-            <w:noWrap/>
-            <w:hideMark/>
-          </w:tcPr>
-          <w:p>
-            <w:pPr>
-              <w:cnfStyle w:val="000000100000" w:firstRow="0" w:lastRow="0" w:firstColumn="0" w:lastColumn="0" w:oddVBand="0" w:evenVBand="0" w:oddHBand="1" w:evenHBand="0" w:firstRowFirstColumn="0" w:firstRowLastColumn="0" w:lastRowFirstColumn="0" w:lastRowLastColumn="0"/>
-              <w:rPr>
-                <w:rFonts w:ascii="Calibri" w:eastAsia="Times New Roman" w:hAnsi="Calibri" w:cs="Calibri"/>
-                <w:color w:val="000000"/>
-                <w:kern w:val="0"/>
-                <w:sz w:val="22"/>
-                <w:szCs w:val="22"/>
-                <w:lang w:eastAsia="en-IN"/>
-                <w14:ligatures w14:val="none"/>
-              </w:rPr>
-            </w:pPr>
-          </w:p>
-        </w:tc>
-        <w:tc>
-          <w:tcPr>
-            <w:tcW w:w="1560" w:type="dxa"/>
-          </w:tcPr>
-          <w:p>
-            <w:pPr>
-              <w:cnfStyle w:val="000000100000" w:firstRow="0" w:lastRow="0" w:firstColumn="0" w:lastColumn="0" w:oddVBand="0" w:evenVBand="0" w:oddHBand="1" w:evenHBand="0" w:firstRowFirstColumn="0" w:firstRowLastColumn="0" w:lastRowFirstColumn="0" w:lastRowLastColumn="0"/>
-              <w:rPr>
-                <w:rFonts w:ascii="Calibri" w:eastAsia="Times New Roman" w:hAnsi="Calibri" w:cs="Calibri"/>
-                <w:color w:val="000000"/>
-                <w:kern w:val="0"/>
-                <w:sz w:val="22"/>
-                <w:szCs w:val="22"/>
-                <w:lang w:eastAsia="en-IN"/>
-                <w14:ligatures w14:val="none"/>
-              </w:rPr>
-            </w:pPr>
-          </w:p>
-        </w:tc>
-      </w:tr>
-      <w:tr>
-        <w:trPr>
-          <w:trHeight w:val="290"/>
-        </w:trPr>
-        <w:tc>
-          <w:tcPr>
-            <w:cnfStyle w:val="001000000000" w:firstRow="0" w:lastRow="0" w:firstColumn="1" w:lastColumn="0" w:oddVBand="0" w:evenVBand="0" w:oddHBand="0" w:evenHBand="0" w:firstRowFirstColumn="0" w:firstRowLastColumn="0" w:lastRowFirstColumn="0" w:lastRowLastColumn="0"/>
-            <w:tcW w:w="1413" w:type="dxa"/>
-            <w:noWrap/>
-            <w:hideMark/>
-          </w:tcPr>
-          <w:p>
-            <w:pPr>
-              <w:rPr>
-                <w:rFonts w:ascii="Times New Roman" w:eastAsia="Times New Roman" w:hAnsi="Times New Roman" w:cs="Times New Roman"/>
-                <w:kern w:val="0"/>
-                <w:sz w:val="20"/>
-                <w:szCs w:val="20"/>
-                <w:lang w:eastAsia="en-IN"/>
-                <w14:ligatures w14:val="none"/>
-              </w:rPr>
-            </w:pPr>
-          </w:p>
-        </w:tc>
-        <w:tc>
-          <w:tcPr>
-            <w:tcW w:w="1047" w:type="dxa"/>
-            <w:noWrap/>
-            <w:hideMark/>
-          </w:tcPr>
-          <w:p>
-            <w:pPr>
-              <w:cnfStyle w:val="000000000000" w:firstRow="0" w:lastRow="0" w:firstColumn="0" w:lastColumn="0" w:oddVBand="0" w:evenVBand="0" w:oddHBand="0" w:evenHBand="0" w:firstRowFirstColumn="0" w:firstRowLastColumn="0" w:lastRowFirstColumn="0" w:lastRowLastColumn="0"/>
-              <w:rPr>
-                <w:rFonts w:ascii="Times New Roman" w:eastAsia="Times New Roman" w:hAnsi="Times New Roman" w:cs="Times New Roman"/>
-                <w:kern w:val="0"/>
-                <w:sz w:val="20"/>
-                <w:szCs w:val="20"/>
-                <w:lang w:eastAsia="en-IN"/>
-                <w14:ligatures w14:val="none"/>
-              </w:rPr>
-            </w:pPr>
-          </w:p>
-        </w:tc>
-        <w:tc>
-          <w:tcPr>
-            <w:tcW w:w="1360" w:type="dxa"/>
-            <w:noWrap/>
-            <w:hideMark/>
-          </w:tcPr>
-          <w:p>
-            <w:pPr>
-              <w:cnfStyle w:val="000000000000" w:firstRow="0" w:lastRow="0" w:firstColumn="0" w:lastColumn="0" w:oddVBand="0" w:evenVBand="0" w:oddHBand="0" w:evenHBand="0" w:firstRowFirstColumn="0" w:firstRowLastColumn="0" w:lastRowFirstColumn="0" w:lastRowLastColumn="0"/>
-              <w:rPr>
-                <w:rFonts w:ascii="Calibri" w:eastAsia="Times New Roman" w:hAnsi="Calibri" w:cs="Calibri"/>
-                <w:color w:val="000000"/>
-                <w:kern w:val="0"/>
-                <w:sz w:val="22"/>
-                <w:szCs w:val="22"/>
-                <w:lang w:eastAsia="en-IN"/>
-                <w14:ligatures w14:val="none"/>
-              </w:rPr>
-            </w:pPr>
-            <w:r>
-              <w:rPr>
-                <w:rFonts w:ascii="Calibri" w:eastAsia="Times New Roman" w:hAnsi="Calibri" w:cs="Calibri"/>
-                <w:color w:val="000000"/>
-                <w:kern w:val="0"/>
-                <w:sz w:val="22"/>
-                <w:szCs w:val="22"/>
-                <w:lang w:eastAsia="en-IN"/>
-                <w14:ligatures w14:val="none"/>
-              </w:rPr>
-              <w:t>C-fb</w:t>
-            </w:r>
-          </w:p>
-        </w:tc>
-        <w:tc>
-          <w:tcPr>
-            <w:tcW w:w="1280" w:type="dxa"/>
-            <w:noWrap/>
-            <w:hideMark/>
-          </w:tcPr>
-          <w:p>
-            <w:pPr>
-              <w:cnfStyle w:val="000000000000" w:firstRow="0" w:lastRow="0" w:firstColumn="0" w:lastColumn="0" w:oddVBand="0" w:evenVBand="0" w:oddHBand="0" w:evenHBand="0" w:firstRowFirstColumn="0" w:firstRowLastColumn="0" w:lastRowFirstColumn="0" w:lastRowLastColumn="0"/>
-              <w:rPr>
-                <w:rFonts w:ascii="Calibri" w:eastAsia="Times New Roman" w:hAnsi="Calibri" w:cs="Calibri"/>
-                <w:color w:val="000000"/>
-                <w:kern w:val="0"/>
-                <w:sz w:val="22"/>
-                <w:szCs w:val="22"/>
-                <w:lang w:eastAsia="en-IN"/>
-                <w14:ligatures w14:val="none"/>
-              </w:rPr>
-            </w:pPr>
-            <w:r>
-              <w:rPr>
-                <w:rFonts w:ascii="Calibri" w:eastAsia="Times New Roman" w:hAnsi="Calibri" w:cs="Calibri"/>
-                <w:color w:val="000000"/>
-                <w:kern w:val="0"/>
-                <w:sz w:val="22"/>
-                <w:szCs w:val="22"/>
-                <w:lang w:eastAsia="en-IN"/>
-                <w14:ligatures w14:val="none"/>
-              </w:rPr>
-              <w:t xml:space="preserve">100 </w:t>
-            </w:r>
-            <w:proofErr w:type="spellStart"/>
-            <w:r>
-              <w:rPr>
-                <w:rFonts w:ascii="Calibri" w:eastAsia="Times New Roman" w:hAnsi="Calibri" w:cs="Calibri"/>
-                <w:color w:val="000000"/>
-                <w:kern w:val="0"/>
-                <w:sz w:val="22"/>
-                <w:szCs w:val="22"/>
-                <w:lang w:eastAsia="en-IN"/>
-                <w14:ligatures w14:val="none"/>
-              </w:rPr>
-              <w:t>nF</w:t>
-            </w:r>
-            <w:proofErr w:type="spellEnd"/>
-          </w:p>
-        </w:tc>
-        <w:tc>
-          <w:tcPr>
-            <w:tcW w:w="1520" w:type="dxa"/>
-            <w:noWrap/>
-            <w:hideMark/>
-          </w:tcPr>
-          <w:p>
-            <w:pPr>
-              <w:cnfStyle w:val="000000000000" w:firstRow="0" w:lastRow="0" w:firstColumn="0" w:lastColumn="0" w:oddVBand="0" w:evenVBand="0" w:oddHBand="0" w:evenHBand="0" w:firstRowFirstColumn="0" w:firstRowLastColumn="0" w:lastRowFirstColumn="0" w:lastRowLastColumn="0"/>
-              <w:rPr>
-                <w:rFonts w:ascii="Calibri" w:eastAsia="Times New Roman" w:hAnsi="Calibri" w:cs="Calibri"/>
-                <w:color w:val="000000"/>
-                <w:kern w:val="0"/>
-                <w:sz w:val="22"/>
-                <w:szCs w:val="22"/>
-                <w:lang w:eastAsia="en-IN"/>
-                <w14:ligatures w14:val="none"/>
-              </w:rPr>
-            </w:pPr>
-            <w:r>
-              <w:rPr>
-                <w:rFonts w:ascii="Calibri" w:eastAsia="Times New Roman" w:hAnsi="Calibri" w:cs="Calibri"/>
-                <w:color w:val="000000"/>
-                <w:kern w:val="0"/>
-                <w:sz w:val="22"/>
-                <w:szCs w:val="22"/>
-                <w:lang w:eastAsia="en-IN"/>
-                <w14:ligatures w14:val="none"/>
-              </w:rPr>
-              <w:t>C-in</w:t>
-            </w:r>
-          </w:p>
-        </w:tc>
-        <w:tc>
-          <w:tcPr>
-            <w:tcW w:w="1180" w:type="dxa"/>
-            <w:noWrap/>
-            <w:hideMark/>
-          </w:tcPr>
-          <w:p>
-            <w:pPr>
-              <w:cnfStyle w:val="000000000000" w:firstRow="0" w:lastRow="0" w:firstColumn="0" w:lastColumn="0" w:oddVBand="0" w:evenVBand="0" w:oddHBand="0" w:evenHBand="0" w:firstRowFirstColumn="0" w:firstRowLastColumn="0" w:lastRowFirstColumn="0" w:lastRowLastColumn="0"/>
-              <w:rPr>
-                <w:rFonts w:ascii="Calibri" w:eastAsia="Times New Roman" w:hAnsi="Calibri" w:cs="Calibri"/>
-                <w:color w:val="000000"/>
-                <w:kern w:val="0"/>
-                <w:sz w:val="22"/>
-                <w:szCs w:val="22"/>
-                <w:lang w:eastAsia="en-IN"/>
-                <w14:ligatures w14:val="none"/>
-              </w:rPr>
-            </w:pPr>
-            <w:r>
-              <w:rPr>
-                <w:rFonts w:ascii="Calibri" w:eastAsia="Times New Roman" w:hAnsi="Calibri" w:cs="Calibri"/>
-                <w:color w:val="000000"/>
-                <w:kern w:val="0"/>
-                <w:sz w:val="22"/>
-                <w:szCs w:val="22"/>
-                <w:lang w:eastAsia="en-IN"/>
-                <w14:ligatures w14:val="none"/>
-              </w:rPr>
-              <w:t xml:space="preserve">100 </w:t>
-            </w:r>
-            <w:proofErr w:type="spellStart"/>
-            <w:r>
-              <w:rPr>
-                <w:rFonts w:ascii="Calibri" w:eastAsia="Times New Roman" w:hAnsi="Calibri" w:cs="Calibri"/>
-                <w:color w:val="000000"/>
-                <w:kern w:val="0"/>
-                <w:sz w:val="22"/>
-                <w:szCs w:val="22"/>
-                <w:lang w:eastAsia="en-IN"/>
-                <w14:ligatures w14:val="none"/>
-              </w:rPr>
-              <w:t>nF</w:t>
-            </w:r>
-            <w:proofErr w:type="spellEnd"/>
-          </w:p>
-        </w:tc>
-        <w:tc>
-          <w:tcPr>
-            <w:tcW w:w="1560" w:type="dxa"/>
-            <w:noWrap/>
-            <w:hideMark/>
-          </w:tcPr>
-          <w:p>
-            <w:pPr>
-              <w:cnfStyle w:val="000000000000" w:firstRow="0" w:lastRow="0" w:firstColumn="0" w:lastColumn="0" w:oddVBand="0" w:evenVBand="0" w:oddHBand="0" w:evenHBand="0" w:firstRowFirstColumn="0" w:firstRowLastColumn="0" w:lastRowFirstColumn="0" w:lastRowLastColumn="0"/>
-              <w:rPr>
-                <w:rFonts w:ascii="Calibri" w:eastAsia="Times New Roman" w:hAnsi="Calibri" w:cs="Calibri"/>
-                <w:color w:val="000000"/>
-                <w:kern w:val="0"/>
-                <w:sz w:val="22"/>
-                <w:szCs w:val="22"/>
-                <w:lang w:eastAsia="en-IN"/>
-                <w14:ligatures w14:val="none"/>
-              </w:rPr>
-            </w:pPr>
-          </w:p>
-        </w:tc>
-        <w:tc>
-          <w:tcPr>
-            <w:tcW w:w="1560" w:type="dxa"/>
-          </w:tcPr>
-          <w:p>
-            <w:pPr>
-              <w:cnfStyle w:val="000000000000" w:firstRow="0" w:lastRow="0" w:firstColumn="0" w:lastColumn="0" w:oddVBand="0" w:evenVBand="0" w:oddHBand="0" w:evenHBand="0" w:firstRowFirstColumn="0" w:firstRowLastColumn="0" w:lastRowFirstColumn="0" w:lastRowLastColumn="0"/>
-              <w:rPr>
-                <w:rFonts w:ascii="Calibri" w:eastAsia="Times New Roman" w:hAnsi="Calibri" w:cs="Calibri"/>
-                <w:color w:val="000000"/>
-                <w:kern w:val="0"/>
-                <w:sz w:val="22"/>
-                <w:szCs w:val="22"/>
-                <w:lang w:eastAsia="en-IN"/>
-                <w14:ligatures w14:val="none"/>
-              </w:rPr>
-            </w:pPr>
-          </w:p>
-        </w:tc>
-      </w:tr>
-    </w:tbl>
     <w:p/>
     <w:tbl>
       <w:tblPr>
@@ -4456,7 +4830,6 @@
                 <w:lang w:eastAsia="en-IN"/>
                 <w14:ligatures w14:val="none"/>
               </w:rPr>
-              <w:lastRenderedPageBreak/>
               <w:t>P Controller</w:t>
             </w:r>
           </w:p>
@@ -4710,22 +5083,8 @@
                 <w:lang w:eastAsia="en-IN"/>
                 <w14:ligatures w14:val="none"/>
               </w:rPr>
-              <w:t xml:space="preserve">5 </w:t>
+              <w:t>5 kOhm</w:t>
             </w:r>
-            <w:proofErr w:type="spellStart"/>
-            <w:r>
-              <w:rPr>
-                <w:rFonts w:ascii="Calibri" w:eastAsia="Times New Roman" w:hAnsi="Calibri" w:cs="Calibri"/>
-                <w:color w:val="000000"/>
-                <w:kern w:val="0"/>
-                <w:sz w:val="22"/>
-                <w:szCs w:val="22"/>
-                <w:lang w:eastAsia="en-IN"/>
-                <w14:ligatures w14:val="none"/>
-              </w:rPr>
-              <w:t>kOhm</w:t>
-            </w:r>
-            <w:proofErr w:type="spellEnd"/>
           </w:p>
         </w:tc>
         <w:tc>
@@ -4802,22 +5161,8 @@
                 <w:lang w:eastAsia="en-IN"/>
                 <w14:ligatures w14:val="none"/>
               </w:rPr>
-              <w:t xml:space="preserve"> </w:t>
+              <w:t xml:space="preserve"> kOhm</w:t>
             </w:r>
-            <w:proofErr w:type="spellStart"/>
-            <w:r>
-              <w:rPr>
-                <w:rFonts w:ascii="Calibri" w:eastAsia="Times New Roman" w:hAnsi="Calibri" w:cs="Calibri"/>
-                <w:color w:val="EE0000"/>
-                <w:kern w:val="0"/>
-                <w:sz w:val="22"/>
-                <w:szCs w:val="22"/>
-                <w:lang w:eastAsia="en-IN"/>
-                <w14:ligatures w14:val="none"/>
-              </w:rPr>
-              <w:t>kOhm</w:t>
-            </w:r>
-            <w:proofErr w:type="spellEnd"/>
           </w:p>
         </w:tc>
         <w:tc>
@@ -4882,22 +5227,8 @@
                 <w:lang w:eastAsia="en-IN"/>
                 <w14:ligatures w14:val="none"/>
               </w:rPr>
-              <w:t xml:space="preserve">5 </w:t>
+              <w:t>5 kOhm</w:t>
             </w:r>
-            <w:proofErr w:type="spellStart"/>
-            <w:r>
-              <w:rPr>
-                <w:rFonts w:ascii="Calibri" w:eastAsia="Times New Roman" w:hAnsi="Calibri" w:cs="Calibri"/>
-                <w:color w:val="000000"/>
-                <w:kern w:val="0"/>
-                <w:sz w:val="22"/>
-                <w:szCs w:val="22"/>
-                <w:lang w:eastAsia="en-IN"/>
-                <w14:ligatures w14:val="none"/>
-              </w:rPr>
-              <w:t>kOhm</w:t>
-            </w:r>
-            <w:proofErr w:type="spellEnd"/>
           </w:p>
         </w:tc>
         <w:tc>
@@ -4960,22 +5291,8 @@
                 <w:lang w:eastAsia="en-IN"/>
                 <w14:ligatures w14:val="none"/>
               </w:rPr>
-              <w:t xml:space="preserve">10 </w:t>
+              <w:t>10 kOhm</w:t>
             </w:r>
-            <w:proofErr w:type="spellStart"/>
-            <w:r>
-              <w:rPr>
-                <w:rFonts w:ascii="Calibri" w:eastAsia="Times New Roman" w:hAnsi="Calibri" w:cs="Calibri"/>
-                <w:color w:val="000000"/>
-                <w:kern w:val="0"/>
-                <w:sz w:val="22"/>
-                <w:szCs w:val="22"/>
-                <w:lang w:eastAsia="en-IN"/>
-                <w14:ligatures w14:val="none"/>
-              </w:rPr>
-              <w:t>kOhm</w:t>
-            </w:r>
-            <w:proofErr w:type="spellEnd"/>
           </w:p>
         </w:tc>
       </w:tr>
@@ -5045,22 +5362,8 @@
                 <w:lang w:eastAsia="en-IN"/>
                 <w14:ligatures w14:val="none"/>
               </w:rPr>
-              <w:t xml:space="preserve">15 </w:t>
+              <w:t>15 kOhm</w:t>
             </w:r>
-            <w:proofErr w:type="spellStart"/>
-            <w:r>
-              <w:rPr>
-                <w:rFonts w:ascii="Calibri" w:eastAsia="Times New Roman" w:hAnsi="Calibri" w:cs="Calibri"/>
-                <w:color w:val="EE0000"/>
-                <w:kern w:val="0"/>
-                <w:sz w:val="22"/>
-                <w:szCs w:val="22"/>
-                <w:lang w:eastAsia="en-IN"/>
-                <w14:ligatures w14:val="none"/>
-              </w:rPr>
-              <w:t>kOhm</w:t>
-            </w:r>
-            <w:proofErr w:type="spellEnd"/>
           </w:p>
         </w:tc>
         <w:tc>
@@ -5125,22 +5428,8 @@
                 <w:lang w:eastAsia="en-IN"/>
                 <w14:ligatures w14:val="none"/>
               </w:rPr>
-              <w:t xml:space="preserve">100 </w:t>
+              <w:t>100 kOhm</w:t>
             </w:r>
-            <w:proofErr w:type="spellStart"/>
-            <w:r>
-              <w:rPr>
-                <w:rFonts w:ascii="Calibri" w:eastAsia="Times New Roman" w:hAnsi="Calibri" w:cs="Calibri"/>
-                <w:color w:val="000000"/>
-                <w:kern w:val="0"/>
-                <w:sz w:val="22"/>
-                <w:szCs w:val="22"/>
-                <w:lang w:eastAsia="en-IN"/>
-                <w14:ligatures w14:val="none"/>
-              </w:rPr>
-              <w:t>kOhm</w:t>
-            </w:r>
-            <w:proofErr w:type="spellEnd"/>
           </w:p>
         </w:tc>
         <w:tc>
@@ -5217,22 +5506,8 @@
                 <w:lang w:eastAsia="en-IN"/>
                 <w14:ligatures w14:val="none"/>
               </w:rPr>
-              <w:t xml:space="preserve"> </w:t>
+              <w:t xml:space="preserve"> kOhm</w:t>
             </w:r>
-            <w:proofErr w:type="spellStart"/>
-            <w:r>
-              <w:rPr>
-                <w:rFonts w:ascii="Calibri" w:eastAsia="Times New Roman" w:hAnsi="Calibri" w:cs="Calibri"/>
-                <w:color w:val="EE0000"/>
-                <w:kern w:val="0"/>
-                <w:sz w:val="22"/>
-                <w:szCs w:val="22"/>
-                <w:lang w:eastAsia="en-IN"/>
-                <w14:ligatures w14:val="none"/>
-              </w:rPr>
-              <w:t>kOhm</w:t>
-            </w:r>
-            <w:proofErr w:type="spellEnd"/>
           </w:p>
         </w:tc>
         <w:tc>
@@ -5343,22 +5618,8 @@
                 <w:lang w:eastAsia="en-IN"/>
                 <w14:ligatures w14:val="none"/>
               </w:rPr>
-              <w:t xml:space="preserve">10 </w:t>
+              <w:t>10 kOhm</w:t>
             </w:r>
-            <w:proofErr w:type="spellStart"/>
-            <w:r>
-              <w:rPr>
-                <w:rFonts w:ascii="Calibri" w:eastAsia="Times New Roman" w:hAnsi="Calibri" w:cs="Calibri"/>
-                <w:color w:val="000000"/>
-                <w:kern w:val="0"/>
-                <w:sz w:val="22"/>
-                <w:szCs w:val="22"/>
-                <w:lang w:eastAsia="en-IN"/>
-                <w14:ligatures w14:val="none"/>
-              </w:rPr>
-              <w:t>kOhm</w:t>
-            </w:r>
-            <w:proofErr w:type="spellEnd"/>
           </w:p>
         </w:tc>
         <w:tc>
@@ -5423,22 +5684,8 @@
                 <w:lang w:eastAsia="en-IN"/>
                 <w14:ligatures w14:val="none"/>
               </w:rPr>
-              <w:t xml:space="preserve">10 </w:t>
+              <w:t>10 kOhm</w:t>
             </w:r>
-            <w:proofErr w:type="spellStart"/>
-            <w:r>
-              <w:rPr>
-                <w:rFonts w:ascii="Calibri" w:eastAsia="Times New Roman" w:hAnsi="Calibri" w:cs="Calibri"/>
-                <w:color w:val="000000"/>
-                <w:kern w:val="0"/>
-                <w:sz w:val="22"/>
-                <w:szCs w:val="22"/>
-                <w:lang w:eastAsia="en-IN"/>
-                <w14:ligatures w14:val="none"/>
-              </w:rPr>
-              <w:t>kOhm</w:t>
-            </w:r>
-            <w:proofErr w:type="spellEnd"/>
           </w:p>
         </w:tc>
         <w:tc>
@@ -5503,22 +5750,8 @@
                 <w:lang w:eastAsia="en-IN"/>
                 <w14:ligatures w14:val="none"/>
               </w:rPr>
-              <w:t xml:space="preserve">10 </w:t>
+              <w:t>10 kOhm</w:t>
             </w:r>
-            <w:proofErr w:type="spellStart"/>
-            <w:r>
-              <w:rPr>
-                <w:rFonts w:ascii="Calibri" w:eastAsia="Times New Roman" w:hAnsi="Calibri" w:cs="Calibri"/>
-                <w:color w:val="000000"/>
-                <w:kern w:val="0"/>
-                <w:sz w:val="22"/>
-                <w:szCs w:val="22"/>
-                <w:lang w:eastAsia="en-IN"/>
-                <w14:ligatures w14:val="none"/>
-              </w:rPr>
-              <w:t>kOhm</w:t>
-            </w:r>
-            <w:proofErr w:type="spellEnd"/>
           </w:p>
         </w:tc>
         <w:tc>
@@ -5668,22 +5901,8 @@
                 <w:lang w:eastAsia="en-IN"/>
                 <w14:ligatures w14:val="none"/>
               </w:rPr>
-              <w:t xml:space="preserve">100 </w:t>
+              <w:t>100 nF</w:t>
             </w:r>
-            <w:proofErr w:type="spellStart"/>
-            <w:r>
-              <w:rPr>
-                <w:rFonts w:ascii="Calibri" w:eastAsia="Times New Roman" w:hAnsi="Calibri" w:cs="Calibri"/>
-                <w:color w:val="000000"/>
-                <w:kern w:val="0"/>
-                <w:sz w:val="22"/>
-                <w:szCs w:val="22"/>
-                <w:lang w:eastAsia="en-IN"/>
-                <w14:ligatures w14:val="none"/>
-              </w:rPr>
-              <w:t>nF</w:t>
-            </w:r>
-            <w:proofErr w:type="spellEnd"/>
           </w:p>
         </w:tc>
         <w:tc>
@@ -5748,22 +5967,8 @@
                 <w:lang w:eastAsia="en-IN"/>
                 <w14:ligatures w14:val="none"/>
               </w:rPr>
-              <w:t xml:space="preserve">100 </w:t>
+              <w:t>100 nF</w:t>
             </w:r>
-            <w:proofErr w:type="spellStart"/>
-            <w:r>
-              <w:rPr>
-                <w:rFonts w:ascii="Calibri" w:eastAsia="Times New Roman" w:hAnsi="Calibri" w:cs="Calibri"/>
-                <w:color w:val="000000"/>
-                <w:kern w:val="0"/>
-                <w:sz w:val="22"/>
-                <w:szCs w:val="22"/>
-                <w:lang w:eastAsia="en-IN"/>
-                <w14:ligatures w14:val="none"/>
-              </w:rPr>
-              <w:t>nF</w:t>
-            </w:r>
-            <w:proofErr w:type="spellEnd"/>
           </w:p>
         </w:tc>
         <w:tc>
@@ -5817,186 +6022,6 @@
     <w:p/>
     <w:p/>
     <w:p/>
-    <w:p>
-      <w:r>
-        <w:t xml:space="preserve">gain = -Rf/Rin = </w:t>
-      </w:r>
-      <w:r>
-        <w:t xml:space="preserve">4 </w:t>
-      </w:r>
-      <w:r>
-        <w:t>times</w:t>
-      </w:r>
-    </w:p>
-    <w:p>
-      <w:proofErr w:type="gramStart"/>
-      <w:r>
-        <w:t>180 degree</w:t>
-      </w:r>
-      <w:proofErr w:type="gramEnd"/>
-      <w:r>
-        <w:t xml:space="preserve"> phase difference/flipped/amplified output</w:t>
-      </w:r>
-    </w:p>
-    <w:p>
-      <w:r>
-        <w:t xml:space="preserve">Sin amplified to </w:t>
-      </w:r>
-      <w:r>
-        <w:t>6</w:t>
-      </w:r>
-      <w:r>
-        <w:t>v</w:t>
-      </w:r>
-    </w:p>
-    <w:p>
-      <w:r>
-        <w:t xml:space="preserve">square amplified to </w:t>
-      </w:r>
-    </w:p>
-    <w:p>
-      <w:r>
-        <w:t xml:space="preserve">saw amplified to </w:t>
-      </w:r>
-    </w:p>
-    <w:p/>
-    <w:p>
-      <w:r>
-        <w:t>INTEGRAL CONTROL</w:t>
-      </w:r>
-    </w:p>
-    <w:p>
-      <w:r>
-        <w:t>-----------------------------------------------</w:t>
-      </w:r>
-    </w:p>
-    <w:p>
-      <w:r>
-        <w:t>differential control</w:t>
-      </w:r>
-    </w:p>
-    <w:p>
-      <w:r>
-        <w:t>C-in = 100nf</w:t>
-      </w:r>
-    </w:p>
-    <w:p>
-      <w:r>
-        <w:t>R-in3 = 5k</w:t>
-      </w:r>
-    </w:p>
-    <w:p>
-      <w:r>
-        <w:t>R-fb3 = 80k</w:t>
-      </w:r>
-    </w:p>
-    <w:p>
-      <w:r>
-        <w:t>R-out3 = 10k</w:t>
-      </w:r>
-    </w:p>
-    <w:p/>
-    <w:p>
-      <w:r>
-        <w:t>R-</w:t>
-      </w:r>
-      <w:r>
-        <w:t>f</w:t>
-      </w:r>
-      <w:r>
-        <w:t>b3</w:t>
-      </w:r>
-      <w:r>
-        <w:t xml:space="preserve"> = 10/</w:t>
-      </w:r>
-      <w:proofErr w:type="spellStart"/>
-      <w:r>
-        <w:t>smthe</w:t>
-      </w:r>
-      <w:proofErr w:type="spellEnd"/>
-    </w:p>
-    <w:p>
-      <w:r>
-        <w:t>rf = 79577.47</w:t>
-      </w:r>
-    </w:p>
-    <w:p>
-      <w:r>
-        <w:t>rf = 80 k</w:t>
-      </w:r>
-    </w:p>
-    <w:p/>
-    <w:p>
-      <w:proofErr w:type="spellStart"/>
-      <w:r>
-        <w:t>vo</w:t>
-      </w:r>
-      <w:proofErr w:type="spellEnd"/>
-      <w:r>
-        <w:t xml:space="preserve"> = 10</w:t>
-      </w:r>
-    </w:p>
-    <w:p/>
-    <w:p>
-      <w:pPr>
-        <w:numPr>
-          <w:ilvl w:val="0"/>
-          <w:numId w:val="13"/>
-        </w:numPr>
-      </w:pPr>
-      <w:r>
-        <w:rPr>
-          <w:b/>
-          <w:bCs/>
-        </w:rPr>
-        <w:t>Square Wave Test:</w:t>
-      </w:r>
-    </w:p>
-    <w:p>
-      <w:pPr>
-        <w:numPr>
-          <w:ilvl w:val="1"/>
-          <w:numId w:val="13"/>
-        </w:numPr>
-      </w:pPr>
-      <w:r>
-        <w:t>Frequency: 50 Hz</w:t>
-      </w:r>
-    </w:p>
-    <w:p>
-      <w:pPr>
-        <w:numPr>
-          <w:ilvl w:val="1"/>
-          <w:numId w:val="13"/>
-        </w:numPr>
-      </w:pPr>
-      <w:r>
-        <w:t>Amplitude: 2.5 V</w:t>
-      </w:r>
-    </w:p>
-    <w:p>
-      <w:pPr>
-        <w:numPr>
-          <w:ilvl w:val="1"/>
-          <w:numId w:val="13"/>
-        </w:numPr>
-      </w:pPr>
-      <w:r>
-        <w:lastRenderedPageBreak/>
-        <w:t>DC Offset: 0.0 V</w:t>
-      </w:r>
-    </w:p>
-    <w:p>
-      <w:pPr>
-        <w:numPr>
-          <w:ilvl w:val="1"/>
-          <w:numId w:val="13"/>
-        </w:numPr>
-      </w:pPr>
-      <w:r>
-        <w:t>Function Type: Square</w:t>
-      </w:r>
-    </w:p>
     <w:p>
       <w:pPr>
         <w:numPr>
@@ -6217,6 +6242,7 @@
         <w:pStyle w:val="ListParagraph"/>
       </w:pPr>
       <w:r>
+        <w:lastRenderedPageBreak/>
         <w:t>An Ideal integral controller would use only</w:t>
       </w:r>
       <w:r>
@@ -6330,11 +6356,7 @@
         <w:t xml:space="preserve">essentially </w:t>
       </w:r>
       <w:r>
-        <w:t xml:space="preserve">connecting the positive end of the function </w:t>
-      </w:r>
-      <w:r>
-        <w:lastRenderedPageBreak/>
-        <w:t>generator directly to the inverting input which acts as a virtual ground (stays close to 0). The negative terminal of function generator is connected to ground and the positive terminal got connected to a virtual ground (as explained above), so we essentially shorted our function generator which caused the signal it generated to collapse and caused the other controllers to show haphazard outputs.</w:t>
+        <w:t>connecting the positive end of the function generator directly to the inverting input which acts as a virtual ground (stays close to 0). The negative terminal of function generator is connected to ground and the positive terminal got connected to a virtual ground (as explained above), so we essentially shorted our function generator which caused the signal it generated to collapse and caused the other controllers to show haphazard outputs.</w:t>
       </w:r>
     </w:p>
     <w:p>
@@ -6346,13 +6368,8 @@
       <w:pPr>
         <w:pStyle w:val="ListParagraph"/>
       </w:pPr>
-      <w:proofErr w:type="gramStart"/>
-      <w:r>
-        <w:t>FIX :</w:t>
-      </w:r>
-      <w:proofErr w:type="gramEnd"/>
-      <w:r>
-        <w:t xml:space="preserve"> attach a small resistance in series with the input capacitor.</w:t>
+      <w:r>
+        <w:t>FIX : attach a small resistance in series with the input capacitor.</w:t>
       </w:r>
     </w:p>
     <w:p>
@@ -6386,15 +6403,7 @@
         </w:numPr>
       </w:pPr>
       <w:r>
-        <w:t xml:space="preserve">fix </w:t>
-      </w:r>
-      <w:proofErr w:type="gramStart"/>
-      <w:r>
-        <w:t>how ?</w:t>
-      </w:r>
-      <w:proofErr w:type="gramEnd"/>
-      <w:r>
-        <w:t xml:space="preserve"> Increasing the input resistor reduces jaggedness</w:t>
+        <w:t>fix how ? Increasing the input resistor reduces jaggedness</w:t>
       </w:r>
     </w:p>
     <w:p>
@@ -6406,13 +6415,8 @@
         </w:numPr>
       </w:pPr>
       <w:r>
-        <w:t xml:space="preserve">cutoff voltage both integrator and </w:t>
-      </w:r>
-      <w:proofErr w:type="spellStart"/>
-      <w:r>
-        <w:t>diffrentiator</w:t>
-      </w:r>
-      <w:proofErr w:type="spellEnd"/>
+        <w:t>cutoff voltage both integrator and diffrentiator</w:t>
+      </w:r>
     </w:p>
     <w:p/>
     <w:p>
@@ -6527,13 +6531,8 @@
           <w:numId w:val="3"/>
         </w:numPr>
       </w:pPr>
-      <w:proofErr w:type="spellStart"/>
-      <w:r>
-        <w:t>Tinkercad's</w:t>
-      </w:r>
-      <w:proofErr w:type="spellEnd"/>
-      <w:r>
-        <w:t xml:space="preserve"> simulation engine panics when this happens, resulting in the jagged edges and square pulses you see on the other scopes.</w:t>
+      <w:r>
+        <w:t>Tinkercad's simulation engine panics when this happens, resulting in the jagged edges and square pulses you see on the other scopes.</w:t>
       </w:r>
     </w:p>
     <w:p/>
@@ -6564,60 +6563,32 @@
           <w:b/>
           <w:bCs/>
         </w:rPr>
-        <w:t xml:space="preserve">1.Disconnect the D Stage </w:t>
-      </w:r>
-      <w:proofErr w:type="spellStart"/>
-      <w:proofErr w:type="gramStart"/>
+        <w:t>1.Disconnect the D Stage Temporarily:</w:t>
+      </w:r>
+      <w:r>
+        <w:t>Isolate the problem.</w:t>
+      </w:r>
+    </w:p>
+    <w:p>
+      <w:r>
+        <w:t>Delete the wire connecting the main input node to your Derivative capacitor. Run the simulation. Your input wave, P stage, and I stage should instantly return to normal.</w:t>
+      </w:r>
+    </w:p>
+    <w:p>
+      <w:r>
+        <w:br/>
+      </w:r>
+    </w:p>
+    <w:p>
       <w:r>
         <w:rPr>
           <w:b/>
           <w:bCs/>
         </w:rPr>
-        <w:t>Temporarily:</w:t>
-      </w:r>
-      <w:r>
-        <w:t>Isolate</w:t>
-      </w:r>
-      <w:proofErr w:type="spellEnd"/>
-      <w:proofErr w:type="gramEnd"/>
-      <w:r>
-        <w:t xml:space="preserve"> the problem.</w:t>
-      </w:r>
-    </w:p>
-    <w:p>
-      <w:r>
-        <w:t>Delete the wire connecting the main input node to your Derivative capacitor. Run the simulation. Your input wave, P stage, and I stage should instantly return to normal.</w:t>
-      </w:r>
-    </w:p>
-    <w:p>
-      <w:r>
-        <w:br/>
-      </w:r>
-    </w:p>
-    <w:p>
-      <w:r>
-        <w:rPr>
-          <w:b/>
-          <w:bCs/>
-        </w:rPr>
-        <w:t xml:space="preserve">2.Add a Series Resistor to the </w:t>
-      </w:r>
-      <w:proofErr w:type="spellStart"/>
-      <w:proofErr w:type="gramStart"/>
-      <w:r>
-        <w:rPr>
-          <w:b/>
-          <w:bCs/>
-        </w:rPr>
-        <w:t>Input:</w:t>
-      </w:r>
-      <w:r>
-        <w:t>Limit</w:t>
-      </w:r>
-      <w:proofErr w:type="spellEnd"/>
-      <w:proofErr w:type="gramEnd"/>
-      <w:r>
-        <w:t xml:space="preserve"> the high-frequency current.</w:t>
+        <w:t>2.Add a Series Resistor to the Input:</w:t>
+      </w:r>
+      <w:r>
+        <w:t>Limit the high-frequency current.</w:t>
       </w:r>
     </w:p>
     <w:p>
@@ -6812,24 +6783,10 @@
           <w:b/>
           <w:bCs/>
         </w:rPr>
-        <w:t xml:space="preserve">3.Verify the Feedback </w:t>
-      </w:r>
-      <w:proofErr w:type="spellStart"/>
-      <w:proofErr w:type="gramStart"/>
-      <w:r>
-        <w:rPr>
-          <w:b/>
-          <w:bCs/>
-        </w:rPr>
-        <w:t>Resistor:</w:t>
-      </w:r>
-      <w:r>
-        <w:t>Check</w:t>
-      </w:r>
-      <w:proofErr w:type="spellEnd"/>
-      <w:proofErr w:type="gramEnd"/>
-      <w:r>
-        <w:t xml:space="preserve"> the feedback loop.</w:t>
+        <w:t>3.Verify the Feedback Resistor:</w:t>
+      </w:r>
+      <w:r>
+        <w:t>Check the feedback loop.</w:t>
       </w:r>
     </w:p>
     <w:p>
@@ -6901,22 +6858,10 @@
           <w:b/>
           <w:bCs/>
         </w:rPr>
-        <w:t xml:space="preserve">4.Check Pin </w:t>
-      </w:r>
-      <w:proofErr w:type="gramStart"/>
-      <w:r>
-        <w:rPr>
-          <w:b/>
-          <w:bCs/>
-        </w:rPr>
-        <w:t>3:</w:t>
-      </w:r>
-      <w:r>
-        <w:t>Keep</w:t>
-      </w:r>
-      <w:proofErr w:type="gramEnd"/>
-      <w:r>
-        <w:t xml:space="preserve"> it grounded.</w:t>
+        <w:t>4.Check Pin 3:</w:t>
+      </w:r>
+      <w:r>
+        <w:t>Keep it grounded.</w:t>
       </w:r>
     </w:p>
     <w:p>

</xml_diff>

<commit_message>
completed triangle wave test documentation
</commit_message>
<xml_diff>
--- a/PID-Controller-using-OP-AMPS- Hari Mohan 2026A8PS1148H.docx
+++ b/PID-Controller-using-OP-AMPS- Hari Mohan 2026A8PS1148H.docx
@@ -1278,8 +1278,22 @@
                 <w:lang w:eastAsia="en-IN"/>
                 <w14:ligatures w14:val="none"/>
               </w:rPr>
-              <w:t>5 kOhm</w:t>
+              <w:t xml:space="preserve">5 </w:t>
             </w:r>
+            <w:proofErr w:type="spellStart"/>
+            <w:r>
+              <w:rPr>
+                <w:rFonts w:ascii="Calibri" w:eastAsia="Times New Roman" w:hAnsi="Calibri" w:cs="Calibri"/>
+                <w:color w:val="000000"/>
+                <w:kern w:val="0"/>
+                <w:sz w:val="22"/>
+                <w:szCs w:val="22"/>
+                <w:lang w:eastAsia="en-IN"/>
+                <w14:ligatures w14:val="none"/>
+              </w:rPr>
+              <w:t>kOhm</w:t>
+            </w:r>
+            <w:proofErr w:type="spellEnd"/>
           </w:p>
         </w:tc>
         <w:tc>
@@ -1344,8 +1358,22 @@
                 <w:lang w:eastAsia="en-IN"/>
                 <w14:ligatures w14:val="none"/>
               </w:rPr>
-              <w:t>3 kOhm</w:t>
+              <w:t xml:space="preserve">3 </w:t>
             </w:r>
+            <w:proofErr w:type="spellStart"/>
+            <w:r>
+              <w:rPr>
+                <w:rFonts w:ascii="Calibri" w:eastAsia="Times New Roman" w:hAnsi="Calibri" w:cs="Calibri"/>
+                <w:color w:val="EE0000"/>
+                <w:kern w:val="0"/>
+                <w:sz w:val="22"/>
+                <w:szCs w:val="22"/>
+                <w:lang w:eastAsia="en-IN"/>
+                <w14:ligatures w14:val="none"/>
+              </w:rPr>
+              <w:t>kOhm</w:t>
+            </w:r>
+            <w:proofErr w:type="spellEnd"/>
           </w:p>
         </w:tc>
         <w:tc>
@@ -1410,8 +1438,22 @@
                 <w:lang w:eastAsia="en-IN"/>
                 <w14:ligatures w14:val="none"/>
               </w:rPr>
-              <w:t>5 kOhm</w:t>
+              <w:t xml:space="preserve">5 </w:t>
             </w:r>
+            <w:proofErr w:type="spellStart"/>
+            <w:r>
+              <w:rPr>
+                <w:rFonts w:ascii="Calibri" w:eastAsia="Times New Roman" w:hAnsi="Calibri" w:cs="Calibri"/>
+                <w:color w:val="000000"/>
+                <w:kern w:val="0"/>
+                <w:sz w:val="22"/>
+                <w:szCs w:val="22"/>
+                <w:lang w:eastAsia="en-IN"/>
+                <w14:ligatures w14:val="none"/>
+              </w:rPr>
+              <w:t>kOhm</w:t>
+            </w:r>
+            <w:proofErr w:type="spellEnd"/>
           </w:p>
         </w:tc>
         <w:tc>
@@ -1474,8 +1516,22 @@
                 <w:lang w:eastAsia="en-IN"/>
                 <w14:ligatures w14:val="none"/>
               </w:rPr>
-              <w:t>10 kOhm</w:t>
+              <w:t xml:space="preserve">10 </w:t>
             </w:r>
+            <w:proofErr w:type="spellStart"/>
+            <w:r>
+              <w:rPr>
+                <w:rFonts w:ascii="Calibri" w:eastAsia="Times New Roman" w:hAnsi="Calibri" w:cs="Calibri"/>
+                <w:color w:val="000000"/>
+                <w:kern w:val="0"/>
+                <w:sz w:val="22"/>
+                <w:szCs w:val="22"/>
+                <w:lang w:eastAsia="en-IN"/>
+                <w14:ligatures w14:val="none"/>
+              </w:rPr>
+              <w:t>kOhm</w:t>
+            </w:r>
+            <w:proofErr w:type="spellEnd"/>
           </w:p>
         </w:tc>
       </w:tr>
@@ -1545,8 +1601,22 @@
                 <w:lang w:eastAsia="en-IN"/>
                 <w14:ligatures w14:val="none"/>
               </w:rPr>
-              <w:t>15 kOhm</w:t>
+              <w:t xml:space="preserve">15 </w:t>
             </w:r>
+            <w:proofErr w:type="spellStart"/>
+            <w:r>
+              <w:rPr>
+                <w:rFonts w:ascii="Calibri" w:eastAsia="Times New Roman" w:hAnsi="Calibri" w:cs="Calibri"/>
+                <w:color w:val="EE0000"/>
+                <w:kern w:val="0"/>
+                <w:sz w:val="22"/>
+                <w:szCs w:val="22"/>
+                <w:lang w:eastAsia="en-IN"/>
+                <w14:ligatures w14:val="none"/>
+              </w:rPr>
+              <w:t>kOhm</w:t>
+            </w:r>
+            <w:proofErr w:type="spellEnd"/>
           </w:p>
         </w:tc>
         <w:tc>
@@ -1611,8 +1681,22 @@
                 <w:lang w:eastAsia="en-IN"/>
                 <w14:ligatures w14:val="none"/>
               </w:rPr>
-              <w:t>100 kOhm</w:t>
+              <w:t xml:space="preserve">100 </w:t>
             </w:r>
+            <w:proofErr w:type="spellStart"/>
+            <w:r>
+              <w:rPr>
+                <w:rFonts w:ascii="Calibri" w:eastAsia="Times New Roman" w:hAnsi="Calibri" w:cs="Calibri"/>
+                <w:color w:val="000000"/>
+                <w:kern w:val="0"/>
+                <w:sz w:val="22"/>
+                <w:szCs w:val="22"/>
+                <w:lang w:eastAsia="en-IN"/>
+                <w14:ligatures w14:val="none"/>
+              </w:rPr>
+              <w:t>kOhm</w:t>
+            </w:r>
+            <w:proofErr w:type="spellEnd"/>
           </w:p>
         </w:tc>
         <w:tc>
@@ -1677,8 +1761,22 @@
                 <w:lang w:eastAsia="en-IN"/>
                 <w14:ligatures w14:val="none"/>
               </w:rPr>
-              <w:t>80 kOhm</w:t>
+              <w:t xml:space="preserve">80 </w:t>
             </w:r>
+            <w:proofErr w:type="spellStart"/>
+            <w:r>
+              <w:rPr>
+                <w:rFonts w:ascii="Calibri" w:eastAsia="Times New Roman" w:hAnsi="Calibri" w:cs="Calibri"/>
+                <w:color w:val="EE0000"/>
+                <w:kern w:val="0"/>
+                <w:sz w:val="22"/>
+                <w:szCs w:val="22"/>
+                <w:lang w:eastAsia="en-IN"/>
+                <w14:ligatures w14:val="none"/>
+              </w:rPr>
+              <w:t>kOhm</w:t>
+            </w:r>
+            <w:proofErr w:type="spellEnd"/>
           </w:p>
         </w:tc>
         <w:tc>
@@ -1789,8 +1887,22 @@
                 <w:lang w:eastAsia="en-IN"/>
                 <w14:ligatures w14:val="none"/>
               </w:rPr>
-              <w:t>10 kOhm</w:t>
+              <w:t xml:space="preserve">10 </w:t>
             </w:r>
+            <w:proofErr w:type="spellStart"/>
+            <w:r>
+              <w:rPr>
+                <w:rFonts w:ascii="Calibri" w:eastAsia="Times New Roman" w:hAnsi="Calibri" w:cs="Calibri"/>
+                <w:color w:val="000000"/>
+                <w:kern w:val="0"/>
+                <w:sz w:val="22"/>
+                <w:szCs w:val="22"/>
+                <w:lang w:eastAsia="en-IN"/>
+                <w14:ligatures w14:val="none"/>
+              </w:rPr>
+              <w:t>kOhm</w:t>
+            </w:r>
+            <w:proofErr w:type="spellEnd"/>
           </w:p>
         </w:tc>
         <w:tc>
@@ -1855,8 +1967,22 @@
                 <w:lang w:eastAsia="en-IN"/>
                 <w14:ligatures w14:val="none"/>
               </w:rPr>
-              <w:t>10 kOhm</w:t>
+              <w:t xml:space="preserve">10 </w:t>
             </w:r>
+            <w:proofErr w:type="spellStart"/>
+            <w:r>
+              <w:rPr>
+                <w:rFonts w:ascii="Calibri" w:eastAsia="Times New Roman" w:hAnsi="Calibri" w:cs="Calibri"/>
+                <w:color w:val="000000"/>
+                <w:kern w:val="0"/>
+                <w:sz w:val="22"/>
+                <w:szCs w:val="22"/>
+                <w:lang w:eastAsia="en-IN"/>
+                <w14:ligatures w14:val="none"/>
+              </w:rPr>
+              <w:t>kOhm</w:t>
+            </w:r>
+            <w:proofErr w:type="spellEnd"/>
           </w:p>
         </w:tc>
         <w:tc>
@@ -1921,8 +2047,22 @@
                 <w:lang w:eastAsia="en-IN"/>
                 <w14:ligatures w14:val="none"/>
               </w:rPr>
-              <w:t>10 kOhm</w:t>
+              <w:t xml:space="preserve">10 </w:t>
             </w:r>
+            <w:proofErr w:type="spellStart"/>
+            <w:r>
+              <w:rPr>
+                <w:rFonts w:ascii="Calibri" w:eastAsia="Times New Roman" w:hAnsi="Calibri" w:cs="Calibri"/>
+                <w:color w:val="000000"/>
+                <w:kern w:val="0"/>
+                <w:sz w:val="22"/>
+                <w:szCs w:val="22"/>
+                <w:lang w:eastAsia="en-IN"/>
+                <w14:ligatures w14:val="none"/>
+              </w:rPr>
+              <w:t>kOhm</w:t>
+            </w:r>
+            <w:proofErr w:type="spellEnd"/>
           </w:p>
         </w:tc>
         <w:tc>
@@ -2072,8 +2212,22 @@
                 <w:lang w:eastAsia="en-IN"/>
                 <w14:ligatures w14:val="none"/>
               </w:rPr>
-              <w:t>100 nF</w:t>
+              <w:t xml:space="preserve">100 </w:t>
             </w:r>
+            <w:proofErr w:type="spellStart"/>
+            <w:r>
+              <w:rPr>
+                <w:rFonts w:ascii="Calibri" w:eastAsia="Times New Roman" w:hAnsi="Calibri" w:cs="Calibri"/>
+                <w:color w:val="000000"/>
+                <w:kern w:val="0"/>
+                <w:sz w:val="22"/>
+                <w:szCs w:val="22"/>
+                <w:lang w:eastAsia="en-IN"/>
+                <w14:ligatures w14:val="none"/>
+              </w:rPr>
+              <w:t>nF</w:t>
+            </w:r>
+            <w:proofErr w:type="spellEnd"/>
           </w:p>
         </w:tc>
         <w:tc>
@@ -2138,8 +2292,22 @@
                 <w:lang w:eastAsia="en-IN"/>
                 <w14:ligatures w14:val="none"/>
               </w:rPr>
-              <w:t>100 nF</w:t>
+              <w:t xml:space="preserve">100 </w:t>
             </w:r>
+            <w:proofErr w:type="spellStart"/>
+            <w:r>
+              <w:rPr>
+                <w:rFonts w:ascii="Calibri" w:eastAsia="Times New Roman" w:hAnsi="Calibri" w:cs="Calibri"/>
+                <w:color w:val="000000"/>
+                <w:kern w:val="0"/>
+                <w:sz w:val="22"/>
+                <w:szCs w:val="22"/>
+                <w:lang w:eastAsia="en-IN"/>
+                <w14:ligatures w14:val="none"/>
+              </w:rPr>
+              <w:t>nF</w:t>
+            </w:r>
+            <w:proofErr w:type="spellEnd"/>
           </w:p>
         </w:tc>
         <w:tc>
@@ -2806,6 +2974,17 @@
       <w:r>
         <w:t>all previous output wave equations</w:t>
       </w:r>
+      <w:r>
+        <w:t xml:space="preserve">. </w:t>
+      </w:r>
+    </w:p>
+    <w:p>
+      <w:pPr>
+        <w:pStyle w:val="ListParagraph"/>
+      </w:pPr>
+      <w:r>
+        <w:t>Output Wave is inphase with the input wave.</w:t>
+      </w:r>
     </w:p>
     <w:p>
       <w:pPr>
@@ -2820,7 +2999,6 @@
         <w:t>Note: Noise is due to noise in the derivative control output</w:t>
       </w:r>
     </w:p>
-    <w:p/>
     <w:p/>
     <w:p/>
     <w:p/>
@@ -3244,8 +3422,22 @@
                 <w:lang w:eastAsia="en-IN"/>
                 <w14:ligatures w14:val="none"/>
               </w:rPr>
-              <w:t>5 kOhm</w:t>
+              <w:t xml:space="preserve">5 </w:t>
             </w:r>
+            <w:proofErr w:type="spellStart"/>
+            <w:r>
+              <w:rPr>
+                <w:rFonts w:ascii="Calibri" w:eastAsia="Times New Roman" w:hAnsi="Calibri" w:cs="Calibri"/>
+                <w:color w:val="000000"/>
+                <w:kern w:val="0"/>
+                <w:sz w:val="22"/>
+                <w:szCs w:val="22"/>
+                <w:lang w:eastAsia="en-IN"/>
+                <w14:ligatures w14:val="none"/>
+              </w:rPr>
+              <w:t>kOhm</w:t>
+            </w:r>
+            <w:proofErr w:type="spellEnd"/>
           </w:p>
         </w:tc>
         <w:tc>
@@ -3310,8 +3502,22 @@
                 <w:lang w:eastAsia="en-IN"/>
                 <w14:ligatures w14:val="none"/>
               </w:rPr>
-              <w:t>20 kOhm</w:t>
+              <w:t xml:space="preserve">20 </w:t>
             </w:r>
+            <w:proofErr w:type="spellStart"/>
+            <w:r>
+              <w:rPr>
+                <w:rFonts w:ascii="Calibri" w:eastAsia="Times New Roman" w:hAnsi="Calibri" w:cs="Calibri"/>
+                <w:color w:val="EE0000"/>
+                <w:kern w:val="0"/>
+                <w:sz w:val="22"/>
+                <w:szCs w:val="22"/>
+                <w:lang w:eastAsia="en-IN"/>
+                <w14:ligatures w14:val="none"/>
+              </w:rPr>
+              <w:t>kOhm</w:t>
+            </w:r>
+            <w:proofErr w:type="spellEnd"/>
           </w:p>
         </w:tc>
         <w:tc>
@@ -3376,8 +3582,22 @@
                 <w:lang w:eastAsia="en-IN"/>
                 <w14:ligatures w14:val="none"/>
               </w:rPr>
-              <w:t>5 kOhm</w:t>
+              <w:t xml:space="preserve">5 </w:t>
             </w:r>
+            <w:proofErr w:type="spellStart"/>
+            <w:r>
+              <w:rPr>
+                <w:rFonts w:ascii="Calibri" w:eastAsia="Times New Roman" w:hAnsi="Calibri" w:cs="Calibri"/>
+                <w:color w:val="000000"/>
+                <w:kern w:val="0"/>
+                <w:sz w:val="22"/>
+                <w:szCs w:val="22"/>
+                <w:lang w:eastAsia="en-IN"/>
+                <w14:ligatures w14:val="none"/>
+              </w:rPr>
+              <w:t>kOhm</w:t>
+            </w:r>
+            <w:proofErr w:type="spellEnd"/>
           </w:p>
         </w:tc>
         <w:tc>
@@ -3440,8 +3660,22 @@
                 <w:lang w:eastAsia="en-IN"/>
                 <w14:ligatures w14:val="none"/>
               </w:rPr>
-              <w:t>10 kOhm</w:t>
+              <w:t xml:space="preserve">10 </w:t>
             </w:r>
+            <w:proofErr w:type="spellStart"/>
+            <w:r>
+              <w:rPr>
+                <w:rFonts w:ascii="Calibri" w:eastAsia="Times New Roman" w:hAnsi="Calibri" w:cs="Calibri"/>
+                <w:color w:val="000000"/>
+                <w:kern w:val="0"/>
+                <w:sz w:val="22"/>
+                <w:szCs w:val="22"/>
+                <w:lang w:eastAsia="en-IN"/>
+                <w14:ligatures w14:val="none"/>
+              </w:rPr>
+              <w:t>kOhm</w:t>
+            </w:r>
+            <w:proofErr w:type="spellEnd"/>
           </w:p>
         </w:tc>
       </w:tr>
@@ -3511,8 +3745,22 @@
                 <w:lang w:eastAsia="en-IN"/>
                 <w14:ligatures w14:val="none"/>
               </w:rPr>
-              <w:t>10 kOhm</w:t>
+              <w:t xml:space="preserve">10 </w:t>
             </w:r>
+            <w:proofErr w:type="spellStart"/>
+            <w:r>
+              <w:rPr>
+                <w:rFonts w:ascii="Calibri" w:eastAsia="Times New Roman" w:hAnsi="Calibri" w:cs="Calibri"/>
+                <w:color w:val="EE0000"/>
+                <w:kern w:val="0"/>
+                <w:sz w:val="22"/>
+                <w:szCs w:val="22"/>
+                <w:lang w:eastAsia="en-IN"/>
+                <w14:ligatures w14:val="none"/>
+              </w:rPr>
+              <w:t>kOhm</w:t>
+            </w:r>
+            <w:proofErr w:type="spellEnd"/>
           </w:p>
         </w:tc>
         <w:tc>
@@ -3577,8 +3825,22 @@
                 <w:lang w:eastAsia="en-IN"/>
                 <w14:ligatures w14:val="none"/>
               </w:rPr>
-              <w:t>100 kOhm</w:t>
+              <w:t xml:space="preserve">100 </w:t>
             </w:r>
+            <w:proofErr w:type="spellStart"/>
+            <w:r>
+              <w:rPr>
+                <w:rFonts w:ascii="Calibri" w:eastAsia="Times New Roman" w:hAnsi="Calibri" w:cs="Calibri"/>
+                <w:color w:val="000000"/>
+                <w:kern w:val="0"/>
+                <w:sz w:val="22"/>
+                <w:szCs w:val="22"/>
+                <w:lang w:eastAsia="en-IN"/>
+                <w14:ligatures w14:val="none"/>
+              </w:rPr>
+              <w:t>kOhm</w:t>
+            </w:r>
+            <w:proofErr w:type="spellEnd"/>
           </w:p>
         </w:tc>
         <w:tc>
@@ -3643,8 +3905,22 @@
                 <w:lang w:eastAsia="en-IN"/>
                 <w14:ligatures w14:val="none"/>
               </w:rPr>
-              <w:t>5 kOhm</w:t>
+              <w:t xml:space="preserve">5 </w:t>
             </w:r>
+            <w:proofErr w:type="spellStart"/>
+            <w:r>
+              <w:rPr>
+                <w:rFonts w:ascii="Calibri" w:eastAsia="Times New Roman" w:hAnsi="Calibri" w:cs="Calibri"/>
+                <w:color w:val="EE0000"/>
+                <w:kern w:val="0"/>
+                <w:sz w:val="22"/>
+                <w:szCs w:val="22"/>
+                <w:lang w:eastAsia="en-IN"/>
+                <w14:ligatures w14:val="none"/>
+              </w:rPr>
+              <w:t>kOhm</w:t>
+            </w:r>
+            <w:proofErr w:type="spellEnd"/>
           </w:p>
         </w:tc>
         <w:tc>
@@ -3755,8 +4031,22 @@
                 <w:lang w:eastAsia="en-IN"/>
                 <w14:ligatures w14:val="none"/>
               </w:rPr>
-              <w:t>10 kOhm</w:t>
+              <w:t xml:space="preserve">10 </w:t>
             </w:r>
+            <w:proofErr w:type="spellStart"/>
+            <w:r>
+              <w:rPr>
+                <w:rFonts w:ascii="Calibri" w:eastAsia="Times New Roman" w:hAnsi="Calibri" w:cs="Calibri"/>
+                <w:color w:val="000000"/>
+                <w:kern w:val="0"/>
+                <w:sz w:val="22"/>
+                <w:szCs w:val="22"/>
+                <w:lang w:eastAsia="en-IN"/>
+                <w14:ligatures w14:val="none"/>
+              </w:rPr>
+              <w:t>kOhm</w:t>
+            </w:r>
+            <w:proofErr w:type="spellEnd"/>
           </w:p>
         </w:tc>
         <w:tc>
@@ -3821,8 +4111,22 @@
                 <w:lang w:eastAsia="en-IN"/>
                 <w14:ligatures w14:val="none"/>
               </w:rPr>
-              <w:t>10 kOhm</w:t>
+              <w:t xml:space="preserve">10 </w:t>
             </w:r>
+            <w:proofErr w:type="spellStart"/>
+            <w:r>
+              <w:rPr>
+                <w:rFonts w:ascii="Calibri" w:eastAsia="Times New Roman" w:hAnsi="Calibri" w:cs="Calibri"/>
+                <w:color w:val="000000"/>
+                <w:kern w:val="0"/>
+                <w:sz w:val="22"/>
+                <w:szCs w:val="22"/>
+                <w:lang w:eastAsia="en-IN"/>
+                <w14:ligatures w14:val="none"/>
+              </w:rPr>
+              <w:t>kOhm</w:t>
+            </w:r>
+            <w:proofErr w:type="spellEnd"/>
           </w:p>
         </w:tc>
         <w:tc>
@@ -3887,8 +4191,22 @@
                 <w:lang w:eastAsia="en-IN"/>
                 <w14:ligatures w14:val="none"/>
               </w:rPr>
-              <w:t>10 kOhm</w:t>
+              <w:t xml:space="preserve">10 </w:t>
             </w:r>
+            <w:proofErr w:type="spellStart"/>
+            <w:r>
+              <w:rPr>
+                <w:rFonts w:ascii="Calibri" w:eastAsia="Times New Roman" w:hAnsi="Calibri" w:cs="Calibri"/>
+                <w:color w:val="000000"/>
+                <w:kern w:val="0"/>
+                <w:sz w:val="22"/>
+                <w:szCs w:val="22"/>
+                <w:lang w:eastAsia="en-IN"/>
+                <w14:ligatures w14:val="none"/>
+              </w:rPr>
+              <w:t>kOhm</w:t>
+            </w:r>
+            <w:proofErr w:type="spellEnd"/>
           </w:p>
         </w:tc>
         <w:tc>
@@ -4038,8 +4356,22 @@
                 <w:lang w:eastAsia="en-IN"/>
                 <w14:ligatures w14:val="none"/>
               </w:rPr>
-              <w:t>100 nF</w:t>
+              <w:t xml:space="preserve">100 </w:t>
             </w:r>
+            <w:proofErr w:type="spellStart"/>
+            <w:r>
+              <w:rPr>
+                <w:rFonts w:ascii="Calibri" w:eastAsia="Times New Roman" w:hAnsi="Calibri" w:cs="Calibri"/>
+                <w:color w:val="000000"/>
+                <w:kern w:val="0"/>
+                <w:sz w:val="22"/>
+                <w:szCs w:val="22"/>
+                <w:lang w:eastAsia="en-IN"/>
+                <w14:ligatures w14:val="none"/>
+              </w:rPr>
+              <w:t>nF</w:t>
+            </w:r>
+            <w:proofErr w:type="spellEnd"/>
           </w:p>
         </w:tc>
         <w:tc>
@@ -4104,8 +4436,22 @@
                 <w:lang w:eastAsia="en-IN"/>
                 <w14:ligatures w14:val="none"/>
               </w:rPr>
-              <w:t>100 nF</w:t>
+              <w:t xml:space="preserve">100 </w:t>
             </w:r>
+            <w:proofErr w:type="spellStart"/>
+            <w:r>
+              <w:rPr>
+                <w:rFonts w:ascii="Calibri" w:eastAsia="Times New Roman" w:hAnsi="Calibri" w:cs="Calibri"/>
+                <w:color w:val="000000"/>
+                <w:kern w:val="0"/>
+                <w:sz w:val="22"/>
+                <w:szCs w:val="22"/>
+                <w:lang w:eastAsia="en-IN"/>
+                <w14:ligatures w14:val="none"/>
+              </w:rPr>
+              <w:t>nF</w:t>
+            </w:r>
+            <w:proofErr w:type="spellEnd"/>
           </w:p>
         </w:tc>
         <w:tc>
@@ -4259,7 +4605,15 @@
         <w:pStyle w:val="ListParagraph"/>
       </w:pPr>
       <w:r>
-        <w:t xml:space="preserve">with the original square wave, ie. high voltage during </w:t>
+        <w:t xml:space="preserve">with the original square wave, </w:t>
+      </w:r>
+      <w:proofErr w:type="spellStart"/>
+      <w:r>
+        <w:t>ie</w:t>
+      </w:r>
+      <w:proofErr w:type="spellEnd"/>
+      <w:r>
+        <w:t xml:space="preserve">. high voltage during </w:t>
       </w:r>
     </w:p>
     <w:p>
@@ -4761,28 +5115,165 @@
     </w:p>
     <w:p/>
     <w:p/>
-    <w:p/>
-    <w:p/>
-    <w:p/>
-    <w:p/>
-    <w:p/>
-    <w:p/>
-    <w:p/>
-    <w:p/>
-    <w:p/>
-    <w:p/>
-    <w:p/>
-    <w:p/>
-    <w:p/>
-    <w:p/>
-    <w:p/>
-    <w:p/>
-    <w:p/>
-    <w:p/>
+    <w:p>
+      <w:pPr>
+        <w:numPr>
+          <w:ilvl w:val="0"/>
+          <w:numId w:val="13"/>
+        </w:numPr>
+      </w:pPr>
+      <w:r>
+        <w:rPr>
+          <w:b/>
+          <w:bCs/>
+        </w:rPr>
+        <w:t>Sawtooth/Triangle Wave Test:</w:t>
+      </w:r>
+    </w:p>
+    <w:p>
+      <w:pPr>
+        <w:numPr>
+          <w:ilvl w:val="1"/>
+          <w:numId w:val="13"/>
+        </w:numPr>
+      </w:pPr>
+      <w:r>
+        <w:t>Frequency: 100 Hz</w:t>
+      </w:r>
+    </w:p>
+    <w:p>
+      <w:pPr>
+        <w:numPr>
+          <w:ilvl w:val="1"/>
+          <w:numId w:val="13"/>
+        </w:numPr>
+      </w:pPr>
+      <w:r>
+        <w:t>Amplitude: 2.0 V</w:t>
+      </w:r>
+    </w:p>
+    <w:p>
+      <w:pPr>
+        <w:numPr>
+          <w:ilvl w:val="1"/>
+          <w:numId w:val="13"/>
+        </w:numPr>
+      </w:pPr>
+      <w:r>
+        <w:t>DC Offset: 0.0 V</w:t>
+      </w:r>
+    </w:p>
+    <w:p>
+      <w:pPr>
+        <w:numPr>
+          <w:ilvl w:val="1"/>
+          <w:numId w:val="13"/>
+        </w:numPr>
+      </w:pPr>
+      <w:r>
+        <w:t>Function Type: Triangle</w:t>
+      </w:r>
+      <w:r>
+        <w:br/>
+      </w:r>
+    </w:p>
+    <w:p>
+      <w:pPr>
+        <w:rPr>
+          <w:b/>
+          <w:bCs/>
+          <w:u w:val="single"/>
+        </w:rPr>
+      </w:pPr>
+      <w:r>
+        <w:rPr>
+          <w:b/>
+          <w:bCs/>
+          <w:u w:val="single"/>
+        </w:rPr>
+        <w:t>Tinker Cad Link:</w:t>
+      </w:r>
+    </w:p>
+    <w:p>
+      <w:hyperlink r:id="rId16" w:history="1">
+        <w:r>
+          <w:rPr>
+            <w:rStyle w:val="Hyperlink"/>
+          </w:rPr>
+          <w:t>https://www.tinkercad.com/things/erQ</w:t>
+        </w:r>
+        <w:r>
+          <w:rPr>
+            <w:rStyle w:val="Hyperlink"/>
+          </w:rPr>
+          <w:t>P</w:t>
+        </w:r>
+        <w:r>
+          <w:rPr>
+            <w:rStyle w:val="Hyperlink"/>
+          </w:rPr>
+          <w:t>LDAx</w:t>
+        </w:r>
+        <w:r>
+          <w:rPr>
+            <w:rStyle w:val="Hyperlink"/>
+          </w:rPr>
+          <w:t>r</w:t>
+        </w:r>
+        <w:r>
+          <w:rPr>
+            <w:rStyle w:val="Hyperlink"/>
+          </w:rPr>
+          <w:t>TN-sawtoothtriangle-wave-testpid-using-opamps?sharecode=cz8ztlS</w:t>
+        </w:r>
+        <w:r>
+          <w:rPr>
+            <w:rStyle w:val="Hyperlink"/>
+          </w:rPr>
+          <w:t>B</w:t>
+        </w:r>
+        <w:r>
+          <w:rPr>
+            <w:rStyle w:val="Hyperlink"/>
+          </w:rPr>
+          <w:t>7tOJGHumuUf0zEa-G3FRGnmPVz9otPNd5BE</w:t>
+        </w:r>
+      </w:hyperlink>
+    </w:p>
+    <w:p>
+      <w:pPr>
+        <w:rPr>
+          <w:b/>
+          <w:bCs/>
+          <w:u w:val="single"/>
+        </w:rPr>
+      </w:pPr>
+      <w:r>
+        <w:rPr>
+          <w:b/>
+          <w:bCs/>
+          <w:u w:val="single"/>
+        </w:rPr>
+        <w:t>Component Values</w:t>
+      </w:r>
+      <w:r>
+        <w:rPr>
+          <w:b/>
+          <w:bCs/>
+          <w:u w:val="single"/>
+        </w:rPr>
+        <w:t>;</w:t>
+      </w:r>
+    </w:p>
+    <w:p>
+      <w:r>
+        <w:br/>
+      </w:r>
+    </w:p>
     <w:tbl>
       <w:tblPr>
         <w:tblStyle w:val="GridTable4-Accent5"/>
-        <w:tblpPr w:leftFromText="180" w:rightFromText="180" w:vertAnchor="text" w:horzAnchor="margin" w:tblpXSpec="center" w:tblpY="449"/>
+        <w:tblpPr w:leftFromText="180" w:rightFromText="180" w:vertAnchor="text" w:horzAnchor="margin" w:tblpY="-521"/>
         <w:tblW w:w="10920" w:type="dxa"/>
         <w:tblLook w:val="04A0" w:firstRow="1" w:lastRow="0" w:firstColumn="1" w:lastColumn="0" w:noHBand="0" w:noVBand="1"/>
       </w:tblPr>
@@ -4830,6 +5321,7 @@
                 <w:lang w:eastAsia="en-IN"/>
                 <w14:ligatures w14:val="none"/>
               </w:rPr>
+              <w:lastRenderedPageBreak/>
               <w:t>P Controller</w:t>
             </w:r>
           </w:p>
@@ -5083,8 +5575,22 @@
                 <w:lang w:eastAsia="en-IN"/>
                 <w14:ligatures w14:val="none"/>
               </w:rPr>
-              <w:t>5 kOhm</w:t>
+              <w:t xml:space="preserve">5 </w:t>
             </w:r>
+            <w:proofErr w:type="spellStart"/>
+            <w:r>
+              <w:rPr>
+                <w:rFonts w:ascii="Calibri" w:eastAsia="Times New Roman" w:hAnsi="Calibri" w:cs="Calibri"/>
+                <w:color w:val="000000"/>
+                <w:kern w:val="0"/>
+                <w:sz w:val="22"/>
+                <w:szCs w:val="22"/>
+                <w:lang w:eastAsia="en-IN"/>
+                <w14:ligatures w14:val="none"/>
+              </w:rPr>
+              <w:t>kOhm</w:t>
+            </w:r>
+            <w:proofErr w:type="spellEnd"/>
           </w:p>
         </w:tc>
         <w:tc>
@@ -5149,8 +5655,9 @@
                 <w:lang w:eastAsia="en-IN"/>
                 <w14:ligatures w14:val="none"/>
               </w:rPr>
-              <w:t>10</w:t>
+              <w:t xml:space="preserve">10 </w:t>
             </w:r>
+            <w:proofErr w:type="spellStart"/>
             <w:r>
               <w:rPr>
                 <w:rFonts w:ascii="Calibri" w:eastAsia="Times New Roman" w:hAnsi="Calibri" w:cs="Calibri"/>
@@ -5161,8 +5668,9 @@
                 <w:lang w:eastAsia="en-IN"/>
                 <w14:ligatures w14:val="none"/>
               </w:rPr>
-              <w:t xml:space="preserve"> kOhm</w:t>
+              <w:t>kOhm</w:t>
             </w:r>
+            <w:proofErr w:type="spellEnd"/>
           </w:p>
         </w:tc>
         <w:tc>
@@ -5227,8 +5735,22 @@
                 <w:lang w:eastAsia="en-IN"/>
                 <w14:ligatures w14:val="none"/>
               </w:rPr>
-              <w:t>5 kOhm</w:t>
+              <w:t xml:space="preserve">5 </w:t>
             </w:r>
+            <w:proofErr w:type="spellStart"/>
+            <w:r>
+              <w:rPr>
+                <w:rFonts w:ascii="Calibri" w:eastAsia="Times New Roman" w:hAnsi="Calibri" w:cs="Calibri"/>
+                <w:color w:val="000000"/>
+                <w:kern w:val="0"/>
+                <w:sz w:val="22"/>
+                <w:szCs w:val="22"/>
+                <w:lang w:eastAsia="en-IN"/>
+                <w14:ligatures w14:val="none"/>
+              </w:rPr>
+              <w:t>kOhm</w:t>
+            </w:r>
+            <w:proofErr w:type="spellEnd"/>
           </w:p>
         </w:tc>
         <w:tc>
@@ -5291,8 +5813,22 @@
                 <w:lang w:eastAsia="en-IN"/>
                 <w14:ligatures w14:val="none"/>
               </w:rPr>
-              <w:t>10 kOhm</w:t>
+              <w:t xml:space="preserve">10 </w:t>
             </w:r>
+            <w:proofErr w:type="spellStart"/>
+            <w:r>
+              <w:rPr>
+                <w:rFonts w:ascii="Calibri" w:eastAsia="Times New Roman" w:hAnsi="Calibri" w:cs="Calibri"/>
+                <w:color w:val="000000"/>
+                <w:kern w:val="0"/>
+                <w:sz w:val="22"/>
+                <w:szCs w:val="22"/>
+                <w:lang w:eastAsia="en-IN"/>
+                <w14:ligatures w14:val="none"/>
+              </w:rPr>
+              <w:t>kOhm</w:t>
+            </w:r>
+            <w:proofErr w:type="spellEnd"/>
           </w:p>
         </w:tc>
       </w:tr>
@@ -5362,8 +5898,22 @@
                 <w:lang w:eastAsia="en-IN"/>
                 <w14:ligatures w14:val="none"/>
               </w:rPr>
-              <w:t>15 kOhm</w:t>
+              <w:t xml:space="preserve">15 </w:t>
             </w:r>
+            <w:proofErr w:type="spellStart"/>
+            <w:r>
+              <w:rPr>
+                <w:rFonts w:ascii="Calibri" w:eastAsia="Times New Roman" w:hAnsi="Calibri" w:cs="Calibri"/>
+                <w:color w:val="EE0000"/>
+                <w:kern w:val="0"/>
+                <w:sz w:val="22"/>
+                <w:szCs w:val="22"/>
+                <w:lang w:eastAsia="en-IN"/>
+                <w14:ligatures w14:val="none"/>
+              </w:rPr>
+              <w:t>kOhm</w:t>
+            </w:r>
+            <w:proofErr w:type="spellEnd"/>
           </w:p>
         </w:tc>
         <w:tc>
@@ -5428,8 +5978,22 @@
                 <w:lang w:eastAsia="en-IN"/>
                 <w14:ligatures w14:val="none"/>
               </w:rPr>
-              <w:t>100 kOhm</w:t>
+              <w:t xml:space="preserve">100 </w:t>
             </w:r>
+            <w:proofErr w:type="spellStart"/>
+            <w:r>
+              <w:rPr>
+                <w:rFonts w:ascii="Calibri" w:eastAsia="Times New Roman" w:hAnsi="Calibri" w:cs="Calibri"/>
+                <w:color w:val="000000"/>
+                <w:kern w:val="0"/>
+                <w:sz w:val="22"/>
+                <w:szCs w:val="22"/>
+                <w:lang w:eastAsia="en-IN"/>
+                <w14:ligatures w14:val="none"/>
+              </w:rPr>
+              <w:t>kOhm</w:t>
+            </w:r>
+            <w:proofErr w:type="spellEnd"/>
           </w:p>
         </w:tc>
         <w:tc>
@@ -5494,8 +6058,9 @@
                 <w:lang w:eastAsia="en-IN"/>
                 <w14:ligatures w14:val="none"/>
               </w:rPr>
-              <w:t>100</w:t>
+              <w:t xml:space="preserve">100 </w:t>
             </w:r>
+            <w:proofErr w:type="spellStart"/>
             <w:r>
               <w:rPr>
                 <w:rFonts w:ascii="Calibri" w:eastAsia="Times New Roman" w:hAnsi="Calibri" w:cs="Calibri"/>
@@ -5506,8 +6071,9 @@
                 <w:lang w:eastAsia="en-IN"/>
                 <w14:ligatures w14:val="none"/>
               </w:rPr>
-              <w:t xml:space="preserve"> kOhm</w:t>
+              <w:t>kOhm</w:t>
             </w:r>
+            <w:proofErr w:type="spellEnd"/>
           </w:p>
         </w:tc>
         <w:tc>
@@ -5618,8 +6184,22 @@
                 <w:lang w:eastAsia="en-IN"/>
                 <w14:ligatures w14:val="none"/>
               </w:rPr>
-              <w:t>10 kOhm</w:t>
+              <w:t xml:space="preserve">10 </w:t>
             </w:r>
+            <w:proofErr w:type="spellStart"/>
+            <w:r>
+              <w:rPr>
+                <w:rFonts w:ascii="Calibri" w:eastAsia="Times New Roman" w:hAnsi="Calibri" w:cs="Calibri"/>
+                <w:color w:val="000000"/>
+                <w:kern w:val="0"/>
+                <w:sz w:val="22"/>
+                <w:szCs w:val="22"/>
+                <w:lang w:eastAsia="en-IN"/>
+                <w14:ligatures w14:val="none"/>
+              </w:rPr>
+              <w:t>kOhm</w:t>
+            </w:r>
+            <w:proofErr w:type="spellEnd"/>
           </w:p>
         </w:tc>
         <w:tc>
@@ -5684,8 +6264,22 @@
                 <w:lang w:eastAsia="en-IN"/>
                 <w14:ligatures w14:val="none"/>
               </w:rPr>
-              <w:t>10 kOhm</w:t>
+              <w:t xml:space="preserve">10 </w:t>
             </w:r>
+            <w:proofErr w:type="spellStart"/>
+            <w:r>
+              <w:rPr>
+                <w:rFonts w:ascii="Calibri" w:eastAsia="Times New Roman" w:hAnsi="Calibri" w:cs="Calibri"/>
+                <w:color w:val="000000"/>
+                <w:kern w:val="0"/>
+                <w:sz w:val="22"/>
+                <w:szCs w:val="22"/>
+                <w:lang w:eastAsia="en-IN"/>
+                <w14:ligatures w14:val="none"/>
+              </w:rPr>
+              <w:t>kOhm</w:t>
+            </w:r>
+            <w:proofErr w:type="spellEnd"/>
           </w:p>
         </w:tc>
         <w:tc>
@@ -5750,8 +6344,22 @@
                 <w:lang w:eastAsia="en-IN"/>
                 <w14:ligatures w14:val="none"/>
               </w:rPr>
-              <w:t>10 kOhm</w:t>
+              <w:t xml:space="preserve">10 </w:t>
             </w:r>
+            <w:proofErr w:type="spellStart"/>
+            <w:r>
+              <w:rPr>
+                <w:rFonts w:ascii="Calibri" w:eastAsia="Times New Roman" w:hAnsi="Calibri" w:cs="Calibri"/>
+                <w:color w:val="000000"/>
+                <w:kern w:val="0"/>
+                <w:sz w:val="22"/>
+                <w:szCs w:val="22"/>
+                <w:lang w:eastAsia="en-IN"/>
+                <w14:ligatures w14:val="none"/>
+              </w:rPr>
+              <w:t>kOhm</w:t>
+            </w:r>
+            <w:proofErr w:type="spellEnd"/>
           </w:p>
         </w:tc>
         <w:tc>
@@ -5901,8 +6509,22 @@
                 <w:lang w:eastAsia="en-IN"/>
                 <w14:ligatures w14:val="none"/>
               </w:rPr>
-              <w:t>100 nF</w:t>
+              <w:t xml:space="preserve">100 </w:t>
             </w:r>
+            <w:proofErr w:type="spellStart"/>
+            <w:r>
+              <w:rPr>
+                <w:rFonts w:ascii="Calibri" w:eastAsia="Times New Roman" w:hAnsi="Calibri" w:cs="Calibri"/>
+                <w:color w:val="000000"/>
+                <w:kern w:val="0"/>
+                <w:sz w:val="22"/>
+                <w:szCs w:val="22"/>
+                <w:lang w:eastAsia="en-IN"/>
+                <w14:ligatures w14:val="none"/>
+              </w:rPr>
+              <w:t>nF</w:t>
+            </w:r>
+            <w:proofErr w:type="spellEnd"/>
           </w:p>
         </w:tc>
         <w:tc>
@@ -5967,8 +6589,22 @@
                 <w:lang w:eastAsia="en-IN"/>
                 <w14:ligatures w14:val="none"/>
               </w:rPr>
-              <w:t>100 nF</w:t>
+              <w:t xml:space="preserve">100 </w:t>
             </w:r>
+            <w:proofErr w:type="spellStart"/>
+            <w:r>
+              <w:rPr>
+                <w:rFonts w:ascii="Calibri" w:eastAsia="Times New Roman" w:hAnsi="Calibri" w:cs="Calibri"/>
+                <w:color w:val="000000"/>
+                <w:kern w:val="0"/>
+                <w:sz w:val="22"/>
+                <w:szCs w:val="22"/>
+                <w:lang w:eastAsia="en-IN"/>
+                <w14:ligatures w14:val="none"/>
+              </w:rPr>
+              <w:t>nF</w:t>
+            </w:r>
+            <w:proofErr w:type="spellEnd"/>
           </w:p>
         </w:tc>
         <w:tc>
@@ -6014,8 +6650,155 @@
       </w:tr>
     </w:tbl>
     <w:p>
-      <w:r>
-        <w:t>Triangle wave</w:t>
+      <w:pPr>
+        <w:pStyle w:val="ListParagraph"/>
+        <w:rPr>
+          <w:b/>
+          <w:bCs/>
+          <w:u w:val="single"/>
+        </w:rPr>
+      </w:pPr>
+    </w:p>
+    <w:p>
+      <w:pPr>
+        <w:ind w:left="360"/>
+        <w:rPr>
+          <w:b/>
+          <w:bCs/>
+          <w:u w:val="single"/>
+        </w:rPr>
+      </w:pPr>
+    </w:p>
+    <w:p>
+      <w:pPr>
+        <w:pStyle w:val="ListParagraph"/>
+        <w:numPr>
+          <w:ilvl w:val="0"/>
+          <w:numId w:val="17"/>
+        </w:numPr>
+        <w:rPr>
+          <w:b/>
+          <w:bCs/>
+          <w:u w:val="single"/>
+        </w:rPr>
+      </w:pPr>
+      <w:r>
+        <w:rPr>
+          <w:b/>
+          <w:bCs/>
+          <w:u w:val="single"/>
+        </w:rPr>
+        <w:t>Proportional Control Output</w:t>
+      </w:r>
+    </w:p>
+    <w:p>
+      <w:pPr>
+        <w:pStyle w:val="ListParagraph"/>
+      </w:pPr>
+      <w:r>
+        <w:t>Voltage Gain = -(15/5) = 3</w:t>
+      </w:r>
+    </w:p>
+    <w:p>
+      <w:pPr>
+        <w:pStyle w:val="ListParagraph"/>
+      </w:pPr>
+      <w:r>
+        <w:drawing>
+          <wp:anchor distT="0" distB="0" distL="114300" distR="114300" simplePos="0" relativeHeight="251682816" behindDoc="1" locked="0" layoutInCell="1" allowOverlap="1" wp14:anchorId="2A84AB60" wp14:editId="05F4367D">
+            <wp:simplePos x="0" y="0"/>
+            <wp:positionH relativeFrom="margin">
+              <wp:posOffset>5040775</wp:posOffset>
+            </wp:positionH>
+            <wp:positionV relativeFrom="paragraph">
+              <wp:posOffset>4349</wp:posOffset>
+            </wp:positionV>
+            <wp:extent cx="1653871" cy="1678940"/>
+            <wp:effectExtent l="0" t="0" r="3810" b="0"/>
+            <wp:wrapNone/>
+            <wp:docPr id="1631582742" name="Picture 1"/>
+            <wp:cNvGraphicFramePr>
+              <a:graphicFrameLocks xmlns:a="http://schemas.openxmlformats.org/drawingml/2006/main" noChangeAspect="1"/>
+            </wp:cNvGraphicFramePr>
+            <a:graphic xmlns:a="http://schemas.openxmlformats.org/drawingml/2006/main">
+              <a:graphicData uri="http://schemas.openxmlformats.org/drawingml/2006/picture">
+                <pic:pic xmlns:pic="http://schemas.openxmlformats.org/drawingml/2006/picture">
+                  <pic:nvPicPr>
+                    <pic:cNvPr id="1545510123" name=""/>
+                    <pic:cNvPicPr/>
+                  </pic:nvPicPr>
+                  <pic:blipFill rotWithShape="1">
+                    <a:blip r:embed="rId17">
+                      <a:extLst>
+                        <a:ext uri="{28A0092B-C50C-407E-A947-70E740481C1C}">
+                          <a14:useLocalDpi xmlns:a14="http://schemas.microsoft.com/office/drawing/2010/main" val="0"/>
+                        </a:ext>
+                      </a:extLst>
+                    </a:blip>
+                    <a:srcRect r="75114"/>
+                    <a:stretch>
+                      <a:fillRect/>
+                    </a:stretch>
+                  </pic:blipFill>
+                  <pic:spPr bwMode="auto">
+                    <a:xfrm>
+                      <a:off x="0" y="0"/>
+                      <a:ext cx="1653871" cy="1678940"/>
+                    </a:xfrm>
+                    <a:prstGeom prst="rect">
+                      <a:avLst/>
+                    </a:prstGeom>
+                    <a:ln>
+                      <a:noFill/>
+                    </a:ln>
+                    <a:extLst>
+                      <a:ext uri="{53640926-AAD7-44D8-BBD7-CCE9431645EC}">
+                        <a14:shadowObscured xmlns:a14="http://schemas.microsoft.com/office/drawing/2010/main"/>
+                      </a:ext>
+                    </a:extLst>
+                  </pic:spPr>
+                </pic:pic>
+              </a:graphicData>
+            </a:graphic>
+            <wp14:sizeRelH relativeFrom="page">
+              <wp14:pctWidth>0</wp14:pctWidth>
+            </wp14:sizeRelH>
+            <wp14:sizeRelV relativeFrom="page">
+              <wp14:pctHeight>0</wp14:pctHeight>
+            </wp14:sizeRelV>
+          </wp:anchor>
+        </w:drawing>
+      </w:r>
+      <w:r>
+        <w:t xml:space="preserve">Amplitude of </w:t>
+      </w:r>
+      <w:r>
+        <w:t>Input</w:t>
+      </w:r>
+      <w:r>
+        <w:t xml:space="preserve"> sawtooth voltage is amplified to 6 Volts.</w:t>
+      </w:r>
+    </w:p>
+    <w:p>
+      <w:pPr>
+        <w:pStyle w:val="ListParagraph"/>
+      </w:pPr>
+      <w:r>
+        <w:t xml:space="preserve">The output wave form is inverted/ </w:t>
+      </w:r>
+      <w:r>
+        <w:t>180-degree</w:t>
+      </w:r>
+      <w:r>
+        <w:t xml:space="preserve"> phase difference </w:t>
+      </w:r>
+    </w:p>
+    <w:p>
+      <w:pPr>
+        <w:pStyle w:val="ListParagraph"/>
+      </w:pPr>
+      <w:r>
+        <w:t>with input waveform.</w:t>
       </w:r>
     </w:p>
     <w:p/>
@@ -6024,63 +6807,486 @@
     <w:p/>
     <w:p>
       <w:pPr>
+        <w:pStyle w:val="ListParagraph"/>
+      </w:pPr>
+      <w:r>
+        <w:drawing>
+          <wp:anchor distT="0" distB="0" distL="114300" distR="114300" simplePos="0" relativeHeight="251684864" behindDoc="1" locked="0" layoutInCell="1" allowOverlap="1" wp14:anchorId="471E3D0C" wp14:editId="7CE87754">
+            <wp:simplePos x="0" y="0"/>
+            <wp:positionH relativeFrom="margin">
+              <wp:posOffset>5023413</wp:posOffset>
+            </wp:positionH>
+            <wp:positionV relativeFrom="paragraph">
+              <wp:posOffset>518474</wp:posOffset>
+            </wp:positionV>
+            <wp:extent cx="1661823" cy="1678744"/>
+            <wp:effectExtent l="0" t="0" r="0" b="0"/>
+            <wp:wrapNone/>
+            <wp:docPr id="1020348986" name="Picture 1"/>
+            <wp:cNvGraphicFramePr>
+              <a:graphicFrameLocks xmlns:a="http://schemas.openxmlformats.org/drawingml/2006/main" noChangeAspect="1"/>
+            </wp:cNvGraphicFramePr>
+            <a:graphic xmlns:a="http://schemas.openxmlformats.org/drawingml/2006/main">
+              <a:graphicData uri="http://schemas.openxmlformats.org/drawingml/2006/picture">
+                <pic:pic xmlns:pic="http://schemas.openxmlformats.org/drawingml/2006/picture">
+                  <pic:nvPicPr>
+                    <pic:cNvPr id="1545510123" name=""/>
+                    <pic:cNvPicPr/>
+                  </pic:nvPicPr>
+                  <pic:blipFill rotWithShape="1">
+                    <a:blip r:embed="rId17">
+                      <a:extLst>
+                        <a:ext uri="{28A0092B-C50C-407E-A947-70E740481C1C}">
+                          <a14:useLocalDpi xmlns:a14="http://schemas.microsoft.com/office/drawing/2010/main" val="0"/>
+                        </a:ext>
+                      </a:extLst>
+                    </a:blip>
+                    <a:srcRect l="25245" r="49747"/>
+                    <a:stretch>
+                      <a:fillRect/>
+                    </a:stretch>
+                  </pic:blipFill>
+                  <pic:spPr bwMode="auto">
+                    <a:xfrm>
+                      <a:off x="0" y="0"/>
+                      <a:ext cx="1661823" cy="1678744"/>
+                    </a:xfrm>
+                    <a:prstGeom prst="rect">
+                      <a:avLst/>
+                    </a:prstGeom>
+                    <a:ln>
+                      <a:noFill/>
+                    </a:ln>
+                    <a:extLst>
+                      <a:ext uri="{53640926-AAD7-44D8-BBD7-CCE9431645EC}">
+                        <a14:shadowObscured xmlns:a14="http://schemas.microsoft.com/office/drawing/2010/main"/>
+                      </a:ext>
+                    </a:extLst>
+                  </pic:spPr>
+                </pic:pic>
+              </a:graphicData>
+            </a:graphic>
+            <wp14:sizeRelH relativeFrom="page">
+              <wp14:pctWidth>0</wp14:pctWidth>
+            </wp14:sizeRelH>
+            <wp14:sizeRelV relativeFrom="page">
+              <wp14:pctHeight>0</wp14:pctHeight>
+            </wp14:sizeRelV>
+          </wp:anchor>
+        </w:drawing>
+      </w:r>
+      <w:r>
+        <w:br/>
+      </w:r>
+      <w:r>
+        <w:br/>
+      </w:r>
+    </w:p>
+    <w:p>
+      <w:pPr>
+        <w:pStyle w:val="ListParagraph"/>
         <w:numPr>
           <w:ilvl w:val="0"/>
-          <w:numId w:val="13"/>
+          <w:numId w:val="17"/>
         </w:numPr>
-      </w:pPr>
-      <w:r>
         <w:rPr>
           <w:b/>
           <w:bCs/>
+          <w:u w:val="single"/>
         </w:rPr>
-        <w:t>Sawtooth/Triangle Wave Test:</w:t>
-      </w:r>
-    </w:p>
-    <w:p>
-      <w:pPr>
+      </w:pPr>
+      <w:r>
+        <w:rPr>
+          <w:b/>
+          <w:bCs/>
+          <w:u w:val="single"/>
+        </w:rPr>
+        <w:t>Integral Control Output</w:t>
+      </w:r>
+    </w:p>
+    <w:p>
+      <w:pPr>
+        <w:pStyle w:val="ListParagraph"/>
+      </w:pPr>
+      <w:r>
+        <w:t>Appears to be sine wave but it is actually parabolic curves</w:t>
+      </w:r>
+    </w:p>
+    <w:p>
+      <w:pPr>
+        <w:pStyle w:val="ListParagraph"/>
+      </w:pPr>
+      <w:r>
+        <w:t>joined together. This is because we can approximate each line</w:t>
+      </w:r>
+    </w:p>
+    <w:p>
+      <w:pPr>
+        <w:pStyle w:val="ListParagraph"/>
+      </w:pPr>
+      <w:r>
+        <w:t>in sawtooth input voltage to be a linear function of time,</w:t>
+      </w:r>
+    </w:p>
+    <w:p>
+      <w:pPr>
+        <w:pStyle w:val="ListParagraph"/>
+      </w:pPr>
+      <w:r>
+        <w:t>integrating this gives a t squared value in the output wave form</w:t>
+      </w:r>
+    </w:p>
+    <w:p>
+      <w:pPr>
+        <w:pStyle w:val="ListParagraph"/>
+      </w:pPr>
+      <w:r>
+        <w:t>causing the parabolic curve</w:t>
+      </w:r>
+      <w:r>
+        <w:t>.</w:t>
+      </w:r>
+    </w:p>
+    <w:p>
+      <w:pPr>
+        <w:pStyle w:val="ListParagraph"/>
+      </w:pPr>
+    </w:p>
+    <w:p>
+      <w:pPr>
+        <w:pStyle w:val="ListParagraph"/>
+      </w:pPr>
+      <w:r>
+        <w:t>When sawtooth input rises, the parabolic curve falls and vice versa.</w:t>
+      </w:r>
+    </w:p>
+    <w:p>
+      <w:pPr>
+        <w:pStyle w:val="ListParagraph"/>
+      </w:pPr>
+    </w:p>
+    <w:p>
+      <w:pPr>
+        <w:pStyle w:val="ListParagraph"/>
+      </w:pPr>
+    </w:p>
+    <w:p>
+      <w:pPr>
+        <w:pStyle w:val="ListParagraph"/>
+      </w:pPr>
+    </w:p>
+    <w:p>
+      <w:pPr>
+        <w:pStyle w:val="ListParagraph"/>
+      </w:pPr>
+      <w:r>
+        <w:br/>
+      </w:r>
+    </w:p>
+    <w:p>
+      <w:pPr>
+        <w:pStyle w:val="ListParagraph"/>
         <w:numPr>
-          <w:ilvl w:val="1"/>
-          <w:numId w:val="13"/>
+          <w:ilvl w:val="0"/>
+          <w:numId w:val="17"/>
         </w:numPr>
-      </w:pPr>
-      <w:r>
-        <w:t>Frequency: 100 Hz</w:t>
-      </w:r>
-    </w:p>
-    <w:p>
-      <w:pPr>
+        <w:rPr>
+          <w:b/>
+          <w:bCs/>
+          <w:u w:val="single"/>
+        </w:rPr>
+      </w:pPr>
+      <w:r>
+        <w:drawing>
+          <wp:anchor distT="0" distB="0" distL="114300" distR="114300" simplePos="0" relativeHeight="251686912" behindDoc="1" locked="0" layoutInCell="1" allowOverlap="1" wp14:anchorId="07B3DDAF" wp14:editId="3B037CD7">
+            <wp:simplePos x="0" y="0"/>
+            <wp:positionH relativeFrom="margin">
+              <wp:align>right</wp:align>
+            </wp:positionH>
+            <wp:positionV relativeFrom="paragraph">
+              <wp:posOffset>8673</wp:posOffset>
+            </wp:positionV>
+            <wp:extent cx="1685677" cy="1678940"/>
+            <wp:effectExtent l="0" t="0" r="0" b="0"/>
+            <wp:wrapNone/>
+            <wp:docPr id="1333214402" name="Picture 1"/>
+            <wp:cNvGraphicFramePr>
+              <a:graphicFrameLocks xmlns:a="http://schemas.openxmlformats.org/drawingml/2006/main" noChangeAspect="1"/>
+            </wp:cNvGraphicFramePr>
+            <a:graphic xmlns:a="http://schemas.openxmlformats.org/drawingml/2006/main">
+              <a:graphicData uri="http://schemas.openxmlformats.org/drawingml/2006/picture">
+                <pic:pic xmlns:pic="http://schemas.openxmlformats.org/drawingml/2006/picture">
+                  <pic:nvPicPr>
+                    <pic:cNvPr id="1545510123" name=""/>
+                    <pic:cNvPicPr/>
+                  </pic:nvPicPr>
+                  <pic:blipFill rotWithShape="1">
+                    <a:blip r:embed="rId17">
+                      <a:extLst>
+                        <a:ext uri="{28A0092B-C50C-407E-A947-70E740481C1C}">
+                          <a14:useLocalDpi xmlns:a14="http://schemas.microsoft.com/office/drawing/2010/main" val="0"/>
+                        </a:ext>
+                      </a:extLst>
+                    </a:blip>
+                    <a:srcRect l="50489" r="24142"/>
+                    <a:stretch>
+                      <a:fillRect/>
+                    </a:stretch>
+                  </pic:blipFill>
+                  <pic:spPr bwMode="auto">
+                    <a:xfrm>
+                      <a:off x="0" y="0"/>
+                      <a:ext cx="1685677" cy="1678940"/>
+                    </a:xfrm>
+                    <a:prstGeom prst="rect">
+                      <a:avLst/>
+                    </a:prstGeom>
+                    <a:ln>
+                      <a:noFill/>
+                    </a:ln>
+                    <a:extLst>
+                      <a:ext uri="{53640926-AAD7-44D8-BBD7-CCE9431645EC}">
+                        <a14:shadowObscured xmlns:a14="http://schemas.microsoft.com/office/drawing/2010/main"/>
+                      </a:ext>
+                    </a:extLst>
+                  </pic:spPr>
+                </pic:pic>
+              </a:graphicData>
+            </a:graphic>
+            <wp14:sizeRelH relativeFrom="page">
+              <wp14:pctWidth>0</wp14:pctWidth>
+            </wp14:sizeRelH>
+            <wp14:sizeRelV relativeFrom="page">
+              <wp14:pctHeight>0</wp14:pctHeight>
+            </wp14:sizeRelV>
+          </wp:anchor>
+        </w:drawing>
+      </w:r>
+      <w:r>
+        <w:rPr>
+          <w:b/>
+          <w:bCs/>
+          <w:u w:val="single"/>
+        </w:rPr>
+        <w:t>Derivative Control Output</w:t>
+      </w:r>
+    </w:p>
+    <w:p>
+      <w:pPr>
+        <w:pStyle w:val="ListParagraph"/>
+      </w:pPr>
+      <w:r>
+        <w:t xml:space="preserve">It outputs an approximate square wave, although there </w:t>
+      </w:r>
+    </w:p>
+    <w:p>
+      <w:pPr>
+        <w:pStyle w:val="ListParagraph"/>
+      </w:pPr>
+      <w:r>
+        <w:t>is significant noise which can be reduce by increasing R-in3</w:t>
+      </w:r>
+      <w:r>
+        <w:t xml:space="preserve"> resistor</w:t>
+      </w:r>
+    </w:p>
+    <w:p>
+      <w:pPr>
+        <w:pStyle w:val="ListParagraph"/>
+      </w:pPr>
+      <w:r>
+        <w:t>value</w:t>
+      </w:r>
+      <w:r>
+        <w:t xml:space="preserve"> </w:t>
+      </w:r>
+      <w:r>
+        <w:t xml:space="preserve">or by adding a noise filter capacitor </w:t>
+      </w:r>
+      <w:r>
+        <w:t xml:space="preserve">parallel to the </w:t>
+      </w:r>
+    </w:p>
+    <w:p>
+      <w:pPr>
+        <w:pStyle w:val="ListParagraph"/>
+      </w:pPr>
+      <w:r>
+        <w:t>feedback resistor.</w:t>
+      </w:r>
+    </w:p>
+    <w:p>
+      <w:pPr>
+        <w:pStyle w:val="ListParagraph"/>
+      </w:pPr>
+    </w:p>
+    <w:p>
+      <w:pPr>
+        <w:pStyle w:val="ListParagraph"/>
+      </w:pPr>
+      <w:r>
+        <w:t>Derivative control amplifies tiny noise signals in input</w:t>
+      </w:r>
+    </w:p>
+    <w:p>
+      <w:pPr>
+        <w:pStyle w:val="ListParagraph"/>
+      </w:pPr>
+      <w:r>
+        <w:t xml:space="preserve">as it outputs high value of rate of change reacting to </w:t>
+      </w:r>
+    </w:p>
+    <w:p>
+      <w:pPr>
+        <w:pStyle w:val="ListParagraph"/>
+      </w:pPr>
+      <w:r>
+        <w:t>noise in input signal.</w:t>
+      </w:r>
+    </w:p>
+    <w:p>
+      <w:pPr>
+        <w:pStyle w:val="ListParagraph"/>
+      </w:pPr>
+      <w:r>
+        <w:br/>
+      </w:r>
+      <w:r>
+        <w:br/>
+      </w:r>
+    </w:p>
+    <w:p>
+      <w:pPr>
+        <w:pStyle w:val="ListParagraph"/>
         <w:numPr>
-          <w:ilvl w:val="1"/>
-          <w:numId w:val="13"/>
+          <w:ilvl w:val="0"/>
+          <w:numId w:val="17"/>
         </w:numPr>
-      </w:pPr>
-      <w:r>
-        <w:t>Amplitude: 2.0 V</w:t>
-      </w:r>
-    </w:p>
-    <w:p>
-      <w:pPr>
-        <w:numPr>
-          <w:ilvl w:val="1"/>
-          <w:numId w:val="13"/>
-        </w:numPr>
-      </w:pPr>
-      <w:r>
-        <w:t>DC Offset: 0.0 V</w:t>
-      </w:r>
-    </w:p>
-    <w:p>
-      <w:pPr>
-        <w:numPr>
-          <w:ilvl w:val="1"/>
-          <w:numId w:val="13"/>
-        </w:numPr>
-      </w:pPr>
-      <w:r>
-        <w:t>Function Type: Triangle</w:t>
-      </w:r>
-    </w:p>
+        <w:rPr>
+          <w:b/>
+          <w:bCs/>
+          <w:u w:val="single"/>
+        </w:rPr>
+      </w:pPr>
+      <w:r>
+        <w:lastRenderedPageBreak/>
+        <w:drawing>
+          <wp:anchor distT="0" distB="0" distL="114300" distR="114300" simplePos="0" relativeHeight="251674624" behindDoc="1" locked="0" layoutInCell="1" allowOverlap="1" wp14:anchorId="4C0C93A8" wp14:editId="1C851A04">
+            <wp:simplePos x="0" y="0"/>
+            <wp:positionH relativeFrom="margin">
+              <wp:posOffset>5151586</wp:posOffset>
+            </wp:positionH>
+            <wp:positionV relativeFrom="paragraph">
+              <wp:posOffset>5128</wp:posOffset>
+            </wp:positionV>
+            <wp:extent cx="1598213" cy="1678741"/>
+            <wp:effectExtent l="0" t="0" r="2540" b="0"/>
+            <wp:wrapNone/>
+            <wp:docPr id="1545510123" name="Picture 1"/>
+            <wp:cNvGraphicFramePr>
+              <a:graphicFrameLocks xmlns:a="http://schemas.openxmlformats.org/drawingml/2006/main" noChangeAspect="1"/>
+            </wp:cNvGraphicFramePr>
+            <a:graphic xmlns:a="http://schemas.openxmlformats.org/drawingml/2006/main">
+              <a:graphicData uri="http://schemas.openxmlformats.org/drawingml/2006/picture">
+                <pic:pic xmlns:pic="http://schemas.openxmlformats.org/drawingml/2006/picture">
+                  <pic:nvPicPr>
+                    <pic:cNvPr id="1545510123" name=""/>
+                    <pic:cNvPicPr/>
+                  </pic:nvPicPr>
+                  <pic:blipFill rotWithShape="1">
+                    <a:blip r:embed="rId17">
+                      <a:extLst>
+                        <a:ext uri="{28A0092B-C50C-407E-A947-70E740481C1C}">
+                          <a14:useLocalDpi xmlns:a14="http://schemas.microsoft.com/office/drawing/2010/main" val="0"/>
+                        </a:ext>
+                      </a:extLst>
+                    </a:blip>
+                    <a:srcRect l="75374" r="575"/>
+                    <a:stretch>
+                      <a:fillRect/>
+                    </a:stretch>
+                  </pic:blipFill>
+                  <pic:spPr bwMode="auto">
+                    <a:xfrm>
+                      <a:off x="0" y="0"/>
+                      <a:ext cx="1598213" cy="1678741"/>
+                    </a:xfrm>
+                    <a:prstGeom prst="rect">
+                      <a:avLst/>
+                    </a:prstGeom>
+                    <a:ln>
+                      <a:noFill/>
+                    </a:ln>
+                    <a:extLst>
+                      <a:ext uri="{53640926-AAD7-44D8-BBD7-CCE9431645EC}">
+                        <a14:shadowObscured xmlns:a14="http://schemas.microsoft.com/office/drawing/2010/main"/>
+                      </a:ext>
+                    </a:extLst>
+                  </pic:spPr>
+                </pic:pic>
+              </a:graphicData>
+            </a:graphic>
+            <wp14:sizeRelH relativeFrom="page">
+              <wp14:pctWidth>0</wp14:pctWidth>
+            </wp14:sizeRelH>
+            <wp14:sizeRelV relativeFrom="page">
+              <wp14:pctHeight>0</wp14:pctHeight>
+            </wp14:sizeRelV>
+          </wp:anchor>
+        </w:drawing>
+      </w:r>
+      <w:r>
+        <w:rPr>
+          <w:b/>
+          <w:bCs/>
+          <w:u w:val="single"/>
+        </w:rPr>
+        <w:t>Net PID Output after Summation</w:t>
+      </w:r>
+    </w:p>
+    <w:p>
+      <w:pPr>
+        <w:pStyle w:val="ListParagraph"/>
+      </w:pPr>
+      <w:r>
+        <w:t>S</w:t>
+      </w:r>
+      <w:r>
+        <w:t>uper</w:t>
+      </w:r>
+      <w:r>
+        <w:t xml:space="preserve">position of all previous waveforms. </w:t>
+      </w:r>
+    </w:p>
+    <w:p/>
+    <w:p/>
+    <w:p/>
+    <w:p/>
+    <w:p/>
+    <w:p/>
+    <w:p/>
+    <w:p/>
+    <w:p/>
+    <w:p/>
+    <w:p/>
+    <w:p/>
+    <w:p/>
+    <w:p/>
+    <w:p/>
+    <w:p/>
+    <w:p/>
+    <w:p/>
+    <w:p/>
+    <w:p/>
+    <w:p/>
+    <w:p/>
+    <w:p/>
+    <w:p/>
+    <w:p/>
+    <w:p/>
+    <w:p/>
+    <w:p/>
+    <w:p/>
     <w:p>
       <w:pPr>
         <w:pBdr>
@@ -6242,7 +7448,6 @@
         <w:pStyle w:val="ListParagraph"/>
       </w:pPr>
       <w:r>
-        <w:lastRenderedPageBreak/>
         <w:t>An Ideal integral controller would use only</w:t>
       </w:r>
       <w:r>
@@ -6415,18 +7620,19 @@
         </w:numPr>
       </w:pPr>
       <w:r>
-        <w:t>cutoff voltage both integrator and diffrentiator</w:t>
-      </w:r>
+        <w:lastRenderedPageBreak/>
+        <w:t xml:space="preserve">cutoff voltage both integrator and </w:t>
+      </w:r>
+      <w:proofErr w:type="spellStart"/>
+      <w:r>
+        <w:t>diffrentiator</w:t>
+      </w:r>
+      <w:proofErr w:type="spellEnd"/>
     </w:p>
     <w:p/>
-    <w:p>
-      <w:r>
-        <w:br w:type="page"/>
-      </w:r>
-    </w:p>
-    <w:p>
-      <w:r>
-        <w:lastRenderedPageBreak/>
+    <w:p/>
+    <w:p>
+      <w:r>
         <w:t xml:space="preserve">The reason your input oscilloscope flatlined and the other stages went crazy is that </w:t>
       </w:r>
       <w:r>
@@ -6531,8 +7737,13 @@
           <w:numId w:val="3"/>
         </w:numPr>
       </w:pPr>
-      <w:r>
-        <w:t>Tinkercad's simulation engine panics when this happens, resulting in the jagged edges and square pulses you see on the other scopes.</w:t>
+      <w:proofErr w:type="spellStart"/>
+      <w:r>
+        <w:t>Tinkercad's</w:t>
+      </w:r>
+      <w:proofErr w:type="spellEnd"/>
+      <w:r>
+        <w:t xml:space="preserve"> simulation engine panics when this happens, resulting in the jagged edges and square pulses you see on the other scopes.</w:t>
       </w:r>
     </w:p>
     <w:p/>
@@ -6563,36 +7774,61 @@
           <w:b/>
           <w:bCs/>
         </w:rPr>
-        <w:t>1.Disconnect the D Stage Temporarily:</w:t>
-      </w:r>
-      <w:r>
-        <w:t>Isolate the problem.</w:t>
-      </w:r>
-    </w:p>
-    <w:p>
-      <w:r>
-        <w:t>Delete the wire connecting the main input node to your Derivative capacitor. Run the simulation. Your input wave, P stage, and I stage should instantly return to normal.</w:t>
-      </w:r>
-    </w:p>
-    <w:p>
-      <w:r>
-        <w:br/>
-      </w:r>
-    </w:p>
-    <w:p>
+        <w:t xml:space="preserve">1.Disconnect the D Stage </w:t>
+      </w:r>
+      <w:proofErr w:type="spellStart"/>
       <w:r>
         <w:rPr>
           <w:b/>
           <w:bCs/>
         </w:rPr>
-        <w:t>2.Add a Series Resistor to the Input:</w:t>
-      </w:r>
-      <w:r>
-        <w:t>Limit the high-frequency current.</w:t>
-      </w:r>
-    </w:p>
-    <w:p>
-      <w:r>
+        <w:t>Temporarily:</w:t>
+      </w:r>
+      <w:r>
+        <w:t>Isolate</w:t>
+      </w:r>
+      <w:proofErr w:type="spellEnd"/>
+      <w:r>
+        <w:t xml:space="preserve"> the problem.</w:t>
+      </w:r>
+    </w:p>
+    <w:p>
+      <w:r>
+        <w:t>Delete the wire connecting the main input node to your Derivative capacitor. Run the simulation. Your input wave, P stage, and I stage should instantly return to normal.</w:t>
+      </w:r>
+    </w:p>
+    <w:p>
+      <w:r>
+        <w:br/>
+      </w:r>
+    </w:p>
+    <w:p>
+      <w:r>
+        <w:rPr>
+          <w:b/>
+          <w:bCs/>
+        </w:rPr>
+        <w:t xml:space="preserve">2.Add a Series Resistor to the </w:t>
+      </w:r>
+      <w:proofErr w:type="spellStart"/>
+      <w:r>
+        <w:rPr>
+          <w:b/>
+          <w:bCs/>
+        </w:rPr>
+        <w:t>Input:</w:t>
+      </w:r>
+      <w:r>
+        <w:t>Limit</w:t>
+      </w:r>
+      <w:proofErr w:type="spellEnd"/>
+      <w:r>
+        <w:t xml:space="preserve"> the high-frequency current.</w:t>
+      </w:r>
+    </w:p>
+    <w:p>
+      <w:r>
+        <w:lastRenderedPageBreak/>
         <w:t xml:space="preserve">Place a </w:t>
       </w:r>
       <m:oMath>
@@ -6642,7 +7878,6 @@
         </w:numPr>
       </w:pPr>
       <w:r>
-        <w:lastRenderedPageBreak/>
         <w:t xml:space="preserve">The path should be: </w:t>
       </w:r>
       <w:r>
@@ -6783,10 +8018,22 @@
           <w:b/>
           <w:bCs/>
         </w:rPr>
-        <w:t>3.Verify the Feedback Resistor:</w:t>
-      </w:r>
-      <w:r>
-        <w:t>Check the feedback loop.</w:t>
+        <w:t xml:space="preserve">3.Verify the Feedback </w:t>
+      </w:r>
+      <w:proofErr w:type="spellStart"/>
+      <w:r>
+        <w:rPr>
+          <w:b/>
+          <w:bCs/>
+        </w:rPr>
+        <w:t>Resistor:</w:t>
+      </w:r>
+      <w:r>
+        <w:t>Check</w:t>
+      </w:r>
+      <w:proofErr w:type="spellEnd"/>
+      <w:r>
+        <w:t xml:space="preserve"> the feedback loop.</w:t>
       </w:r>
     </w:p>
     <w:p>
@@ -10347,6 +11594,18 @@
       <w:color w:val="666666"/>
     </w:rPr>
   </w:style>
+  <w:style w:type="character" w:styleId="FollowedHyperlink">
+    <w:name w:val="FollowedHyperlink"/>
+    <w:basedOn w:val="DefaultParagraphFont"/>
+    <w:uiPriority w:val="99"/>
+    <w:semiHidden/>
+    <w:unhideWhenUsed/>
+    <w:rsid w:val="000870C5"/>
+    <w:rPr>
+      <w:color w:val="954F72" w:themeColor="followedHyperlink"/>
+      <w:u w:val="single"/>
+    </w:rPr>
+  </w:style>
 </w:styles>
 </file>
 

</xml_diff>

<commit_message>
final formatting chnages ; added name id no
</commit_message>
<xml_diff>
--- a/PID-Controller-using-OP-AMPS- Hari Mohan 2026A8PS1148H.docx
+++ b/PID-Controller-using-OP-AMPS- Hari Mohan 2026A8PS1148H.docx
@@ -182,6 +182,48 @@
           <w:bCs/>
           <w:u w:val="single"/>
         </w:rPr>
+        <w:t>Name: Hari Mohan Sambyal</w:t>
+      </w:r>
+    </w:p>
+    <w:p>
+      <w:pPr>
+        <w:rPr>
+          <w:b/>
+          <w:bCs/>
+          <w:u w:val="single"/>
+        </w:rPr>
+      </w:pPr>
+      <w:r>
+        <w:rPr>
+          <w:b/>
+          <w:bCs/>
+          <w:u w:val="single"/>
+        </w:rPr>
+        <w:t>Id No: 2026A8PS1148H</w:t>
+      </w:r>
+    </w:p>
+    <w:p>
+      <w:pPr>
+        <w:rPr>
+          <w:b/>
+          <w:bCs/>
+          <w:u w:val="single"/>
+        </w:rPr>
+      </w:pPr>
+      <w:r>
+        <w:rPr>
+          <w:b/>
+          <w:bCs/>
+          <w:u w:val="single"/>
+        </w:rPr>
+        <w:br/>
+      </w:r>
+      <w:r>
+        <w:rPr>
+          <w:b/>
+          <w:bCs/>
+          <w:u w:val="single"/>
+        </w:rPr>
         <w:t>C</w:t>
       </w:r>
       <w:r>
@@ -281,9 +323,6 @@
       <w:r>
         <w:t>Connecting Wires</w:t>
       </w:r>
-      <w:r>
-        <w:br/>
-      </w:r>
     </w:p>
     <w:p>
       <w:pPr>
@@ -313,9 +352,9 @@
     <w:p>
       <w:r>
         <w:drawing>
-          <wp:inline distT="0" distB="0" distL="0" distR="0" wp14:anchorId="1751A828" wp14:editId="2FCC5887">
-            <wp:extent cx="6587498" cy="5057030"/>
-            <wp:effectExtent l="0" t="0" r="3810" b="0"/>
+          <wp:inline distT="0" distB="0" distL="0" distR="0" wp14:anchorId="1751A828" wp14:editId="33AEE7EC">
+            <wp:extent cx="6111089" cy="4691304"/>
+            <wp:effectExtent l="0" t="0" r="4445" b="0"/>
             <wp:docPr id="659721725" name="Picture 1"/>
             <wp:cNvGraphicFramePr>
               <a:graphicFrameLocks xmlns:a="http://schemas.openxmlformats.org/drawingml/2006/main" noChangeAspect="1"/>
@@ -336,7 +375,7 @@
                   <pic:spPr>
                     <a:xfrm>
                       <a:off x="0" y="0"/>
-                      <a:ext cx="6621816" cy="5083375"/>
+                      <a:ext cx="6227384" cy="4780581"/>
                     </a:xfrm>
                     <a:prstGeom prst="rect">
                       <a:avLst/>
@@ -837,6 +876,9 @@
     </w:p>
     <w:p>
       <w:pPr>
+        <w:pBdr>
+          <w:bottom w:val="single" w:sz="12" w:space="1" w:color="auto"/>
+        </w:pBdr>
         <w:rPr>
           <w:rFonts w:eastAsiaTheme="minorEastAsia"/>
         </w:rPr>
@@ -847,13 +889,6 @@
         </w:rPr>
         <w:t>These equations are applied to the input waveform (Vin) to transform it to output waveform.</w:t>
       </w:r>
-    </w:p>
-    <w:p>
-      <w:pPr>
-        <w:rPr>
-          <w:rFonts w:eastAsiaTheme="minorEastAsia"/>
-        </w:rPr>
-      </w:pPr>
     </w:p>
     <w:p>
       <w:pPr>
@@ -959,7 +994,19 @@
           <w:rPr>
             <w:rStyle w:val="Hyperlink"/>
           </w:rPr>
-          <w:t>https://www.tinkercad.com/things/7pLT7ZwJvSK-sine-wave-test-pid-using-op-amps?sharecode=Y0dhuDTfMtLGkQgUxdCAVcYEuKSC0x8eQNOmDoOD-zA</w:t>
+          <w:t>https://www.tinkercad.com/things/7pLT</w:t>
+        </w:r>
+        <w:r>
+          <w:rPr>
+            <w:rStyle w:val="Hyperlink"/>
+          </w:rPr>
+          <w:t>7</w:t>
+        </w:r>
+        <w:r>
+          <w:rPr>
+            <w:rStyle w:val="Hyperlink"/>
+          </w:rPr>
+          <w:t>ZwJvSK-sine-wave-test-pid-using-op-amps?sharecode=Y0dhuDTfMtLGkQgUxdCAVcYEuKSC0x8eQNOmDoOD-zA</w:t>
         </w:r>
       </w:hyperlink>
     </w:p>
@@ -2506,6 +2553,11 @@
       <w:r>
         <w:br/>
       </w:r>
+    </w:p>
+    <w:p>
+      <w:pPr>
+        <w:pStyle w:val="ListParagraph"/>
+      </w:pPr>
     </w:p>
     <w:p>
       <w:pPr>
@@ -3017,6 +3069,13 @@
     <w:p/>
     <w:p>
       <w:pPr>
+        <w:pBdr>
+          <w:bottom w:val="single" w:sz="12" w:space="1" w:color="auto"/>
+        </w:pBdr>
+      </w:pPr>
+    </w:p>
+    <w:p>
+      <w:pPr>
         <w:numPr>
           <w:ilvl w:val="0"/>
           <w:numId w:val="13"/>
@@ -3035,7 +3094,6 @@
           <w:szCs w:val="32"/>
           <w:u w:val="single"/>
         </w:rPr>
-        <w:lastRenderedPageBreak/>
         <w:t>Square Wave Test:</w:t>
       </w:r>
     </w:p>
@@ -3105,7 +3163,19 @@
           <w:rPr>
             <w:rStyle w:val="Hyperlink"/>
           </w:rPr>
-          <w:t>https://www.tinkercad.com/things/0EchvulRUdH-square-wave-test-pid-using-op-amps-2026a8ps1148h-hari-mohan?sharecode=9NQDNDahdHH81qDx8PzoyDR-Fjtf2_VbeuRBUoWWmKg</w:t>
+          <w:t>https://www.tinkercad.com/things/0EchvulRUdH-square-wave-test-pid-using-op-amps-2026a8ps1148h-hari-mohan?sharecode=9NQDNDa</w:t>
+        </w:r>
+        <w:r>
+          <w:rPr>
+            <w:rStyle w:val="Hyperlink"/>
+          </w:rPr>
+          <w:t>h</w:t>
+        </w:r>
+        <w:r>
+          <w:rPr>
+            <w:rStyle w:val="Hyperlink"/>
+          </w:rPr>
+          <w:t>dHH81qDx8PzoyDR-Fjtf2_VbeuRBUoWWmKg</w:t>
         </w:r>
       </w:hyperlink>
       <w:r>
@@ -4512,16 +4582,16 @@
     <w:p>
       <w:r>
         <w:drawing>
-          <wp:anchor distT="0" distB="0" distL="114300" distR="114300" simplePos="0" relativeHeight="251670528" behindDoc="1" locked="0" layoutInCell="1" allowOverlap="1" wp14:anchorId="2716BE07" wp14:editId="5BEC58B3">
+          <wp:anchor distT="0" distB="0" distL="114300" distR="114300" simplePos="0" relativeHeight="251670528" behindDoc="1" locked="0" layoutInCell="1" allowOverlap="1" wp14:anchorId="2716BE07" wp14:editId="733F3385">
             <wp:simplePos x="0" y="0"/>
             <wp:positionH relativeFrom="margin">
-              <wp:posOffset>4351183</wp:posOffset>
+              <wp:posOffset>4487545</wp:posOffset>
             </wp:positionH>
             <wp:positionV relativeFrom="paragraph">
-              <wp:posOffset>1300480</wp:posOffset>
+              <wp:posOffset>1355562</wp:posOffset>
             </wp:positionV>
-            <wp:extent cx="2349500" cy="2298700"/>
-            <wp:effectExtent l="0" t="0" r="0" b="6350"/>
+            <wp:extent cx="2220849" cy="2172831"/>
+            <wp:effectExtent l="0" t="0" r="8255" b="0"/>
             <wp:wrapNone/>
             <wp:docPr id="1811063850" name="Picture 1"/>
             <wp:cNvGraphicFramePr>
@@ -4549,7 +4619,7 @@
                   <pic:spPr>
                     <a:xfrm>
                       <a:off x="0" y="0"/>
-                      <a:ext cx="2349500" cy="2298700"/>
+                      <a:ext cx="2220849" cy="2172831"/>
                     </a:xfrm>
                     <a:prstGeom prst="rect">
                       <a:avLst/>
@@ -4567,9 +4637,6 @@
           </wp:anchor>
         </w:drawing>
       </w:r>
-      <w:r>
-        <w:br/>
-      </w:r>
     </w:p>
     <w:p>
       <w:pPr>
@@ -4650,25 +4717,20 @@
         <w:pStyle w:val="ListParagraph"/>
       </w:pPr>
     </w:p>
-    <w:p>
-      <w:pPr>
-        <w:pStyle w:val="ListParagraph"/>
-      </w:pPr>
-    </w:p>
     <w:p/>
     <w:p/>
     <w:p>
       <w:r>
         <w:drawing>
-          <wp:anchor distT="0" distB="0" distL="114300" distR="114300" simplePos="0" relativeHeight="251671552" behindDoc="1" locked="0" layoutInCell="1" allowOverlap="1" wp14:anchorId="49D5D2C9" wp14:editId="6BA999B6">
+          <wp:anchor distT="0" distB="0" distL="114300" distR="114300" simplePos="0" relativeHeight="251671552" behindDoc="1" locked="0" layoutInCell="1" allowOverlap="1" wp14:anchorId="49D5D2C9" wp14:editId="4D95A586">
             <wp:simplePos x="0" y="0"/>
             <wp:positionH relativeFrom="margin">
-              <wp:posOffset>4331335</wp:posOffset>
+              <wp:posOffset>4513153</wp:posOffset>
             </wp:positionH>
             <wp:positionV relativeFrom="paragraph">
-              <wp:posOffset>143673</wp:posOffset>
+              <wp:posOffset>196606</wp:posOffset>
             </wp:positionV>
-            <wp:extent cx="2381250" cy="2368550"/>
+            <wp:extent cx="2211788" cy="2199992"/>
             <wp:effectExtent l="0" t="0" r="0" b="0"/>
             <wp:wrapNone/>
             <wp:docPr id="1356912487" name="Picture 1"/>
@@ -4697,7 +4759,7 @@
                   <pic:spPr>
                     <a:xfrm>
                       <a:off x="0" y="0"/>
-                      <a:ext cx="2381250" cy="2368550"/>
+                      <a:ext cx="2218970" cy="2207136"/>
                     </a:xfrm>
                     <a:prstGeom prst="rect">
                       <a:avLst/>
@@ -4801,11 +4863,9 @@
       <w:pPr>
         <w:pStyle w:val="ListParagraph"/>
       </w:pPr>
-    </w:p>
-    <w:p>
-      <w:pPr>
-        <w:pStyle w:val="ListParagraph"/>
-      </w:pPr>
+      <w:r>
+        <w:br/>
+      </w:r>
     </w:p>
     <w:p>
       <w:pPr>
@@ -4823,16 +4883,16 @@
       <w:r>
         <w:lastRenderedPageBreak/>
         <w:drawing>
-          <wp:anchor distT="0" distB="0" distL="114300" distR="114300" simplePos="0" relativeHeight="251672576" behindDoc="1" locked="0" layoutInCell="1" allowOverlap="1" wp14:anchorId="68D6B6FA" wp14:editId="6262888C">
+          <wp:anchor distT="0" distB="0" distL="114300" distR="114300" simplePos="0" relativeHeight="251672576" behindDoc="1" locked="0" layoutInCell="1" allowOverlap="1" wp14:anchorId="68D6B6FA" wp14:editId="3A83C7F2">
             <wp:simplePos x="0" y="0"/>
             <wp:positionH relativeFrom="column">
-              <wp:posOffset>4468164</wp:posOffset>
+              <wp:posOffset>4562475</wp:posOffset>
             </wp:positionH>
             <wp:positionV relativeFrom="paragraph">
-              <wp:posOffset>-50800</wp:posOffset>
+              <wp:posOffset>-29373</wp:posOffset>
             </wp:positionV>
-            <wp:extent cx="2311400" cy="2343150"/>
-            <wp:effectExtent l="0" t="0" r="0" b="0"/>
+            <wp:extent cx="2188043" cy="2218099"/>
+            <wp:effectExtent l="0" t="0" r="3175" b="0"/>
             <wp:wrapNone/>
             <wp:docPr id="235363301" name="Picture 1"/>
             <wp:cNvGraphicFramePr>
@@ -4860,7 +4920,7 @@
                   <pic:spPr>
                     <a:xfrm>
                       <a:off x="0" y="0"/>
-                      <a:ext cx="2311400" cy="2343150"/>
+                      <a:ext cx="2188043" cy="2218099"/>
                     </a:xfrm>
                     <a:prstGeom prst="rect">
                       <a:avLst/>
@@ -5000,15 +5060,15 @@
       </w:pPr>
       <w:r>
         <w:drawing>
-          <wp:anchor distT="0" distB="0" distL="114300" distR="114300" simplePos="0" relativeHeight="251673600" behindDoc="1" locked="0" layoutInCell="1" allowOverlap="1" wp14:anchorId="13E6EDCC" wp14:editId="6167B432">
+          <wp:anchor distT="0" distB="0" distL="114300" distR="114300" simplePos="0" relativeHeight="251673600" behindDoc="1" locked="0" layoutInCell="1" allowOverlap="1" wp14:anchorId="13E6EDCC" wp14:editId="67827014">
             <wp:simplePos x="0" y="0"/>
             <wp:positionH relativeFrom="margin">
-              <wp:posOffset>4449445</wp:posOffset>
+              <wp:posOffset>4570730</wp:posOffset>
             </wp:positionH>
             <wp:positionV relativeFrom="paragraph">
-              <wp:posOffset>255107</wp:posOffset>
+              <wp:posOffset>74440</wp:posOffset>
             </wp:positionV>
-            <wp:extent cx="2362200" cy="2438400"/>
+            <wp:extent cx="2199992" cy="2270959"/>
             <wp:effectExtent l="0" t="0" r="0" b="0"/>
             <wp:wrapNone/>
             <wp:docPr id="294476595" name="Picture 1"/>
@@ -5037,7 +5097,7 @@
                   <pic:spPr>
                     <a:xfrm>
                       <a:off x="0" y="0"/>
-                      <a:ext cx="2362200" cy="2438400"/>
+                      <a:ext cx="2199992" cy="2270959"/>
                     </a:xfrm>
                     <a:prstGeom prst="rect">
                       <a:avLst/>
@@ -5056,7 +5116,11 @@
         </w:drawing>
       </w:r>
     </w:p>
-    <w:p/>
+    <w:p>
+      <w:pPr>
+        <w:pStyle w:val="ListParagraph"/>
+      </w:pPr>
+    </w:p>
     <w:p>
       <w:pPr>
         <w:pStyle w:val="ListParagraph"/>
@@ -5127,8 +5191,18 @@
         <w:pStyle w:val="ListParagraph"/>
       </w:pPr>
     </w:p>
-    <w:p/>
-    <w:p/>
+    <w:p>
+      <w:pPr>
+        <w:pStyle w:val="ListParagraph"/>
+      </w:pPr>
+    </w:p>
+    <w:p>
+      <w:pPr>
+        <w:pBdr>
+          <w:bottom w:val="single" w:sz="12" w:space="1" w:color="auto"/>
+        </w:pBdr>
+      </w:pPr>
+    </w:p>
     <w:p>
       <w:pPr>
         <w:numPr>
@@ -5226,7 +5300,19 @@
           <w:rPr>
             <w:rStyle w:val="Hyperlink"/>
           </w:rPr>
-          <w:t>LDAx</w:t>
+          <w:t>L</w:t>
+        </w:r>
+        <w:r>
+          <w:rPr>
+            <w:rStyle w:val="Hyperlink"/>
+          </w:rPr>
+          <w:t>D</w:t>
+        </w:r>
+        <w:r>
+          <w:rPr>
+            <w:rStyle w:val="Hyperlink"/>
+          </w:rPr>
+          <w:t>Ax</w:t>
         </w:r>
         <w:r>
           <w:rPr>
@@ -6662,6 +6748,16 @@
         </w:tc>
       </w:tr>
     </w:tbl>
+    <w:p>
+      <w:pPr>
+        <w:pStyle w:val="ListParagraph"/>
+        <w:rPr>
+          <w:b/>
+          <w:bCs/>
+          <w:u w:val="single"/>
+        </w:rPr>
+      </w:pPr>
+    </w:p>
     <w:p>
       <w:pPr>
         <w:pStyle w:val="ListParagraph"/>
@@ -6971,13 +7067,13 @@
       </w:pPr>
       <w:r>
         <w:drawing>
-          <wp:anchor distT="0" distB="0" distL="114300" distR="114300" simplePos="0" relativeHeight="251686912" behindDoc="1" locked="0" layoutInCell="1" allowOverlap="1" wp14:anchorId="07B3DDAF" wp14:editId="546AD7F0">
+          <wp:anchor distT="0" distB="0" distL="114300" distR="114300" simplePos="0" relativeHeight="251686912" behindDoc="1" locked="0" layoutInCell="1" allowOverlap="1" wp14:anchorId="07B3DDAF" wp14:editId="0A6815C5">
             <wp:simplePos x="0" y="0"/>
             <wp:positionH relativeFrom="margin">
-              <wp:posOffset>4483100</wp:posOffset>
+              <wp:posOffset>4464522</wp:posOffset>
             </wp:positionH>
             <wp:positionV relativeFrom="paragraph">
-              <wp:posOffset>771053</wp:posOffset>
+              <wp:posOffset>770890</wp:posOffset>
             </wp:positionV>
             <wp:extent cx="2217420" cy="2208530"/>
             <wp:effectExtent l="0" t="0" r="0" b="1270"/>
@@ -7170,13 +7266,13 @@
       </w:pPr>
       <w:r>
         <w:drawing>
-          <wp:anchor distT="0" distB="0" distL="114300" distR="114300" simplePos="0" relativeHeight="251674624" behindDoc="1" locked="0" layoutInCell="1" allowOverlap="1" wp14:anchorId="4C0C93A8" wp14:editId="579A2960">
+          <wp:anchor distT="0" distB="0" distL="114300" distR="114300" simplePos="0" relativeHeight="251674624" behindDoc="1" locked="0" layoutInCell="1" allowOverlap="1" wp14:anchorId="4C0C93A8" wp14:editId="0D329693">
             <wp:simplePos x="0" y="0"/>
             <wp:positionH relativeFrom="margin">
-              <wp:posOffset>4499610</wp:posOffset>
+              <wp:posOffset>4481032</wp:posOffset>
             </wp:positionH>
             <wp:positionV relativeFrom="paragraph">
-              <wp:posOffset>25563</wp:posOffset>
+              <wp:posOffset>25400</wp:posOffset>
             </wp:positionV>
             <wp:extent cx="2176145" cy="2285365"/>
             <wp:effectExtent l="0" t="0" r="0" b="635"/>

</xml_diff>